<commit_message>
Solve Task one with first 3 points
</commit_message>
<xml_diff>
--- a/IT244 - Project.docx
+++ b/IT244 - Project.docx
@@ -206,14 +206,14 @@
               </wp:anchor>
             </w:drawing>
           </mc:Choice>
-          <mc:Fallback xmlns:wpsCustomData="http://www.wps.cn/officeDocument/2013/wpsCustomData">
+          <mc:Fallback>
             <w:pict>
-              <v:shape id="_x0000_s1026" o:spid="_x0000_s1026" o:spt="202" alt="Report title" type="#_x0000_t202" style="position:absolute;left:0pt;margin-left:36pt;margin-top:85.4pt;height:148.1pt;width:540pt;mso-position-horizontal-relative:page;mso-position-vertical-relative:margin;z-index:-251652096;v-text-anchor:bottom;mso-width-relative:page;mso-height-relative:page;" filled="f" stroked="f" coordsize="21600,21600" o:allowoverlap="f" o:gfxdata="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">
-                <v:fill on="f" focussize="0,0"/>
-                <v:stroke on="f"/>
-                <v:imagedata o:title=""/>
-                <o:lock v:ext="edit" aspectratio="f"/>
-                <v:textbox inset="0mm,0mm,0mm,0mm">
+              <v:shapetype w14:anchorId="6024A75B" id="_x0000_t202" coordsize="21600,21600" o:spt="202" path="m,l,21600r21600,l21600,xe">
+                <v:stroke joinstyle="miter"/>
+                <v:path gradientshapeok="t" o:connecttype="rect"/>
+              </v:shapetype>
+              <v:shape id="Text Box 14" o:spid="_x0000_s1026" type="#_x0000_t202" alt="Report title" style="position:absolute;margin-left:36pt;margin-top:85.4pt;width:540pt;height:148.1pt;z-index:-251652096;visibility:visible;mso-wrap-style:square;mso-wrap-distance-left:9pt;mso-wrap-distance-top:0;mso-wrap-distance-right:9pt;mso-wrap-distance-bottom:0;mso-position-horizontal:absolute;mso-position-horizontal-relative:page;mso-position-vertical:absolute;mso-position-vertical-relative:margin;v-text-anchor:bottom" o:gfxdata="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" o:allowoverlap="f" filled="f" stroked="f">
+                <v:textbox inset="0,0,0,0">
                   <w:txbxContent>
                     <w:sdt>
                       <w:sdtPr>
@@ -229,16 +229,10 @@
                         <w:dataBinding w:prefixMappings="xmlns:ns0='http://purl.org/dc/elements/1.1/' xmlns:ns1='http://schemas.openxmlformats.org/package/2006/metadata/core-properties' " w:xpath="/ns1:coreProperties[1]/ns0:title[1]" w:storeItemID="{6C3C8BC8-F283-45AE-878A-BAB7291924A1}"/>
                         <w:text/>
                       </w:sdtPr>
-                      <w:sdtEndPr>
-                        <w:rPr>
-                          <w:sz w:val="96"/>
-                          <w:szCs w:val="96"/>
-                        </w:rPr>
-                      </w:sdtEndPr>
                       <w:sdtContent>
                         <w:p>
                           <w:pPr>
-                            <w:pStyle w:val="26"/>
+                            <w:pStyle w:val="Title"/>
                             <w:jc w:val="center"/>
                             <w:rPr>
                               <w:sz w:val="96"/>
@@ -257,7 +251,7 @@
                     </w:sdt>
                     <w:p>
                       <w:pPr>
-                        <w:pStyle w:val="24"/>
+                        <w:pStyle w:val="Subtitle"/>
                         <w:ind w:left="709" w:right="720"/>
                         <w:jc w:val="center"/>
                         <w:rPr>
@@ -286,20 +280,6 @@
                           <w:dataBinding w:prefixMappings="xmlns:ns0='http://purl.org/dc/elements/1.1/' xmlns:ns1='http://schemas.openxmlformats.org/package/2006/metadata/core-properties' " w:xpath="/ns1:coreProperties[1]/ns0:subject[1]" w:storeItemID="{6C3C8BC8-F283-45AE-878A-BAB7291924A1}"/>
                           <w:text/>
                         </w:sdtPr>
-                        <w:sdtEndPr>
-                          <w:rPr>
-                            <w:b w:val="0"/>
-                            <w:caps w:val="0"/>
-                            <w:color w:val="0070C0"/>
-                            <w:sz w:val="52"/>
-                            <w:szCs w:val="16"/>
-                            <w14:shadow w14:blurRad="38100" w14:dist="19050" w14:dir="2700000" w14:sx="100000" w14:sy="100000" w14:kx="0" w14:ky="0" w14:algn="tl">
-                              <w14:schemeClr w14:val="dk1">
-                                <w14:alpha w14:val="60000"/>
-                              </w14:schemeClr>
-                            </w14:shadow>
-                          </w:rPr>
-                        </w:sdtEndPr>
                         <w:sdtContent>
                           <w:r>
                             <w:rPr>
@@ -327,11 +307,6 @@
                           <w:color w:val="000000" w:themeColor="text1"/>
                           <w:sz w:val="36"/>
                           <w:szCs w:val="24"/>
-                          <w14:textFill>
-                            <w14:solidFill>
-                              <w14:schemeClr w14:val="tx1"/>
-                            </w14:solidFill>
-                          </w14:textFill>
                         </w:rPr>
                         <w:alias w:val="Quote or Abstract"/>
                         <w:tag w:val="Quote or Abstract"/>
@@ -342,24 +317,10 @@
                         <w:dataBinding w:prefixMappings="xmlns:ns0='http://schemas.microsoft.com/office/2006/coverPageProps'" w:xpath="/ns0:CoverPageProperties[1]/ns0:Abstract[1]" w:storeItemID="{55AF091B-3C7A-41E3-B477-F2FDAA23CFDA}"/>
                         <w:text/>
                       </w:sdtPr>
-                      <w:sdtEndPr>
-                        <w:rPr>
-                          <w:b/>
-                          <w:bCs/>
-                          <w:color w:val="000000" w:themeColor="text1"/>
-                          <w:sz w:val="36"/>
-                          <w:szCs w:val="24"/>
-                          <w14:textFill>
-                            <w14:solidFill>
-                              <w14:schemeClr w14:val="tx1"/>
-                            </w14:solidFill>
-                          </w14:textFill>
-                        </w:rPr>
-                      </w:sdtEndPr>
                       <w:sdtContent>
                         <w:p>
                           <w:pPr>
-                            <w:pStyle w:val="38"/>
+                            <w:pStyle w:val="Abstract"/>
                             <w:spacing w:after="600"/>
                             <w:jc w:val="center"/>
                             <w:rPr>
@@ -368,11 +329,6 @@
                               <w:color w:val="000000" w:themeColor="text1"/>
                               <w:sz w:val="36"/>
                               <w:szCs w:val="24"/>
-                              <w14:textFill>
-                                <w14:solidFill>
-                                  <w14:schemeClr w14:val="tx1"/>
-                                </w14:solidFill>
-                              </w14:textFill>
                             </w:rPr>
                           </w:pPr>
                           <w:r>
@@ -382,11 +338,6 @@
                               <w:color w:val="000000" w:themeColor="text1"/>
                               <w:sz w:val="36"/>
                               <w:szCs w:val="24"/>
-                              <w14:textFill>
-                                <w14:solidFill>
-                                  <w14:schemeClr w14:val="tx1"/>
-                                </w14:solidFill>
-                              </w14:textFill>
                             </w:rPr>
                             <w:t>[Total Mark is 20]</w:t>
                           </w:r>
@@ -396,6 +347,7 @@
                     <w:p/>
                   </w:txbxContent>
                 </v:textbox>
+                <w10:wrap anchorx="page" anchory="margin"/>
               </v:shape>
             </w:pict>
           </mc:Fallback>
@@ -554,11 +506,7 @@
           </mc:Choice>
           <mc:Fallback>
             <w:pict>
-              <v:shapetype w14:anchorId="0C531A2A" id="_x0000_t202" coordsize="21600,21600" o:spt="202" path="m,l,21600r21600,l21600,xe">
-                <v:stroke joinstyle="miter"/>
-                <v:path gradientshapeok="t" o:connecttype="rect"/>
-              </v:shapetype>
-              <v:shape id="Text Box 2" o:spid="_x0000_s1027" type="#_x0000_t202" style="position:absolute;margin-left:40.3pt;margin-top:0;width:545.45pt;height:87.55pt;z-index:251666432;visibility:visible;mso-wrap-style:square;mso-wrap-distance-left:9pt;mso-wrap-distance-top:7.2pt;mso-wrap-distance-right:9pt;mso-wrap-distance-bottom:7.2pt;mso-position-horizontal:absolute;mso-position-horizontal-relative:page;mso-position-vertical:absolute;mso-position-vertical-relative:text;v-text-anchor:top" o:gfxdata="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" filled="f" stroked="f">
+              <v:shape w14:anchorId="0C531A2A" id="Text Box 2" o:spid="_x0000_s1027" type="#_x0000_t202" style="position:absolute;margin-left:40.3pt;margin-top:0;width:545.45pt;height:87.55pt;z-index:251666432;visibility:visible;mso-wrap-style:square;mso-wrap-distance-left:9pt;mso-wrap-distance-top:7.2pt;mso-wrap-distance-right:9pt;mso-wrap-distance-bottom:7.2pt;mso-position-horizontal:absolute;mso-position-horizontal-relative:page;mso-position-vertical:absolute;mso-position-vertical-relative:text;v-text-anchor:top" o:gfxdata="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" filled="f" stroked="f">
                 <v:textbox>
                   <w:txbxContent>
                     <w:p>
@@ -2088,46 +2036,31 @@
                   </wp:anchor>
                 </w:drawing>
               </mc:Choice>
-              <mc:Fallback xmlns:wpsCustomData="http://www.wps.cn/officeDocument/2013/wpsCustomData">
+              <mc:Fallback>
                 <w:pict>
-                  <v:group id="_x0000_s1026" o:spid="_x0000_s1026" o:spt="203" style="position:absolute;left:0pt;margin-left:-105.75pt;margin-top:341.4pt;height:318.6pt;width:518.25pt;mso-position-horizontal-relative:margin;mso-position-vertical-relative:margin;mso-wrap-distance-bottom:3.6pt;mso-wrap-distance-left:14.4pt;mso-wrap-distance-right:14.4pt;mso-wrap-distance-top:3.6pt;z-index:251665408;mso-width-relative:page;mso-height-relative:page;" coordorigin="0,22849" coordsize="3578496,2257602" o:gfxdata="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">
-                    <o:lock v:ext="edit" aspectratio="f"/>
-                    <v:rect id="_x0000_s1026" o:spid="_x0000_s1026" o:spt="1" style="position:absolute;left:0;top:22849;height:244772;width:3567448;v-text-anchor:middle;" fillcolor="#EF4623 [3204]" filled="t" stroked="f" coordsize="21600,21600" o:gfxdata="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">
-                      <v:fill on="t" focussize="0,0"/>
-                      <v:stroke on="f" weight="2pt"/>
-                      <v:imagedata o:title=""/>
-                      <o:lock v:ext="edit" aspectratio="f"/>
+                  <v:group w14:anchorId="1FE035DF" id="Group 198" o:spid="_x0000_s1029" style="position:absolute;margin-left:-105.75pt;margin-top:341.4pt;width:518.25pt;height:318.6pt;z-index:251665408;mso-wrap-distance-left:14.4pt;mso-wrap-distance-top:3.6pt;mso-wrap-distance-right:14.4pt;mso-wrap-distance-bottom:3.6pt;mso-position-horizontal-relative:margin;mso-position-vertical-relative:margin" coordorigin=",228" coordsize="35784,22576" o:gfxdata="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">
+                    <v:rect id="Rectangle 199" o:spid="_x0000_s1030" style="position:absolute;top:228;width:35674;height:2448;visibility:visible;mso-wrap-style:square;v-text-anchor:middle" o:gfxdata="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" fillcolor="#ef4623 [3204]" stroked="f" strokeweight="2pt">
                       <v:textbox>
                         <w:txbxContent>
                           <w:p>
                             <w:pPr>
                               <w:rPr>
-                                <w:rFonts w:asciiTheme="majorHAnsi" w:hAnsiTheme="majorHAnsi" w:eastAsiaTheme="majorEastAsia" w:cstheme="majorBidi"/>
+                                <w:rFonts w:asciiTheme="majorHAnsi" w:eastAsiaTheme="majorEastAsia" w:hAnsiTheme="majorHAnsi" w:cstheme="majorBidi"/>
                                 <w:b/>
                                 <w:bCs/>
                                 <w:color w:val="FFFFFF" w:themeColor="background1"/>
                                 <w:sz w:val="28"/>
                                 <w:szCs w:val="28"/>
-                                <w14:textFill>
-                                  <w14:solidFill>
-                                    <w14:schemeClr w14:val="bg1"/>
-                                  </w14:solidFill>
-                                </w14:textFill>
                               </w:rPr>
                             </w:pPr>
                             <w:r>
                               <w:rPr>
-                                <w:rFonts w:asciiTheme="majorHAnsi" w:hAnsiTheme="majorHAnsi" w:eastAsiaTheme="majorEastAsia" w:cstheme="majorBidi"/>
+                                <w:rFonts w:asciiTheme="majorHAnsi" w:eastAsiaTheme="majorEastAsia" w:hAnsiTheme="majorHAnsi" w:cstheme="majorBidi"/>
                                 <w:b/>
                                 <w:bCs/>
                                 <w:color w:val="FFFFFF" w:themeColor="background1"/>
                                 <w:sz w:val="28"/>
                                 <w:szCs w:val="28"/>
-                                <w14:textFill>
-                                  <w14:solidFill>
-                                    <w14:schemeClr w14:val="bg1"/>
-                                  </w14:solidFill>
-                                </w14:textFill>
                               </w:rPr>
                               <w:t>Instructions:</w:t>
                             </w:r>
@@ -2135,16 +2068,12 @@
                         </w:txbxContent>
                       </v:textbox>
                     </v:rect>
-                    <v:shape id="_x0000_s1026" o:spid="_x0000_s1026" o:spt="202" type="#_x0000_t202" style="position:absolute;left:0;top:289632;height:1990819;width:3578496;" filled="f" stroked="f" coordsize="21600,21600" o:gfxdata="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">
-                      <v:fill on="f" focussize="0,0"/>
-                      <v:stroke on="f" weight="0.5pt"/>
-                      <v:imagedata o:title=""/>
-                      <o:lock v:ext="edit" aspectratio="f"/>
-                      <v:textbox inset="2.54mm,2.54mm,2.54mm,0mm">
+                    <v:shape id="Text Box 200" o:spid="_x0000_s1031" type="#_x0000_t202" style="position:absolute;top:2896;width:35784;height:19908;visibility:visible;mso-wrap-style:square;v-text-anchor:top" o:gfxdata="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" filled="f" stroked="f" strokeweight=".5pt">
+                      <v:textbox inset=",7.2pt,,0">
                         <w:txbxContent>
                           <w:p>
                             <w:pPr>
-                              <w:pStyle w:val="53"/>
+                              <w:pStyle w:val="ListParagraph"/>
                               <w:numPr>
                                 <w:ilvl w:val="0"/>
                                 <w:numId w:val="3"/>
@@ -2154,13 +2083,29 @@
                               <w:rPr>
                                 <w:rFonts w:asciiTheme="majorBidi" w:hAnsiTheme="majorBidi" w:cstheme="majorBidi"/>
                                 <w:caps/>
-                                <w:color w:val="auto"/>
+                                <w:color w:val="000000"/>
+                                <w14:textFill>
+                                  <w14:solidFill>
+                                    <w14:srgbClr w14:val="000000">
+                                      <w14:lumMod w14:val="75000"/>
+                                      <w14:lumOff w14:val="25000"/>
+                                    </w14:srgbClr>
+                                  </w14:solidFill>
+                                </w14:textFill>
                               </w:rPr>
                             </w:pPr>
                             <w:r>
                               <w:rPr>
                                 <w:rFonts w:asciiTheme="majorBidi" w:hAnsiTheme="majorBidi" w:cstheme="majorBidi"/>
-                                <w:color w:val="auto"/>
+                                <w:color w:val="000000"/>
+                                <w14:textFill>
+                                  <w14:solidFill>
+                                    <w14:srgbClr w14:val="000000">
+                                      <w14:lumMod w14:val="75000"/>
+                                      <w14:lumOff w14:val="25000"/>
+                                    </w14:srgbClr>
+                                  </w14:solidFill>
+                                </w14:textFill>
                               </w:rPr>
                               <w:t xml:space="preserve">You must submit two separate copies </w:t>
                             </w:r>
@@ -2169,14 +2114,30 @@
                                 <w:rFonts w:asciiTheme="majorBidi" w:hAnsiTheme="majorBidi" w:cstheme="majorBidi"/>
                                 <w:b/>
                                 <w:bCs/>
-                                <w:color w:val="auto"/>
+                                <w:color w:val="000000"/>
+                                <w14:textFill>
+                                  <w14:solidFill>
+                                    <w14:srgbClr w14:val="000000">
+                                      <w14:lumMod w14:val="75000"/>
+                                      <w14:lumOff w14:val="25000"/>
+                                    </w14:srgbClr>
+                                  </w14:solidFill>
+                                </w14:textFill>
                               </w:rPr>
                               <w:t>(one Word file and one PDF file)</w:t>
                             </w:r>
                             <w:r>
                               <w:rPr>
                                 <w:rFonts w:asciiTheme="majorBidi" w:hAnsiTheme="majorBidi" w:cstheme="majorBidi"/>
-                                <w:color w:val="auto"/>
+                                <w:color w:val="000000"/>
+                                <w14:textFill>
+                                  <w14:solidFill>
+                                    <w14:srgbClr w14:val="000000">
+                                      <w14:lumMod w14:val="75000"/>
+                                      <w14:lumOff w14:val="25000"/>
+                                    </w14:srgbClr>
+                                  </w14:solidFill>
+                                </w14:textFill>
                               </w:rPr>
                               <w:t xml:space="preserve"> using the Assignment Template on Blackboard via the allocated folder. These files </w:t>
                             </w:r>
@@ -2185,21 +2146,37 @@
                                 <w:rFonts w:asciiTheme="majorBidi" w:hAnsiTheme="majorBidi" w:cstheme="majorBidi"/>
                                 <w:b/>
                                 <w:bCs/>
-                                <w:color w:val="auto"/>
+                                <w:color w:val="000000"/>
+                                <w14:textFill>
+                                  <w14:solidFill>
+                                    <w14:srgbClr w14:val="000000">
+                                      <w14:lumMod w14:val="75000"/>
+                                      <w14:lumOff w14:val="25000"/>
+                                    </w14:srgbClr>
+                                  </w14:solidFill>
+                                </w14:textFill>
                               </w:rPr>
                               <w:t>must not be in compressed format</w:t>
                             </w:r>
                             <w:r>
                               <w:rPr>
                                 <w:rFonts w:asciiTheme="majorBidi" w:hAnsiTheme="majorBidi" w:cstheme="majorBidi"/>
-                                <w:color w:val="auto"/>
+                                <w:color w:val="000000"/>
+                                <w14:textFill>
+                                  <w14:solidFill>
+                                    <w14:srgbClr w14:val="000000">
+                                      <w14:lumMod w14:val="75000"/>
+                                      <w14:lumOff w14:val="25000"/>
+                                    </w14:srgbClr>
+                                  </w14:solidFill>
+                                </w14:textFill>
                               </w:rPr>
                               <w:t>.</w:t>
                             </w:r>
                           </w:p>
                           <w:p>
                             <w:pPr>
-                              <w:pStyle w:val="53"/>
+                              <w:pStyle w:val="ListParagraph"/>
                               <w:numPr>
                                 <w:ilvl w:val="0"/>
                                 <w:numId w:val="3"/>
@@ -2208,19 +2185,35 @@
                               <w:ind w:left="426"/>
                               <w:jc w:val="both"/>
                               <w:rPr>
-                                <w:color w:val="auto"/>
+                                <w:color w:val="000000"/>
+                                <w14:textFill>
+                                  <w14:solidFill>
+                                    <w14:srgbClr w14:val="000000">
+                                      <w14:lumMod w14:val="75000"/>
+                                      <w14:lumOff w14:val="25000"/>
+                                    </w14:srgbClr>
+                                  </w14:solidFill>
+                                </w14:textFill>
                               </w:rPr>
                             </w:pPr>
                             <w:r>
                               <w:rPr>
-                                <w:color w:val="auto"/>
+                                <w:color w:val="000000"/>
+                                <w14:textFill>
+                                  <w14:solidFill>
+                                    <w14:srgbClr w14:val="000000">
+                                      <w14:lumMod w14:val="75000"/>
+                                      <w14:lumOff w14:val="25000"/>
+                                    </w14:srgbClr>
+                                  </w14:solidFill>
+                                </w14:textFill>
                               </w:rPr>
                               <w:t>It is your responsibility to check and make sure that you have uploaded both the correct files.</w:t>
                             </w:r>
                           </w:p>
                           <w:p>
                             <w:pPr>
-                              <w:pStyle w:val="53"/>
+                              <w:pStyle w:val="ListParagraph"/>
                               <w:numPr>
                                 <w:ilvl w:val="0"/>
                                 <w:numId w:val="3"/>
@@ -2230,31 +2223,63 @@
                               <w:jc w:val="both"/>
                               <w:rPr>
                                 <w:caps/>
-                                <w:color w:val="auto"/>
+                                <w:color w:val="000000"/>
+                                <w14:textFill>
+                                  <w14:solidFill>
+                                    <w14:srgbClr w14:val="000000">
+                                      <w14:lumMod w14:val="75000"/>
+                                      <w14:lumOff w14:val="25000"/>
+                                    </w14:srgbClr>
+                                  </w14:solidFill>
+                                </w14:textFill>
                               </w:rPr>
                             </w:pPr>
                             <w:r>
                               <w:rPr>
-                                <w:color w:val="auto"/>
+                                <w:color w:val="000000"/>
+                                <w14:textFill>
+                                  <w14:solidFill>
+                                    <w14:srgbClr w14:val="000000">
+                                      <w14:lumMod w14:val="75000"/>
+                                      <w14:lumOff w14:val="25000"/>
+                                    </w14:srgbClr>
+                                  </w14:solidFill>
+                                </w14:textFill>
                               </w:rPr>
                               <w:t xml:space="preserve">Zero mark will be given if you try to bypass the SafeAssign (e.g. misspell words, remove spaces between words, hide characters, use different character sets, </w:t>
                             </w:r>
                             <w:r>
                               <w:rPr>
                                 <w:color w:val="FF0000"/>
+                                <w14:textFill>
+                                  <w14:solidFill>
+                                    <w14:srgbClr w14:val="FF0000">
+                                      <w14:lumMod w14:val="75000"/>
+                                      <w14:lumOff w14:val="25000"/>
+                                    </w14:srgbClr>
+                                  </w14:solidFill>
+                                </w14:textFill>
                               </w:rPr>
                               <w:t xml:space="preserve">convert text into image </w:t>
                             </w:r>
                             <w:r>
                               <w:rPr>
-                                <w:color w:val="auto"/>
+                                <w:color w:val="000000"/>
+                                <w14:textFill>
+                                  <w14:solidFill>
+                                    <w14:srgbClr w14:val="000000">
+                                      <w14:lumMod w14:val="75000"/>
+                                      <w14:lumOff w14:val="25000"/>
+                                    </w14:srgbClr>
+                                  </w14:solidFill>
+                                </w14:textFill>
                               </w:rPr>
                               <w:t>or languages other than English or any kind of manipulation).</w:t>
                             </w:r>
                           </w:p>
                           <w:p>
                             <w:pPr>
-                              <w:pStyle w:val="53"/>
+                              <w:pStyle w:val="ListParagraph"/>
                               <w:numPr>
                                 <w:ilvl w:val="0"/>
                                 <w:numId w:val="3"/>
@@ -2264,19 +2289,35 @@
                               <w:jc w:val="both"/>
                               <w:rPr>
                                 <w:caps/>
-                                <w:color w:val="auto"/>
+                                <w:color w:val="000000"/>
+                                <w14:textFill>
+                                  <w14:solidFill>
+                                    <w14:srgbClr w14:val="000000">
+                                      <w14:lumMod w14:val="75000"/>
+                                      <w14:lumOff w14:val="25000"/>
+                                    </w14:srgbClr>
+                                  </w14:solidFill>
+                                </w14:textFill>
                               </w:rPr>
                             </w:pPr>
                             <w:r>
                               <w:rPr>
-                                <w:color w:val="auto"/>
+                                <w:color w:val="000000"/>
+                                <w14:textFill>
+                                  <w14:solidFill>
+                                    <w14:srgbClr w14:val="000000">
+                                      <w14:lumMod w14:val="75000"/>
+                                      <w14:lumOff w14:val="25000"/>
+                                    </w14:srgbClr>
+                                  </w14:solidFill>
+                                </w14:textFill>
                               </w:rPr>
                               <w:t>Email submission will not be accepted.</w:t>
                             </w:r>
                           </w:p>
                           <w:p>
                             <w:pPr>
-                              <w:pStyle w:val="53"/>
+                              <w:pStyle w:val="ListParagraph"/>
                               <w:numPr>
                                 <w:ilvl w:val="0"/>
                                 <w:numId w:val="3"/>
@@ -2286,19 +2327,35 @@
                               <w:jc w:val="both"/>
                               <w:rPr>
                                 <w:caps/>
-                                <w:color w:val="auto"/>
+                                <w:color w:val="000000"/>
+                                <w14:textFill>
+                                  <w14:solidFill>
+                                    <w14:srgbClr w14:val="000000">
+                                      <w14:lumMod w14:val="75000"/>
+                                      <w14:lumOff w14:val="25000"/>
+                                    </w14:srgbClr>
+                                  </w14:solidFill>
+                                </w14:textFill>
                               </w:rPr>
                             </w:pPr>
                             <w:r>
                               <w:rPr>
-                                <w:color w:val="auto"/>
+                                <w:color w:val="000000"/>
+                                <w14:textFill>
+                                  <w14:solidFill>
+                                    <w14:srgbClr w14:val="000000">
+                                      <w14:lumMod w14:val="75000"/>
+                                      <w14:lumOff w14:val="25000"/>
+                                    </w14:srgbClr>
+                                  </w14:solidFill>
+                                </w14:textFill>
                               </w:rPr>
                               <w:t>You are advised to make your work clear and well-presented. This includes filling your information on the cover page.</w:t>
                             </w:r>
                           </w:p>
                           <w:p>
                             <w:pPr>
-                              <w:pStyle w:val="53"/>
+                              <w:pStyle w:val="ListParagraph"/>
                               <w:numPr>
                                 <w:ilvl w:val="0"/>
                                 <w:numId w:val="3"/>
@@ -2308,19 +2365,35 @@
                               <w:jc w:val="both"/>
                               <w:rPr>
                                 <w:caps/>
-                                <w:color w:val="auto"/>
+                                <w:color w:val="000000"/>
+                                <w14:textFill>
+                                  <w14:solidFill>
+                                    <w14:srgbClr w14:val="000000">
+                                      <w14:lumMod w14:val="75000"/>
+                                      <w14:lumOff w14:val="25000"/>
+                                    </w14:srgbClr>
+                                  </w14:solidFill>
+                                </w14:textFill>
                               </w:rPr>
                             </w:pPr>
                             <w:r>
                               <w:rPr>
-                                <w:color w:val="auto"/>
+                                <w:color w:val="000000"/>
+                                <w14:textFill>
+                                  <w14:solidFill>
+                                    <w14:srgbClr w14:val="000000">
+                                      <w14:lumMod w14:val="75000"/>
+                                      <w14:lumOff w14:val="25000"/>
+                                    </w14:srgbClr>
+                                  </w14:solidFill>
+                                </w14:textFill>
                               </w:rPr>
                               <w:t>You must use this template, failing which will result in zero mark.</w:t>
                             </w:r>
                           </w:p>
                           <w:p>
                             <w:pPr>
-                              <w:pStyle w:val="53"/>
+                              <w:pStyle w:val="ListParagraph"/>
                               <w:numPr>
                                 <w:ilvl w:val="0"/>
                                 <w:numId w:val="3"/>
@@ -2330,32 +2403,64 @@
                               <w:jc w:val="both"/>
                               <w:rPr>
                                 <w:caps/>
-                                <w:color w:val="auto"/>
+                                <w:color w:val="000000"/>
+                                <w14:textFill>
+                                  <w14:solidFill>
+                                    <w14:srgbClr w14:val="000000">
+                                      <w14:lumMod w14:val="75000"/>
+                                      <w14:lumOff w14:val="25000"/>
+                                    </w14:srgbClr>
+                                  </w14:solidFill>
+                                </w14:textFill>
                               </w:rPr>
                             </w:pPr>
                             <w:r>
                               <w:rPr>
-                                <w:color w:val="auto"/>
+                                <w:color w:val="000000"/>
+                                <w14:textFill>
+                                  <w14:solidFill>
+                                    <w14:srgbClr w14:val="000000">
+                                      <w14:lumMod w14:val="75000"/>
+                                      <w14:lumOff w14:val="25000"/>
+                                    </w14:srgbClr>
+                                  </w14:solidFill>
+                                </w14:textFill>
                               </w:rPr>
                               <w:t xml:space="preserve">You MUST show all your work, and text </w:t>
                             </w:r>
                             <w:r>
                               <w:rPr>
-                                <w:color w:val="auto"/>
+                                <w:color w:val="000000"/>
                                 <w:u w:val="single"/>
+                                <w14:textFill>
+                                  <w14:solidFill>
+                                    <w14:srgbClr w14:val="000000">
+                                      <w14:lumMod w14:val="75000"/>
+                                      <w14:lumOff w14:val="25000"/>
+                                    </w14:srgbClr>
+                                  </w14:solidFill>
+                                </w14:textFill>
                               </w:rPr>
                               <w:t>must not</w:t>
                             </w:r>
                             <w:r>
                               <w:rPr>
-                                <w:color w:val="auto"/>
+                                <w:color w:val="000000"/>
+                                <w14:textFill>
+                                  <w14:solidFill>
+                                    <w14:srgbClr w14:val="000000">
+                                      <w14:lumMod w14:val="75000"/>
+                                      <w14:lumOff w14:val="25000"/>
+                                    </w14:srgbClr>
+                                  </w14:solidFill>
+                                </w14:textFill>
                               </w:rPr>
                               <w:t xml:space="preserve"> be converted into an image, unless specified otherwise by the question.</w:t>
                             </w:r>
                           </w:p>
                           <w:p>
                             <w:pPr>
-                              <w:pStyle w:val="53"/>
+                              <w:pStyle w:val="ListParagraph"/>
                               <w:numPr>
                                 <w:ilvl w:val="0"/>
                                 <w:numId w:val="3"/>
@@ -2365,19 +2470,35 @@
                               <w:jc w:val="both"/>
                               <w:rPr>
                                 <w:caps/>
-                                <w:color w:val="auto"/>
+                                <w:color w:val="000000"/>
+                                <w14:textFill>
+                                  <w14:solidFill>
+                                    <w14:srgbClr w14:val="000000">
+                                      <w14:lumMod w14:val="75000"/>
+                                      <w14:lumOff w14:val="25000"/>
+                                    </w14:srgbClr>
+                                  </w14:solidFill>
+                                </w14:textFill>
                               </w:rPr>
                             </w:pPr>
                             <w:r>
                               <w:rPr>
-                                <w:color w:val="auto"/>
+                                <w:color w:val="000000"/>
+                                <w14:textFill>
+                                  <w14:solidFill>
+                                    <w14:srgbClr w14:val="000000">
+                                      <w14:lumMod w14:val="75000"/>
+                                      <w14:lumOff w14:val="25000"/>
+                                    </w14:srgbClr>
+                                  </w14:solidFill>
+                                </w14:textFill>
                               </w:rPr>
                               <w:t>Late submission will result in ZERO mark.</w:t>
                             </w:r>
                           </w:p>
                           <w:p>
                             <w:pPr>
-                              <w:pStyle w:val="53"/>
+                              <w:pStyle w:val="ListParagraph"/>
                               <w:numPr>
                                 <w:ilvl w:val="0"/>
                                 <w:numId w:val="3"/>
@@ -2387,19 +2508,35 @@
                               <w:jc w:val="both"/>
                               <w:rPr>
                                 <w:caps/>
-                                <w:color w:val="auto"/>
+                                <w:color w:val="000000"/>
+                                <w14:textFill>
+                                  <w14:solidFill>
+                                    <w14:srgbClr w14:val="000000">
+                                      <w14:lumMod w14:val="75000"/>
+                                      <w14:lumOff w14:val="25000"/>
+                                    </w14:srgbClr>
+                                  </w14:solidFill>
+                                </w14:textFill>
                               </w:rPr>
                             </w:pPr>
                             <w:r>
                               <w:rPr>
-                                <w:color w:val="auto"/>
+                                <w:color w:val="000000"/>
+                                <w14:textFill>
+                                  <w14:solidFill>
+                                    <w14:srgbClr w14:val="000000">
+                                      <w14:lumMod w14:val="75000"/>
+                                      <w14:lumOff w14:val="25000"/>
+                                    </w14:srgbClr>
+                                  </w14:solidFill>
+                                </w14:textFill>
                               </w:rPr>
                               <w:t>The work should be your own, copying from students or other resources will result in ZERO mark.</w:t>
                             </w:r>
                           </w:p>
                           <w:p>
                             <w:pPr>
-                              <w:pStyle w:val="53"/>
+                              <w:pStyle w:val="ListParagraph"/>
                               <w:numPr>
                                 <w:ilvl w:val="0"/>
                                 <w:numId w:val="3"/>
@@ -2408,12 +2545,28 @@
                               <w:jc w:val="both"/>
                               <w:rPr>
                                 <w:caps/>
-                                <w:color w:val="auto"/>
+                                <w:color w:val="000000"/>
+                                <w14:textFill>
+                                  <w14:solidFill>
+                                    <w14:srgbClr w14:val="000000">
+                                      <w14:lumMod w14:val="75000"/>
+                                      <w14:lumOff w14:val="25000"/>
+                                    </w14:srgbClr>
+                                  </w14:solidFill>
+                                </w14:textFill>
                               </w:rPr>
                             </w:pPr>
                             <w:r>
                               <w:rPr>
-                                <w:color w:val="auto"/>
+                                <w:color w:val="000000"/>
+                                <w14:textFill>
+                                  <w14:solidFill>
+                                    <w14:srgbClr w14:val="000000">
+                                      <w14:lumMod w14:val="75000"/>
+                                      <w14:lumOff w14:val="25000"/>
+                                    </w14:srgbClr>
+                                  </w14:solidFill>
+                                </w14:textFill>
                               </w:rPr>
                               <w:t xml:space="preserve">Use </w:t>
                             </w:r>
@@ -2421,13 +2574,29 @@
                               <w:rPr>
                                 <w:b/>
                                 <w:bCs/>
-                                <w:color w:val="auto"/>
+                                <w:color w:val="000000"/>
+                                <w14:textFill>
+                                  <w14:solidFill>
+                                    <w14:srgbClr w14:val="000000">
+                                      <w14:lumMod w14:val="75000"/>
+                                      <w14:lumOff w14:val="25000"/>
+                                    </w14:srgbClr>
+                                  </w14:solidFill>
+                                </w14:textFill>
                               </w:rPr>
                               <w:t xml:space="preserve">Times New Roman </w:t>
                             </w:r>
                             <w:r>
                               <w:rPr>
-                                <w:color w:val="auto"/>
+                                <w:color w:val="000000"/>
+                                <w14:textFill>
+                                  <w14:solidFill>
+                                    <w14:srgbClr w14:val="000000">
+                                      <w14:lumMod w14:val="75000"/>
+                                      <w14:lumOff w14:val="25000"/>
+                                    </w14:srgbClr>
+                                  </w14:solidFill>
+                                </w14:textFill>
                               </w:rPr>
                               <w:t xml:space="preserve">font for all your answers. </w:t>
                             </w:r>
@@ -2435,7 +2604,7 @@
                         </w:txbxContent>
                       </v:textbox>
                     </v:shape>
-                    <w10:wrap type="square"/>
+                    <w10:wrap type="square" anchorx="margin" anchory="margin"/>
                   </v:group>
                 </w:pict>
               </mc:Fallback>
@@ -3427,25 +3596,7 @@
           <w:sz w:val="24"/>
           <w:szCs w:val="24"/>
         </w:rPr>
-        <w:t xml:space="preserve"> to the live report document, GitHub/GitLab repository, and Google </w:t>
-      </w:r>
-      <w:proofErr w:type="spellStart"/>
-      <w:r>
-        <w:rPr>
-          <w:rFonts w:ascii="Times New Roman" w:hAnsi="Times New Roman" w:cs="Times New Roman"/>
-          <w:sz w:val="24"/>
-          <w:szCs w:val="24"/>
-        </w:rPr>
-        <w:t>Colab</w:t>
-      </w:r>
-      <w:proofErr w:type="spellEnd"/>
-      <w:r>
-        <w:rPr>
-          <w:rFonts w:ascii="Times New Roman" w:hAnsi="Times New Roman" w:cs="Times New Roman"/>
-          <w:sz w:val="24"/>
-          <w:szCs w:val="24"/>
-        </w:rPr>
-        <w:t xml:space="preserve"> notebook (if applicable) in the </w:t>
+        <w:t xml:space="preserve"> to the live report document, GitHub/GitLab repository, and Google Colab notebook (if applicable) in the </w:t>
       </w:r>
       <w:r>
         <w:rPr>
@@ -4044,27 +4195,23 @@
               </wp:anchor>
             </w:drawing>
           </mc:Choice>
-          <mc:Fallback xmlns:wpsCustomData="http://www.wps.cn/officeDocument/2013/wpsCustomData">
+          <mc:Fallback>
             <w:pict>
-              <v:shape id="_x0000_s1026" o:spid="_x0000_s1026" o:spt="202" alt="Sidebar" type="#_x0000_t202" style="position:absolute;left:0pt;margin-left:32.5pt;margin-top:6.6pt;height:181.45pt;width:95.9pt;mso-position-horizontal-relative:page;mso-position-vertical-relative:margin;mso-wrap-distance-bottom:216pt;mso-wrap-distance-left:14.4pt;mso-wrap-distance-right:14.4pt;mso-wrap-distance-top:0pt;z-index:251667456;mso-width-relative:margin;mso-height-relative:margin;mso-width-percent:250;mso-height-percent:950;" filled="f" stroked="f" coordsize="21600,21600" o:gfxdata="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">
-                <v:fill on="f" focussize="0,0"/>
-                <v:stroke on="f"/>
-                <v:imagedata o:title=""/>
-                <o:lock v:ext="edit" aspectratio="f"/>
-                <v:textbox inset="1.27mm,0mm,1.27mm,0mm">
+              <v:shape w14:anchorId="71199B0E" id="Text Box 1" o:spid="_x0000_s1032" type="#_x0000_t202" alt="Sidebar" style="position:absolute;left:0;text-align:left;margin-left:32.5pt;margin-top:6.6pt;width:95.9pt;height:181.45pt;z-index:251667456;visibility:visible;mso-wrap-style:square;mso-width-percent:250;mso-height-percent:950;mso-wrap-distance-left:14.4pt;mso-wrap-distance-top:0;mso-wrap-distance-right:14.4pt;mso-wrap-distance-bottom:3in;mso-position-horizontal:absolute;mso-position-horizontal-relative:page;mso-position-vertical:absolute;mso-position-vertical-relative:margin;mso-width-percent:250;mso-height-percent:950;mso-width-relative:margin;mso-height-relative:margin;v-text-anchor:top" o:gfxdata="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" filled="f" stroked="f">
+                <v:textbox inset="3.6pt,0,3.6pt,0">
                   <w:txbxContent>
                     <w:p>
                       <w:pPr>
-                        <w:pStyle w:val="43"/>
+                        <w:pStyle w:val="Quote"/>
                         <w:rPr>
-                          <w:rStyle w:val="44"/>
+                          <w:rStyle w:val="QuoteChar"/>
                           <w:i/>
                           <w:iCs/>
                         </w:rPr>
                       </w:pPr>
                       <w:r>
                         <w:rPr>
-                          <w:rStyle w:val="44"/>
+                          <w:rStyle w:val="QuoteChar"/>
                           <w:i/>
                           <w:iCs/>
                         </w:rPr>
@@ -4077,12 +4224,20 @@
                           <w:i/>
                           <w:iCs/>
                           <w:color w:val="FF0000"/>
+                          <w14:textFill>
+                            <w14:solidFill>
+                              <w14:srgbClr w14:val="FF0000">
+                                <w14:lumMod w14:val="75000"/>
+                                <w14:lumOff w14:val="25000"/>
+                              </w14:srgbClr>
+                            </w14:solidFill>
+                          </w14:textFill>
                         </w:rPr>
                       </w:pPr>
                     </w:p>
                     <w:p>
                       <w:pPr>
-                        <w:pStyle w:val="21"/>
+                        <w:pStyle w:val="NormalWeb"/>
                         <w:shd w:val="clear" w:color="auto" w:fill="FFFFFF"/>
                         <w:spacing w:before="0" w:beforeAutospacing="0" w:after="0" w:afterAutospacing="0" w:line="360" w:lineRule="auto"/>
                         <w:jc w:val="both"/>
@@ -4092,25 +4247,41 @@
                           <w:color w:val="FF0000"/>
                           <w:sz w:val="27"/>
                           <w:szCs w:val="27"/>
+                          <w14:textFill>
+                            <w14:solidFill>
+                              <w14:srgbClr w14:val="FF0000">
+                                <w14:lumMod w14:val="75000"/>
+                                <w14:lumOff w14:val="25000"/>
+                              </w14:srgbClr>
+                            </w14:solidFill>
+                          </w14:textFill>
                         </w:rPr>
                       </w:pPr>
-                      <w:bookmarkStart w:id="5" w:name="_Hlk83660964"/>
+                      <w:bookmarkStart w:id="4" w:name="_Hlk83660964"/>
                       <w:r>
                         <w:rPr>
-                          <w:rFonts w:asciiTheme="minorHAnsi" w:hAnsiTheme="minorHAnsi" w:eastAsiaTheme="minorHAnsi" w:cstheme="minorBidi"/>
+                          <w:rFonts w:asciiTheme="minorHAnsi" w:eastAsiaTheme="minorHAnsi" w:hAnsiTheme="minorHAnsi" w:cstheme="minorBidi"/>
                           <w:i/>
                           <w:iCs/>
                           <w:color w:val="FF0000"/>
                           <w:sz w:val="20"/>
                           <w:szCs w:val="20"/>
                           <w:lang w:eastAsia="ja-JP"/>
+                          <w14:textFill>
+                            <w14:solidFill>
+                              <w14:srgbClr w14:val="FF0000">
+                                <w14:lumMod w14:val="75000"/>
+                                <w14:lumOff w14:val="25000"/>
+                              </w14:srgbClr>
+                            </w14:solidFill>
+                          </w14:textFill>
                         </w:rPr>
                         <w:t>CLO1, CLO2, CLO3, CLO4, CLO5</w:t>
                       </w:r>
                     </w:p>
                     <w:p>
                       <w:pPr>
-                        <w:pStyle w:val="21"/>
+                        <w:pStyle w:val="NormalWeb"/>
                         <w:shd w:val="clear" w:color="auto" w:fill="FFFFFF"/>
                         <w:spacing w:before="0" w:beforeAutospacing="0" w:after="0" w:afterAutospacing="0"/>
                         <w:rPr>
@@ -4119,19 +4290,35 @@
                           <w:color w:val="FF0000"/>
                           <w:sz w:val="27"/>
                           <w:szCs w:val="27"/>
+                          <w14:textFill>
+                            <w14:solidFill>
+                              <w14:srgbClr w14:val="FF0000">
+                                <w14:lumMod w14:val="75000"/>
+                                <w14:lumOff w14:val="25000"/>
+                              </w14:srgbClr>
+                            </w14:solidFill>
+                          </w14:textFill>
                         </w:rPr>
                       </w:pPr>
                     </w:p>
                     <w:p>
                       <w:pPr>
                         <w:rPr>
-                          <w:color w:val="auto"/>
+                          <w:color w:val="000000"/>
                           <w:sz w:val="24"/>
                           <w:szCs w:val="24"/>
+                          <w14:textFill>
+                            <w14:solidFill>
+                              <w14:srgbClr w14:val="000000">
+                                <w14:lumMod w14:val="75000"/>
+                                <w14:lumOff w14:val="25000"/>
+                              </w14:srgbClr>
+                            </w14:solidFill>
+                          </w14:textFill>
                         </w:rPr>
                       </w:pPr>
                     </w:p>
-                    <w:bookmarkEnd w:id="5"/>
+                    <w:bookmarkEnd w:id="4"/>
                     <w:p/>
                     <w:p/>
                     <w:p/>
@@ -4156,7 +4343,7 @@
                     </w:p>
                   </w:txbxContent>
                 </v:textbox>
-                <w10:wrap type="square" side="largest"/>
+                <w10:wrap type="square" side="largest" anchorx="page" anchory="margin"/>
               </v:shape>
             </w:pict>
           </mc:Fallback>
@@ -4253,27 +4440,7 @@
           <w:szCs w:val="24"/>
           <w:lang w:val="es-ES"/>
         </w:rPr>
-        <w:t xml:space="preserve">A complete ER/EER </w:t>
-      </w:r>
-      <w:proofErr w:type="spellStart"/>
-      <w:r>
-        <w:rPr>
-          <w:rFonts w:ascii="Times New Roman" w:hAnsi="Times New Roman" w:cs="Times New Roman"/>
-          <w:sz w:val="24"/>
-          <w:szCs w:val="24"/>
-          <w:lang w:val="es-ES"/>
-        </w:rPr>
-        <w:t>diagram</w:t>
-      </w:r>
-      <w:proofErr w:type="spellEnd"/>
-      <w:r>
-        <w:rPr>
-          <w:rFonts w:ascii="Times New Roman" w:hAnsi="Times New Roman" w:cs="Times New Roman"/>
-          <w:sz w:val="24"/>
-          <w:szCs w:val="24"/>
-          <w:lang w:val="es-ES"/>
-        </w:rPr>
-        <w:t>.</w:t>
+        <w:t>A complete ER/EER diagram.</w:t>
       </w:r>
     </w:p>
     <w:p>
@@ -4371,7 +4538,7 @@
           <w:bCs/>
         </w:rPr>
       </w:pPr>
-      <w:bookmarkStart w:id="4" w:name="_Hlk235258935"/>
+      <w:bookmarkStart w:id="5" w:name="_Hlk235258935"/>
       <w:r>
         <w:rPr>
           <w:b/>
@@ -4384,38 +4551,1085 @@
       <w:pPr>
         <w:pStyle w:val="IT"/>
         <w:rPr>
+          <w:b/>
+          <w:bCs/>
           <w:lang w:bidi="ar-EG"/>
         </w:rPr>
       </w:pPr>
-      <w:bookmarkStart w:id="5" w:name="_Hlk235363843"/>
+      <w:bookmarkStart w:id="6" w:name="_Hlk235363843"/>
+      <w:r>
+        <w:rPr>
+          <w:b/>
+          <w:bCs/>
+          <w:lang w:bidi="ar-EG"/>
+        </w:rPr>
+        <w:t>Database Design</w:t>
+      </w:r>
+    </w:p>
+    <w:p>
+      <w:pPr>
+        <w:pStyle w:val="IT"/>
+        <w:rPr>
+          <w:lang w:bidi="ar-EG"/>
+        </w:rPr>
+      </w:pPr>
+      <w:r>
+        <w:rPr>
+          <w:lang w:bidi="ar-EG"/>
+        </w:rPr>
+        <w:t xml:space="preserve">The Smart Clinic Database System can be designed using six main entities: </w:t>
+      </w:r>
+      <w:r>
+        <w:rPr>
+          <w:b/>
+          <w:bCs/>
+          <w:lang w:bidi="ar-EG"/>
+        </w:rPr>
+        <w:t>Patient, Doctor, Appointment, Treatment, Medicine, and Payment</w:t>
+      </w:r>
+      <w:r>
+        <w:rPr>
+          <w:lang w:bidi="ar-EG"/>
+        </w:rPr>
+        <w:t>. The design uses primary keys to uniquely identify records and foreign keys to connect related entities. The relationships follow the normal ER/EER rules for cardinality and participation.</w:t>
+      </w:r>
+    </w:p>
+    <w:p>
+      <w:pPr>
+        <w:pStyle w:val="IT"/>
+        <w:rPr>
+          <w:b/>
+          <w:bCs/>
+          <w:lang w:bidi="ar-EG"/>
+        </w:rPr>
+      </w:pPr>
+      <w:r>
+        <w:rPr>
+          <w:b/>
+          <w:bCs/>
+          <w:lang w:bidi="ar-EG"/>
+        </w:rPr>
+        <w:t>1. Entities and Attributes</w:t>
+      </w:r>
+    </w:p>
+    <w:tbl>
+      <w:tblPr>
+        <w:tblStyle w:val="TableGridLight"/>
+        <w:tblW w:w="0" w:type="auto"/>
+        <w:tblLook w:val="04A0" w:firstRow="1" w:lastRow="0" w:firstColumn="1" w:lastColumn="0" w:noHBand="0" w:noVBand="1"/>
+      </w:tblPr>
+      <w:tblGrid>
+        <w:gridCol w:w="1577"/>
+        <w:gridCol w:w="2915"/>
+        <w:gridCol w:w="1856"/>
+        <w:gridCol w:w="2066"/>
+      </w:tblGrid>
+      <w:tr>
+        <w:tc>
+          <w:tcPr>
+            <w:tcW w:w="0" w:type="auto"/>
+            <w:hideMark/>
+          </w:tcPr>
+          <w:p>
+            <w:pPr>
+              <w:pStyle w:val="IT"/>
+              <w:rPr>
+                <w:b/>
+                <w:bCs/>
+                <w:lang w:bidi="ar-EG"/>
+              </w:rPr>
+            </w:pPr>
+            <w:r>
+              <w:rPr>
+                <w:b/>
+                <w:bCs/>
+                <w:lang w:bidi="ar-EG"/>
+              </w:rPr>
+              <w:t>Entity</w:t>
+            </w:r>
+          </w:p>
+        </w:tc>
+        <w:tc>
+          <w:tcPr>
+            <w:tcW w:w="0" w:type="auto"/>
+            <w:hideMark/>
+          </w:tcPr>
+          <w:p>
+            <w:pPr>
+              <w:pStyle w:val="IT"/>
+              <w:rPr>
+                <w:b/>
+                <w:bCs/>
+                <w:lang w:bidi="ar-EG"/>
+              </w:rPr>
+            </w:pPr>
+            <w:r>
+              <w:rPr>
+                <w:b/>
+                <w:bCs/>
+                <w:lang w:bidi="ar-EG"/>
+              </w:rPr>
+              <w:t>Main Attributes</w:t>
+            </w:r>
+          </w:p>
+        </w:tc>
+        <w:tc>
+          <w:tcPr>
+            <w:tcW w:w="0" w:type="auto"/>
+            <w:hideMark/>
+          </w:tcPr>
+          <w:p>
+            <w:pPr>
+              <w:pStyle w:val="IT"/>
+              <w:rPr>
+                <w:b/>
+                <w:bCs/>
+                <w:lang w:bidi="ar-EG"/>
+              </w:rPr>
+            </w:pPr>
+            <w:r>
+              <w:rPr>
+                <w:b/>
+                <w:bCs/>
+                <w:lang w:bidi="ar-EG"/>
+              </w:rPr>
+              <w:t>Primary Key</w:t>
+            </w:r>
+          </w:p>
+        </w:tc>
+        <w:tc>
+          <w:tcPr>
+            <w:tcW w:w="0" w:type="auto"/>
+            <w:hideMark/>
+          </w:tcPr>
+          <w:p>
+            <w:pPr>
+              <w:pStyle w:val="IT"/>
+              <w:rPr>
+                <w:b/>
+                <w:bCs/>
+                <w:lang w:bidi="ar-EG"/>
+              </w:rPr>
+            </w:pPr>
+            <w:r>
+              <w:rPr>
+                <w:b/>
+                <w:bCs/>
+                <w:lang w:bidi="ar-EG"/>
+              </w:rPr>
+              <w:t>Foreign Key</w:t>
+            </w:r>
+          </w:p>
+        </w:tc>
+      </w:tr>
+      <w:tr>
+        <w:tc>
+          <w:tcPr>
+            <w:tcW w:w="0" w:type="auto"/>
+            <w:hideMark/>
+          </w:tcPr>
+          <w:p>
+            <w:pPr>
+              <w:pStyle w:val="IT"/>
+              <w:rPr>
+                <w:lang w:bidi="ar-EG"/>
+              </w:rPr>
+            </w:pPr>
+            <w:r>
+              <w:rPr>
+                <w:b/>
+                <w:bCs/>
+                <w:lang w:bidi="ar-EG"/>
+              </w:rPr>
+              <w:t>Patient</w:t>
+            </w:r>
+          </w:p>
+        </w:tc>
+        <w:tc>
+          <w:tcPr>
+            <w:tcW w:w="0" w:type="auto"/>
+            <w:hideMark/>
+          </w:tcPr>
+          <w:p>
+            <w:pPr>
+              <w:pStyle w:val="IT"/>
+              <w:rPr>
+                <w:lang w:bidi="ar-EG"/>
+              </w:rPr>
+            </w:pPr>
+            <w:r>
+              <w:rPr>
+                <w:lang w:bidi="ar-EG"/>
+              </w:rPr>
+              <w:t>Patient_ID, National_ID, Full_Name, Date_of_Birth, Gender, Phone, Email, Address</w:t>
+            </w:r>
+          </w:p>
+        </w:tc>
+        <w:tc>
+          <w:tcPr>
+            <w:tcW w:w="0" w:type="auto"/>
+            <w:hideMark/>
+          </w:tcPr>
+          <w:p>
+            <w:pPr>
+              <w:pStyle w:val="IT"/>
+              <w:rPr>
+                <w:lang w:bidi="ar-EG"/>
+              </w:rPr>
+            </w:pPr>
+            <w:r>
+              <w:rPr>
+                <w:lang w:bidi="ar-EG"/>
+              </w:rPr>
+              <w:t>Patient_ID</w:t>
+            </w:r>
+          </w:p>
+        </w:tc>
+        <w:tc>
+          <w:tcPr>
+            <w:tcW w:w="0" w:type="auto"/>
+            <w:hideMark/>
+          </w:tcPr>
+          <w:p>
+            <w:pPr>
+              <w:pStyle w:val="IT"/>
+              <w:rPr>
+                <w:lang w:bidi="ar-EG"/>
+              </w:rPr>
+            </w:pPr>
+            <w:r>
+              <w:rPr>
+                <w:lang w:bidi="ar-EG"/>
+              </w:rPr>
+              <w:t>—</w:t>
+            </w:r>
+          </w:p>
+        </w:tc>
+      </w:tr>
+      <w:tr>
+        <w:tc>
+          <w:tcPr>
+            <w:tcW w:w="0" w:type="auto"/>
+            <w:hideMark/>
+          </w:tcPr>
+          <w:p>
+            <w:pPr>
+              <w:pStyle w:val="IT"/>
+              <w:rPr>
+                <w:lang w:bidi="ar-EG"/>
+              </w:rPr>
+            </w:pPr>
+            <w:r>
+              <w:rPr>
+                <w:b/>
+                <w:bCs/>
+                <w:lang w:bidi="ar-EG"/>
+              </w:rPr>
+              <w:t>Doctor</w:t>
+            </w:r>
+          </w:p>
+        </w:tc>
+        <w:tc>
+          <w:tcPr>
+            <w:tcW w:w="0" w:type="auto"/>
+            <w:hideMark/>
+          </w:tcPr>
+          <w:p>
+            <w:pPr>
+              <w:pStyle w:val="IT"/>
+              <w:rPr>
+                <w:lang w:bidi="ar-EG"/>
+              </w:rPr>
+            </w:pPr>
+            <w:r>
+              <w:rPr>
+                <w:lang w:bidi="ar-EG"/>
+              </w:rPr>
+              <w:t>Doctor_ID, Full_Name, Specialty, License_No, Phone, Email, Doctor_Type</w:t>
+            </w:r>
+          </w:p>
+        </w:tc>
+        <w:tc>
+          <w:tcPr>
+            <w:tcW w:w="0" w:type="auto"/>
+            <w:hideMark/>
+          </w:tcPr>
+          <w:p>
+            <w:pPr>
+              <w:pStyle w:val="IT"/>
+              <w:rPr>
+                <w:lang w:bidi="ar-EG"/>
+              </w:rPr>
+            </w:pPr>
+            <w:r>
+              <w:rPr>
+                <w:lang w:bidi="ar-EG"/>
+              </w:rPr>
+              <w:t>Doctor_ID</w:t>
+            </w:r>
+          </w:p>
+        </w:tc>
+        <w:tc>
+          <w:tcPr>
+            <w:tcW w:w="0" w:type="auto"/>
+            <w:hideMark/>
+          </w:tcPr>
+          <w:p>
+            <w:pPr>
+              <w:pStyle w:val="IT"/>
+              <w:rPr>
+                <w:lang w:bidi="ar-EG"/>
+              </w:rPr>
+            </w:pPr>
+            <w:r>
+              <w:rPr>
+                <w:lang w:bidi="ar-EG"/>
+              </w:rPr>
+              <w:t>—</w:t>
+            </w:r>
+          </w:p>
+        </w:tc>
+      </w:tr>
+      <w:tr>
+        <w:tc>
+          <w:tcPr>
+            <w:tcW w:w="0" w:type="auto"/>
+            <w:hideMark/>
+          </w:tcPr>
+          <w:p>
+            <w:pPr>
+              <w:pStyle w:val="IT"/>
+              <w:rPr>
+                <w:lang w:bidi="ar-EG"/>
+              </w:rPr>
+            </w:pPr>
+            <w:r>
+              <w:rPr>
+                <w:b/>
+                <w:bCs/>
+                <w:lang w:bidi="ar-EG"/>
+              </w:rPr>
+              <w:t>Appointment</w:t>
+            </w:r>
+          </w:p>
+        </w:tc>
+        <w:tc>
+          <w:tcPr>
+            <w:tcW w:w="0" w:type="auto"/>
+            <w:hideMark/>
+          </w:tcPr>
+          <w:p>
+            <w:pPr>
+              <w:pStyle w:val="IT"/>
+              <w:rPr>
+                <w:lang w:bidi="ar-EG"/>
+              </w:rPr>
+            </w:pPr>
+            <w:r>
+              <w:rPr>
+                <w:lang w:bidi="ar-EG"/>
+              </w:rPr>
+              <w:t>Appointment_ID, Appointment_Date, Appointment_Time, Visit_Reason, Status</w:t>
+            </w:r>
+          </w:p>
+        </w:tc>
+        <w:tc>
+          <w:tcPr>
+            <w:tcW w:w="0" w:type="auto"/>
+            <w:hideMark/>
+          </w:tcPr>
+          <w:p>
+            <w:pPr>
+              <w:pStyle w:val="IT"/>
+              <w:rPr>
+                <w:lang w:bidi="ar-EG"/>
+              </w:rPr>
+            </w:pPr>
+            <w:r>
+              <w:rPr>
+                <w:lang w:bidi="ar-EG"/>
+              </w:rPr>
+              <w:t>Appointment_ID</w:t>
+            </w:r>
+          </w:p>
+        </w:tc>
+        <w:tc>
+          <w:tcPr>
+            <w:tcW w:w="0" w:type="auto"/>
+            <w:hideMark/>
+          </w:tcPr>
+          <w:p>
+            <w:pPr>
+              <w:pStyle w:val="IT"/>
+              <w:rPr>
+                <w:lang w:bidi="ar-EG"/>
+              </w:rPr>
+            </w:pPr>
+            <w:r>
+              <w:rPr>
+                <w:lang w:bidi="ar-EG"/>
+              </w:rPr>
+              <w:t>Patient_ID, Doctor_ID</w:t>
+            </w:r>
+          </w:p>
+        </w:tc>
+      </w:tr>
+      <w:tr>
+        <w:tc>
+          <w:tcPr>
+            <w:tcW w:w="0" w:type="auto"/>
+            <w:hideMark/>
+          </w:tcPr>
+          <w:p>
+            <w:pPr>
+              <w:pStyle w:val="IT"/>
+              <w:rPr>
+                <w:lang w:bidi="ar-EG"/>
+              </w:rPr>
+            </w:pPr>
+            <w:r>
+              <w:rPr>
+                <w:b/>
+                <w:bCs/>
+                <w:lang w:bidi="ar-EG"/>
+              </w:rPr>
+              <w:t>Treatment</w:t>
+            </w:r>
+          </w:p>
+        </w:tc>
+        <w:tc>
+          <w:tcPr>
+            <w:tcW w:w="0" w:type="auto"/>
+            <w:hideMark/>
+          </w:tcPr>
+          <w:p>
+            <w:pPr>
+              <w:pStyle w:val="IT"/>
+              <w:rPr>
+                <w:lang w:bidi="ar-EG"/>
+              </w:rPr>
+            </w:pPr>
+            <w:r>
+              <w:rPr>
+                <w:lang w:bidi="ar-EG"/>
+              </w:rPr>
+              <w:t>Treatment_ID, Diagnosis, Procedure_Name, Notes, Cost</w:t>
+            </w:r>
+          </w:p>
+        </w:tc>
+        <w:tc>
+          <w:tcPr>
+            <w:tcW w:w="0" w:type="auto"/>
+            <w:hideMark/>
+          </w:tcPr>
+          <w:p>
+            <w:pPr>
+              <w:pStyle w:val="IT"/>
+              <w:rPr>
+                <w:lang w:bidi="ar-EG"/>
+              </w:rPr>
+            </w:pPr>
+            <w:r>
+              <w:rPr>
+                <w:lang w:bidi="ar-EG"/>
+              </w:rPr>
+              <w:t>Treatment_ID</w:t>
+            </w:r>
+          </w:p>
+        </w:tc>
+        <w:tc>
+          <w:tcPr>
+            <w:tcW w:w="0" w:type="auto"/>
+            <w:hideMark/>
+          </w:tcPr>
+          <w:p>
+            <w:pPr>
+              <w:pStyle w:val="IT"/>
+              <w:rPr>
+                <w:lang w:bidi="ar-EG"/>
+              </w:rPr>
+            </w:pPr>
+            <w:r>
+              <w:rPr>
+                <w:lang w:bidi="ar-EG"/>
+              </w:rPr>
+              <w:t>Appointment_ID, Medicine_ID</w:t>
+            </w:r>
+          </w:p>
+        </w:tc>
+      </w:tr>
+      <w:tr>
+        <w:tc>
+          <w:tcPr>
+            <w:tcW w:w="0" w:type="auto"/>
+            <w:hideMark/>
+          </w:tcPr>
+          <w:p>
+            <w:pPr>
+              <w:pStyle w:val="IT"/>
+              <w:rPr>
+                <w:lang w:bidi="ar-EG"/>
+              </w:rPr>
+            </w:pPr>
+            <w:r>
+              <w:rPr>
+                <w:b/>
+                <w:bCs/>
+                <w:lang w:bidi="ar-EG"/>
+              </w:rPr>
+              <w:t>Medicine</w:t>
+            </w:r>
+          </w:p>
+        </w:tc>
+        <w:tc>
+          <w:tcPr>
+            <w:tcW w:w="0" w:type="auto"/>
+            <w:hideMark/>
+          </w:tcPr>
+          <w:p>
+            <w:pPr>
+              <w:pStyle w:val="IT"/>
+              <w:rPr>
+                <w:lang w:bidi="ar-EG"/>
+              </w:rPr>
+            </w:pPr>
+            <w:r>
+              <w:rPr>
+                <w:lang w:bidi="ar-EG"/>
+              </w:rPr>
+              <w:t>Medicine_ID, Medicine_Name, Description, Unit_Price, Stock_Quantity</w:t>
+            </w:r>
+          </w:p>
+        </w:tc>
+        <w:tc>
+          <w:tcPr>
+            <w:tcW w:w="0" w:type="auto"/>
+            <w:hideMark/>
+          </w:tcPr>
+          <w:p>
+            <w:pPr>
+              <w:pStyle w:val="IT"/>
+              <w:rPr>
+                <w:lang w:bidi="ar-EG"/>
+              </w:rPr>
+            </w:pPr>
+            <w:r>
+              <w:rPr>
+                <w:lang w:bidi="ar-EG"/>
+              </w:rPr>
+              <w:t>Medicine_ID</w:t>
+            </w:r>
+          </w:p>
+        </w:tc>
+        <w:tc>
+          <w:tcPr>
+            <w:tcW w:w="0" w:type="auto"/>
+            <w:hideMark/>
+          </w:tcPr>
+          <w:p>
+            <w:pPr>
+              <w:pStyle w:val="IT"/>
+              <w:rPr>
+                <w:lang w:bidi="ar-EG"/>
+              </w:rPr>
+            </w:pPr>
+            <w:r>
+              <w:rPr>
+                <w:lang w:bidi="ar-EG"/>
+              </w:rPr>
+              <w:t>—</w:t>
+            </w:r>
+          </w:p>
+        </w:tc>
+      </w:tr>
+      <w:tr>
+        <w:tc>
+          <w:tcPr>
+            <w:tcW w:w="0" w:type="auto"/>
+            <w:hideMark/>
+          </w:tcPr>
+          <w:p>
+            <w:pPr>
+              <w:pStyle w:val="IT"/>
+              <w:rPr>
+                <w:lang w:bidi="ar-EG"/>
+              </w:rPr>
+            </w:pPr>
+            <w:r>
+              <w:rPr>
+                <w:b/>
+                <w:bCs/>
+                <w:lang w:bidi="ar-EG"/>
+              </w:rPr>
+              <w:t>Payment</w:t>
+            </w:r>
+          </w:p>
+        </w:tc>
+        <w:tc>
+          <w:tcPr>
+            <w:tcW w:w="0" w:type="auto"/>
+            <w:hideMark/>
+          </w:tcPr>
+          <w:p>
+            <w:pPr>
+              <w:pStyle w:val="IT"/>
+              <w:rPr>
+                <w:lang w:bidi="ar-EG"/>
+              </w:rPr>
+            </w:pPr>
+            <w:r>
+              <w:rPr>
+                <w:lang w:bidi="ar-EG"/>
+              </w:rPr>
+              <w:t>Payment_ID, Amount, Payment_Date, Payment_Method, Payment_Status, Payment_Type</w:t>
+            </w:r>
+          </w:p>
+        </w:tc>
+        <w:tc>
+          <w:tcPr>
+            <w:tcW w:w="0" w:type="auto"/>
+            <w:hideMark/>
+          </w:tcPr>
+          <w:p>
+            <w:pPr>
+              <w:pStyle w:val="IT"/>
+              <w:rPr>
+                <w:lang w:bidi="ar-EG"/>
+              </w:rPr>
+            </w:pPr>
+            <w:r>
+              <w:rPr>
+                <w:lang w:bidi="ar-EG"/>
+              </w:rPr>
+              <w:t>Payment_ID</w:t>
+            </w:r>
+          </w:p>
+        </w:tc>
+        <w:tc>
+          <w:tcPr>
+            <w:tcW w:w="0" w:type="auto"/>
+            <w:hideMark/>
+          </w:tcPr>
+          <w:p>
+            <w:pPr>
+              <w:pStyle w:val="IT"/>
+              <w:rPr>
+                <w:lang w:bidi="ar-EG"/>
+              </w:rPr>
+            </w:pPr>
+            <w:r>
+              <w:rPr>
+                <w:lang w:bidi="ar-EG"/>
+              </w:rPr>
+              <w:t>Appointment_ID</w:t>
+            </w:r>
+          </w:p>
+        </w:tc>
+      </w:tr>
+    </w:tbl>
+    <w:p>
+      <w:pPr>
+        <w:pStyle w:val="IT"/>
+        <w:rPr>
+          <w:lang w:bidi="ar-EG"/>
+        </w:rPr>
+      </w:pPr>
+      <w:r>
+        <w:rPr>
+          <w:lang w:bidi="ar-EG"/>
+        </w:rPr>
+        <w:t xml:space="preserve">Each strong entity has its own primary key. For a binary </w:t>
+      </w:r>
+      <w:r>
+        <w:rPr>
+          <w:b/>
+          <w:bCs/>
+          <w:lang w:bidi="ar-EG"/>
+        </w:rPr>
+        <w:t>1:N relationship</w:t>
+      </w:r>
+      <w:r>
+        <w:rPr>
+          <w:lang w:bidi="ar-EG"/>
+        </w:rPr>
+        <w:t>, the primary key of the entity on the one side is stored as a foreign key in the relation on the many side.</w:t>
+      </w:r>
+    </w:p>
+    <w:p>
+      <w:pPr>
+        <w:pStyle w:val="IT"/>
+        <w:rPr>
+          <w:b/>
+          <w:bCs/>
+          <w:lang w:bidi="ar-EG"/>
+        </w:rPr>
+      </w:pPr>
+      <w:r>
+        <w:rPr>
+          <w:b/>
+          <w:bCs/>
+          <w:lang w:bidi="ar-EG"/>
+        </w:rPr>
+        <w:t>2. Relationships and Cardinality</w:t>
+      </w:r>
+    </w:p>
+    <w:p>
+      <w:pPr>
+        <w:pStyle w:val="IT"/>
+        <w:rPr>
+          <w:lang w:bidi="ar-EG"/>
+        </w:rPr>
+      </w:pPr>
+      <w:r>
+        <w:rPr>
+          <w:lang w:bidi="ar-EG"/>
+        </w:rPr>
+        <w:t>The main relationships are:</w:t>
+      </w:r>
+    </w:p>
+    <w:p>
+      <w:pPr>
+        <w:pStyle w:val="IT"/>
+        <w:numPr>
+          <w:ilvl w:val="0"/>
+          <w:numId w:val="9"/>
+        </w:numPr>
+        <w:jc w:val="left"/>
+        <w:rPr>
+          <w:lang w:bidi="ar-EG"/>
+        </w:rPr>
+      </w:pPr>
+      <w:r>
+        <w:rPr>
+          <w:b/>
+          <w:bCs/>
+          <w:lang w:bidi="ar-EG"/>
+        </w:rPr>
+        <w:t>Patient – Appointment:</w:t>
+      </w:r>
+      <w:r>
+        <w:rPr>
+          <w:lang w:bidi="ar-EG"/>
+        </w:rPr>
+        <w:t xml:space="preserve"> One patient may have many appointments, while each appointment belongs to one patient.</w:t>
+      </w:r>
+      <w:r>
+        <w:rPr>
+          <w:lang w:bidi="ar-EG"/>
+        </w:rPr>
+        <w:br/>
+      </w:r>
+      <w:r>
+        <w:rPr>
+          <w:b/>
+          <w:bCs/>
+          <w:lang w:bidi="ar-EG"/>
+        </w:rPr>
+        <w:t>Cardinality: 1:N</w:t>
+      </w:r>
+    </w:p>
+    <w:p>
+      <w:pPr>
+        <w:pStyle w:val="IT"/>
+        <w:numPr>
+          <w:ilvl w:val="0"/>
+          <w:numId w:val="9"/>
+        </w:numPr>
+        <w:jc w:val="left"/>
+        <w:rPr>
+          <w:lang w:bidi="ar-EG"/>
+        </w:rPr>
+      </w:pPr>
+      <w:r>
+        <w:rPr>
+          <w:b/>
+          <w:bCs/>
+          <w:lang w:bidi="ar-EG"/>
+        </w:rPr>
+        <w:t>Doctor – Appointment:</w:t>
+      </w:r>
+      <w:r>
+        <w:rPr>
+          <w:lang w:bidi="ar-EG"/>
+        </w:rPr>
+        <w:t xml:space="preserve"> One doctor may handle many appointments, while each appointment is assigned to one doctor.</w:t>
+      </w:r>
+      <w:r>
+        <w:rPr>
+          <w:lang w:bidi="ar-EG"/>
+        </w:rPr>
+        <w:br/>
+      </w:r>
+      <w:r>
+        <w:rPr>
+          <w:b/>
+          <w:bCs/>
+          <w:lang w:bidi="ar-EG"/>
+        </w:rPr>
+        <w:t>Cardinality: 1:N</w:t>
+      </w:r>
+    </w:p>
+    <w:p>
+      <w:pPr>
+        <w:pStyle w:val="IT"/>
+        <w:numPr>
+          <w:ilvl w:val="0"/>
+          <w:numId w:val="9"/>
+        </w:numPr>
+        <w:jc w:val="left"/>
+        <w:rPr>
+          <w:lang w:bidi="ar-EG"/>
+        </w:rPr>
+      </w:pPr>
+      <w:r>
+        <w:rPr>
+          <w:b/>
+          <w:bCs/>
+          <w:lang w:bidi="ar-EG"/>
+        </w:rPr>
+        <w:t>Appointment – Treatment:</w:t>
+      </w:r>
+      <w:r>
+        <w:rPr>
+          <w:lang w:bidi="ar-EG"/>
+        </w:rPr>
+        <w:t xml:space="preserve"> One appointment may produce one or more treatment records, while each treatment belongs to one appointment.</w:t>
+      </w:r>
+      <w:r>
+        <w:rPr>
+          <w:lang w:bidi="ar-EG"/>
+        </w:rPr>
+        <w:br/>
+      </w:r>
+      <w:r>
+        <w:rPr>
+          <w:b/>
+          <w:bCs/>
+          <w:lang w:bidi="ar-EG"/>
+        </w:rPr>
+        <w:t>Cardinality: 1:N</w:t>
+      </w:r>
+    </w:p>
+    <w:p>
+      <w:pPr>
+        <w:pStyle w:val="IT"/>
+        <w:numPr>
+          <w:ilvl w:val="0"/>
+          <w:numId w:val="9"/>
+        </w:numPr>
+        <w:jc w:val="left"/>
+        <w:rPr>
+          <w:lang w:bidi="ar-EG"/>
+        </w:rPr>
+      </w:pPr>
+      <w:r>
+        <w:rPr>
+          <w:b/>
+          <w:bCs/>
+          <w:lang w:bidi="ar-EG"/>
+        </w:rPr>
+        <w:t>Medicine – Treatment:</w:t>
+      </w:r>
+      <w:r>
+        <w:rPr>
+          <w:lang w:bidi="ar-EG"/>
+        </w:rPr>
+        <w:t xml:space="preserve"> One medicine may be used in many treatments, while each treatment record may refer to one medicine.</w:t>
+      </w:r>
+      <w:r>
+        <w:rPr>
+          <w:lang w:bidi="ar-EG"/>
+        </w:rPr>
+        <w:br/>
+      </w:r>
+      <w:r>
+        <w:rPr>
+          <w:b/>
+          <w:bCs/>
+          <w:lang w:bidi="ar-EG"/>
+        </w:rPr>
+        <w:t>Cardinality: 1:N</w:t>
+      </w:r>
+    </w:p>
+    <w:p>
+      <w:pPr>
+        <w:pStyle w:val="IT"/>
+        <w:numPr>
+          <w:ilvl w:val="0"/>
+          <w:numId w:val="9"/>
+        </w:numPr>
+        <w:jc w:val="left"/>
+        <w:rPr>
+          <w:lang w:bidi="ar-EG"/>
+        </w:rPr>
+      </w:pPr>
+      <w:r>
+        <w:rPr>
+          <w:b/>
+          <w:bCs/>
+          <w:lang w:bidi="ar-EG"/>
+        </w:rPr>
+        <w:t>Appointment – Payment:</w:t>
+      </w:r>
+      <w:r>
+        <w:rPr>
+          <w:lang w:bidi="ar-EG"/>
+        </w:rPr>
+        <w:t xml:space="preserve"> One appointment may have one or more payment records, while each payment is related to one appointment.</w:t>
+      </w:r>
+      <w:r>
+        <w:rPr>
+          <w:lang w:bidi="ar-EG"/>
+        </w:rPr>
+        <w:br/>
+      </w:r>
+      <w:r>
+        <w:rPr>
+          <w:b/>
+          <w:bCs/>
+          <w:lang w:bidi="ar-EG"/>
+        </w:rPr>
+        <w:t>Cardinality: 1:N</w:t>
+      </w:r>
+    </w:p>
+    <w:p>
+      <w:pPr>
+        <w:pStyle w:val="IT"/>
+        <w:rPr>
+          <w:lang w:bidi="ar-EG"/>
+        </w:rPr>
+      </w:pPr>
+      <w:r>
+        <w:rPr>
+          <w:lang w:bidi="ar-EG"/>
+        </w:rPr>
+        <w:t xml:space="preserve">Cardinality ratios such as </w:t>
+      </w:r>
+      <w:r>
+        <w:rPr>
+          <w:b/>
+          <w:bCs/>
+          <w:lang w:bidi="ar-EG"/>
+        </w:rPr>
+        <w:t>1:1, 1:N, and M:N</w:t>
+      </w:r>
+      <w:r>
+        <w:rPr>
+          <w:lang w:bidi="ar-EG"/>
+        </w:rPr>
+        <w:t xml:space="preserve"> specify the maximum participation of entities in a relationship, while participation constraints indicate whether participation is optional or mandatory.</w:t>
+      </w:r>
+    </w:p>
+    <w:p>
+      <w:pPr>
+        <w:pStyle w:val="IT"/>
+        <w:rPr>
+          <w:b/>
+          <w:bCs/>
+          <w:lang w:bidi="ar-EG"/>
+        </w:rPr>
+      </w:pPr>
+      <w:r>
+        <w:rPr>
+          <w:b/>
+          <w:bCs/>
+          <w:lang w:bidi="ar-EG"/>
+        </w:rPr>
+        <w:t>3. ER Diagram</w:t>
+      </w:r>
+    </w:p>
+    <w:p>
+      <w:pPr>
+        <w:pStyle w:val="IT"/>
+        <w:rPr>
+          <w:lang w:bidi="ar-EG"/>
+        </w:rPr>
+      </w:pPr>
+      <w:r>
+        <w:rPr>
+          <w:noProof/>
+          <w:lang w:bidi="ar-EG"/>
+        </w:rPr>
+        <w:drawing>
+          <wp:inline distT="0" distB="0" distL="0" distR="0" wp14:anchorId="4433908C" wp14:editId="093D1C29">
+            <wp:extent cx="5349240" cy="3553460"/>
+            <wp:effectExtent l="0" t="0" r="3810" b="8890"/>
+            <wp:docPr id="728108486" name="Picture 1"/>
+            <wp:cNvGraphicFramePr>
+              <a:graphicFrameLocks xmlns:a="http://schemas.openxmlformats.org/drawingml/2006/main" noChangeAspect="1"/>
+            </wp:cNvGraphicFramePr>
+            <a:graphic xmlns:a="http://schemas.openxmlformats.org/drawingml/2006/main">
+              <a:graphicData uri="http://schemas.openxmlformats.org/drawingml/2006/picture">
+                <pic:pic xmlns:pic="http://schemas.openxmlformats.org/drawingml/2006/picture">
+                  <pic:nvPicPr>
+                    <pic:cNvPr id="728108486" name=""/>
+                    <pic:cNvPicPr/>
+                  </pic:nvPicPr>
+                  <pic:blipFill>
+                    <a:blip r:embed="rId16"/>
+                    <a:stretch>
+                      <a:fillRect/>
+                    </a:stretch>
+                  </pic:blipFill>
+                  <pic:spPr>
+                    <a:xfrm>
+                      <a:off x="0" y="0"/>
+                      <a:ext cx="5349240" cy="3553460"/>
+                    </a:xfrm>
+                    <a:prstGeom prst="rect">
+                      <a:avLst/>
+                    </a:prstGeom>
+                  </pic:spPr>
+                </pic:pic>
+              </a:graphicData>
+            </a:graphic>
+          </wp:inline>
+        </w:drawing>
+      </w:r>
+    </w:p>
+    <w:p>
+      <w:pPr>
+        <w:pStyle w:val="IT"/>
+        <w:rPr>
+          <w:lang w:bidi="ar-EG"/>
+        </w:rPr>
+      </w:pPr>
+    </w:p>
+    <w:p>
+      <w:pPr>
+        <w:pStyle w:val="IT"/>
+        <w:rPr>
+          <w:lang w:bidi="ar-EG"/>
+        </w:rPr>
+      </w:pPr>
+    </w:p>
+    <w:bookmarkEnd w:id="6"/>
+    <w:p>
+      <w:pPr>
+        <w:pStyle w:val="IT"/>
+      </w:pPr>
+    </w:p>
+    <w:p>
+      <w:pPr>
+        <w:pStyle w:val="IT"/>
+      </w:pPr>
+    </w:p>
+    <w:p>
+      <w:pPr>
+        <w:pStyle w:val="IT"/>
+      </w:pPr>
+    </w:p>
+    <w:p>
+      <w:pPr>
+        <w:pStyle w:val="IT"/>
+      </w:pPr>
+    </w:p>
+    <w:p>
+      <w:pPr>
+        <w:pStyle w:val="IT"/>
+      </w:pPr>
     </w:p>
     <w:bookmarkEnd w:id="5"/>
-    <w:p>
-      <w:pPr>
-        <w:pStyle w:val="IT"/>
-      </w:pPr>
-    </w:p>
-    <w:p>
-      <w:pPr>
-        <w:pStyle w:val="IT"/>
-      </w:pPr>
-    </w:p>
-    <w:p>
-      <w:pPr>
-        <w:pStyle w:val="IT"/>
-      </w:pPr>
-    </w:p>
-    <w:p>
-      <w:pPr>
-        <w:pStyle w:val="IT"/>
-      </w:pPr>
-    </w:p>
-    <w:p>
-      <w:pPr>
-        <w:pStyle w:val="IT"/>
-      </w:pPr>
-    </w:p>
-    <w:bookmarkEnd w:id="4"/>
     <w:p>
       <w:pPr>
         <w:pStyle w:val="Heading1"/>
@@ -5287,29 +6501,7 @@
           <w:sz w:val="24"/>
           <w:szCs w:val="24"/>
         </w:rPr>
-        <w:t>SQL Script (.</w:t>
-      </w:r>
-      <w:proofErr w:type="spellStart"/>
-      <w:r>
-        <w:rPr>
-          <w:rFonts w:ascii="Times New Roman" w:hAnsi="Times New Roman" w:cs="Times New Roman"/>
-          <w:b/>
-          <w:bCs/>
-          <w:sz w:val="24"/>
-          <w:szCs w:val="24"/>
-        </w:rPr>
-        <w:t>sql</w:t>
-      </w:r>
-      <w:proofErr w:type="spellEnd"/>
-      <w:r>
-        <w:rPr>
-          <w:rFonts w:ascii="Times New Roman" w:hAnsi="Times New Roman" w:cs="Times New Roman"/>
-          <w:b/>
-          <w:bCs/>
-          <w:sz w:val="24"/>
-          <w:szCs w:val="24"/>
-        </w:rPr>
-        <w:t>)</w:t>
+        <w:t>SQL Script (.sql)</w:t>
       </w:r>
       <w:r>
         <w:rPr>
@@ -5403,7 +6595,7 @@
       </w:pPr>
     </w:p>
     <w:sectPr>
-      <w:headerReference w:type="default" r:id="rId16"/>
+      <w:headerReference w:type="default" r:id="rId17"/>
       <w:pgSz w:w="12240" w:h="15840"/>
       <w:pgMar w:top="1080" w:right="720" w:bottom="1800" w:left="3096" w:header="1080" w:footer="720" w:gutter="0"/>
       <w:pgNumType w:start="1"/>
@@ -5559,48 +6751,81 @@
             </wp:anchor>
           </w:drawing>
         </mc:Choice>
-        <mc:Fallback xmlns:wpsCustomData="http://www.wps.cn/officeDocument/2013/wpsCustomData">
+        <mc:Fallback>
           <w:pict>
-            <v:shape id="Text Box 9" o:spid="_x0000_s1026" o:spt="202" alt="Restricted - مقيد " type="#_x0000_t202" style="position:absolute;left:0pt;height:32.1pt;width:84.4pt;mso-position-horizontal:left;mso-position-horizontal-relative:page;mso-position-vertical:bottom;mso-position-vertical-relative:page;mso-wrap-style:none;z-index:251662336;v-text-anchor:bottom;mso-width-relative:page;mso-height-relative:page;" filled="f" stroked="f" coordsize="21600,21600" o:gfxdata="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">
-              <v:fill on="f" focussize="0,0"/>
-              <v:stroke on="f"/>
-              <v:imagedata o:title=""/>
-              <o:lock v:ext="edit" aspectratio="f"/>
-              <v:textbox inset="20pt,0mm,0mm,15pt" style="mso-fit-shape-to-text:t;">
+            <v:shapetype w14:anchorId="35EF330F" id="_x0000_t202" coordsize="21600,21600" o:spt="202" path="m,l,21600r21600,l21600,xe">
+              <v:stroke joinstyle="miter"/>
+              <v:path gradientshapeok="t" o:connecttype="rect"/>
+            </v:shapetype>
+            <v:shape id="Text Box 9" o:spid="_x0000_s1033" type="#_x0000_t202" alt="Restricted - مقيد " style="position:absolute;left:0;text-align:left;margin-left:0;margin-top:0;width:84.4pt;height:32.1pt;z-index:251662336;visibility:visible;mso-wrap-style:none;mso-wrap-distance-left:0;mso-wrap-distance-top:0;mso-wrap-distance-right:0;mso-wrap-distance-bottom:0;mso-position-horizontal:left;mso-position-horizontal-relative:page;mso-position-vertical:bottom;mso-position-vertical-relative:page;v-text-anchor:bottom" o:gfxdata="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" filled="f" stroked="f">
+              <v:textbox style="mso-fit-shape-to-text:t" inset="20pt,0,0,15pt">
                 <w:txbxContent>
                   <w:p>
                     <w:pPr>
                       <w:spacing w:after="0"/>
                       <w:rPr>
-                        <w:rFonts w:ascii="Aptos" w:hAnsi="Aptos" w:eastAsia="Aptos" w:cs="Aptos"/>
+                        <w:rFonts w:ascii="Aptos" w:eastAsia="Aptos" w:hAnsi="Aptos" w:cs="Aptos"/>
                         <w:color w:val="000000"/>
+                        <w14:textFill>
+                          <w14:solidFill>
+                            <w14:srgbClr w14:val="000000">
+                              <w14:lumMod w14:val="75000"/>
+                              <w14:lumOff w14:val="25000"/>
+                            </w14:srgbClr>
+                          </w14:solidFill>
+                        </w14:textFill>
                       </w:rPr>
                     </w:pPr>
                     <w:r>
                       <w:rPr>
-                        <w:rFonts w:ascii="Aptos" w:hAnsi="Aptos" w:eastAsia="Aptos" w:cs="Aptos"/>
+                        <w:rFonts w:ascii="Aptos" w:eastAsia="Aptos" w:hAnsi="Aptos" w:cs="Aptos"/>
                         <w:color w:val="000000"/>
+                        <w14:textFill>
+                          <w14:solidFill>
+                            <w14:srgbClr w14:val="000000">
+                              <w14:lumMod w14:val="75000"/>
+                              <w14:lumOff w14:val="25000"/>
+                            </w14:srgbClr>
+                          </w14:solidFill>
+                        </w14:textFill>
                       </w:rPr>
                       <w:t xml:space="preserve">Restricted - </w:t>
                     </w:r>
                     <w:r>
                       <w:rPr>
-                        <w:rFonts w:ascii="Aptos" w:hAnsi="Aptos" w:eastAsia="Aptos" w:cs="Aptos"/>
+                        <w:rFonts w:ascii="Aptos" w:eastAsia="Aptos" w:hAnsi="Aptos" w:cs="Aptos"/>
                         <w:color w:val="000000"/>
                         <w:rtl/>
+                        <w14:textFill>
+                          <w14:solidFill>
+                            <w14:srgbClr w14:val="000000">
+                              <w14:lumMod w14:val="75000"/>
+                              <w14:lumOff w14:val="25000"/>
+                            </w14:srgbClr>
+                          </w14:solidFill>
+                        </w14:textFill>
                       </w:rPr>
                       <w:t>مقيد</w:t>
                     </w:r>
                     <w:r>
                       <w:rPr>
-                        <w:rFonts w:ascii="Aptos" w:hAnsi="Aptos" w:eastAsia="Aptos" w:cs="Aptos"/>
+                        <w:rFonts w:ascii="Aptos" w:eastAsia="Aptos" w:hAnsi="Aptos" w:cs="Aptos"/>
                         <w:color w:val="000000"/>
+                        <w14:textFill>
+                          <w14:solidFill>
+                            <w14:srgbClr w14:val="000000">
+                              <w14:lumMod w14:val="75000"/>
+                              <w14:lumOff w14:val="25000"/>
+                            </w14:srgbClr>
+                          </w14:solidFill>
+                        </w14:textFill>
                       </w:rPr>
                       <w:t xml:space="preserve"> </w:t>
                     </w:r>
                   </w:p>
                 </w:txbxContent>
               </v:textbox>
+              <w10:wrap anchorx="page" anchory="page"/>
             </v:shape>
           </w:pict>
         </mc:Fallback>
@@ -5730,48 +6955,81 @@
             </wp:anchor>
           </w:drawing>
         </mc:Choice>
-        <mc:Fallback xmlns:wpsCustomData="http://www.wps.cn/officeDocument/2013/wpsCustomData">
+        <mc:Fallback>
           <w:pict>
-            <v:shape id="Text Box 10" o:spid="_x0000_s1026" o:spt="202" alt="Restricted - مقيد " type="#_x0000_t202" style="position:absolute;left:0pt;height:32.1pt;width:84.4pt;mso-position-horizontal:left;mso-position-horizontal-relative:page;mso-position-vertical:bottom;mso-position-vertical-relative:page;mso-wrap-style:none;z-index:251663360;v-text-anchor:bottom;mso-width-relative:page;mso-height-relative:page;" filled="f" stroked="f" coordsize="21600,21600" o:gfxdata="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">
-              <v:fill on="f" focussize="0,0"/>
-              <v:stroke on="f"/>
-              <v:imagedata o:title=""/>
-              <o:lock v:ext="edit" aspectratio="f"/>
-              <v:textbox inset="20pt,0mm,0mm,15pt" style="mso-fit-shape-to-text:t;">
+            <v:shapetype w14:anchorId="2AE87241" id="_x0000_t202" coordsize="21600,21600" o:spt="202" path="m,l,21600r21600,l21600,xe">
+              <v:stroke joinstyle="miter"/>
+              <v:path gradientshapeok="t" o:connecttype="rect"/>
+            </v:shapetype>
+            <v:shape id="Text Box 10" o:spid="_x0000_s1034" type="#_x0000_t202" alt="Restricted - مقيد " style="position:absolute;left:0;text-align:left;margin-left:0;margin-top:0;width:84.4pt;height:32.1pt;z-index:251663360;visibility:visible;mso-wrap-style:none;mso-wrap-distance-left:0;mso-wrap-distance-top:0;mso-wrap-distance-right:0;mso-wrap-distance-bottom:0;mso-position-horizontal:left;mso-position-horizontal-relative:page;mso-position-vertical:bottom;mso-position-vertical-relative:page;v-text-anchor:bottom" o:gfxdata="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" filled="f" stroked="f">
+              <v:textbox style="mso-fit-shape-to-text:t" inset="20pt,0,0,15pt">
                 <w:txbxContent>
                   <w:p>
                     <w:pPr>
                       <w:spacing w:after="0"/>
                       <w:rPr>
-                        <w:rFonts w:ascii="Aptos" w:hAnsi="Aptos" w:eastAsia="Aptos" w:cs="Aptos"/>
+                        <w:rFonts w:ascii="Aptos" w:eastAsia="Aptos" w:hAnsi="Aptos" w:cs="Aptos"/>
                         <w:color w:val="000000"/>
+                        <w14:textFill>
+                          <w14:solidFill>
+                            <w14:srgbClr w14:val="000000">
+                              <w14:lumMod w14:val="75000"/>
+                              <w14:lumOff w14:val="25000"/>
+                            </w14:srgbClr>
+                          </w14:solidFill>
+                        </w14:textFill>
                       </w:rPr>
                     </w:pPr>
                     <w:r>
                       <w:rPr>
-                        <w:rFonts w:ascii="Aptos" w:hAnsi="Aptos" w:eastAsia="Aptos" w:cs="Aptos"/>
+                        <w:rFonts w:ascii="Aptos" w:eastAsia="Aptos" w:hAnsi="Aptos" w:cs="Aptos"/>
                         <w:color w:val="000000"/>
+                        <w14:textFill>
+                          <w14:solidFill>
+                            <w14:srgbClr w14:val="000000">
+                              <w14:lumMod w14:val="75000"/>
+                              <w14:lumOff w14:val="25000"/>
+                            </w14:srgbClr>
+                          </w14:solidFill>
+                        </w14:textFill>
                       </w:rPr>
                       <w:t xml:space="preserve">Restricted - </w:t>
                     </w:r>
                     <w:r>
                       <w:rPr>
-                        <w:rFonts w:ascii="Aptos" w:hAnsi="Aptos" w:eastAsia="Aptos" w:cs="Aptos"/>
+                        <w:rFonts w:ascii="Aptos" w:eastAsia="Aptos" w:hAnsi="Aptos" w:cs="Aptos"/>
                         <w:color w:val="000000"/>
                         <w:rtl/>
+                        <w14:textFill>
+                          <w14:solidFill>
+                            <w14:srgbClr w14:val="000000">
+                              <w14:lumMod w14:val="75000"/>
+                              <w14:lumOff w14:val="25000"/>
+                            </w14:srgbClr>
+                          </w14:solidFill>
+                        </w14:textFill>
                       </w:rPr>
                       <w:t>مقيد</w:t>
                     </w:r>
                     <w:r>
                       <w:rPr>
-                        <w:rFonts w:ascii="Aptos" w:hAnsi="Aptos" w:eastAsia="Aptos" w:cs="Aptos"/>
+                        <w:rFonts w:ascii="Aptos" w:eastAsia="Aptos" w:hAnsi="Aptos" w:cs="Aptos"/>
                         <w:color w:val="000000"/>
+                        <w14:textFill>
+                          <w14:solidFill>
+                            <w14:srgbClr w14:val="000000">
+                              <w14:lumMod w14:val="75000"/>
+                              <w14:lumOff w14:val="25000"/>
+                            </w14:srgbClr>
+                          </w14:solidFill>
+                        </w14:textFill>
                       </w:rPr>
                       <w:t xml:space="preserve"> </w:t>
                     </w:r>
                   </w:p>
                 </w:txbxContent>
               </v:textbox>
+              <w10:wrap anchorx="page" anchory="page"/>
             </v:shape>
           </w:pict>
         </mc:Fallback>
@@ -5901,48 +7159,81 @@
             </wp:anchor>
           </w:drawing>
         </mc:Choice>
-        <mc:Fallback xmlns:wpsCustomData="http://www.wps.cn/officeDocument/2013/wpsCustomData">
+        <mc:Fallback>
           <w:pict>
-            <v:shape id="Text Box 8" o:spid="_x0000_s1026" o:spt="202" alt="Restricted - مقيد " type="#_x0000_t202" style="position:absolute;left:0pt;height:32.1pt;width:84.4pt;mso-position-horizontal:left;mso-position-horizontal-relative:page;mso-position-vertical:bottom;mso-position-vertical-relative:page;mso-wrap-style:none;z-index:251661312;v-text-anchor:bottom;mso-width-relative:page;mso-height-relative:page;" filled="f" stroked="f" coordsize="21600,21600" o:gfxdata="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">
-              <v:fill on="f" focussize="0,0"/>
-              <v:stroke on="f"/>
-              <v:imagedata o:title=""/>
-              <o:lock v:ext="edit" aspectratio="f"/>
-              <v:textbox inset="20pt,0mm,0mm,15pt" style="mso-fit-shape-to-text:t;">
+            <v:shapetype w14:anchorId="35DA803F" id="_x0000_t202" coordsize="21600,21600" o:spt="202" path="m,l,21600r21600,l21600,xe">
+              <v:stroke joinstyle="miter"/>
+              <v:path gradientshapeok="t" o:connecttype="rect"/>
+            </v:shapetype>
+            <v:shape id="Text Box 8" o:spid="_x0000_s1035" type="#_x0000_t202" alt="Restricted - مقيد " style="position:absolute;left:0;text-align:left;margin-left:0;margin-top:0;width:84.4pt;height:32.1pt;z-index:251661312;visibility:visible;mso-wrap-style:none;mso-wrap-distance-left:0;mso-wrap-distance-top:0;mso-wrap-distance-right:0;mso-wrap-distance-bottom:0;mso-position-horizontal:left;mso-position-horizontal-relative:page;mso-position-vertical:bottom;mso-position-vertical-relative:page;v-text-anchor:bottom" o:gfxdata="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" filled="f" stroked="f">
+              <v:textbox style="mso-fit-shape-to-text:t" inset="20pt,0,0,15pt">
                 <w:txbxContent>
                   <w:p>
                     <w:pPr>
                       <w:spacing w:after="0"/>
                       <w:rPr>
-                        <w:rFonts w:ascii="Aptos" w:hAnsi="Aptos" w:eastAsia="Aptos" w:cs="Aptos"/>
+                        <w:rFonts w:ascii="Aptos" w:eastAsia="Aptos" w:hAnsi="Aptos" w:cs="Aptos"/>
                         <w:color w:val="000000"/>
+                        <w14:textFill>
+                          <w14:solidFill>
+                            <w14:srgbClr w14:val="000000">
+                              <w14:lumMod w14:val="75000"/>
+                              <w14:lumOff w14:val="25000"/>
+                            </w14:srgbClr>
+                          </w14:solidFill>
+                        </w14:textFill>
                       </w:rPr>
                     </w:pPr>
                     <w:r>
                       <w:rPr>
-                        <w:rFonts w:ascii="Aptos" w:hAnsi="Aptos" w:eastAsia="Aptos" w:cs="Aptos"/>
+                        <w:rFonts w:ascii="Aptos" w:eastAsia="Aptos" w:hAnsi="Aptos" w:cs="Aptos"/>
                         <w:color w:val="000000"/>
+                        <w14:textFill>
+                          <w14:solidFill>
+                            <w14:srgbClr w14:val="000000">
+                              <w14:lumMod w14:val="75000"/>
+                              <w14:lumOff w14:val="25000"/>
+                            </w14:srgbClr>
+                          </w14:solidFill>
+                        </w14:textFill>
                       </w:rPr>
                       <w:t xml:space="preserve">Restricted - </w:t>
                     </w:r>
                     <w:r>
                       <w:rPr>
-                        <w:rFonts w:ascii="Aptos" w:hAnsi="Aptos" w:eastAsia="Aptos" w:cs="Aptos"/>
+                        <w:rFonts w:ascii="Aptos" w:eastAsia="Aptos" w:hAnsi="Aptos" w:cs="Aptos"/>
                         <w:color w:val="000000"/>
                         <w:rtl/>
+                        <w14:textFill>
+                          <w14:solidFill>
+                            <w14:srgbClr w14:val="000000">
+                              <w14:lumMod w14:val="75000"/>
+                              <w14:lumOff w14:val="25000"/>
+                            </w14:srgbClr>
+                          </w14:solidFill>
+                        </w14:textFill>
                       </w:rPr>
                       <w:t>مقيد</w:t>
                     </w:r>
                     <w:r>
                       <w:rPr>
-                        <w:rFonts w:ascii="Aptos" w:hAnsi="Aptos" w:eastAsia="Aptos" w:cs="Aptos"/>
+                        <w:rFonts w:ascii="Aptos" w:eastAsia="Aptos" w:hAnsi="Aptos" w:cs="Aptos"/>
                         <w:color w:val="000000"/>
+                        <w14:textFill>
+                          <w14:solidFill>
+                            <w14:srgbClr w14:val="000000">
+                              <w14:lumMod w14:val="75000"/>
+                              <w14:lumOff w14:val="25000"/>
+                            </w14:srgbClr>
+                          </w14:solidFill>
+                        </w14:textFill>
                       </w:rPr>
                       <w:t xml:space="preserve"> </w:t>
                     </w:r>
                   </w:p>
                 </w:txbxContent>
               </v:textbox>
+              <w10:wrap anchorx="page" anchory="page"/>
             </v:shape>
           </w:pict>
         </mc:Fallback>
@@ -7188,6 +8479,155 @@
       </w:rPr>
     </w:lvl>
   </w:abstractNum>
+  <w:abstractNum w:abstractNumId="8" w15:restartNumberingAfterBreak="0">
+    <w:nsid w:val="7E1D6510"/>
+    <w:multiLevelType w:val="multilevel"/>
+    <w:tmpl w:val="B0F2A73E"/>
+    <w:lvl w:ilvl="0">
+      <w:start w:val="1"/>
+      <w:numFmt w:val="bullet"/>
+      <w:lvlText w:val=""/>
+      <w:lvlJc w:val="left"/>
+      <w:pPr>
+        <w:tabs>
+          <w:tab w:val="num" w:pos="720"/>
+        </w:tabs>
+        <w:ind w:left="720" w:hanging="360"/>
+      </w:pPr>
+      <w:rPr>
+        <w:rFonts w:ascii="Symbol" w:hAnsi="Symbol" w:hint="default"/>
+        <w:sz w:val="20"/>
+      </w:rPr>
+    </w:lvl>
+    <w:lvl w:ilvl="1" w:tentative="1">
+      <w:start w:val="1"/>
+      <w:numFmt w:val="bullet"/>
+      <w:lvlText w:val="o"/>
+      <w:lvlJc w:val="left"/>
+      <w:pPr>
+        <w:tabs>
+          <w:tab w:val="num" w:pos="1440"/>
+        </w:tabs>
+        <w:ind w:left="1440" w:hanging="360"/>
+      </w:pPr>
+      <w:rPr>
+        <w:rFonts w:ascii="Courier New" w:hAnsi="Courier New" w:hint="default"/>
+        <w:sz w:val="20"/>
+      </w:rPr>
+    </w:lvl>
+    <w:lvl w:ilvl="2" w:tentative="1">
+      <w:start w:val="1"/>
+      <w:numFmt w:val="bullet"/>
+      <w:lvlText w:val=""/>
+      <w:lvlJc w:val="left"/>
+      <w:pPr>
+        <w:tabs>
+          <w:tab w:val="num" w:pos="2160"/>
+        </w:tabs>
+        <w:ind w:left="2160" w:hanging="360"/>
+      </w:pPr>
+      <w:rPr>
+        <w:rFonts w:ascii="Wingdings" w:hAnsi="Wingdings" w:hint="default"/>
+        <w:sz w:val="20"/>
+      </w:rPr>
+    </w:lvl>
+    <w:lvl w:ilvl="3" w:tentative="1">
+      <w:start w:val="1"/>
+      <w:numFmt w:val="bullet"/>
+      <w:lvlText w:val=""/>
+      <w:lvlJc w:val="left"/>
+      <w:pPr>
+        <w:tabs>
+          <w:tab w:val="num" w:pos="2880"/>
+        </w:tabs>
+        <w:ind w:left="2880" w:hanging="360"/>
+      </w:pPr>
+      <w:rPr>
+        <w:rFonts w:ascii="Wingdings" w:hAnsi="Wingdings" w:hint="default"/>
+        <w:sz w:val="20"/>
+      </w:rPr>
+    </w:lvl>
+    <w:lvl w:ilvl="4" w:tentative="1">
+      <w:start w:val="1"/>
+      <w:numFmt w:val="bullet"/>
+      <w:lvlText w:val=""/>
+      <w:lvlJc w:val="left"/>
+      <w:pPr>
+        <w:tabs>
+          <w:tab w:val="num" w:pos="3600"/>
+        </w:tabs>
+        <w:ind w:left="3600" w:hanging="360"/>
+      </w:pPr>
+      <w:rPr>
+        <w:rFonts w:ascii="Wingdings" w:hAnsi="Wingdings" w:hint="default"/>
+        <w:sz w:val="20"/>
+      </w:rPr>
+    </w:lvl>
+    <w:lvl w:ilvl="5" w:tentative="1">
+      <w:start w:val="1"/>
+      <w:numFmt w:val="bullet"/>
+      <w:lvlText w:val=""/>
+      <w:lvlJc w:val="left"/>
+      <w:pPr>
+        <w:tabs>
+          <w:tab w:val="num" w:pos="4320"/>
+        </w:tabs>
+        <w:ind w:left="4320" w:hanging="360"/>
+      </w:pPr>
+      <w:rPr>
+        <w:rFonts w:ascii="Wingdings" w:hAnsi="Wingdings" w:hint="default"/>
+        <w:sz w:val="20"/>
+      </w:rPr>
+    </w:lvl>
+    <w:lvl w:ilvl="6" w:tentative="1">
+      <w:start w:val="1"/>
+      <w:numFmt w:val="bullet"/>
+      <w:lvlText w:val=""/>
+      <w:lvlJc w:val="left"/>
+      <w:pPr>
+        <w:tabs>
+          <w:tab w:val="num" w:pos="5040"/>
+        </w:tabs>
+        <w:ind w:left="5040" w:hanging="360"/>
+      </w:pPr>
+      <w:rPr>
+        <w:rFonts w:ascii="Wingdings" w:hAnsi="Wingdings" w:hint="default"/>
+        <w:sz w:val="20"/>
+      </w:rPr>
+    </w:lvl>
+    <w:lvl w:ilvl="7" w:tentative="1">
+      <w:start w:val="1"/>
+      <w:numFmt w:val="bullet"/>
+      <w:lvlText w:val=""/>
+      <w:lvlJc w:val="left"/>
+      <w:pPr>
+        <w:tabs>
+          <w:tab w:val="num" w:pos="5760"/>
+        </w:tabs>
+        <w:ind w:left="5760" w:hanging="360"/>
+      </w:pPr>
+      <w:rPr>
+        <w:rFonts w:ascii="Wingdings" w:hAnsi="Wingdings" w:hint="default"/>
+        <w:sz w:val="20"/>
+      </w:rPr>
+    </w:lvl>
+    <w:lvl w:ilvl="8" w:tentative="1">
+      <w:start w:val="1"/>
+      <w:numFmt w:val="bullet"/>
+      <w:lvlText w:val=""/>
+      <w:lvlJc w:val="left"/>
+      <w:pPr>
+        <w:tabs>
+          <w:tab w:val="num" w:pos="6480"/>
+        </w:tabs>
+        <w:ind w:left="6480" w:hanging="360"/>
+      </w:pPr>
+      <w:rPr>
+        <w:rFonts w:ascii="Wingdings" w:hAnsi="Wingdings" w:hint="default"/>
+        <w:sz w:val="20"/>
+      </w:rPr>
+    </w:lvl>
+  </w:abstractNum>
   <w:num w:numId="1" w16cid:durableId="1053851079">
     <w:abstractNumId w:val="0"/>
   </w:num>
@@ -7211,6 +8651,9 @@
   </w:num>
   <w:num w:numId="8" w16cid:durableId="2098819042">
     <w:abstractNumId w:val="1"/>
+  </w:num>
+  <w:num w:numId="9" w16cid:durableId="1168908523">
+    <w:abstractNumId w:val="8"/>
   </w:num>
 </w:numbering>
 </file>
@@ -8668,6 +10111,22 @@
       <w:szCs w:val="24"/>
     </w:rPr>
   </w:style>
+  <w:style w:type="table" w:styleId="TableGridLight">
+    <w:name w:val="Grid Table Light"/>
+    <w:basedOn w:val="TableNormal"/>
+    <w:uiPriority w:val="40"/>
+    <w:rsid w:val="00B16CAF"/>
+    <w:tblPr>
+      <w:tblBorders>
+        <w:top w:val="single" w:sz="4" w:space="0" w:color="BFBFBF" w:themeColor="background1" w:themeShade="BF"/>
+        <w:left w:val="single" w:sz="4" w:space="0" w:color="BFBFBF" w:themeColor="background1" w:themeShade="BF"/>
+        <w:bottom w:val="single" w:sz="4" w:space="0" w:color="BFBFBF" w:themeColor="background1" w:themeShade="BF"/>
+        <w:right w:val="single" w:sz="4" w:space="0" w:color="BFBFBF" w:themeColor="background1" w:themeShade="BF"/>
+        <w:insideH w:val="single" w:sz="4" w:space="0" w:color="BFBFBF" w:themeColor="background1" w:themeShade="BF"/>
+        <w:insideV w:val="single" w:sz="4" w:space="0" w:color="BFBFBF" w:themeColor="background1" w:themeShade="BF"/>
+      </w:tblBorders>
+    </w:tblPr>
+  </w:style>
 </w:styles>
 </file>
 
@@ -8852,7 +10311,6 @@
     <w:sig w:usb0="800002E7" w:usb1="2AC7FCFF" w:usb2="00000012" w:usb3="00000000" w:csb0="0002009F" w:csb1="00000000"/>
   </w:font>
   <w:font w:name="Yu Gothic Light">
-    <w:altName w:val="游ゴシック Light"/>
     <w:panose1 w:val="020B0300000000000000"/>
     <w:charset w:val="80"/>
     <w:family w:val="swiss"/>
@@ -8946,6 +10404,8 @@
     <w:rsid w:val="00046943"/>
     <w:rsid w:val="00051231"/>
     <w:rsid w:val="00096A42"/>
+    <w:rsid w:val="000977CD"/>
+    <w:rsid w:val="000A06ED"/>
     <w:rsid w:val="000D468B"/>
     <w:rsid w:val="000F7A23"/>
     <w:rsid w:val="001111BC"/>
@@ -9858,19 +11318,6 @@
 </file>
 
 <file path=customXml/item2.xml><?xml version="1.0" encoding="utf-8"?>
-<?mso-contentType ?>
-<FormTemplates xmlns="http://schemas.microsoft.com/sharepoint/v3/contenttype/forms">
-  <Display>DocumentLibraryForm</Display>
-  <Edit>AssetEditForm</Edit>
-  <New>DocumentLibraryForm</New>
-</FormTemplates>
-</file>
-
-<file path=customXml/item3.xml><?xml version="1.0" encoding="utf-8"?>
-<b:Sources xmlns:b="http://schemas.openxmlformats.org/officeDocument/2006/bibliography" SelectedStyle="\APA.XSL" StyleName="APA"/>
-</file>
-
-<file path=customXml/item4.xml><?xml version="1.0" encoding="utf-8"?>
 <s:customData xmlns="http://www.wps.cn/officeDocument/2013/wpsCustomData" xmlns:s="http://www.wps.cn/officeDocument/2013/wpsCustomData">
   <customSectProps>
     <customSectPr/>
@@ -9879,6 +11326,19 @@
     <customShpInfo spid="_x0000_s1026" textRotate="1"/>
   </customShpExts>
 </s:customData>
+</file>
+
+<file path=customXml/item3.xml><?xml version="1.0" encoding="utf-8"?>
+<b:Sources xmlns:b="http://schemas.openxmlformats.org/officeDocument/2006/bibliography" SelectedStyle="\APA.XSL" StyleName="APA"/>
+</file>
+
+<file path=customXml/item4.xml><?xml version="1.0" encoding="utf-8"?>
+<?mso-contentType ?>
+<FormTemplates xmlns="http://schemas.microsoft.com/sharepoint/v3/contenttype/forms">
+  <Display>DocumentLibraryForm</Display>
+  <Edit>AssetEditForm</Edit>
+  <New>DocumentLibraryForm</New>
+</FormTemplates>
 </file>
 
 <file path=customXml/itemProps1.xml><?xml version="1.0" encoding="utf-8"?>
@@ -9890,9 +11350,9 @@
 </file>
 
 <file path=customXml/itemProps2.xml><?xml version="1.0" encoding="utf-8"?>
-<ds:datastoreItem xmlns:ds="http://schemas.openxmlformats.org/officeDocument/2006/customXml" ds:itemID="{E34C63B7-A026-4A37-9535-4FBB4C03A11D}">
+<ds:datastoreItem xmlns:ds="http://schemas.openxmlformats.org/officeDocument/2006/customXml" ds:itemID="{B1977F7D-205B-4081-913C-38D41E755F92}">
   <ds:schemaRefs>
-    <ds:schemaRef ds:uri="http://schemas.microsoft.com/sharepoint/v3/contenttype/forms"/>
+    <ds:schemaRef ds:uri="http://www.wps.cn/officeDocument/2013/wpsCustomData"/>
   </ds:schemaRefs>
 </ds:datastoreItem>
 </file>
@@ -9906,9 +11366,9 @@
 </file>
 
 <file path=customXml/itemProps4.xml><?xml version="1.0" encoding="utf-8"?>
-<ds:datastoreItem xmlns:ds="http://schemas.openxmlformats.org/officeDocument/2006/customXml" ds:itemID="{B1977F7D-205B-4081-913C-38D41E755F92}">
+<ds:datastoreItem xmlns:ds="http://schemas.openxmlformats.org/officeDocument/2006/customXml" ds:itemID="{E34C63B7-A026-4A37-9535-4FBB4C03A11D}">
   <ds:schemaRefs>
-    <ds:schemaRef ds:uri="http://www.wps.cn/officeDocument/2013/wpsCustomData"/>
+    <ds:schemaRef ds:uri="http://schemas.microsoft.com/sharepoint/v3/contenttype/forms"/>
   </ds:schemaRefs>
 </ds:datastoreItem>
 </file>
</xml_diff>

<commit_message>
Complete task one and create the database and tabled for task 2
</commit_message>
<xml_diff>
--- a/IT244 - Project.docx
+++ b/IT244 - Project.docx
@@ -5591,9 +5591,599 @@
       <w:pPr>
         <w:pStyle w:val="IT"/>
         <w:rPr>
+          <w:b/>
+          <w:bCs/>
           <w:lang w:bidi="ar-EG"/>
         </w:rPr>
       </w:pPr>
+      <w:r>
+        <w:rPr>
+          <w:b/>
+          <w:bCs/>
+          <w:lang w:bidi="ar-EG"/>
+        </w:rPr>
+        <w:t>4. Specialization/Generalization</w:t>
+      </w:r>
+    </w:p>
+    <w:p>
+      <w:pPr>
+        <w:pStyle w:val="IT"/>
+        <w:rPr>
+          <w:lang w:bidi="ar-EG"/>
+        </w:rPr>
+      </w:pPr>
+      <w:r>
+        <w:rPr>
+          <w:lang w:bidi="ar-EG"/>
+        </w:rPr>
+        <w:t xml:space="preserve">An EER specialization can be applied to the </w:t>
+      </w:r>
+      <w:r>
+        <w:rPr>
+          <w:b/>
+          <w:bCs/>
+          <w:lang w:bidi="ar-EG"/>
+        </w:rPr>
+        <w:t>Doctor</w:t>
+      </w:r>
+      <w:r>
+        <w:rPr>
+          <w:lang w:bidi="ar-EG"/>
+        </w:rPr>
+        <w:t xml:space="preserve"> entity.</w:t>
+      </w:r>
+    </w:p>
+    <w:p>
+      <w:pPr>
+        <w:pStyle w:val="IT"/>
+        <w:rPr>
+          <w:lang w:bidi="ar-EG"/>
+        </w:rPr>
+      </w:pPr>
+      <w:r>
+        <w:rPr>
+          <w:lang w:bidi="ar-EG"/>
+        </w:rPr>
+        <w:t>The superclass is:</w:t>
+      </w:r>
+    </w:p>
+    <w:p>
+      <w:pPr>
+        <w:pStyle w:val="IT"/>
+        <w:rPr>
+          <w:lang w:bidi="ar-EG"/>
+        </w:rPr>
+      </w:pPr>
+      <w:r>
+        <w:rPr>
+          <w:b/>
+          <w:bCs/>
+          <w:lang w:bidi="ar-EG"/>
+        </w:rPr>
+        <w:t>Doctor</w:t>
+      </w:r>
+    </w:p>
+    <w:p>
+      <w:pPr>
+        <w:pStyle w:val="IT"/>
+        <w:rPr>
+          <w:lang w:bidi="ar-EG"/>
+        </w:rPr>
+      </w:pPr>
+      <w:r>
+        <w:rPr>
+          <w:lang w:bidi="ar-EG"/>
+        </w:rPr>
+        <w:t>The subclasses are:</w:t>
+      </w:r>
+    </w:p>
+    <w:p>
+      <w:pPr>
+        <w:pStyle w:val="IT"/>
+        <w:jc w:val="left"/>
+        <w:rPr>
+          <w:lang w:bidi="ar-EG"/>
+        </w:rPr>
+      </w:pPr>
+      <w:r>
+        <w:rPr>
+          <w:b/>
+          <w:bCs/>
+          <w:lang w:bidi="ar-EG"/>
+        </w:rPr>
+        <w:t>Consultant Doctor</w:t>
+      </w:r>
+      <w:r>
+        <w:rPr>
+          <w:lang w:bidi="ar-EG"/>
+        </w:rPr>
+        <w:br/>
+      </w:r>
+      <w:r>
+        <w:rPr>
+          <w:b/>
+          <w:bCs/>
+          <w:lang w:bidi="ar-EG"/>
+        </w:rPr>
+        <w:t>Resident Doctor</w:t>
+      </w:r>
+    </w:p>
+    <w:p>
+      <w:pPr>
+        <w:pStyle w:val="IT"/>
+        <w:rPr>
+          <w:lang w:bidi="ar-EG"/>
+        </w:rPr>
+      </w:pPr>
+      <w:r>
+        <w:rPr>
+          <w:lang w:bidi="ar-EG"/>
+        </w:rPr>
+        <w:t>Both subclasses inherit the common attributes of Doctor, such as Doctor_ID, Full_Name, Specialty, License_No, Phone, and Email.</w:t>
+      </w:r>
+    </w:p>
+    <w:p>
+      <w:pPr>
+        <w:pStyle w:val="IT"/>
+        <w:rPr>
+          <w:lang w:bidi="ar-EG"/>
+        </w:rPr>
+      </w:pPr>
+      <w:r>
+        <w:rPr>
+          <w:lang w:bidi="ar-EG"/>
+        </w:rPr>
+        <w:t xml:space="preserve">This specialization is defined as </w:t>
+      </w:r>
+      <w:r>
+        <w:rPr>
+          <w:b/>
+          <w:bCs/>
+          <w:lang w:bidi="ar-EG"/>
+        </w:rPr>
+        <w:t>disjoint and total</w:t>
+      </w:r>
+      <w:r>
+        <w:rPr>
+          <w:lang w:bidi="ar-EG"/>
+        </w:rPr>
+        <w:t>. Disjoint means that a doctor can belong to only one of the subclasses. Total means that every doctor must belong to at least one subclass. These are the two main specialization constraints used in an EER model: disjointness and completeness.</w:t>
+      </w:r>
+    </w:p>
+    <w:p>
+      <w:pPr>
+        <w:pStyle w:val="IT"/>
+        <w:rPr>
+          <w:lang w:bidi="ar-EG"/>
+        </w:rPr>
+      </w:pPr>
+      <w:r>
+        <w:rPr>
+          <w:noProof/>
+          <w:lang w:bidi="ar-EG"/>
+        </w:rPr>
+        <w:drawing>
+          <wp:inline distT="0" distB="0" distL="0" distR="0" wp14:anchorId="0090C1E3" wp14:editId="4C6ADEE8">
+            <wp:extent cx="5349240" cy="3769360"/>
+            <wp:effectExtent l="0" t="0" r="3810" b="2540"/>
+            <wp:docPr id="71435936" name="Picture 1"/>
+            <wp:cNvGraphicFramePr>
+              <a:graphicFrameLocks xmlns:a="http://schemas.openxmlformats.org/drawingml/2006/main" noChangeAspect="1"/>
+            </wp:cNvGraphicFramePr>
+            <a:graphic xmlns:a="http://schemas.openxmlformats.org/drawingml/2006/main">
+              <a:graphicData uri="http://schemas.openxmlformats.org/drawingml/2006/picture">
+                <pic:pic xmlns:pic="http://schemas.openxmlformats.org/drawingml/2006/picture">
+                  <pic:nvPicPr>
+                    <pic:cNvPr id="71435936" name=""/>
+                    <pic:cNvPicPr/>
+                  </pic:nvPicPr>
+                  <pic:blipFill>
+                    <a:blip r:embed="rId17"/>
+                    <a:stretch>
+                      <a:fillRect/>
+                    </a:stretch>
+                  </pic:blipFill>
+                  <pic:spPr>
+                    <a:xfrm>
+                      <a:off x="0" y="0"/>
+                      <a:ext cx="5349240" cy="3769360"/>
+                    </a:xfrm>
+                    <a:prstGeom prst="rect">
+                      <a:avLst/>
+                    </a:prstGeom>
+                  </pic:spPr>
+                </pic:pic>
+              </a:graphicData>
+            </a:graphic>
+          </wp:inline>
+        </w:drawing>
+      </w:r>
+    </w:p>
+    <w:p>
+      <w:pPr>
+        <w:pStyle w:val="IT"/>
+        <w:rPr>
+          <w:lang w:bidi="ar-EG"/>
+        </w:rPr>
+      </w:pPr>
+      <w:r>
+        <w:rPr>
+          <w:lang w:bidi="ar-EG"/>
+        </w:rPr>
+        <w:t>The specialization is suitable because consultant and resident doctors share common Doctor attributes but may also have characteristics specific to their roles. Specialization follows a top-down process where subclasses are defined from an existing entity type.</w:t>
+      </w:r>
+    </w:p>
+    <w:p>
+      <w:pPr>
+        <w:pStyle w:val="IT"/>
+        <w:rPr>
+          <w:b/>
+          <w:bCs/>
+          <w:lang w:bidi="ar-EG"/>
+        </w:rPr>
+      </w:pPr>
+      <w:r>
+        <w:rPr>
+          <w:b/>
+          <w:bCs/>
+          <w:lang w:bidi="ar-EG"/>
+        </w:rPr>
+        <w:t>5. Primary and Foreign Key Structure</w:t>
+      </w:r>
+    </w:p>
+    <w:p>
+      <w:pPr>
+        <w:pStyle w:val="IT"/>
+        <w:rPr>
+          <w:lang w:bidi="ar-EG"/>
+        </w:rPr>
+      </w:pPr>
+      <w:r>
+        <w:rPr>
+          <w:lang w:bidi="ar-EG"/>
+        </w:rPr>
+        <w:t>The main foreign-key connections are:</w:t>
+      </w:r>
+    </w:p>
+    <w:p>
+      <w:pPr>
+        <w:pStyle w:val="IT"/>
+        <w:numPr>
+          <w:ilvl w:val="0"/>
+          <w:numId w:val="10"/>
+        </w:numPr>
+        <w:rPr>
+          <w:lang w:bidi="ar-EG"/>
+        </w:rPr>
+      </w:pPr>
+      <w:r>
+        <w:rPr>
+          <w:lang w:bidi="ar-EG"/>
+        </w:rPr>
+        <w:t>Appointment.Patient_ID → Patient.Patient_ID</w:t>
+      </w:r>
+    </w:p>
+    <w:p>
+      <w:pPr>
+        <w:pStyle w:val="IT"/>
+        <w:numPr>
+          <w:ilvl w:val="0"/>
+          <w:numId w:val="10"/>
+        </w:numPr>
+        <w:rPr>
+          <w:lang w:bidi="ar-EG"/>
+        </w:rPr>
+      </w:pPr>
+      <w:r>
+        <w:rPr>
+          <w:lang w:bidi="ar-EG"/>
+        </w:rPr>
+        <w:t>Appointment.Doctor_ID → Doctor.Doctor_ID</w:t>
+      </w:r>
+    </w:p>
+    <w:p>
+      <w:pPr>
+        <w:pStyle w:val="IT"/>
+        <w:numPr>
+          <w:ilvl w:val="0"/>
+          <w:numId w:val="10"/>
+        </w:numPr>
+        <w:rPr>
+          <w:lang w:bidi="ar-EG"/>
+        </w:rPr>
+      </w:pPr>
+      <w:r>
+        <w:rPr>
+          <w:lang w:bidi="ar-EG"/>
+        </w:rPr>
+        <w:t>Treatment.Appointment_ID → Appointment.Appointment_ID</w:t>
+      </w:r>
+    </w:p>
+    <w:p>
+      <w:pPr>
+        <w:pStyle w:val="IT"/>
+        <w:numPr>
+          <w:ilvl w:val="0"/>
+          <w:numId w:val="10"/>
+        </w:numPr>
+        <w:rPr>
+          <w:lang w:bidi="ar-EG"/>
+        </w:rPr>
+      </w:pPr>
+      <w:r>
+        <w:rPr>
+          <w:lang w:bidi="ar-EG"/>
+        </w:rPr>
+        <w:t>Treatment.Medicine_ID → Medicine.Medicine_ID</w:t>
+      </w:r>
+    </w:p>
+    <w:p>
+      <w:pPr>
+        <w:pStyle w:val="IT"/>
+        <w:numPr>
+          <w:ilvl w:val="0"/>
+          <w:numId w:val="10"/>
+        </w:numPr>
+        <w:rPr>
+          <w:lang w:bidi="ar-EG"/>
+        </w:rPr>
+      </w:pPr>
+      <w:r>
+        <w:rPr>
+          <w:lang w:bidi="ar-EG"/>
+        </w:rPr>
+        <w:t>Payment.Appointment_ID → Appointment.Appointment_ID</w:t>
+      </w:r>
+    </w:p>
+    <w:p>
+      <w:pPr>
+        <w:pStyle w:val="IT"/>
+        <w:rPr>
+          <w:lang w:bidi="ar-EG"/>
+        </w:rPr>
+      </w:pPr>
+      <w:r>
+        <w:rPr>
+          <w:lang w:bidi="ar-EG"/>
+        </w:rPr>
+        <w:t>These foreign keys maintain connections between related records and support referential integrity across the database.</w:t>
+      </w:r>
+    </w:p>
+    <w:p>
+      <w:pPr>
+        <w:pStyle w:val="IT"/>
+        <w:rPr>
+          <w:b/>
+          <w:bCs/>
+          <w:lang w:bidi="ar-EG"/>
+        </w:rPr>
+      </w:pPr>
+      <w:r>
+        <w:rPr>
+          <w:b/>
+          <w:bCs/>
+          <w:lang w:bidi="ar-EG"/>
+        </w:rPr>
+        <w:t>6. Design Assumptions</w:t>
+      </w:r>
+    </w:p>
+    <w:p>
+      <w:pPr>
+        <w:pStyle w:val="IT"/>
+        <w:rPr>
+          <w:lang w:bidi="ar-EG"/>
+        </w:rPr>
+      </w:pPr>
+      <w:r>
+        <w:rPr>
+          <w:lang w:bidi="ar-EG"/>
+        </w:rPr>
+        <w:t>The following assumptions are made for the clinic database:</w:t>
+      </w:r>
+    </w:p>
+    <w:p>
+      <w:pPr>
+        <w:pStyle w:val="IT"/>
+        <w:numPr>
+          <w:ilvl w:val="0"/>
+          <w:numId w:val="11"/>
+        </w:numPr>
+        <w:rPr>
+          <w:lang w:bidi="ar-EG"/>
+        </w:rPr>
+      </w:pPr>
+      <w:r>
+        <w:rPr>
+          <w:lang w:bidi="ar-EG"/>
+        </w:rPr>
+        <w:t>Each patient has a unique Patient_ID.</w:t>
+      </w:r>
+    </w:p>
+    <w:p>
+      <w:pPr>
+        <w:pStyle w:val="IT"/>
+        <w:numPr>
+          <w:ilvl w:val="0"/>
+          <w:numId w:val="11"/>
+        </w:numPr>
+        <w:rPr>
+          <w:lang w:bidi="ar-EG"/>
+        </w:rPr>
+      </w:pPr>
+      <w:r>
+        <w:rPr>
+          <w:lang w:bidi="ar-EG"/>
+        </w:rPr>
+        <w:t>Each doctor has a unique Doctor_ID and license number.</w:t>
+      </w:r>
+    </w:p>
+    <w:p>
+      <w:pPr>
+        <w:pStyle w:val="IT"/>
+        <w:numPr>
+          <w:ilvl w:val="0"/>
+          <w:numId w:val="11"/>
+        </w:numPr>
+        <w:rPr>
+          <w:lang w:bidi="ar-EG"/>
+        </w:rPr>
+      </w:pPr>
+      <w:r>
+        <w:rPr>
+          <w:lang w:bidi="ar-EG"/>
+        </w:rPr>
+        <w:t>A patient can make several appointments over time, but each appointment is associated with only one patient.</w:t>
+      </w:r>
+    </w:p>
+    <w:p>
+      <w:pPr>
+        <w:pStyle w:val="IT"/>
+        <w:numPr>
+          <w:ilvl w:val="0"/>
+          <w:numId w:val="11"/>
+        </w:numPr>
+        <w:rPr>
+          <w:lang w:bidi="ar-EG"/>
+        </w:rPr>
+      </w:pPr>
+      <w:r>
+        <w:rPr>
+          <w:lang w:bidi="ar-EG"/>
+        </w:rPr>
+        <w:t>Each appointment is handled by one doctor, although a doctor may handle many appointments.</w:t>
+      </w:r>
+    </w:p>
+    <w:p>
+      <w:pPr>
+        <w:pStyle w:val="IT"/>
+        <w:numPr>
+          <w:ilvl w:val="0"/>
+          <w:numId w:val="11"/>
+        </w:numPr>
+        <w:rPr>
+          <w:lang w:bidi="ar-EG"/>
+        </w:rPr>
+      </w:pPr>
+      <w:r>
+        <w:rPr>
+          <w:lang w:bidi="ar-EG"/>
+        </w:rPr>
+        <w:t>An appointment may result in more than one treatment.</w:t>
+      </w:r>
+    </w:p>
+    <w:p>
+      <w:pPr>
+        <w:pStyle w:val="IT"/>
+        <w:numPr>
+          <w:ilvl w:val="0"/>
+          <w:numId w:val="11"/>
+        </w:numPr>
+        <w:rPr>
+          <w:lang w:bidi="ar-EG"/>
+        </w:rPr>
+      </w:pPr>
+      <w:r>
+        <w:rPr>
+          <w:lang w:bidi="ar-EG"/>
+        </w:rPr>
+        <w:t>A treatment may include a medicine, while the same medicine can be used in many treatment records.</w:t>
+      </w:r>
+    </w:p>
+    <w:p>
+      <w:pPr>
+        <w:pStyle w:val="IT"/>
+        <w:numPr>
+          <w:ilvl w:val="0"/>
+          <w:numId w:val="11"/>
+        </w:numPr>
+        <w:rPr>
+          <w:lang w:bidi="ar-EG"/>
+        </w:rPr>
+      </w:pPr>
+      <w:r>
+        <w:rPr>
+          <w:lang w:bidi="ar-EG"/>
+        </w:rPr>
+        <w:t>An appointment can have multiple payment records if payment is divided into installments or different payment transactions.</w:t>
+      </w:r>
+    </w:p>
+    <w:p>
+      <w:pPr>
+        <w:pStyle w:val="IT"/>
+        <w:numPr>
+          <w:ilvl w:val="0"/>
+          <w:numId w:val="11"/>
+        </w:numPr>
+        <w:rPr>
+          <w:lang w:bidi="ar-EG"/>
+        </w:rPr>
+      </w:pPr>
+      <w:r>
+        <w:rPr>
+          <w:lang w:bidi="ar-EG"/>
+        </w:rPr>
+        <w:t xml:space="preserve">Every doctor is classified as either a </w:t>
+      </w:r>
+      <w:r>
+        <w:rPr>
+          <w:b/>
+          <w:bCs/>
+          <w:lang w:bidi="ar-EG"/>
+        </w:rPr>
+        <w:t>Consultant Doctor</w:t>
+      </w:r>
+      <w:r>
+        <w:rPr>
+          <w:lang w:bidi="ar-EG"/>
+        </w:rPr>
+        <w:t xml:space="preserve"> or a </w:t>
+      </w:r>
+      <w:r>
+        <w:rPr>
+          <w:b/>
+          <w:bCs/>
+          <w:lang w:bidi="ar-EG"/>
+        </w:rPr>
+        <w:t>Resident Doctor</w:t>
+      </w:r>
+      <w:r>
+        <w:rPr>
+          <w:lang w:bidi="ar-EG"/>
+        </w:rPr>
+        <w:t>, but not both.</w:t>
+      </w:r>
+    </w:p>
+    <w:p>
+      <w:pPr>
+        <w:pStyle w:val="IT"/>
+        <w:numPr>
+          <w:ilvl w:val="0"/>
+          <w:numId w:val="11"/>
+        </w:numPr>
+        <w:rPr>
+          <w:lang w:bidi="ar-EG"/>
+        </w:rPr>
+      </w:pPr>
+      <w:r>
+        <w:rPr>
+          <w:lang w:bidi="ar-EG"/>
+        </w:rPr>
+        <w:t>Payments are recorded only for existing appointments.</w:t>
+      </w:r>
+    </w:p>
+    <w:p>
+      <w:pPr>
+        <w:pStyle w:val="IT"/>
+        <w:rPr>
+          <w:lang w:bidi="ar-EG"/>
+        </w:rPr>
+      </w:pPr>
+      <w:r>
+        <w:rPr>
+          <w:lang w:bidi="ar-EG"/>
+        </w:rPr>
+        <w:t>Patient, appointment, treatment, medicine, doctor, and payment information is stored separately to reduce unnecessary duplication and make retrieval and updating easier.</w:t>
+      </w:r>
     </w:p>
     <w:p>
       <w:pPr>
@@ -5829,6 +6419,1179 @@
     <w:p>
       <w:pPr>
         <w:pStyle w:val="IT"/>
+        <w:rPr>
+          <w:b/>
+          <w:bCs/>
+        </w:rPr>
+      </w:pPr>
+      <w:r>
+        <w:rPr>
+          <w:b/>
+          <w:bCs/>
+        </w:rPr>
+        <w:t>Answer:</w:t>
+      </w:r>
+    </w:p>
+    <w:p>
+      <w:pPr>
+        <w:pStyle w:val="IT"/>
+        <w:rPr>
+          <w:b/>
+          <w:bCs/>
+        </w:rPr>
+      </w:pPr>
+      <w:r>
+        <w:rPr>
+          <w:b/>
+          <w:bCs/>
+        </w:rPr>
+        <w:t>1. Create the Database</w:t>
+      </w:r>
+    </w:p>
+    <w:p>
+      <w:pPr>
+        <w:pStyle w:val="IT"/>
+      </w:pPr>
+      <w:r>
+        <w:t>CREATE DATABASE Smart_Clinic_DB;</w:t>
+      </w:r>
+    </w:p>
+    <w:p>
+      <w:pPr>
+        <w:pStyle w:val="IT"/>
+      </w:pPr>
+      <w:r>
+        <w:t>USE Smart_Clinic_DB;</w:t>
+      </w:r>
+    </w:p>
+    <w:p>
+      <w:pPr>
+        <w:pStyle w:val="IT"/>
+        <w:rPr>
+          <w:b/>
+          <w:bCs/>
+        </w:rPr>
+      </w:pPr>
+      <w:r>
+        <w:rPr>
+          <w:b/>
+          <w:bCs/>
+        </w:rPr>
+        <w:t>2. Create the Tables</w:t>
+      </w:r>
+    </w:p>
+    <w:p>
+      <w:pPr>
+        <w:pStyle w:val="IT"/>
+        <w:rPr>
+          <w:b/>
+          <w:bCs/>
+        </w:rPr>
+      </w:pPr>
+      <w:r>
+        <w:rPr>
+          <w:b/>
+          <w:bCs/>
+        </w:rPr>
+        <w:t>Patient Table</w:t>
+      </w:r>
+    </w:p>
+    <w:p>
+      <w:pPr>
+        <w:pStyle w:val="IT"/>
+      </w:pPr>
+      <w:r>
+        <w:t>CREATE TABLE Patient (</w:t>
+      </w:r>
+    </w:p>
+    <w:p>
+      <w:pPr>
+        <w:pStyle w:val="IT"/>
+      </w:pPr>
+      <w:r>
+        <w:t xml:space="preserve">    Patient_ID INT AUTO_INCREMENT,</w:t>
+      </w:r>
+    </w:p>
+    <w:p>
+      <w:pPr>
+        <w:pStyle w:val="IT"/>
+      </w:pPr>
+      <w:r>
+        <w:t xml:space="preserve">    National_ID CHAR(10) NOT NULL,</w:t>
+      </w:r>
+    </w:p>
+    <w:p>
+      <w:pPr>
+        <w:pStyle w:val="IT"/>
+      </w:pPr>
+      <w:r>
+        <w:t xml:space="preserve">    Full_Name VARCHAR(100) NOT NULL,</w:t>
+      </w:r>
+    </w:p>
+    <w:p>
+      <w:pPr>
+        <w:pStyle w:val="IT"/>
+      </w:pPr>
+      <w:r>
+        <w:t xml:space="preserve">    Date_of_Birth DATE NOT NULL,</w:t>
+      </w:r>
+    </w:p>
+    <w:p>
+      <w:pPr>
+        <w:pStyle w:val="IT"/>
+      </w:pPr>
+      <w:r>
+        <w:t xml:space="preserve">    Gender VARCHAR(10) NOT NULL,</w:t>
+      </w:r>
+    </w:p>
+    <w:p>
+      <w:pPr>
+        <w:pStyle w:val="IT"/>
+      </w:pPr>
+      <w:r>
+        <w:t xml:space="preserve">    Phone VARCHAR(15) NOT NULL,</w:t>
+      </w:r>
+    </w:p>
+    <w:p>
+      <w:pPr>
+        <w:pStyle w:val="IT"/>
+      </w:pPr>
+      <w:r>
+        <w:t xml:space="preserve">    Email VARCHAR(100),</w:t>
+      </w:r>
+    </w:p>
+    <w:p>
+      <w:pPr>
+        <w:pStyle w:val="IT"/>
+      </w:pPr>
+      <w:r>
+        <w:t xml:space="preserve">    Address VARCHAR(200),</w:t>
+      </w:r>
+    </w:p>
+    <w:p>
+      <w:pPr>
+        <w:pStyle w:val="IT"/>
+      </w:pPr>
+    </w:p>
+    <w:p>
+      <w:pPr>
+        <w:pStyle w:val="IT"/>
+      </w:pPr>
+      <w:r>
+        <w:t xml:space="preserve">    PRIMARY KEY (Patient_ID),</w:t>
+      </w:r>
+    </w:p>
+    <w:p>
+      <w:pPr>
+        <w:pStyle w:val="IT"/>
+      </w:pPr>
+      <w:r>
+        <w:t xml:space="preserve">    UNIQUE (National_ID),</w:t>
+      </w:r>
+    </w:p>
+    <w:p>
+      <w:pPr>
+        <w:pStyle w:val="IT"/>
+      </w:pPr>
+      <w:r>
+        <w:t xml:space="preserve">    UNIQUE (Phone),</w:t>
+      </w:r>
+    </w:p>
+    <w:p>
+      <w:pPr>
+        <w:pStyle w:val="IT"/>
+      </w:pPr>
+      <w:r>
+        <w:t xml:space="preserve">    UNIQUE (Email)</w:t>
+      </w:r>
+    </w:p>
+    <w:p>
+      <w:pPr>
+        <w:pStyle w:val="IT"/>
+      </w:pPr>
+      <w:r>
+        <w:t>);</w:t>
+      </w:r>
+    </w:p>
+    <w:p>
+      <w:pPr>
+        <w:pStyle w:val="IT"/>
+        <w:rPr>
+          <w:b/>
+          <w:bCs/>
+        </w:rPr>
+      </w:pPr>
+      <w:r>
+        <w:rPr>
+          <w:b/>
+          <w:bCs/>
+        </w:rPr>
+        <w:t>Doctor Table</w:t>
+      </w:r>
+    </w:p>
+    <w:p>
+      <w:pPr>
+        <w:pStyle w:val="IT"/>
+      </w:pPr>
+      <w:r>
+        <w:t>CREATE TABLE Doctor (</w:t>
+      </w:r>
+    </w:p>
+    <w:p>
+      <w:pPr>
+        <w:pStyle w:val="IT"/>
+      </w:pPr>
+      <w:r>
+        <w:t xml:space="preserve">    Doctor_ID INT AUTO_INCREMENT,</w:t>
+      </w:r>
+    </w:p>
+    <w:p>
+      <w:pPr>
+        <w:pStyle w:val="IT"/>
+      </w:pPr>
+      <w:r>
+        <w:t xml:space="preserve">    Full_Name VARCHAR(100) NOT NULL,</w:t>
+      </w:r>
+    </w:p>
+    <w:p>
+      <w:pPr>
+        <w:pStyle w:val="IT"/>
+      </w:pPr>
+      <w:r>
+        <w:t xml:space="preserve">    Specialty VARCHAR(100) NOT NULL,</w:t>
+      </w:r>
+    </w:p>
+    <w:p>
+      <w:pPr>
+        <w:pStyle w:val="IT"/>
+      </w:pPr>
+      <w:r>
+        <w:t xml:space="preserve">    License_No VARCHAR(30) NOT NULL,</w:t>
+      </w:r>
+    </w:p>
+    <w:p>
+      <w:pPr>
+        <w:pStyle w:val="IT"/>
+      </w:pPr>
+      <w:r>
+        <w:t xml:space="preserve">    Phone VARCHAR(15) NOT NULL,</w:t>
+      </w:r>
+    </w:p>
+    <w:p>
+      <w:pPr>
+        <w:pStyle w:val="IT"/>
+      </w:pPr>
+      <w:r>
+        <w:t xml:space="preserve">    Email VARCHAR(100) NOT NULL,</w:t>
+      </w:r>
+    </w:p>
+    <w:p>
+      <w:pPr>
+        <w:pStyle w:val="IT"/>
+      </w:pPr>
+      <w:r>
+        <w:t xml:space="preserve">    Doctor_Type VARCHAR(20) NOT NULL,</w:t>
+      </w:r>
+    </w:p>
+    <w:p>
+      <w:pPr>
+        <w:pStyle w:val="IT"/>
+      </w:pPr>
+    </w:p>
+    <w:p>
+      <w:pPr>
+        <w:pStyle w:val="IT"/>
+      </w:pPr>
+      <w:r>
+        <w:t xml:space="preserve">    PRIMARY KEY (Doctor_ID),</w:t>
+      </w:r>
+    </w:p>
+    <w:p>
+      <w:pPr>
+        <w:pStyle w:val="IT"/>
+      </w:pPr>
+      <w:r>
+        <w:t xml:space="preserve">    UNIQUE (License_No),</w:t>
+      </w:r>
+    </w:p>
+    <w:p>
+      <w:pPr>
+        <w:pStyle w:val="IT"/>
+      </w:pPr>
+      <w:r>
+        <w:t xml:space="preserve">    UNIQUE (Phone),</w:t>
+      </w:r>
+    </w:p>
+    <w:p>
+      <w:pPr>
+        <w:pStyle w:val="IT"/>
+      </w:pPr>
+      <w:r>
+        <w:t xml:space="preserve">    UNIQUE (Email)</w:t>
+      </w:r>
+    </w:p>
+    <w:p>
+      <w:pPr>
+        <w:pStyle w:val="IT"/>
+      </w:pPr>
+      <w:r>
+        <w:t>);</w:t>
+      </w:r>
+    </w:p>
+    <w:p>
+      <w:pPr>
+        <w:pStyle w:val="IT"/>
+        <w:rPr>
+          <w:b/>
+          <w:bCs/>
+        </w:rPr>
+      </w:pPr>
+      <w:r>
+        <w:rPr>
+          <w:b/>
+          <w:bCs/>
+        </w:rPr>
+        <w:t>Consultant Doctor Subtype</w:t>
+      </w:r>
+    </w:p>
+    <w:p>
+      <w:pPr>
+        <w:pStyle w:val="IT"/>
+      </w:pPr>
+      <w:r>
+        <w:t>CREATE TABLE Consultant_Doctor (</w:t>
+      </w:r>
+    </w:p>
+    <w:p>
+      <w:pPr>
+        <w:pStyle w:val="IT"/>
+      </w:pPr>
+      <w:r>
+        <w:t xml:space="preserve">    Doctor_ID INT,</w:t>
+      </w:r>
+    </w:p>
+    <w:p>
+      <w:pPr>
+        <w:pStyle w:val="IT"/>
+      </w:pPr>
+      <w:r>
+        <w:t xml:space="preserve">    Years_of_Experience INT NOT NULL,</w:t>
+      </w:r>
+    </w:p>
+    <w:p>
+      <w:pPr>
+        <w:pStyle w:val="IT"/>
+      </w:pPr>
+    </w:p>
+    <w:p>
+      <w:pPr>
+        <w:pStyle w:val="IT"/>
+      </w:pPr>
+      <w:r>
+        <w:t xml:space="preserve">    PRIMARY KEY (Doctor_ID),</w:t>
+      </w:r>
+    </w:p>
+    <w:p>
+      <w:pPr>
+        <w:pStyle w:val="IT"/>
+      </w:pPr>
+    </w:p>
+    <w:p>
+      <w:pPr>
+        <w:pStyle w:val="IT"/>
+      </w:pPr>
+      <w:r>
+        <w:t xml:space="preserve">    FOREIGN KEY (Doctor_ID)</w:t>
+      </w:r>
+    </w:p>
+    <w:p>
+      <w:pPr>
+        <w:pStyle w:val="IT"/>
+      </w:pPr>
+      <w:r>
+        <w:t xml:space="preserve">        REFERENCES Doctor(Doctor_ID)</w:t>
+      </w:r>
+    </w:p>
+    <w:p>
+      <w:pPr>
+        <w:pStyle w:val="IT"/>
+      </w:pPr>
+      <w:r>
+        <w:t xml:space="preserve">        ON UPDATE CASCADE</w:t>
+      </w:r>
+    </w:p>
+    <w:p>
+      <w:pPr>
+        <w:pStyle w:val="IT"/>
+      </w:pPr>
+      <w:r>
+        <w:t xml:space="preserve">        ON DELETE CASCADE</w:t>
+      </w:r>
+    </w:p>
+    <w:p>
+      <w:pPr>
+        <w:pStyle w:val="IT"/>
+      </w:pPr>
+      <w:r>
+        <w:t>);</w:t>
+      </w:r>
+    </w:p>
+    <w:p>
+      <w:pPr>
+        <w:pStyle w:val="IT"/>
+        <w:rPr>
+          <w:b/>
+          <w:bCs/>
+        </w:rPr>
+      </w:pPr>
+      <w:r>
+        <w:rPr>
+          <w:b/>
+          <w:bCs/>
+        </w:rPr>
+        <w:t>Resident Doctor Subtype</w:t>
+      </w:r>
+    </w:p>
+    <w:p>
+      <w:pPr>
+        <w:pStyle w:val="IT"/>
+      </w:pPr>
+      <w:r>
+        <w:t>CREATE TABLE Resident_Doctor (</w:t>
+      </w:r>
+    </w:p>
+    <w:p>
+      <w:pPr>
+        <w:pStyle w:val="IT"/>
+      </w:pPr>
+      <w:r>
+        <w:t xml:space="preserve">    Doctor_ID INT,</w:t>
+      </w:r>
+    </w:p>
+    <w:p>
+      <w:pPr>
+        <w:pStyle w:val="IT"/>
+      </w:pPr>
+      <w:r>
+        <w:t xml:space="preserve">    Residency_Year INT NOT NULL,</w:t>
+      </w:r>
+    </w:p>
+    <w:p>
+      <w:pPr>
+        <w:pStyle w:val="IT"/>
+      </w:pPr>
+    </w:p>
+    <w:p>
+      <w:pPr>
+        <w:pStyle w:val="IT"/>
+      </w:pPr>
+      <w:r>
+        <w:t xml:space="preserve">    PRIMARY KEY (Doctor_ID),</w:t>
+      </w:r>
+    </w:p>
+    <w:p>
+      <w:pPr>
+        <w:pStyle w:val="IT"/>
+      </w:pPr>
+    </w:p>
+    <w:p>
+      <w:pPr>
+        <w:pStyle w:val="IT"/>
+      </w:pPr>
+      <w:r>
+        <w:t xml:space="preserve">    FOREIGN KEY (Doctor_ID)</w:t>
+      </w:r>
+    </w:p>
+    <w:p>
+      <w:pPr>
+        <w:pStyle w:val="IT"/>
+      </w:pPr>
+      <w:r>
+        <w:t xml:space="preserve">        REFERENCES Doctor(Doctor_ID)</w:t>
+      </w:r>
+    </w:p>
+    <w:p>
+      <w:pPr>
+        <w:pStyle w:val="IT"/>
+      </w:pPr>
+      <w:r>
+        <w:t xml:space="preserve">        ON UPDATE CASCADE</w:t>
+      </w:r>
+    </w:p>
+    <w:p>
+      <w:pPr>
+        <w:pStyle w:val="IT"/>
+      </w:pPr>
+      <w:r>
+        <w:t xml:space="preserve">        ON DELETE CASCADE</w:t>
+      </w:r>
+    </w:p>
+    <w:p>
+      <w:pPr>
+        <w:pStyle w:val="IT"/>
+      </w:pPr>
+      <w:r>
+        <w:t>);</w:t>
+      </w:r>
+    </w:p>
+    <w:p>
+      <w:pPr>
+        <w:pStyle w:val="IT"/>
+      </w:pPr>
+      <w:r>
+        <w:t>The subtype tables use the Doctor_ID of the superclass as both their primary key and foreign key. This preserves the specialization/generalization structure designed in the EER model.</w:t>
+      </w:r>
+    </w:p>
+    <w:p>
+      <w:pPr>
+        <w:pStyle w:val="IT"/>
+        <w:rPr>
+          <w:b/>
+          <w:bCs/>
+        </w:rPr>
+      </w:pPr>
+      <w:r>
+        <w:rPr>
+          <w:b/>
+          <w:bCs/>
+        </w:rPr>
+        <w:t>Appointment Table</w:t>
+      </w:r>
+    </w:p>
+    <w:p>
+      <w:pPr>
+        <w:pStyle w:val="IT"/>
+      </w:pPr>
+      <w:r>
+        <w:t>CREATE TABLE Appointment (</w:t>
+      </w:r>
+    </w:p>
+    <w:p>
+      <w:pPr>
+        <w:pStyle w:val="IT"/>
+      </w:pPr>
+      <w:r>
+        <w:t xml:space="preserve">    Appointment_ID INT AUTO_INCREMENT,</w:t>
+      </w:r>
+    </w:p>
+    <w:p>
+      <w:pPr>
+        <w:pStyle w:val="IT"/>
+      </w:pPr>
+      <w:r>
+        <w:t xml:space="preserve">    Patient_ID INT NOT NULL,</w:t>
+      </w:r>
+    </w:p>
+    <w:p>
+      <w:pPr>
+        <w:pStyle w:val="IT"/>
+      </w:pPr>
+      <w:r>
+        <w:t xml:space="preserve">    Doctor_ID INT NOT NULL,</w:t>
+      </w:r>
+    </w:p>
+    <w:p>
+      <w:pPr>
+        <w:pStyle w:val="IT"/>
+      </w:pPr>
+      <w:r>
+        <w:t xml:space="preserve">    Appointment_Date DATE NOT NULL,</w:t>
+      </w:r>
+    </w:p>
+    <w:p>
+      <w:pPr>
+        <w:pStyle w:val="IT"/>
+      </w:pPr>
+      <w:r>
+        <w:t xml:space="preserve">    Appointment_Time TIME NOT NULL,</w:t>
+      </w:r>
+    </w:p>
+    <w:p>
+      <w:pPr>
+        <w:pStyle w:val="IT"/>
+      </w:pPr>
+      <w:r>
+        <w:t xml:space="preserve">    Visit_Reason VARCHAR(255) NOT NULL,</w:t>
+      </w:r>
+    </w:p>
+    <w:p>
+      <w:pPr>
+        <w:pStyle w:val="IT"/>
+      </w:pPr>
+      <w:r>
+        <w:t xml:space="preserve">    Status VARCHAR(20) NOT NULL,</w:t>
+      </w:r>
+    </w:p>
+    <w:p>
+      <w:pPr>
+        <w:pStyle w:val="IT"/>
+      </w:pPr>
+    </w:p>
+    <w:p>
+      <w:pPr>
+        <w:pStyle w:val="IT"/>
+      </w:pPr>
+      <w:r>
+        <w:t xml:space="preserve">    PRIMARY KEY (Appointment_ID),</w:t>
+      </w:r>
+    </w:p>
+    <w:p>
+      <w:pPr>
+        <w:pStyle w:val="IT"/>
+      </w:pPr>
+    </w:p>
+    <w:p>
+      <w:pPr>
+        <w:pStyle w:val="IT"/>
+      </w:pPr>
+      <w:r>
+        <w:t xml:space="preserve">    FOREIGN KEY (Patient_ID)</w:t>
+      </w:r>
+    </w:p>
+    <w:p>
+      <w:pPr>
+        <w:pStyle w:val="IT"/>
+      </w:pPr>
+      <w:r>
+        <w:t xml:space="preserve">        REFERENCES Patient(Patient_ID)</w:t>
+      </w:r>
+    </w:p>
+    <w:p>
+      <w:pPr>
+        <w:pStyle w:val="IT"/>
+      </w:pPr>
+      <w:r>
+        <w:t xml:space="preserve">        ON UPDATE CASCADE</w:t>
+      </w:r>
+    </w:p>
+    <w:p>
+      <w:pPr>
+        <w:pStyle w:val="IT"/>
+      </w:pPr>
+      <w:r>
+        <w:t xml:space="preserve">        ON DELETE RESTRICT,</w:t>
+      </w:r>
+    </w:p>
+    <w:p>
+      <w:pPr>
+        <w:pStyle w:val="IT"/>
+      </w:pPr>
+    </w:p>
+    <w:p>
+      <w:pPr>
+        <w:pStyle w:val="IT"/>
+      </w:pPr>
+      <w:r>
+        <w:t xml:space="preserve">    FOREIGN KEY (Doctor_ID)</w:t>
+      </w:r>
+    </w:p>
+    <w:p>
+      <w:pPr>
+        <w:pStyle w:val="IT"/>
+      </w:pPr>
+      <w:r>
+        <w:t xml:space="preserve">        REFERENCES Doctor(Doctor_ID)</w:t>
+      </w:r>
+    </w:p>
+    <w:p>
+      <w:pPr>
+        <w:pStyle w:val="IT"/>
+      </w:pPr>
+      <w:r>
+        <w:t xml:space="preserve">        ON UPDATE CASCADE</w:t>
+      </w:r>
+    </w:p>
+    <w:p>
+      <w:pPr>
+        <w:pStyle w:val="IT"/>
+      </w:pPr>
+      <w:r>
+        <w:t xml:space="preserve">        ON DELETE RESTRICT,</w:t>
+      </w:r>
+    </w:p>
+    <w:p>
+      <w:pPr>
+        <w:pStyle w:val="IT"/>
+      </w:pPr>
+    </w:p>
+    <w:p>
+      <w:pPr>
+        <w:pStyle w:val="IT"/>
+      </w:pPr>
+      <w:r>
+        <w:t xml:space="preserve">    UNIQUE (Doctor_ID, Appointment_Date, Appointment_Time)</w:t>
+      </w:r>
+    </w:p>
+    <w:p>
+      <w:pPr>
+        <w:pStyle w:val="IT"/>
+      </w:pPr>
+      <w:r>
+        <w:t>);</w:t>
+      </w:r>
+    </w:p>
+    <w:p>
+      <w:pPr>
+        <w:pStyle w:val="IT"/>
+      </w:pPr>
+      <w:r>
+        <w:t>The foreign keys ensure that an appointment cannot reference a patient or doctor who does not exist. Foreign-key constraints are important because inserting a reference to a nonexistent primary-key value would violate referential integrity.</w:t>
+      </w:r>
+    </w:p>
+    <w:p>
+      <w:pPr>
+        <w:pStyle w:val="IT"/>
+        <w:rPr>
+          <w:b/>
+          <w:bCs/>
+        </w:rPr>
+      </w:pPr>
+      <w:r>
+        <w:rPr>
+          <w:b/>
+          <w:bCs/>
+        </w:rPr>
+        <w:t>Medicine Table</w:t>
+      </w:r>
+    </w:p>
+    <w:p>
+      <w:pPr>
+        <w:pStyle w:val="IT"/>
+      </w:pPr>
+      <w:r>
+        <w:t>CREATE TABLE Medicine (</w:t>
+      </w:r>
+    </w:p>
+    <w:p>
+      <w:pPr>
+        <w:pStyle w:val="IT"/>
+      </w:pPr>
+      <w:r>
+        <w:t xml:space="preserve">    Medicine_ID INT AUTO_INCREMENT,</w:t>
+      </w:r>
+    </w:p>
+    <w:p>
+      <w:pPr>
+        <w:pStyle w:val="IT"/>
+      </w:pPr>
+      <w:r>
+        <w:t xml:space="preserve">    Medicine_Name VARCHAR(100) NOT NULL,</w:t>
+      </w:r>
+    </w:p>
+    <w:p>
+      <w:pPr>
+        <w:pStyle w:val="IT"/>
+      </w:pPr>
+      <w:r>
+        <w:t xml:space="preserve">    Description VARCHAR(255),</w:t>
+      </w:r>
+    </w:p>
+    <w:p>
+      <w:pPr>
+        <w:pStyle w:val="IT"/>
+      </w:pPr>
+      <w:r>
+        <w:t xml:space="preserve">    Unit_Price DECIMAL(8,2) NOT NULL,</w:t>
+      </w:r>
+    </w:p>
+    <w:p>
+      <w:pPr>
+        <w:pStyle w:val="IT"/>
+      </w:pPr>
+      <w:r>
+        <w:t xml:space="preserve">    Stock_Quantity INT NOT NULL,</w:t>
+      </w:r>
+    </w:p>
+    <w:p>
+      <w:pPr>
+        <w:pStyle w:val="IT"/>
+      </w:pPr>
+    </w:p>
+    <w:p>
+      <w:pPr>
+        <w:pStyle w:val="IT"/>
+      </w:pPr>
+      <w:r>
+        <w:t xml:space="preserve">    PRIMARY KEY (Medicine_ID),</w:t>
+      </w:r>
+    </w:p>
+    <w:p>
+      <w:pPr>
+        <w:pStyle w:val="IT"/>
+      </w:pPr>
+      <w:r>
+        <w:t xml:space="preserve">    UNIQUE (Medicine_Name)</w:t>
+      </w:r>
+    </w:p>
+    <w:p>
+      <w:pPr>
+        <w:pStyle w:val="IT"/>
+      </w:pPr>
+      <w:r>
+        <w:t>);</w:t>
+      </w:r>
+    </w:p>
+    <w:p>
+      <w:pPr>
+        <w:pStyle w:val="IT"/>
+        <w:rPr>
+          <w:b/>
+          <w:bCs/>
+        </w:rPr>
+      </w:pPr>
+      <w:r>
+        <w:rPr>
+          <w:b/>
+          <w:bCs/>
+        </w:rPr>
+        <w:t>Treatment Table</w:t>
+      </w:r>
+    </w:p>
+    <w:p>
+      <w:pPr>
+        <w:pStyle w:val="IT"/>
+      </w:pPr>
+      <w:r>
+        <w:t>CREATE TABLE Treatment (</w:t>
+      </w:r>
+    </w:p>
+    <w:p>
+      <w:pPr>
+        <w:pStyle w:val="IT"/>
+      </w:pPr>
+      <w:r>
+        <w:t xml:space="preserve">    Treatment_ID INT AUTO_INCREMENT,</w:t>
+      </w:r>
+    </w:p>
+    <w:p>
+      <w:pPr>
+        <w:pStyle w:val="IT"/>
+      </w:pPr>
+      <w:r>
+        <w:t xml:space="preserve">    Appointment_ID INT NOT NULL,</w:t>
+      </w:r>
+    </w:p>
+    <w:p>
+      <w:pPr>
+        <w:pStyle w:val="IT"/>
+      </w:pPr>
+      <w:r>
+        <w:t xml:space="preserve">    Medicine_ID INT,</w:t>
+      </w:r>
+    </w:p>
+    <w:p>
+      <w:pPr>
+        <w:pStyle w:val="IT"/>
+      </w:pPr>
+      <w:r>
+        <w:t xml:space="preserve">    Diagnosis VARCHAR(255) NOT NULL,</w:t>
+      </w:r>
+    </w:p>
+    <w:p>
+      <w:pPr>
+        <w:pStyle w:val="IT"/>
+      </w:pPr>
+      <w:r>
+        <w:t xml:space="preserve">    Procedure_Name VARCHAR(150) NOT NULL,</w:t>
+      </w:r>
+    </w:p>
+    <w:p>
+      <w:pPr>
+        <w:pStyle w:val="IT"/>
+      </w:pPr>
+      <w:r>
+        <w:t xml:space="preserve">    Notes VARCHAR(500),</w:t>
+      </w:r>
+    </w:p>
+    <w:p>
+      <w:pPr>
+        <w:pStyle w:val="IT"/>
+      </w:pPr>
+      <w:r>
+        <w:t xml:space="preserve">    Cost DECIMAL(10,2) NOT NULL,</w:t>
+      </w:r>
+    </w:p>
+    <w:p>
+      <w:pPr>
+        <w:pStyle w:val="IT"/>
+      </w:pPr>
+    </w:p>
+    <w:p>
+      <w:pPr>
+        <w:pStyle w:val="IT"/>
+      </w:pPr>
+      <w:r>
+        <w:t xml:space="preserve">    PRIMARY KEY (Treatment_ID),</w:t>
+      </w:r>
+    </w:p>
+    <w:p>
+      <w:pPr>
+        <w:pStyle w:val="IT"/>
+      </w:pPr>
+    </w:p>
+    <w:p>
+      <w:pPr>
+        <w:pStyle w:val="IT"/>
+      </w:pPr>
+      <w:r>
+        <w:t xml:space="preserve">    FOREIGN KEY (Appointment_ID)</w:t>
+      </w:r>
+    </w:p>
+    <w:p>
+      <w:pPr>
+        <w:pStyle w:val="IT"/>
+      </w:pPr>
+      <w:r>
+        <w:t xml:space="preserve">        REFERENCES Appointment(Appointment_ID)</w:t>
+      </w:r>
+    </w:p>
+    <w:p>
+      <w:pPr>
+        <w:pStyle w:val="IT"/>
+      </w:pPr>
+      <w:r>
+        <w:t xml:space="preserve">        ON UPDATE CASCADE</w:t>
+      </w:r>
+    </w:p>
+    <w:p>
+      <w:pPr>
+        <w:pStyle w:val="IT"/>
+      </w:pPr>
+      <w:r>
+        <w:t xml:space="preserve">        ON DELETE RESTRICT,</w:t>
+      </w:r>
+    </w:p>
+    <w:p>
+      <w:pPr>
+        <w:pStyle w:val="IT"/>
+      </w:pPr>
+    </w:p>
+    <w:p>
+      <w:pPr>
+        <w:pStyle w:val="IT"/>
+      </w:pPr>
+      <w:r>
+        <w:t xml:space="preserve">    FOREIGN KEY (Medicine_ID)</w:t>
+      </w:r>
+    </w:p>
+    <w:p>
+      <w:pPr>
+        <w:pStyle w:val="IT"/>
+      </w:pPr>
+      <w:r>
+        <w:t xml:space="preserve">        REFERENCES Medicine(Medicine_ID)</w:t>
+      </w:r>
+    </w:p>
+    <w:p>
+      <w:pPr>
+        <w:pStyle w:val="IT"/>
+      </w:pPr>
+      <w:r>
+        <w:t xml:space="preserve">        ON UPDATE CASCADE</w:t>
+      </w:r>
+    </w:p>
+    <w:p>
+      <w:pPr>
+        <w:pStyle w:val="IT"/>
+      </w:pPr>
+      <w:r>
+        <w:t xml:space="preserve">        ON DELETE RESTRICT</w:t>
+      </w:r>
+    </w:p>
+    <w:p>
+      <w:pPr>
+        <w:pStyle w:val="IT"/>
+      </w:pPr>
+      <w:r>
+        <w:t>);</w:t>
+      </w:r>
+    </w:p>
+    <w:p>
+      <w:pPr>
+        <w:pStyle w:val="IT"/>
+        <w:rPr>
+          <w:b/>
+          <w:bCs/>
+        </w:rPr>
+      </w:pPr>
+      <w:r>
+        <w:rPr>
+          <w:b/>
+          <w:bCs/>
+        </w:rPr>
+        <w:t>Payment Table</w:t>
+      </w:r>
+    </w:p>
+    <w:p>
+      <w:pPr>
+        <w:pStyle w:val="IT"/>
+      </w:pPr>
+      <w:r>
+        <w:t>CREATE TABLE Payment (</w:t>
+      </w:r>
+    </w:p>
+    <w:p>
+      <w:pPr>
+        <w:pStyle w:val="IT"/>
+      </w:pPr>
+      <w:r>
+        <w:t xml:space="preserve">    Payment_ID INT AUTO_INCREMENT,</w:t>
+      </w:r>
+    </w:p>
+    <w:p>
+      <w:pPr>
+        <w:pStyle w:val="IT"/>
+      </w:pPr>
+      <w:r>
+        <w:t xml:space="preserve">    Appointment_ID INT NOT NULL,</w:t>
+      </w:r>
+    </w:p>
+    <w:p>
+      <w:pPr>
+        <w:pStyle w:val="IT"/>
+      </w:pPr>
+      <w:r>
+        <w:t xml:space="preserve">    Amount DECIMAL(10,2) NOT NULL,</w:t>
+      </w:r>
+    </w:p>
+    <w:p>
+      <w:pPr>
+        <w:pStyle w:val="IT"/>
+      </w:pPr>
+      <w:r>
+        <w:t xml:space="preserve">    Payment_Date DATE NOT NULL,</w:t>
+      </w:r>
+    </w:p>
+    <w:p>
+      <w:pPr>
+        <w:pStyle w:val="IT"/>
+      </w:pPr>
+      <w:r>
+        <w:t xml:space="preserve">    Payment_Method VARCHAR(30) NOT NULL,</w:t>
+      </w:r>
+    </w:p>
+    <w:p>
+      <w:pPr>
+        <w:pStyle w:val="IT"/>
+      </w:pPr>
+      <w:r>
+        <w:t xml:space="preserve">    Payment_Status VARCHAR(20) NOT NULL,</w:t>
+      </w:r>
+    </w:p>
+    <w:p>
+      <w:pPr>
+        <w:pStyle w:val="IT"/>
+      </w:pPr>
+      <w:r>
+        <w:t xml:space="preserve">    Payment_Type VARCHAR(30) NOT NULL,</w:t>
+      </w:r>
+    </w:p>
+    <w:p>
+      <w:pPr>
+        <w:pStyle w:val="IT"/>
+      </w:pPr>
+    </w:p>
+    <w:p>
+      <w:pPr>
+        <w:pStyle w:val="IT"/>
+      </w:pPr>
+      <w:r>
+        <w:t xml:space="preserve">    PRIMARY KEY (Payment_ID),</w:t>
+      </w:r>
+    </w:p>
+    <w:p>
+      <w:pPr>
+        <w:pStyle w:val="IT"/>
+      </w:pPr>
+    </w:p>
+    <w:p>
+      <w:pPr>
+        <w:pStyle w:val="IT"/>
+      </w:pPr>
+      <w:r>
+        <w:t xml:space="preserve">    FOREIGN KEY (Appointment_ID)</w:t>
+      </w:r>
+    </w:p>
+    <w:p>
+      <w:pPr>
+        <w:pStyle w:val="IT"/>
+      </w:pPr>
+      <w:r>
+        <w:t xml:space="preserve">        REFERENCES Appointment(Appointment_ID)</w:t>
+      </w:r>
+    </w:p>
+    <w:p>
+      <w:pPr>
+        <w:pStyle w:val="IT"/>
+      </w:pPr>
+      <w:r>
+        <w:t xml:space="preserve">        ON UPDATE CASCADE</w:t>
+      </w:r>
+    </w:p>
+    <w:p>
+      <w:pPr>
+        <w:pStyle w:val="IT"/>
+      </w:pPr>
+      <w:r>
+        <w:t xml:space="preserve">        ON DELETE RESTRICT</w:t>
+      </w:r>
+    </w:p>
+    <w:p>
+      <w:pPr>
+        <w:pStyle w:val="IT"/>
+      </w:pPr>
+      <w:r>
+        <w:t>);</w:t>
+      </w:r>
+    </w:p>
+    <w:p>
+      <w:pPr>
+        <w:pStyle w:val="IT"/>
+      </w:pPr>
+      <w:r>
+        <w:rPr>
+          <w:noProof/>
+        </w:rPr>
+        <w:drawing>
+          <wp:inline distT="0" distB="0" distL="0" distR="0" wp14:anchorId="17C7AB40" wp14:editId="62016C46">
+            <wp:extent cx="5349240" cy="1959610"/>
+            <wp:effectExtent l="0" t="0" r="3810" b="2540"/>
+            <wp:docPr id="640978079" name="Picture 1"/>
+            <wp:cNvGraphicFramePr>
+              <a:graphicFrameLocks xmlns:a="http://schemas.openxmlformats.org/drawingml/2006/main" noChangeAspect="1"/>
+            </wp:cNvGraphicFramePr>
+            <a:graphic xmlns:a="http://schemas.openxmlformats.org/drawingml/2006/main">
+              <a:graphicData uri="http://schemas.openxmlformats.org/drawingml/2006/picture">
+                <pic:pic xmlns:pic="http://schemas.openxmlformats.org/drawingml/2006/picture">
+                  <pic:nvPicPr>
+                    <pic:cNvPr id="640978079" name=""/>
+                    <pic:cNvPicPr/>
+                  </pic:nvPicPr>
+                  <pic:blipFill>
+                    <a:blip r:embed="rId18"/>
+                    <a:stretch>
+                      <a:fillRect/>
+                    </a:stretch>
+                  </pic:blipFill>
+                  <pic:spPr>
+                    <a:xfrm>
+                      <a:off x="0" y="0"/>
+                      <a:ext cx="5349240" cy="1959610"/>
+                    </a:xfrm>
+                    <a:prstGeom prst="rect">
+                      <a:avLst/>
+                    </a:prstGeom>
+                  </pic:spPr>
+                </pic:pic>
+              </a:graphicData>
+            </a:graphic>
+          </wp:inline>
+        </w:drawing>
+      </w:r>
+    </w:p>
+    <w:p>
+      <w:pPr>
+        <w:pStyle w:val="IT"/>
       </w:pPr>
     </w:p>
     <w:p>
@@ -6595,7 +8358,7 @@
       </w:pPr>
     </w:p>
     <w:sectPr>
-      <w:headerReference w:type="default" r:id="rId17"/>
+      <w:headerReference w:type="default" r:id="rId19"/>
       <w:pgSz w:w="12240" w:h="15840"/>
       <w:pgMar w:top="1080" w:right="720" w:bottom="1800" w:left="3096" w:header="1080" w:footer="720" w:gutter="0"/>
       <w:pgNumType w:start="1"/>
@@ -7613,7 +9376,7 @@
               <w:rPr>
                 <w:noProof/>
               </w:rPr>
-              <w:instrText>Deliverables</w:instrText>
+              <w:instrText>Task 2 – Database Implementation (6 Marks)</w:instrText>
             </w:r>
           </w:fldSimple>
           <w:r>
@@ -7624,7 +9387,7 @@
               <w:rPr>
                 <w:noProof/>
               </w:rPr>
-              <w:instrText>Deliverables</w:instrText>
+              <w:instrText>Task 2 – Database Implementation (6 Marks)</w:instrText>
             </w:r>
           </w:fldSimple>
           <w:r>
@@ -7637,7 +9400,7 @@
             <w:rPr>
               <w:noProof/>
             </w:rPr>
-            <w:t xml:space="preserve">Deliverables </w:t>
+            <w:t xml:space="preserve">Task 2 – Database Implementation (6 Marks) </w:t>
           </w:r>
           <w:r>
             <w:fldChar w:fldCharType="end"/>
@@ -7829,6 +9592,119 @@
     </w:lvl>
   </w:abstractNum>
   <w:abstractNum w:abstractNumId="2" w15:restartNumberingAfterBreak="0">
+    <w:nsid w:val="0B3F1D07"/>
+    <w:multiLevelType w:val="multilevel"/>
+    <w:tmpl w:val="8E0E59BA"/>
+    <w:lvl w:ilvl="0">
+      <w:start w:val="1"/>
+      <w:numFmt w:val="decimal"/>
+      <w:lvlText w:val="%1."/>
+      <w:lvlJc w:val="left"/>
+      <w:pPr>
+        <w:tabs>
+          <w:tab w:val="num" w:pos="720"/>
+        </w:tabs>
+        <w:ind w:left="720" w:hanging="360"/>
+      </w:pPr>
+    </w:lvl>
+    <w:lvl w:ilvl="1" w:tentative="1">
+      <w:start w:val="1"/>
+      <w:numFmt w:val="decimal"/>
+      <w:lvlText w:val="%2."/>
+      <w:lvlJc w:val="left"/>
+      <w:pPr>
+        <w:tabs>
+          <w:tab w:val="num" w:pos="1440"/>
+        </w:tabs>
+        <w:ind w:left="1440" w:hanging="360"/>
+      </w:pPr>
+    </w:lvl>
+    <w:lvl w:ilvl="2" w:tentative="1">
+      <w:start w:val="1"/>
+      <w:numFmt w:val="decimal"/>
+      <w:lvlText w:val="%3."/>
+      <w:lvlJc w:val="left"/>
+      <w:pPr>
+        <w:tabs>
+          <w:tab w:val="num" w:pos="2160"/>
+        </w:tabs>
+        <w:ind w:left="2160" w:hanging="360"/>
+      </w:pPr>
+    </w:lvl>
+    <w:lvl w:ilvl="3" w:tentative="1">
+      <w:start w:val="1"/>
+      <w:numFmt w:val="decimal"/>
+      <w:lvlText w:val="%4."/>
+      <w:lvlJc w:val="left"/>
+      <w:pPr>
+        <w:tabs>
+          <w:tab w:val="num" w:pos="2880"/>
+        </w:tabs>
+        <w:ind w:left="2880" w:hanging="360"/>
+      </w:pPr>
+    </w:lvl>
+    <w:lvl w:ilvl="4" w:tentative="1">
+      <w:start w:val="1"/>
+      <w:numFmt w:val="decimal"/>
+      <w:lvlText w:val="%5."/>
+      <w:lvlJc w:val="left"/>
+      <w:pPr>
+        <w:tabs>
+          <w:tab w:val="num" w:pos="3600"/>
+        </w:tabs>
+        <w:ind w:left="3600" w:hanging="360"/>
+      </w:pPr>
+    </w:lvl>
+    <w:lvl w:ilvl="5" w:tentative="1">
+      <w:start w:val="1"/>
+      <w:numFmt w:val="decimal"/>
+      <w:lvlText w:val="%6."/>
+      <w:lvlJc w:val="left"/>
+      <w:pPr>
+        <w:tabs>
+          <w:tab w:val="num" w:pos="4320"/>
+        </w:tabs>
+        <w:ind w:left="4320" w:hanging="360"/>
+      </w:pPr>
+    </w:lvl>
+    <w:lvl w:ilvl="6" w:tentative="1">
+      <w:start w:val="1"/>
+      <w:numFmt w:val="decimal"/>
+      <w:lvlText w:val="%7."/>
+      <w:lvlJc w:val="left"/>
+      <w:pPr>
+        <w:tabs>
+          <w:tab w:val="num" w:pos="5040"/>
+        </w:tabs>
+        <w:ind w:left="5040" w:hanging="360"/>
+      </w:pPr>
+    </w:lvl>
+    <w:lvl w:ilvl="7" w:tentative="1">
+      <w:start w:val="1"/>
+      <w:numFmt w:val="decimal"/>
+      <w:lvlText w:val="%8."/>
+      <w:lvlJc w:val="left"/>
+      <w:pPr>
+        <w:tabs>
+          <w:tab w:val="num" w:pos="5760"/>
+        </w:tabs>
+        <w:ind w:left="5760" w:hanging="360"/>
+      </w:pPr>
+    </w:lvl>
+    <w:lvl w:ilvl="8" w:tentative="1">
+      <w:start w:val="1"/>
+      <w:numFmt w:val="decimal"/>
+      <w:lvlText w:val="%9."/>
+      <w:lvlJc w:val="left"/>
+      <w:pPr>
+        <w:tabs>
+          <w:tab w:val="num" w:pos="6480"/>
+        </w:tabs>
+        <w:ind w:left="6480" w:hanging="360"/>
+      </w:pPr>
+    </w:lvl>
+  </w:abstractNum>
+  <w:abstractNum w:abstractNumId="3" w15:restartNumberingAfterBreak="0">
     <w:nsid w:val="1CAD4C51"/>
     <w:multiLevelType w:val="multilevel"/>
     <w:tmpl w:val="1CAD4C51"/>
@@ -7917,7 +9793,156 @@
       </w:pPr>
     </w:lvl>
   </w:abstractNum>
-  <w:abstractNum w:abstractNumId="3" w15:restartNumberingAfterBreak="0">
+  <w:abstractNum w:abstractNumId="4" w15:restartNumberingAfterBreak="0">
+    <w:nsid w:val="1DD2287F"/>
+    <w:multiLevelType w:val="multilevel"/>
+    <w:tmpl w:val="7D56E722"/>
+    <w:lvl w:ilvl="0">
+      <w:start w:val="1"/>
+      <w:numFmt w:val="bullet"/>
+      <w:lvlText w:val=""/>
+      <w:lvlJc w:val="left"/>
+      <w:pPr>
+        <w:tabs>
+          <w:tab w:val="num" w:pos="720"/>
+        </w:tabs>
+        <w:ind w:left="720" w:hanging="360"/>
+      </w:pPr>
+      <w:rPr>
+        <w:rFonts w:ascii="Symbol" w:hAnsi="Symbol" w:hint="default"/>
+        <w:sz w:val="20"/>
+      </w:rPr>
+    </w:lvl>
+    <w:lvl w:ilvl="1" w:tentative="1">
+      <w:start w:val="1"/>
+      <w:numFmt w:val="bullet"/>
+      <w:lvlText w:val="o"/>
+      <w:lvlJc w:val="left"/>
+      <w:pPr>
+        <w:tabs>
+          <w:tab w:val="num" w:pos="1440"/>
+        </w:tabs>
+        <w:ind w:left="1440" w:hanging="360"/>
+      </w:pPr>
+      <w:rPr>
+        <w:rFonts w:ascii="Courier New" w:hAnsi="Courier New" w:hint="default"/>
+        <w:sz w:val="20"/>
+      </w:rPr>
+    </w:lvl>
+    <w:lvl w:ilvl="2" w:tentative="1">
+      <w:start w:val="1"/>
+      <w:numFmt w:val="bullet"/>
+      <w:lvlText w:val=""/>
+      <w:lvlJc w:val="left"/>
+      <w:pPr>
+        <w:tabs>
+          <w:tab w:val="num" w:pos="2160"/>
+        </w:tabs>
+        <w:ind w:left="2160" w:hanging="360"/>
+      </w:pPr>
+      <w:rPr>
+        <w:rFonts w:ascii="Wingdings" w:hAnsi="Wingdings" w:hint="default"/>
+        <w:sz w:val="20"/>
+      </w:rPr>
+    </w:lvl>
+    <w:lvl w:ilvl="3" w:tentative="1">
+      <w:start w:val="1"/>
+      <w:numFmt w:val="bullet"/>
+      <w:lvlText w:val=""/>
+      <w:lvlJc w:val="left"/>
+      <w:pPr>
+        <w:tabs>
+          <w:tab w:val="num" w:pos="2880"/>
+        </w:tabs>
+        <w:ind w:left="2880" w:hanging="360"/>
+      </w:pPr>
+      <w:rPr>
+        <w:rFonts w:ascii="Wingdings" w:hAnsi="Wingdings" w:hint="default"/>
+        <w:sz w:val="20"/>
+      </w:rPr>
+    </w:lvl>
+    <w:lvl w:ilvl="4" w:tentative="1">
+      <w:start w:val="1"/>
+      <w:numFmt w:val="bullet"/>
+      <w:lvlText w:val=""/>
+      <w:lvlJc w:val="left"/>
+      <w:pPr>
+        <w:tabs>
+          <w:tab w:val="num" w:pos="3600"/>
+        </w:tabs>
+        <w:ind w:left="3600" w:hanging="360"/>
+      </w:pPr>
+      <w:rPr>
+        <w:rFonts w:ascii="Wingdings" w:hAnsi="Wingdings" w:hint="default"/>
+        <w:sz w:val="20"/>
+      </w:rPr>
+    </w:lvl>
+    <w:lvl w:ilvl="5" w:tentative="1">
+      <w:start w:val="1"/>
+      <w:numFmt w:val="bullet"/>
+      <w:lvlText w:val=""/>
+      <w:lvlJc w:val="left"/>
+      <w:pPr>
+        <w:tabs>
+          <w:tab w:val="num" w:pos="4320"/>
+        </w:tabs>
+        <w:ind w:left="4320" w:hanging="360"/>
+      </w:pPr>
+      <w:rPr>
+        <w:rFonts w:ascii="Wingdings" w:hAnsi="Wingdings" w:hint="default"/>
+        <w:sz w:val="20"/>
+      </w:rPr>
+    </w:lvl>
+    <w:lvl w:ilvl="6" w:tentative="1">
+      <w:start w:val="1"/>
+      <w:numFmt w:val="bullet"/>
+      <w:lvlText w:val=""/>
+      <w:lvlJc w:val="left"/>
+      <w:pPr>
+        <w:tabs>
+          <w:tab w:val="num" w:pos="5040"/>
+        </w:tabs>
+        <w:ind w:left="5040" w:hanging="360"/>
+      </w:pPr>
+      <w:rPr>
+        <w:rFonts w:ascii="Wingdings" w:hAnsi="Wingdings" w:hint="default"/>
+        <w:sz w:val="20"/>
+      </w:rPr>
+    </w:lvl>
+    <w:lvl w:ilvl="7" w:tentative="1">
+      <w:start w:val="1"/>
+      <w:numFmt w:val="bullet"/>
+      <w:lvlText w:val=""/>
+      <w:lvlJc w:val="left"/>
+      <w:pPr>
+        <w:tabs>
+          <w:tab w:val="num" w:pos="5760"/>
+        </w:tabs>
+        <w:ind w:left="5760" w:hanging="360"/>
+      </w:pPr>
+      <w:rPr>
+        <w:rFonts w:ascii="Wingdings" w:hAnsi="Wingdings" w:hint="default"/>
+        <w:sz w:val="20"/>
+      </w:rPr>
+    </w:lvl>
+    <w:lvl w:ilvl="8" w:tentative="1">
+      <w:start w:val="1"/>
+      <w:numFmt w:val="bullet"/>
+      <w:lvlText w:val=""/>
+      <w:lvlJc w:val="left"/>
+      <w:pPr>
+        <w:tabs>
+          <w:tab w:val="num" w:pos="6480"/>
+        </w:tabs>
+        <w:ind w:left="6480" w:hanging="360"/>
+      </w:pPr>
+      <w:rPr>
+        <w:rFonts w:ascii="Wingdings" w:hAnsi="Wingdings" w:hint="default"/>
+        <w:sz w:val="20"/>
+      </w:rPr>
+    </w:lvl>
+  </w:abstractNum>
+  <w:abstractNum w:abstractNumId="5" w15:restartNumberingAfterBreak="0">
     <w:nsid w:val="24796DF9"/>
     <w:multiLevelType w:val="multilevel"/>
     <w:tmpl w:val="24796DF9"/>
@@ -8041,7 +10066,7 @@
       </w:rPr>
     </w:lvl>
   </w:abstractNum>
-  <w:abstractNum w:abstractNumId="4" w15:restartNumberingAfterBreak="0">
+  <w:abstractNum w:abstractNumId="6" w15:restartNumberingAfterBreak="0">
     <w:nsid w:val="28044A04"/>
     <w:multiLevelType w:val="multilevel"/>
     <w:tmpl w:val="28044A04"/>
@@ -8127,7 +10152,7 @@
       </w:pPr>
     </w:lvl>
   </w:abstractNum>
-  <w:abstractNum w:abstractNumId="5" w15:restartNumberingAfterBreak="0">
+  <w:abstractNum w:abstractNumId="7" w15:restartNumberingAfterBreak="0">
     <w:nsid w:val="367F6A45"/>
     <w:multiLevelType w:val="multilevel"/>
     <w:tmpl w:val="367F6A45"/>
@@ -8250,7 +10275,7 @@
       </w:rPr>
     </w:lvl>
   </w:abstractNum>
-  <w:abstractNum w:abstractNumId="6" w15:restartNumberingAfterBreak="0">
+  <w:abstractNum w:abstractNumId="8" w15:restartNumberingAfterBreak="0">
     <w:nsid w:val="39DB541F"/>
     <w:multiLevelType w:val="multilevel"/>
     <w:tmpl w:val="39DB541F"/>
@@ -8363,7 +10388,7 @@
       </w:pPr>
     </w:lvl>
   </w:abstractNum>
-  <w:abstractNum w:abstractNumId="7" w15:restartNumberingAfterBreak="0">
+  <w:abstractNum w:abstractNumId="9" w15:restartNumberingAfterBreak="0">
     <w:nsid w:val="44EE13B5"/>
     <w:multiLevelType w:val="multilevel"/>
     <w:tmpl w:val="44EE13B5"/>
@@ -8479,7 +10504,7 @@
       </w:rPr>
     </w:lvl>
   </w:abstractNum>
-  <w:abstractNum w:abstractNumId="8" w15:restartNumberingAfterBreak="0">
+  <w:abstractNum w:abstractNumId="10" w15:restartNumberingAfterBreak="0">
     <w:nsid w:val="7E1D6510"/>
     <w:multiLevelType w:val="multilevel"/>
     <w:tmpl w:val="B0F2A73E"/>
@@ -8632,28 +10657,34 @@
     <w:abstractNumId w:val="0"/>
   </w:num>
   <w:num w:numId="2" w16cid:durableId="1314869028">
+    <w:abstractNumId w:val="7"/>
+  </w:num>
+  <w:num w:numId="3" w16cid:durableId="107310899">
+    <w:abstractNumId w:val="9"/>
+  </w:num>
+  <w:num w:numId="4" w16cid:durableId="997616318">
+    <w:abstractNumId w:val="6"/>
+  </w:num>
+  <w:num w:numId="5" w16cid:durableId="1353646428">
     <w:abstractNumId w:val="5"/>
   </w:num>
-  <w:num w:numId="3" w16cid:durableId="107310899">
-    <w:abstractNumId w:val="7"/>
-  </w:num>
-  <w:num w:numId="4" w16cid:durableId="997616318">
-    <w:abstractNumId w:val="4"/>
-  </w:num>
-  <w:num w:numId="5" w16cid:durableId="1353646428">
+  <w:num w:numId="6" w16cid:durableId="478571207">
     <w:abstractNumId w:val="3"/>
   </w:num>
-  <w:num w:numId="6" w16cid:durableId="478571207">
-    <w:abstractNumId w:val="2"/>
-  </w:num>
   <w:num w:numId="7" w16cid:durableId="1984583047">
-    <w:abstractNumId w:val="6"/>
+    <w:abstractNumId w:val="8"/>
   </w:num>
   <w:num w:numId="8" w16cid:durableId="2098819042">
     <w:abstractNumId w:val="1"/>
   </w:num>
   <w:num w:numId="9" w16cid:durableId="1168908523">
-    <w:abstractNumId w:val="8"/>
+    <w:abstractNumId w:val="10"/>
+  </w:num>
+  <w:num w:numId="10" w16cid:durableId="1644695652">
+    <w:abstractNumId w:val="4"/>
+  </w:num>
+  <w:num w:numId="11" w16cid:durableId="1683168174">
+    <w:abstractNumId w:val="2"/>
   </w:num>
 </w:numbering>
 </file>
@@ -10263,19 +12294,19 @@
     <w:pitch w:val="variable"/>
     <w:sig w:usb0="00000000" w:usb1="10000000" w:usb2="00000000" w:usb3="00000000" w:csb0="80000000" w:csb1="00000000"/>
   </w:font>
+  <w:font w:name="Courier New">
+    <w:panose1 w:val="02070309020205020404"/>
+    <w:charset w:val="00"/>
+    <w:family w:val="modern"/>
+    <w:pitch w:val="fixed"/>
+    <w:sig w:usb0="E0002EFF" w:usb1="C0007843" w:usb2="00000009" w:usb3="00000000" w:csb0="000001FF" w:csb1="00000000"/>
+  </w:font>
   <w:font w:name="Wingdings">
     <w:panose1 w:val="05000000000000000000"/>
     <w:charset w:val="02"/>
     <w:family w:val="auto"/>
     <w:pitch w:val="variable"/>
     <w:sig w:usb0="00000000" w:usb1="10000000" w:usb2="00000000" w:usb3="00000000" w:csb0="80000000" w:csb1="00000000"/>
-  </w:font>
-  <w:font w:name="Courier New">
-    <w:panose1 w:val="02070309020205020404"/>
-    <w:charset w:val="00"/>
-    <w:family w:val="modern"/>
-    <w:pitch w:val="fixed"/>
-    <w:sig w:usb0="E0002EFF" w:usb1="C0007843" w:usb2="00000009" w:usb3="00000000" w:csb0="000001FF" w:csb1="00000000"/>
   </w:font>
   <w:font w:name="Arial">
     <w:panose1 w:val="020B0604020202020204"/>
@@ -10442,6 +12473,7 @@
     <w:rsid w:val="00902777"/>
     <w:rsid w:val="00925156"/>
     <w:rsid w:val="00977680"/>
+    <w:rsid w:val="009917E5"/>
     <w:rsid w:val="009955B4"/>
     <w:rsid w:val="009A2761"/>
     <w:rsid w:val="00A53609"/>
@@ -11329,16 +13361,16 @@
 </file>
 
 <file path=customXml/item3.xml><?xml version="1.0" encoding="utf-8"?>
-<b:Sources xmlns:b="http://schemas.openxmlformats.org/officeDocument/2006/bibliography" SelectedStyle="\APA.XSL" StyleName="APA"/>
-</file>
-
-<file path=customXml/item4.xml><?xml version="1.0" encoding="utf-8"?>
 <?mso-contentType ?>
 <FormTemplates xmlns="http://schemas.microsoft.com/sharepoint/v3/contenttype/forms">
   <Display>DocumentLibraryForm</Display>
   <Edit>AssetEditForm</Edit>
   <New>DocumentLibraryForm</New>
 </FormTemplates>
+</file>
+
+<file path=customXml/item4.xml><?xml version="1.0" encoding="utf-8"?>
+<b:Sources xmlns:b="http://schemas.openxmlformats.org/officeDocument/2006/bibliography" SelectedStyle="\APA.XSL" StyleName="APA"/>
 </file>
 
 <file path=customXml/itemProps1.xml><?xml version="1.0" encoding="utf-8"?>
@@ -11358,17 +13390,17 @@
 </file>
 
 <file path=customXml/itemProps3.xml><?xml version="1.0" encoding="utf-8"?>
+<ds:datastoreItem xmlns:ds="http://schemas.openxmlformats.org/officeDocument/2006/customXml" ds:itemID="{E34C63B7-A026-4A37-9535-4FBB4C03A11D}">
+  <ds:schemaRefs>
+    <ds:schemaRef ds:uri="http://schemas.microsoft.com/sharepoint/v3/contenttype/forms"/>
+  </ds:schemaRefs>
+</ds:datastoreItem>
+</file>
+
+<file path=customXml/itemProps4.xml><?xml version="1.0" encoding="utf-8"?>
 <ds:datastoreItem xmlns:ds="http://schemas.openxmlformats.org/officeDocument/2006/customXml" ds:itemID="{355C5113-D031-41DB-A6D8-43CE1A0E6695}">
   <ds:schemaRefs>
     <ds:schemaRef ds:uri="http://schemas.openxmlformats.org/officeDocument/2006/bibliography"/>
   </ds:schemaRefs>
 </ds:datastoreItem>
-</file>
-
-<file path=customXml/itemProps4.xml><?xml version="1.0" encoding="utf-8"?>
-<ds:datastoreItem xmlns:ds="http://schemas.openxmlformats.org/officeDocument/2006/customXml" ds:itemID="{E34C63B7-A026-4A37-9535-4FBB4C03A11D}">
-  <ds:schemaRefs>
-    <ds:schemaRef ds:uri="http://schemas.microsoft.com/sharepoint/v3/contenttype/forms"/>
-  </ds:schemaRefs>
-</ds:datastoreItem>
 </file>
</xml_diff>

<commit_message>
Insert data for task 2
</commit_message>
<xml_diff>
--- a/IT244 - Project.docx
+++ b/IT244 - Project.docx
@@ -1016,7 +1016,11 @@
           </mc:Choice>
           <mc:Fallback>
             <w:pict>
-              <v:shape w14:anchorId="2ED03E02" id="Text Box 15" o:spid="_x0000_s1028" type="#_x0000_t202" alt="contact info" style="position:absolute;margin-left:48.85pt;margin-top:241.6pt;width:540pt;height:99.75pt;z-index:251668480;visibility:visible;mso-wrap-style:square;mso-width-percent:1282;mso-height-percent:0;mso-wrap-distance-left:9pt;mso-wrap-distance-top:0;mso-wrap-distance-right:9pt;mso-wrap-distance-bottom:0;mso-position-horizontal:absolute;mso-position-horizontal-relative:page;mso-position-vertical:absolute;mso-position-vertical-relative:margin;mso-width-percent:1282;mso-height-percent:0;mso-width-relative:margin;mso-height-relative:page;v-text-anchor:bottom" o:gfxdata="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" o:allowoverlap="f" filled="f" stroked="f" strokeweight=".5pt">
+              <v:shapetype w14:anchorId="2ED03E02" id="_x0000_t202" coordsize="21600,21600" o:spt="202" path="m,l,21600r21600,l21600,xe">
+                <v:stroke joinstyle="miter"/>
+                <v:path gradientshapeok="t" o:connecttype="rect"/>
+              </v:shapetype>
+              <v:shape id="Text Box 15" o:spid="_x0000_s1028" type="#_x0000_t202" alt="contact info" style="position:absolute;margin-left:48.85pt;margin-top:241.6pt;width:540pt;height:99.75pt;z-index:251668480;visibility:visible;mso-wrap-style:square;mso-width-percent:1282;mso-height-percent:0;mso-wrap-distance-left:9pt;mso-wrap-distance-top:0;mso-wrap-distance-right:9pt;mso-wrap-distance-bottom:0;mso-position-horizontal:absolute;mso-position-horizontal-relative:page;mso-position-vertical:absolute;mso-position-vertical-relative:margin;mso-width-percent:1282;mso-height-percent:0;mso-width-relative:margin;mso-height-relative:page;v-text-anchor:bottom" o:gfxdata="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" o:allowoverlap="f" filled="f" stroked="f" strokeweight=".5pt">
                 <v:textbox inset="0,0,0,0">
                   <w:txbxContent>
                     <w:p>
@@ -4538,7 +4542,7 @@
           <w:bCs/>
         </w:rPr>
       </w:pPr>
-      <w:bookmarkStart w:id="5" w:name="_Hlk235258935"/>
+      <w:bookmarkStart w:id="4" w:name="_Hlk235258935"/>
       <w:r>
         <w:rPr>
           <w:b/>
@@ -4556,7 +4560,7 @@
           <w:lang w:bidi="ar-EG"/>
         </w:rPr>
       </w:pPr>
-      <w:bookmarkStart w:id="6" w:name="_Hlk235363843"/>
+      <w:bookmarkStart w:id="5" w:name="_Hlk235363843"/>
       <w:r>
         <w:rPr>
           <w:b/>
@@ -6193,33 +6197,33 @@
         </w:rPr>
       </w:pPr>
     </w:p>
-    <w:bookmarkEnd w:id="6"/>
-    <w:p>
-      <w:pPr>
-        <w:pStyle w:val="IT"/>
-      </w:pPr>
-    </w:p>
-    <w:p>
-      <w:pPr>
-        <w:pStyle w:val="IT"/>
-      </w:pPr>
-    </w:p>
-    <w:p>
-      <w:pPr>
-        <w:pStyle w:val="IT"/>
-      </w:pPr>
-    </w:p>
-    <w:p>
-      <w:pPr>
-        <w:pStyle w:val="IT"/>
-      </w:pPr>
-    </w:p>
-    <w:p>
-      <w:pPr>
-        <w:pStyle w:val="IT"/>
-      </w:pPr>
-    </w:p>
     <w:bookmarkEnd w:id="5"/>
+    <w:p>
+      <w:pPr>
+        <w:pStyle w:val="IT"/>
+      </w:pPr>
+    </w:p>
+    <w:p>
+      <w:pPr>
+        <w:pStyle w:val="IT"/>
+      </w:pPr>
+    </w:p>
+    <w:p>
+      <w:pPr>
+        <w:pStyle w:val="IT"/>
+      </w:pPr>
+    </w:p>
+    <w:p>
+      <w:pPr>
+        <w:pStyle w:val="IT"/>
+      </w:pPr>
+    </w:p>
+    <w:p>
+      <w:pPr>
+        <w:pStyle w:val="IT"/>
+      </w:pPr>
+    </w:p>
+    <w:bookmarkEnd w:id="4"/>
     <w:p>
       <w:pPr>
         <w:pStyle w:val="Heading1"/>
@@ -7592,7 +7596,2286 @@
     <w:p>
       <w:pPr>
         <w:pStyle w:val="IT"/>
-      </w:pPr>
+        <w:rPr>
+          <w:b/>
+          <w:bCs/>
+        </w:rPr>
+      </w:pPr>
+      <w:r>
+        <w:rPr>
+          <w:b/>
+          <w:bCs/>
+        </w:rPr>
+        <w:t>3. Insert Sample Saudi Data</w:t>
+      </w:r>
+    </w:p>
+    <w:p>
+      <w:pPr>
+        <w:pStyle w:val="IT"/>
+        <w:rPr>
+          <w:b/>
+          <w:bCs/>
+        </w:rPr>
+      </w:pPr>
+      <w:r>
+        <w:rPr>
+          <w:b/>
+          <w:bCs/>
+        </w:rPr>
+        <w:t>Patient Records</w:t>
+      </w:r>
+    </w:p>
+    <w:p>
+      <w:pPr>
+        <w:pStyle w:val="IT"/>
+      </w:pPr>
+      <w:r>
+        <w:t>INSERT INTO Patient</w:t>
+      </w:r>
+    </w:p>
+    <w:p>
+      <w:pPr>
+        <w:pStyle w:val="IT"/>
+      </w:pPr>
+      <w:r>
+        <w:t xml:space="preserve">    (National_ID, Full_Name, Date_of_Birth, Gender, Phone, Email, Address)</w:t>
+      </w:r>
+    </w:p>
+    <w:p>
+      <w:pPr>
+        <w:pStyle w:val="IT"/>
+      </w:pPr>
+      <w:r>
+        <w:t>VALUES</w:t>
+      </w:r>
+    </w:p>
+    <w:p>
+      <w:pPr>
+        <w:pStyle w:val="IT"/>
+      </w:pPr>
+      <w:r>
+        <w:t xml:space="preserve">    ('1023456789', 'Abdullah Alzahrani', '1992-04-16',</w:t>
+      </w:r>
+    </w:p>
+    <w:p>
+      <w:pPr>
+        <w:pStyle w:val="IT"/>
+      </w:pPr>
+      <w:r>
+        <w:t xml:space="preserve">     'Male', '0509876543',</w:t>
+      </w:r>
+    </w:p>
+    <w:p>
+      <w:pPr>
+        <w:pStyle w:val="IT"/>
+      </w:pPr>
+      <w:r>
+        <w:t xml:space="preserve">     'abdullah.alzahrani@example.sa',</w:t>
+      </w:r>
+    </w:p>
+    <w:p>
+      <w:pPr>
+        <w:pStyle w:val="IT"/>
+      </w:pPr>
+      <w:r>
+        <w:t xml:space="preserve">     'Al Malqa District, Riyadh'),</w:t>
+      </w:r>
+    </w:p>
+    <w:p>
+      <w:pPr>
+        <w:pStyle w:val="IT"/>
+      </w:pPr>
+    </w:p>
+    <w:p>
+      <w:pPr>
+        <w:pStyle w:val="IT"/>
+      </w:pPr>
+      <w:r>
+        <w:t xml:space="preserve">    ('1098765432', 'Sara Alharbi', '1988-11-03',</w:t>
+      </w:r>
+    </w:p>
+    <w:p>
+      <w:pPr>
+        <w:pStyle w:val="IT"/>
+      </w:pPr>
+      <w:r>
+        <w:t xml:space="preserve">     'Female', '0518765432',</w:t>
+      </w:r>
+    </w:p>
+    <w:p>
+      <w:pPr>
+        <w:pStyle w:val="IT"/>
+      </w:pPr>
+      <w:r>
+        <w:t xml:space="preserve">     'sara.alharbi@example.sa',</w:t>
+      </w:r>
+    </w:p>
+    <w:p>
+      <w:pPr>
+        <w:pStyle w:val="IT"/>
+      </w:pPr>
+      <w:r>
+        <w:t xml:space="preserve">     'Al Rawdah District, Jeddah'),</w:t>
+      </w:r>
+    </w:p>
+    <w:p>
+      <w:pPr>
+        <w:pStyle w:val="IT"/>
+      </w:pPr>
+    </w:p>
+    <w:p>
+      <w:pPr>
+        <w:pStyle w:val="IT"/>
+      </w:pPr>
+      <w:r>
+        <w:t xml:space="preserve">    ('1122334455', 'Mohammed Alqahtani', '2001-07-22',</w:t>
+      </w:r>
+    </w:p>
+    <w:p>
+      <w:pPr>
+        <w:pStyle w:val="IT"/>
+      </w:pPr>
+      <w:r>
+        <w:t xml:space="preserve">     'Male', '0527654321',</w:t>
+      </w:r>
+    </w:p>
+    <w:p>
+      <w:pPr>
+        <w:pStyle w:val="IT"/>
+      </w:pPr>
+      <w:r>
+        <w:t xml:space="preserve">     'mohammed.alqahtani@example.sa',</w:t>
+      </w:r>
+    </w:p>
+    <w:p>
+      <w:pPr>
+        <w:pStyle w:val="IT"/>
+      </w:pPr>
+      <w:r>
+        <w:t xml:space="preserve">     'Al Faisaliyah District, Dammam'),</w:t>
+      </w:r>
+    </w:p>
+    <w:p>
+      <w:pPr>
+        <w:pStyle w:val="IT"/>
+      </w:pPr>
+    </w:p>
+    <w:p>
+      <w:pPr>
+        <w:pStyle w:val="IT"/>
+      </w:pPr>
+      <w:r>
+        <w:t xml:space="preserve">    ('1234567890', 'Norah Alotaibi', '1996-02-10',</w:t>
+      </w:r>
+    </w:p>
+    <w:p>
+      <w:pPr>
+        <w:pStyle w:val="IT"/>
+      </w:pPr>
+      <w:r>
+        <w:t xml:space="preserve">     'Female', '0536543210',</w:t>
+      </w:r>
+    </w:p>
+    <w:p>
+      <w:pPr>
+        <w:pStyle w:val="IT"/>
+      </w:pPr>
+      <w:r>
+        <w:t xml:space="preserve">     'norah.alotaibi@example.sa',</w:t>
+      </w:r>
+    </w:p>
+    <w:p>
+      <w:pPr>
+        <w:pStyle w:val="IT"/>
+      </w:pPr>
+      <w:r>
+        <w:t xml:space="preserve">     'Al Aziziyah District, Makkah'),</w:t>
+      </w:r>
+    </w:p>
+    <w:p>
+      <w:pPr>
+        <w:pStyle w:val="IT"/>
+      </w:pPr>
+    </w:p>
+    <w:p>
+      <w:pPr>
+        <w:pStyle w:val="IT"/>
+      </w:pPr>
+      <w:r>
+        <w:t xml:space="preserve">    ('1987654321', 'Fahad Alshammari', '1979-09-28',</w:t>
+      </w:r>
+    </w:p>
+    <w:p>
+      <w:pPr>
+        <w:pStyle w:val="IT"/>
+      </w:pPr>
+      <w:r>
+        <w:t xml:space="preserve">     'Male', '0545432109',</w:t>
+      </w:r>
+    </w:p>
+    <w:p>
+      <w:pPr>
+        <w:pStyle w:val="IT"/>
+      </w:pPr>
+      <w:r>
+        <w:t xml:space="preserve">     'fahad.alshammari@example.sa',</w:t>
+      </w:r>
+    </w:p>
+    <w:p>
+      <w:pPr>
+        <w:pStyle w:val="IT"/>
+      </w:pPr>
+      <w:r>
+        <w:t xml:space="preserve">     'Qurban District, Madinah');</w:t>
+      </w:r>
+    </w:p>
+    <w:p>
+      <w:pPr>
+        <w:pStyle w:val="IT"/>
+        <w:rPr>
+          <w:b/>
+          <w:bCs/>
+        </w:rPr>
+      </w:pPr>
+      <w:r>
+        <w:rPr>
+          <w:b/>
+          <w:bCs/>
+        </w:rPr>
+        <w:t>Doctor Records</w:t>
+      </w:r>
+    </w:p>
+    <w:p>
+      <w:pPr>
+        <w:pStyle w:val="IT"/>
+      </w:pPr>
+      <w:r>
+        <w:t>Ten doctors are inserted so that both EER subclasses can contain five records while maintaining the disjoint specialization.</w:t>
+      </w:r>
+    </w:p>
+    <w:p>
+      <w:pPr>
+        <w:pStyle w:val="IT"/>
+      </w:pPr>
+      <w:r>
+        <w:t>INSERT INTO Doctor</w:t>
+      </w:r>
+    </w:p>
+    <w:p>
+      <w:pPr>
+        <w:pStyle w:val="IT"/>
+      </w:pPr>
+      <w:r>
+        <w:t xml:space="preserve">    (Full_Name, Specialty, License_No, Phone, Email, Doctor_Type)</w:t>
+      </w:r>
+    </w:p>
+    <w:p>
+      <w:pPr>
+        <w:pStyle w:val="IT"/>
+      </w:pPr>
+      <w:r>
+        <w:t>VALUES</w:t>
+      </w:r>
+    </w:p>
+    <w:p>
+      <w:pPr>
+        <w:pStyle w:val="IT"/>
+      </w:pPr>
+      <w:r>
+        <w:t xml:space="preserve">    ('Khalid Alqahtani', 'Family Medicine',</w:t>
+      </w:r>
+    </w:p>
+    <w:p>
+      <w:pPr>
+        <w:pStyle w:val="IT"/>
+      </w:pPr>
+      <w:r>
+        <w:t xml:space="preserve">     'SCFHS-D-10001', '0501234567',</w:t>
+      </w:r>
+    </w:p>
+    <w:p>
+      <w:pPr>
+        <w:pStyle w:val="IT"/>
+      </w:pPr>
+      <w:r>
+        <w:t xml:space="preserve">     'k.alqahtani@smartclinic.sa', 'Consultant'),</w:t>
+      </w:r>
+    </w:p>
+    <w:p>
+      <w:pPr>
+        <w:pStyle w:val="IT"/>
+      </w:pPr>
+    </w:p>
+    <w:p>
+      <w:pPr>
+        <w:pStyle w:val="IT"/>
+      </w:pPr>
+      <w:r>
+        <w:t xml:space="preserve">    ('Noura Alharbi', 'Pediatrics',</w:t>
+      </w:r>
+    </w:p>
+    <w:p>
+      <w:pPr>
+        <w:pStyle w:val="IT"/>
+      </w:pPr>
+      <w:r>
+        <w:t xml:space="preserve">     'SCFHS-D-10002', '0512345678',</w:t>
+      </w:r>
+    </w:p>
+    <w:p>
+      <w:pPr>
+        <w:pStyle w:val="IT"/>
+      </w:pPr>
+      <w:r>
+        <w:t xml:space="preserve">     'n.alharbi@smartclinic.sa', 'Consultant'),</w:t>
+      </w:r>
+    </w:p>
+    <w:p>
+      <w:pPr>
+        <w:pStyle w:val="IT"/>
+      </w:pPr>
+    </w:p>
+    <w:p>
+      <w:pPr>
+        <w:pStyle w:val="IT"/>
+      </w:pPr>
+      <w:r>
+        <w:t xml:space="preserve">    ('Faisal Alotaibi', 'Dermatology',</w:t>
+      </w:r>
+    </w:p>
+    <w:p>
+      <w:pPr>
+        <w:pStyle w:val="IT"/>
+      </w:pPr>
+      <w:r>
+        <w:t xml:space="preserve">     'SCFHS-D-10003', '0523456789',</w:t>
+      </w:r>
+    </w:p>
+    <w:p>
+      <w:pPr>
+        <w:pStyle w:val="IT"/>
+      </w:pPr>
+      <w:r>
+        <w:t xml:space="preserve">     'f.alotaibi@smartclinic.sa', 'Consultant'),</w:t>
+      </w:r>
+    </w:p>
+    <w:p>
+      <w:pPr>
+        <w:pStyle w:val="IT"/>
+      </w:pPr>
+    </w:p>
+    <w:p>
+      <w:pPr>
+        <w:pStyle w:val="IT"/>
+      </w:pPr>
+      <w:r>
+        <w:t xml:space="preserve">    ('Reem Alghamdi', 'Internal Medicine',</w:t>
+      </w:r>
+    </w:p>
+    <w:p>
+      <w:pPr>
+        <w:pStyle w:val="IT"/>
+      </w:pPr>
+      <w:r>
+        <w:t xml:space="preserve">     'SCFHS-D-10004', '0534567890',</w:t>
+      </w:r>
+    </w:p>
+    <w:p>
+      <w:pPr>
+        <w:pStyle w:val="IT"/>
+      </w:pPr>
+      <w:r>
+        <w:t xml:space="preserve">     'r.alghamdi@smartclinic.sa', 'Consultant'),</w:t>
+      </w:r>
+    </w:p>
+    <w:p>
+      <w:pPr>
+        <w:pStyle w:val="IT"/>
+      </w:pPr>
+    </w:p>
+    <w:p>
+      <w:pPr>
+        <w:pStyle w:val="IT"/>
+      </w:pPr>
+      <w:r>
+        <w:t xml:space="preserve">    ('Saad Alshammari', 'Orthopedics',</w:t>
+      </w:r>
+    </w:p>
+    <w:p>
+      <w:pPr>
+        <w:pStyle w:val="IT"/>
+      </w:pPr>
+      <w:r>
+        <w:t xml:space="preserve">     'SCFHS-D-10005', '0545678901',</w:t>
+      </w:r>
+    </w:p>
+    <w:p>
+      <w:pPr>
+        <w:pStyle w:val="IT"/>
+      </w:pPr>
+      <w:r>
+        <w:t xml:space="preserve">     's.alshammari@smartclinic.sa', 'Consultant'),</w:t>
+      </w:r>
+    </w:p>
+    <w:p>
+      <w:pPr>
+        <w:pStyle w:val="IT"/>
+      </w:pPr>
+    </w:p>
+    <w:p>
+      <w:pPr>
+        <w:pStyle w:val="IT"/>
+      </w:pPr>
+      <w:r>
+        <w:t xml:space="preserve">    ('Ahmed Aldossari', 'Family Medicine',</w:t>
+      </w:r>
+    </w:p>
+    <w:p>
+      <w:pPr>
+        <w:pStyle w:val="IT"/>
+      </w:pPr>
+      <w:r>
+        <w:t xml:space="preserve">     'SCFHS-D-10006', '0556789012',</w:t>
+      </w:r>
+    </w:p>
+    <w:p>
+      <w:pPr>
+        <w:pStyle w:val="IT"/>
+      </w:pPr>
+      <w:r>
+        <w:t xml:space="preserve">     'a.aldossari@smartclinic.sa', 'Resident'),</w:t>
+      </w:r>
+    </w:p>
+    <w:p>
+      <w:pPr>
+        <w:pStyle w:val="IT"/>
+      </w:pPr>
+    </w:p>
+    <w:p>
+      <w:pPr>
+        <w:pStyle w:val="IT"/>
+      </w:pPr>
+      <w:r>
+        <w:t xml:space="preserve">    ('Huda Alzahrani', 'Pediatrics',</w:t>
+      </w:r>
+    </w:p>
+    <w:p>
+      <w:pPr>
+        <w:pStyle w:val="IT"/>
+      </w:pPr>
+      <w:r>
+        <w:t xml:space="preserve">     'SCFHS-D-10007', '0567890123',</w:t>
+      </w:r>
+    </w:p>
+    <w:p>
+      <w:pPr>
+        <w:pStyle w:val="IT"/>
+      </w:pPr>
+      <w:r>
+        <w:t xml:space="preserve">     'h.alzahrani@smartclinic.sa', 'Resident'),</w:t>
+      </w:r>
+    </w:p>
+    <w:p>
+      <w:pPr>
+        <w:pStyle w:val="IT"/>
+      </w:pPr>
+    </w:p>
+    <w:p>
+      <w:pPr>
+        <w:pStyle w:val="IT"/>
+      </w:pPr>
+      <w:r>
+        <w:t xml:space="preserve">    ('Majed Almutairi', 'Dermatology',</w:t>
+      </w:r>
+    </w:p>
+    <w:p>
+      <w:pPr>
+        <w:pStyle w:val="IT"/>
+      </w:pPr>
+      <w:r>
+        <w:t xml:space="preserve">     'SCFHS-D-10008', '0578901234',</w:t>
+      </w:r>
+    </w:p>
+    <w:p>
+      <w:pPr>
+        <w:pStyle w:val="IT"/>
+      </w:pPr>
+      <w:r>
+        <w:t xml:space="preserve">     'm.almutairi@smartclinic.sa', 'Resident'),</w:t>
+      </w:r>
+    </w:p>
+    <w:p>
+      <w:pPr>
+        <w:pStyle w:val="IT"/>
+      </w:pPr>
+    </w:p>
+    <w:p>
+      <w:pPr>
+        <w:pStyle w:val="IT"/>
+      </w:pPr>
+      <w:r>
+        <w:t xml:space="preserve">    ('Lama Alsubaie', 'Internal Medicine',</w:t>
+      </w:r>
+    </w:p>
+    <w:p>
+      <w:pPr>
+        <w:pStyle w:val="IT"/>
+      </w:pPr>
+      <w:r>
+        <w:t xml:space="preserve">     'SCFHS-D-10009', '0589012345',</w:t>
+      </w:r>
+    </w:p>
+    <w:p>
+      <w:pPr>
+        <w:pStyle w:val="IT"/>
+      </w:pPr>
+      <w:r>
+        <w:t xml:space="preserve">     'l.alsubaie@smartclinic.sa', 'Resident'),</w:t>
+      </w:r>
+    </w:p>
+    <w:p>
+      <w:pPr>
+        <w:pStyle w:val="IT"/>
+      </w:pPr>
+    </w:p>
+    <w:p>
+      <w:pPr>
+        <w:pStyle w:val="IT"/>
+      </w:pPr>
+      <w:r>
+        <w:t xml:space="preserve">    ('Omar Alanazi', 'Orthopedics',</w:t>
+      </w:r>
+    </w:p>
+    <w:p>
+      <w:pPr>
+        <w:pStyle w:val="IT"/>
+      </w:pPr>
+      <w:r>
+        <w:t xml:space="preserve">     'SCFHS-D-10010', '0590123456',</w:t>
+      </w:r>
+    </w:p>
+    <w:p>
+      <w:pPr>
+        <w:pStyle w:val="IT"/>
+      </w:pPr>
+      <w:r>
+        <w:t xml:space="preserve">     'o.alanazi@smartclinic.sa', 'Resident');</w:t>
+      </w:r>
+    </w:p>
+    <w:p>
+      <w:pPr>
+        <w:pStyle w:val="IT"/>
+        <w:rPr>
+          <w:b/>
+          <w:bCs/>
+        </w:rPr>
+      </w:pPr>
+      <w:r>
+        <w:rPr>
+          <w:b/>
+          <w:bCs/>
+        </w:rPr>
+        <w:t>Consultant Doctor Records</w:t>
+      </w:r>
+    </w:p>
+    <w:p>
+      <w:pPr>
+        <w:pStyle w:val="IT"/>
+      </w:pPr>
+      <w:r>
+        <w:t>INSERT INTO Consultant_Doctor</w:t>
+      </w:r>
+    </w:p>
+    <w:p>
+      <w:pPr>
+        <w:pStyle w:val="IT"/>
+      </w:pPr>
+      <w:r>
+        <w:t xml:space="preserve">    (Doctor_ID, Years_of_Experience)</w:t>
+      </w:r>
+    </w:p>
+    <w:p>
+      <w:pPr>
+        <w:pStyle w:val="IT"/>
+      </w:pPr>
+      <w:r>
+        <w:t>VALUES</w:t>
+      </w:r>
+    </w:p>
+    <w:p>
+      <w:pPr>
+        <w:pStyle w:val="IT"/>
+      </w:pPr>
+      <w:r>
+        <w:t xml:space="preserve">    (1, 14),</w:t>
+      </w:r>
+    </w:p>
+    <w:p>
+      <w:pPr>
+        <w:pStyle w:val="IT"/>
+      </w:pPr>
+      <w:r>
+        <w:t xml:space="preserve">    (2, 12),</w:t>
+      </w:r>
+    </w:p>
+    <w:p>
+      <w:pPr>
+        <w:pStyle w:val="IT"/>
+      </w:pPr>
+      <w:r>
+        <w:t xml:space="preserve">    (3, 10),</w:t>
+      </w:r>
+    </w:p>
+    <w:p>
+      <w:pPr>
+        <w:pStyle w:val="IT"/>
+      </w:pPr>
+      <w:r>
+        <w:t xml:space="preserve">    (4, 15),</w:t>
+      </w:r>
+    </w:p>
+    <w:p>
+      <w:pPr>
+        <w:pStyle w:val="IT"/>
+      </w:pPr>
+      <w:r>
+        <w:t xml:space="preserve">    (5, 11);</w:t>
+      </w:r>
+    </w:p>
+    <w:p>
+      <w:pPr>
+        <w:pStyle w:val="IT"/>
+        <w:rPr>
+          <w:b/>
+          <w:bCs/>
+        </w:rPr>
+      </w:pPr>
+      <w:r>
+        <w:rPr>
+          <w:b/>
+          <w:bCs/>
+        </w:rPr>
+        <w:t>Resident Doctor Records</w:t>
+      </w:r>
+    </w:p>
+    <w:p>
+      <w:pPr>
+        <w:pStyle w:val="IT"/>
+      </w:pPr>
+      <w:r>
+        <w:t>INSERT INTO Resident_Doctor</w:t>
+      </w:r>
+    </w:p>
+    <w:p>
+      <w:pPr>
+        <w:pStyle w:val="IT"/>
+      </w:pPr>
+      <w:r>
+        <w:t xml:space="preserve">    (Doctor_ID, Residency_Year)</w:t>
+      </w:r>
+    </w:p>
+    <w:p>
+      <w:pPr>
+        <w:pStyle w:val="IT"/>
+      </w:pPr>
+      <w:r>
+        <w:t>VALUES</w:t>
+      </w:r>
+    </w:p>
+    <w:p>
+      <w:pPr>
+        <w:pStyle w:val="IT"/>
+      </w:pPr>
+      <w:r>
+        <w:t xml:space="preserve">    (6, 1),</w:t>
+      </w:r>
+    </w:p>
+    <w:p>
+      <w:pPr>
+        <w:pStyle w:val="IT"/>
+      </w:pPr>
+      <w:r>
+        <w:t xml:space="preserve">    (7, 2),</w:t>
+      </w:r>
+    </w:p>
+    <w:p>
+      <w:pPr>
+        <w:pStyle w:val="IT"/>
+      </w:pPr>
+      <w:r>
+        <w:t xml:space="preserve">    (8, 3),</w:t>
+      </w:r>
+    </w:p>
+    <w:p>
+      <w:pPr>
+        <w:pStyle w:val="IT"/>
+      </w:pPr>
+      <w:r>
+        <w:t xml:space="preserve">    (9, 2),</w:t>
+      </w:r>
+    </w:p>
+    <w:p>
+      <w:pPr>
+        <w:pStyle w:val="IT"/>
+      </w:pPr>
+      <w:r>
+        <w:t xml:space="preserve">    (10, 4);</w:t>
+      </w:r>
+    </w:p>
+    <w:p>
+      <w:pPr>
+        <w:pStyle w:val="IT"/>
+      </w:pPr>
+      <w:r>
+        <w:t xml:space="preserve">This structure implements the </w:t>
+      </w:r>
+      <w:r>
+        <w:rPr>
+          <w:b/>
+          <w:bCs/>
+        </w:rPr>
+        <w:t>disjoint</w:t>
+      </w:r>
+      <w:r>
+        <w:t xml:space="preserve"> rule because each doctor is entered into only one subtype. It also represents the </w:t>
+      </w:r>
+      <w:r>
+        <w:rPr>
+          <w:b/>
+          <w:bCs/>
+        </w:rPr>
+        <w:t>total</w:t>
+      </w:r>
+      <w:r>
+        <w:t xml:space="preserve"> specialization because every doctor is classified as either a Consultant or Resident.</w:t>
+      </w:r>
+    </w:p>
+    <w:p>
+      <w:pPr>
+        <w:pStyle w:val="IT"/>
+        <w:rPr>
+          <w:b/>
+          <w:bCs/>
+        </w:rPr>
+      </w:pPr>
+      <w:r>
+        <w:rPr>
+          <w:b/>
+          <w:bCs/>
+        </w:rPr>
+        <w:t>Appointment Records</w:t>
+      </w:r>
+    </w:p>
+    <w:p>
+      <w:pPr>
+        <w:pStyle w:val="IT"/>
+      </w:pPr>
+      <w:r>
+        <w:t>INSERT INTO Appointment</w:t>
+      </w:r>
+    </w:p>
+    <w:p>
+      <w:pPr>
+        <w:pStyle w:val="IT"/>
+      </w:pPr>
+      <w:r>
+        <w:t xml:space="preserve">    (Patient_ID, Doctor_ID, Appointment_Date,</w:t>
+      </w:r>
+    </w:p>
+    <w:p>
+      <w:pPr>
+        <w:pStyle w:val="IT"/>
+      </w:pPr>
+      <w:r>
+        <w:t xml:space="preserve">     Appointment_Time, Visit_Reason, Status)</w:t>
+      </w:r>
+    </w:p>
+    <w:p>
+      <w:pPr>
+        <w:pStyle w:val="IT"/>
+      </w:pPr>
+      <w:r>
+        <w:t>VALUES</w:t>
+      </w:r>
+    </w:p>
+    <w:p>
+      <w:pPr>
+        <w:pStyle w:val="IT"/>
+      </w:pPr>
+      <w:r>
+        <w:t xml:space="preserve">    (1, 1, '2026-07-05', '09:00:00',</w:t>
+      </w:r>
+    </w:p>
+    <w:p>
+      <w:pPr>
+        <w:pStyle w:val="IT"/>
+      </w:pPr>
+      <w:r>
+        <w:t xml:space="preserve">     'Routine health examination', 'Completed'),</w:t>
+      </w:r>
+    </w:p>
+    <w:p>
+      <w:pPr>
+        <w:pStyle w:val="IT"/>
+      </w:pPr>
+    </w:p>
+    <w:p>
+      <w:pPr>
+        <w:pStyle w:val="IT"/>
+      </w:pPr>
+      <w:r>
+        <w:t xml:space="preserve">    (2, 2, '2026-07-06', '10:30:00',</w:t>
+      </w:r>
+    </w:p>
+    <w:p>
+      <w:pPr>
+        <w:pStyle w:val="IT"/>
+      </w:pPr>
+      <w:r>
+        <w:t xml:space="preserve">     'Child fever and sore throat', 'Completed'),</w:t>
+      </w:r>
+    </w:p>
+    <w:p>
+      <w:pPr>
+        <w:pStyle w:val="IT"/>
+      </w:pPr>
+    </w:p>
+    <w:p>
+      <w:pPr>
+        <w:pStyle w:val="IT"/>
+      </w:pPr>
+      <w:r>
+        <w:t xml:space="preserve">    (3, 3, '2026-07-07', '12:00:00',</w:t>
+      </w:r>
+    </w:p>
+    <w:p>
+      <w:pPr>
+        <w:pStyle w:val="IT"/>
+      </w:pPr>
+      <w:r>
+        <w:t xml:space="preserve">     'Persistent skin rash', 'Completed'),</w:t>
+      </w:r>
+    </w:p>
+    <w:p>
+      <w:pPr>
+        <w:pStyle w:val="IT"/>
+      </w:pPr>
+    </w:p>
+    <w:p>
+      <w:pPr>
+        <w:pStyle w:val="IT"/>
+      </w:pPr>
+      <w:r>
+        <w:t xml:space="preserve">    (4, 4, '2026-07-08', '14:00:00',</w:t>
+      </w:r>
+    </w:p>
+    <w:p>
+      <w:pPr>
+        <w:pStyle w:val="IT"/>
+      </w:pPr>
+      <w:r>
+        <w:t xml:space="preserve">     'Fatigue and high blood pressure', 'Completed'),</w:t>
+      </w:r>
+    </w:p>
+    <w:p>
+      <w:pPr>
+        <w:pStyle w:val="IT"/>
+      </w:pPr>
+    </w:p>
+    <w:p>
+      <w:pPr>
+        <w:pStyle w:val="IT"/>
+      </w:pPr>
+      <w:r>
+        <w:t xml:space="preserve">    (5, 5, '2026-07-09', '16:30:00',</w:t>
+      </w:r>
+    </w:p>
+    <w:p>
+      <w:pPr>
+        <w:pStyle w:val="IT"/>
+      </w:pPr>
+      <w:r>
+        <w:t xml:space="preserve">     'Knee pain after exercise', 'Completed');</w:t>
+      </w:r>
+    </w:p>
+    <w:p>
+      <w:pPr>
+        <w:pStyle w:val="IT"/>
+        <w:rPr>
+          <w:b/>
+          <w:bCs/>
+        </w:rPr>
+      </w:pPr>
+      <w:r>
+        <w:rPr>
+          <w:b/>
+          <w:bCs/>
+        </w:rPr>
+        <w:t>Medicine Records</w:t>
+      </w:r>
+    </w:p>
+    <w:p>
+      <w:pPr>
+        <w:pStyle w:val="IT"/>
+      </w:pPr>
+      <w:r>
+        <w:t>INSERT INTO Medicine</w:t>
+      </w:r>
+    </w:p>
+    <w:p>
+      <w:pPr>
+        <w:pStyle w:val="IT"/>
+      </w:pPr>
+      <w:r>
+        <w:t xml:space="preserve">    (Medicine_Name, Description, Unit_Price, Stock_Quantity)</w:t>
+      </w:r>
+    </w:p>
+    <w:p>
+      <w:pPr>
+        <w:pStyle w:val="IT"/>
+      </w:pPr>
+      <w:r>
+        <w:t>VALUES</w:t>
+      </w:r>
+    </w:p>
+    <w:p>
+      <w:pPr>
+        <w:pStyle w:val="IT"/>
+      </w:pPr>
+      <w:r>
+        <w:t xml:space="preserve">    ('Vitamin D3 1000 IU',</w:t>
+      </w:r>
+    </w:p>
+    <w:p>
+      <w:pPr>
+        <w:pStyle w:val="IT"/>
+      </w:pPr>
+      <w:r>
+        <w:t xml:space="preserve">     'Vitamin D supplement',</w:t>
+      </w:r>
+    </w:p>
+    <w:p>
+      <w:pPr>
+        <w:pStyle w:val="IT"/>
+      </w:pPr>
+      <w:r>
+        <w:t xml:space="preserve">     25.00, 100),</w:t>
+      </w:r>
+    </w:p>
+    <w:p>
+      <w:pPr>
+        <w:pStyle w:val="IT"/>
+      </w:pPr>
+    </w:p>
+    <w:p>
+      <w:pPr>
+        <w:pStyle w:val="IT"/>
+      </w:pPr>
+      <w:r>
+        <w:t xml:space="preserve">    ('Paracetamol 500 mg',</w:t>
+      </w:r>
+    </w:p>
+    <w:p>
+      <w:pPr>
+        <w:pStyle w:val="IT"/>
+      </w:pPr>
+      <w:r>
+        <w:t xml:space="preserve">     'Pain and fever relief tablets',</w:t>
+      </w:r>
+    </w:p>
+    <w:p>
+      <w:pPr>
+        <w:pStyle w:val="IT"/>
+      </w:pPr>
+      <w:r>
+        <w:t xml:space="preserve">     15.00, 200),</w:t>
+      </w:r>
+    </w:p>
+    <w:p>
+      <w:pPr>
+        <w:pStyle w:val="IT"/>
+      </w:pPr>
+    </w:p>
+    <w:p>
+      <w:pPr>
+        <w:pStyle w:val="IT"/>
+      </w:pPr>
+      <w:r>
+        <w:t xml:space="preserve">    ('Hydrocortisone Cream',</w:t>
+      </w:r>
+    </w:p>
+    <w:p>
+      <w:pPr>
+        <w:pStyle w:val="IT"/>
+      </w:pPr>
+      <w:r>
+        <w:t xml:space="preserve">     'Topical cream for skin inflammation',</w:t>
+      </w:r>
+    </w:p>
+    <w:p>
+      <w:pPr>
+        <w:pStyle w:val="IT"/>
+      </w:pPr>
+      <w:r>
+        <w:t xml:space="preserve">     22.50, 80),</w:t>
+      </w:r>
+    </w:p>
+    <w:p>
+      <w:pPr>
+        <w:pStyle w:val="IT"/>
+      </w:pPr>
+    </w:p>
+    <w:p>
+      <w:pPr>
+        <w:pStyle w:val="IT"/>
+      </w:pPr>
+      <w:r>
+        <w:t xml:space="preserve">    ('Amlodipine 5 mg',</w:t>
+      </w:r>
+    </w:p>
+    <w:p>
+      <w:pPr>
+        <w:pStyle w:val="IT"/>
+      </w:pPr>
+      <w:r>
+        <w:t xml:space="preserve">     'Medicine used for high blood pressure',</w:t>
+      </w:r>
+    </w:p>
+    <w:p>
+      <w:pPr>
+        <w:pStyle w:val="IT"/>
+      </w:pPr>
+      <w:r>
+        <w:t xml:space="preserve">     35.00, 120),</w:t>
+      </w:r>
+    </w:p>
+    <w:p>
+      <w:pPr>
+        <w:pStyle w:val="IT"/>
+      </w:pPr>
+    </w:p>
+    <w:p>
+      <w:pPr>
+        <w:pStyle w:val="IT"/>
+      </w:pPr>
+      <w:r>
+        <w:t xml:space="preserve">    ('Diclofenac Gel',</w:t>
+      </w:r>
+    </w:p>
+    <w:p>
+      <w:pPr>
+        <w:pStyle w:val="IT"/>
+      </w:pPr>
+      <w:r>
+        <w:t xml:space="preserve">     'Topical gel used for muscle and joint pain',</w:t>
+      </w:r>
+    </w:p>
+    <w:p>
+      <w:pPr>
+        <w:pStyle w:val="IT"/>
+      </w:pPr>
+      <w:r>
+        <w:t xml:space="preserve">     28.00, 90);</w:t>
+      </w:r>
+    </w:p>
+    <w:p>
+      <w:pPr>
+        <w:pStyle w:val="IT"/>
+        <w:rPr>
+          <w:b/>
+          <w:bCs/>
+        </w:rPr>
+      </w:pPr>
+      <w:r>
+        <w:rPr>
+          <w:b/>
+          <w:bCs/>
+        </w:rPr>
+        <w:t>Treatment Records</w:t>
+      </w:r>
+    </w:p>
+    <w:p>
+      <w:pPr>
+        <w:pStyle w:val="IT"/>
+      </w:pPr>
+      <w:r>
+        <w:t>INSERT INTO Treatment</w:t>
+      </w:r>
+    </w:p>
+    <w:p>
+      <w:pPr>
+        <w:pStyle w:val="IT"/>
+      </w:pPr>
+      <w:r>
+        <w:t xml:space="preserve">    (Appointment_ID, Medicine_ID, Diagnosis,</w:t>
+      </w:r>
+    </w:p>
+    <w:p>
+      <w:pPr>
+        <w:pStyle w:val="IT"/>
+      </w:pPr>
+      <w:r>
+        <w:t xml:space="preserve">     Procedure_Name, Notes, Cost)</w:t>
+      </w:r>
+    </w:p>
+    <w:p>
+      <w:pPr>
+        <w:pStyle w:val="IT"/>
+      </w:pPr>
+      <w:r>
+        <w:t>VALUES</w:t>
+      </w:r>
+    </w:p>
+    <w:p>
+      <w:pPr>
+        <w:pStyle w:val="IT"/>
+      </w:pPr>
+      <w:r>
+        <w:t xml:space="preserve">    (1, 1,</w:t>
+      </w:r>
+    </w:p>
+    <w:p>
+      <w:pPr>
+        <w:pStyle w:val="IT"/>
+      </w:pPr>
+      <w:r>
+        <w:t xml:space="preserve">     'Vitamin D deficiency',</w:t>
+      </w:r>
+    </w:p>
+    <w:p>
+      <w:pPr>
+        <w:pStyle w:val="IT"/>
+      </w:pPr>
+      <w:r>
+        <w:t xml:space="preserve">     'Clinical examination',</w:t>
+      </w:r>
+    </w:p>
+    <w:p>
+      <w:pPr>
+        <w:pStyle w:val="IT"/>
+      </w:pPr>
+      <w:r>
+        <w:t xml:space="preserve">     'Follow-up test recommended after eight weeks',</w:t>
+      </w:r>
+    </w:p>
+    <w:p>
+      <w:pPr>
+        <w:pStyle w:val="IT"/>
+      </w:pPr>
+      <w:r>
+        <w:t xml:space="preserve">     250.00),</w:t>
+      </w:r>
+    </w:p>
+    <w:p>
+      <w:pPr>
+        <w:pStyle w:val="IT"/>
+      </w:pPr>
+    </w:p>
+    <w:p>
+      <w:pPr>
+        <w:pStyle w:val="IT"/>
+      </w:pPr>
+      <w:r>
+        <w:t xml:space="preserve">    (2, 2,</w:t>
+      </w:r>
+    </w:p>
+    <w:p>
+      <w:pPr>
+        <w:pStyle w:val="IT"/>
+      </w:pPr>
+      <w:r>
+        <w:t xml:space="preserve">     'Viral upper respiratory infection',</w:t>
+      </w:r>
+    </w:p>
+    <w:p>
+      <w:pPr>
+        <w:pStyle w:val="IT"/>
+      </w:pPr>
+      <w:r>
+        <w:t xml:space="preserve">     'Pediatric examination',</w:t>
+      </w:r>
+    </w:p>
+    <w:p>
+      <w:pPr>
+        <w:pStyle w:val="IT"/>
+      </w:pPr>
+      <w:r>
+        <w:t xml:space="preserve">     'Rest and adequate fluid intake recommended',</w:t>
+      </w:r>
+    </w:p>
+    <w:p>
+      <w:pPr>
+        <w:pStyle w:val="IT"/>
+      </w:pPr>
+      <w:r>
+        <w:t xml:space="preserve">     300.00),</w:t>
+      </w:r>
+    </w:p>
+    <w:p>
+      <w:pPr>
+        <w:pStyle w:val="IT"/>
+      </w:pPr>
+    </w:p>
+    <w:p>
+      <w:pPr>
+        <w:pStyle w:val="IT"/>
+      </w:pPr>
+      <w:r>
+        <w:t xml:space="preserve">    (3, 3,</w:t>
+      </w:r>
+    </w:p>
+    <w:p>
+      <w:pPr>
+        <w:pStyle w:val="IT"/>
+      </w:pPr>
+      <w:r>
+        <w:t xml:space="preserve">     'Contact dermatitis',</w:t>
+      </w:r>
+    </w:p>
+    <w:p>
+      <w:pPr>
+        <w:pStyle w:val="IT"/>
+      </w:pPr>
+      <w:r>
+        <w:t xml:space="preserve">     'Skin examination',</w:t>
+      </w:r>
+    </w:p>
+    <w:p>
+      <w:pPr>
+        <w:pStyle w:val="IT"/>
+      </w:pPr>
+      <w:r>
+        <w:t xml:space="preserve">     'Avoid suspected skin irritants',</w:t>
+      </w:r>
+    </w:p>
+    <w:p>
+      <w:pPr>
+        <w:pStyle w:val="IT"/>
+      </w:pPr>
+      <w:r>
+        <w:t xml:space="preserve">     350.00),</w:t>
+      </w:r>
+    </w:p>
+    <w:p>
+      <w:pPr>
+        <w:pStyle w:val="IT"/>
+      </w:pPr>
+    </w:p>
+    <w:p>
+      <w:pPr>
+        <w:pStyle w:val="IT"/>
+      </w:pPr>
+      <w:r>
+        <w:t xml:space="preserve">    (4, 4,</w:t>
+      </w:r>
+    </w:p>
+    <w:p>
+      <w:pPr>
+        <w:pStyle w:val="IT"/>
+      </w:pPr>
+      <w:r>
+        <w:t xml:space="preserve">     'Hypertension',</w:t>
+      </w:r>
+    </w:p>
+    <w:p>
+      <w:pPr>
+        <w:pStyle w:val="IT"/>
+      </w:pPr>
+      <w:r>
+        <w:t xml:space="preserve">     'Blood pressure assessment',</w:t>
+      </w:r>
+    </w:p>
+    <w:p>
+      <w:pPr>
+        <w:pStyle w:val="IT"/>
+      </w:pPr>
+      <w:r>
+        <w:t xml:space="preserve">     'Blood pressure should be monitored regularly',</w:t>
+      </w:r>
+    </w:p>
+    <w:p>
+      <w:pPr>
+        <w:pStyle w:val="IT"/>
+      </w:pPr>
+      <w:r>
+        <w:t xml:space="preserve">     320.00),</w:t>
+      </w:r>
+    </w:p>
+    <w:p>
+      <w:pPr>
+        <w:pStyle w:val="IT"/>
+      </w:pPr>
+    </w:p>
+    <w:p>
+      <w:pPr>
+        <w:pStyle w:val="IT"/>
+      </w:pPr>
+      <w:r>
+        <w:t xml:space="preserve">    (5, 5,</w:t>
+      </w:r>
+    </w:p>
+    <w:p>
+      <w:pPr>
+        <w:pStyle w:val="IT"/>
+      </w:pPr>
+      <w:r>
+        <w:t xml:space="preserve">     'Knee muscle strain',</w:t>
+      </w:r>
+    </w:p>
+    <w:p>
+      <w:pPr>
+        <w:pStyle w:val="IT"/>
+      </w:pPr>
+      <w:r>
+        <w:t xml:space="preserve">     'Orthopedic examination',</w:t>
+      </w:r>
+    </w:p>
+    <w:p>
+      <w:pPr>
+        <w:pStyle w:val="IT"/>
+      </w:pPr>
+      <w:r>
+        <w:t xml:space="preserve">     'Reduce strenuous physical activity temporarily',</w:t>
+      </w:r>
+    </w:p>
+    <w:p>
+      <w:pPr>
+        <w:pStyle w:val="IT"/>
+      </w:pPr>
+      <w:r>
+        <w:t xml:space="preserve">     400.00);</w:t>
+      </w:r>
+    </w:p>
+    <w:p>
+      <w:pPr>
+        <w:pStyle w:val="IT"/>
+        <w:rPr>
+          <w:b/>
+          <w:bCs/>
+        </w:rPr>
+      </w:pPr>
+      <w:r>
+        <w:rPr>
+          <w:b/>
+          <w:bCs/>
+        </w:rPr>
+        <w:t>Payment Records</w:t>
+      </w:r>
+    </w:p>
+    <w:p>
+      <w:pPr>
+        <w:pStyle w:val="IT"/>
+      </w:pPr>
+      <w:r>
+        <w:t>INSERT INTO Payment</w:t>
+      </w:r>
+    </w:p>
+    <w:p>
+      <w:pPr>
+        <w:pStyle w:val="IT"/>
+      </w:pPr>
+      <w:r>
+        <w:t xml:space="preserve">    (Appointment_ID, Amount, Payment_Date,</w:t>
+      </w:r>
+    </w:p>
+    <w:p>
+      <w:pPr>
+        <w:pStyle w:val="IT"/>
+      </w:pPr>
+      <w:r>
+        <w:t xml:space="preserve">     Payment_Method, Payment_Status, Payment_Type)</w:t>
+      </w:r>
+    </w:p>
+    <w:p>
+      <w:pPr>
+        <w:pStyle w:val="IT"/>
+      </w:pPr>
+      <w:r>
+        <w:t>VALUES</w:t>
+      </w:r>
+    </w:p>
+    <w:p>
+      <w:pPr>
+        <w:pStyle w:val="IT"/>
+      </w:pPr>
+      <w:r>
+        <w:t xml:space="preserve">    (1, 250.00, '2026-07-05',</w:t>
+      </w:r>
+    </w:p>
+    <w:p>
+      <w:pPr>
+        <w:pStyle w:val="IT"/>
+      </w:pPr>
+      <w:r>
+        <w:t xml:space="preserve">     'Mada', 'Paid', 'Self-Payment'),</w:t>
+      </w:r>
+    </w:p>
+    <w:p>
+      <w:pPr>
+        <w:pStyle w:val="IT"/>
+      </w:pPr>
+    </w:p>
+    <w:p>
+      <w:pPr>
+        <w:pStyle w:val="IT"/>
+      </w:pPr>
+      <w:r>
+        <w:t xml:space="preserve">    (2, 300.00, '2026-07-06',</w:t>
+      </w:r>
+    </w:p>
+    <w:p>
+      <w:pPr>
+        <w:pStyle w:val="IT"/>
+      </w:pPr>
+      <w:r>
+        <w:t xml:space="preserve">     'Insurance', 'Paid', 'Insurance'),</w:t>
+      </w:r>
+    </w:p>
+    <w:p>
+      <w:pPr>
+        <w:pStyle w:val="IT"/>
+      </w:pPr>
+    </w:p>
+    <w:p>
+      <w:pPr>
+        <w:pStyle w:val="IT"/>
+      </w:pPr>
+      <w:r>
+        <w:t xml:space="preserve">    (3, 350.00, '2026-07-07',</w:t>
+      </w:r>
+    </w:p>
+    <w:p>
+      <w:pPr>
+        <w:pStyle w:val="IT"/>
+      </w:pPr>
+      <w:r>
+        <w:t xml:space="preserve">     'Credit Card', 'Paid', 'Self-Payment'),</w:t>
+      </w:r>
+    </w:p>
+    <w:p>
+      <w:pPr>
+        <w:pStyle w:val="IT"/>
+      </w:pPr>
+    </w:p>
+    <w:p>
+      <w:pPr>
+        <w:pStyle w:val="IT"/>
+      </w:pPr>
+      <w:r>
+        <w:t xml:space="preserve">    (4, 320.00, '2026-07-08',</w:t>
+      </w:r>
+    </w:p>
+    <w:p>
+      <w:pPr>
+        <w:pStyle w:val="IT"/>
+      </w:pPr>
+      <w:r>
+        <w:t xml:space="preserve">     'Insurance', 'Paid', 'Insurance'),</w:t>
+      </w:r>
+    </w:p>
+    <w:p>
+      <w:pPr>
+        <w:pStyle w:val="IT"/>
+      </w:pPr>
+    </w:p>
+    <w:p>
+      <w:pPr>
+        <w:pStyle w:val="IT"/>
+      </w:pPr>
+      <w:r>
+        <w:t xml:space="preserve">    (5, 400.00, '2026-07-09',</w:t>
+      </w:r>
+    </w:p>
+    <w:p>
+      <w:pPr>
+        <w:pStyle w:val="IT"/>
+      </w:pPr>
+      <w:r>
+        <w:t xml:space="preserve">     'Mada', 'Paid', 'Self-Payment');</w:t>
+      </w:r>
+    </w:p>
+    <w:p>
+      <w:pPr>
+        <w:pStyle w:val="IT"/>
+        <w:rPr>
+          <w:noProof/>
+        </w:rPr>
+      </w:pPr>
+      <w:r>
+        <w:rPr>
+          <w:noProof/>
+        </w:rPr>
+        <w:drawing>
+          <wp:inline distT="0" distB="0" distL="0" distR="0" wp14:anchorId="121366ED" wp14:editId="0D604607">
+            <wp:extent cx="5349240" cy="1591310"/>
+            <wp:effectExtent l="0" t="0" r="3810" b="8890"/>
+            <wp:docPr id="2098835999" name="Picture 1"/>
+            <wp:cNvGraphicFramePr>
+              <a:graphicFrameLocks xmlns:a="http://schemas.openxmlformats.org/drawingml/2006/main" noChangeAspect="1"/>
+            </wp:cNvGraphicFramePr>
+            <a:graphic xmlns:a="http://schemas.openxmlformats.org/drawingml/2006/main">
+              <a:graphicData uri="http://schemas.openxmlformats.org/drawingml/2006/picture">
+                <pic:pic xmlns:pic="http://schemas.openxmlformats.org/drawingml/2006/picture">
+                  <pic:nvPicPr>
+                    <pic:cNvPr id="2098835999" name=""/>
+                    <pic:cNvPicPr/>
+                  </pic:nvPicPr>
+                  <pic:blipFill>
+                    <a:blip r:embed="rId19"/>
+                    <a:stretch>
+                      <a:fillRect/>
+                    </a:stretch>
+                  </pic:blipFill>
+                  <pic:spPr>
+                    <a:xfrm>
+                      <a:off x="0" y="0"/>
+                      <a:ext cx="5349240" cy="1591310"/>
+                    </a:xfrm>
+                    <a:prstGeom prst="rect">
+                      <a:avLst/>
+                    </a:prstGeom>
+                  </pic:spPr>
+                </pic:pic>
+              </a:graphicData>
+            </a:graphic>
+          </wp:inline>
+        </w:drawing>
+      </w:r>
+      <w:r>
+        <w:rPr>
+          <w:noProof/>
+        </w:rPr>
+        <w:t xml:space="preserve"> </w:t>
+      </w:r>
+      <w:r>
+        <w:rPr>
+          <w:noProof/>
+        </w:rPr>
+        <w:drawing>
+          <wp:inline distT="0" distB="0" distL="0" distR="0" wp14:anchorId="416B294C" wp14:editId="471C2FA3">
+            <wp:extent cx="5349240" cy="2239645"/>
+            <wp:effectExtent l="0" t="0" r="3810" b="8255"/>
+            <wp:docPr id="758817635" name="Picture 1"/>
+            <wp:cNvGraphicFramePr>
+              <a:graphicFrameLocks xmlns:a="http://schemas.openxmlformats.org/drawingml/2006/main" noChangeAspect="1"/>
+            </wp:cNvGraphicFramePr>
+            <a:graphic xmlns:a="http://schemas.openxmlformats.org/drawingml/2006/main">
+              <a:graphicData uri="http://schemas.openxmlformats.org/drawingml/2006/picture">
+                <pic:pic xmlns:pic="http://schemas.openxmlformats.org/drawingml/2006/picture">
+                  <pic:nvPicPr>
+                    <pic:cNvPr id="758817635" name=""/>
+                    <pic:cNvPicPr/>
+                  </pic:nvPicPr>
+                  <pic:blipFill>
+                    <a:blip r:embed="rId20"/>
+                    <a:stretch>
+                      <a:fillRect/>
+                    </a:stretch>
+                  </pic:blipFill>
+                  <pic:spPr>
+                    <a:xfrm>
+                      <a:off x="0" y="0"/>
+                      <a:ext cx="5349240" cy="2239645"/>
+                    </a:xfrm>
+                    <a:prstGeom prst="rect">
+                      <a:avLst/>
+                    </a:prstGeom>
+                  </pic:spPr>
+                </pic:pic>
+              </a:graphicData>
+            </a:graphic>
+          </wp:inline>
+        </w:drawing>
+      </w:r>
+    </w:p>
+    <w:p>
+      <w:pPr>
+        <w:pStyle w:val="IT"/>
+      </w:pPr>
+      <w:r>
+        <w:rPr>
+          <w:noProof/>
+        </w:rPr>
+        <w:drawing>
+          <wp:inline distT="0" distB="0" distL="0" distR="0" wp14:anchorId="1F5C50B1" wp14:editId="33904CED">
+            <wp:extent cx="5349240" cy="2727325"/>
+            <wp:effectExtent l="0" t="0" r="3810" b="0"/>
+            <wp:docPr id="633027317" name="Picture 1"/>
+            <wp:cNvGraphicFramePr>
+              <a:graphicFrameLocks xmlns:a="http://schemas.openxmlformats.org/drawingml/2006/main" noChangeAspect="1"/>
+            </wp:cNvGraphicFramePr>
+            <a:graphic xmlns:a="http://schemas.openxmlformats.org/drawingml/2006/main">
+              <a:graphicData uri="http://schemas.openxmlformats.org/drawingml/2006/picture">
+                <pic:pic xmlns:pic="http://schemas.openxmlformats.org/drawingml/2006/picture">
+                  <pic:nvPicPr>
+                    <pic:cNvPr id="633027317" name=""/>
+                    <pic:cNvPicPr/>
+                  </pic:nvPicPr>
+                  <pic:blipFill>
+                    <a:blip r:embed="rId21"/>
+                    <a:stretch>
+                      <a:fillRect/>
+                    </a:stretch>
+                  </pic:blipFill>
+                  <pic:spPr>
+                    <a:xfrm>
+                      <a:off x="0" y="0"/>
+                      <a:ext cx="5349240" cy="2727325"/>
+                    </a:xfrm>
+                    <a:prstGeom prst="rect">
+                      <a:avLst/>
+                    </a:prstGeom>
+                  </pic:spPr>
+                </pic:pic>
+              </a:graphicData>
+            </a:graphic>
+          </wp:inline>
+        </w:drawing>
+      </w:r>
+    </w:p>
+    <w:p>
+      <w:pPr>
+        <w:pStyle w:val="IT"/>
+      </w:pPr>
+      <w:r>
+        <w:rPr>
+          <w:noProof/>
+        </w:rPr>
+        <w:drawing>
+          <wp:inline distT="0" distB="0" distL="0" distR="0" wp14:anchorId="41E3E389" wp14:editId="5E9CC487">
+            <wp:extent cx="5349240" cy="2233930"/>
+            <wp:effectExtent l="0" t="0" r="3810" b="0"/>
+            <wp:docPr id="1213861384" name="Picture 1"/>
+            <wp:cNvGraphicFramePr>
+              <a:graphicFrameLocks xmlns:a="http://schemas.openxmlformats.org/drawingml/2006/main" noChangeAspect="1"/>
+            </wp:cNvGraphicFramePr>
+            <a:graphic xmlns:a="http://schemas.openxmlformats.org/drawingml/2006/main">
+              <a:graphicData uri="http://schemas.openxmlformats.org/drawingml/2006/picture">
+                <pic:pic xmlns:pic="http://schemas.openxmlformats.org/drawingml/2006/picture">
+                  <pic:nvPicPr>
+                    <pic:cNvPr id="1213861384" name=""/>
+                    <pic:cNvPicPr/>
+                  </pic:nvPicPr>
+                  <pic:blipFill>
+                    <a:blip r:embed="rId22"/>
+                    <a:stretch>
+                      <a:fillRect/>
+                    </a:stretch>
+                  </pic:blipFill>
+                  <pic:spPr>
+                    <a:xfrm>
+                      <a:off x="0" y="0"/>
+                      <a:ext cx="5349240" cy="2233930"/>
+                    </a:xfrm>
+                    <a:prstGeom prst="rect">
+                      <a:avLst/>
+                    </a:prstGeom>
+                  </pic:spPr>
+                </pic:pic>
+              </a:graphicData>
+            </a:graphic>
+          </wp:inline>
+        </w:drawing>
+      </w:r>
+    </w:p>
+    <w:p>
+      <w:pPr>
+        <w:pStyle w:val="IT"/>
+      </w:pPr>
+      <w:r>
+        <w:rPr>
+          <w:noProof/>
+        </w:rPr>
+        <w:drawing>
+          <wp:inline distT="0" distB="0" distL="0" distR="0" wp14:anchorId="3F2C4D01" wp14:editId="2192F0AA">
+            <wp:extent cx="5349240" cy="1762760"/>
+            <wp:effectExtent l="0" t="0" r="3810" b="8890"/>
+            <wp:docPr id="1715264312" name="Picture 1"/>
+            <wp:cNvGraphicFramePr>
+              <a:graphicFrameLocks xmlns:a="http://schemas.openxmlformats.org/drawingml/2006/main" noChangeAspect="1"/>
+            </wp:cNvGraphicFramePr>
+            <a:graphic xmlns:a="http://schemas.openxmlformats.org/drawingml/2006/main">
+              <a:graphicData uri="http://schemas.openxmlformats.org/drawingml/2006/picture">
+                <pic:pic xmlns:pic="http://schemas.openxmlformats.org/drawingml/2006/picture">
+                  <pic:nvPicPr>
+                    <pic:cNvPr id="1715264312" name=""/>
+                    <pic:cNvPicPr/>
+                  </pic:nvPicPr>
+                  <pic:blipFill>
+                    <a:blip r:embed="rId23"/>
+                    <a:stretch>
+                      <a:fillRect/>
+                    </a:stretch>
+                  </pic:blipFill>
+                  <pic:spPr>
+                    <a:xfrm>
+                      <a:off x="0" y="0"/>
+                      <a:ext cx="5349240" cy="1762760"/>
+                    </a:xfrm>
+                    <a:prstGeom prst="rect">
+                      <a:avLst/>
+                    </a:prstGeom>
+                  </pic:spPr>
+                </pic:pic>
+              </a:graphicData>
+            </a:graphic>
+          </wp:inline>
+        </w:drawing>
+      </w:r>
+    </w:p>
+    <w:p>
+      <w:pPr>
+        <w:pStyle w:val="IT"/>
+      </w:pPr>
+      <w:r>
+        <w:rPr>
+          <w:noProof/>
+        </w:rPr>
+        <w:drawing>
+          <wp:inline distT="0" distB="0" distL="0" distR="0" wp14:anchorId="1D27604F" wp14:editId="0AA6732C">
+            <wp:extent cx="5349240" cy="2190750"/>
+            <wp:effectExtent l="0" t="0" r="3810" b="0"/>
+            <wp:docPr id="793405217" name="Picture 1"/>
+            <wp:cNvGraphicFramePr>
+              <a:graphicFrameLocks xmlns:a="http://schemas.openxmlformats.org/drawingml/2006/main" noChangeAspect="1"/>
+            </wp:cNvGraphicFramePr>
+            <a:graphic xmlns:a="http://schemas.openxmlformats.org/drawingml/2006/main">
+              <a:graphicData uri="http://schemas.openxmlformats.org/drawingml/2006/picture">
+                <pic:pic xmlns:pic="http://schemas.openxmlformats.org/drawingml/2006/picture">
+                  <pic:nvPicPr>
+                    <pic:cNvPr id="793405217" name=""/>
+                    <pic:cNvPicPr/>
+                  </pic:nvPicPr>
+                  <pic:blipFill>
+                    <a:blip r:embed="rId24"/>
+                    <a:stretch>
+                      <a:fillRect/>
+                    </a:stretch>
+                  </pic:blipFill>
+                  <pic:spPr>
+                    <a:xfrm>
+                      <a:off x="0" y="0"/>
+                      <a:ext cx="5349240" cy="2190750"/>
+                    </a:xfrm>
+                    <a:prstGeom prst="rect">
+                      <a:avLst/>
+                    </a:prstGeom>
+                  </pic:spPr>
+                </pic:pic>
+              </a:graphicData>
+            </a:graphic>
+          </wp:inline>
+        </w:drawing>
+      </w:r>
+    </w:p>
+    <w:p>
+      <w:pPr>
+        <w:pStyle w:val="IT"/>
+      </w:pPr>
+      <w:r>
+        <w:rPr>
+          <w:noProof/>
+        </w:rPr>
+        <w:drawing>
+          <wp:inline distT="0" distB="0" distL="0" distR="0" wp14:anchorId="2E9D0280" wp14:editId="5875C616">
+            <wp:extent cx="5349240" cy="1689735"/>
+            <wp:effectExtent l="0" t="0" r="3810" b="5715"/>
+            <wp:docPr id="1755597529" name="Picture 1"/>
+            <wp:cNvGraphicFramePr>
+              <a:graphicFrameLocks xmlns:a="http://schemas.openxmlformats.org/drawingml/2006/main" noChangeAspect="1"/>
+            </wp:cNvGraphicFramePr>
+            <a:graphic xmlns:a="http://schemas.openxmlformats.org/drawingml/2006/main">
+              <a:graphicData uri="http://schemas.openxmlformats.org/drawingml/2006/picture">
+                <pic:pic xmlns:pic="http://schemas.openxmlformats.org/drawingml/2006/picture">
+                  <pic:nvPicPr>
+                    <pic:cNvPr id="1755597529" name=""/>
+                    <pic:cNvPicPr/>
+                  </pic:nvPicPr>
+                  <pic:blipFill>
+                    <a:blip r:embed="rId25"/>
+                    <a:stretch>
+                      <a:fillRect/>
+                    </a:stretch>
+                  </pic:blipFill>
+                  <pic:spPr>
+                    <a:xfrm>
+                      <a:off x="0" y="0"/>
+                      <a:ext cx="5349240" cy="1689735"/>
+                    </a:xfrm>
+                    <a:prstGeom prst="rect">
+                      <a:avLst/>
+                    </a:prstGeom>
+                  </pic:spPr>
+                </pic:pic>
+              </a:graphicData>
+            </a:graphic>
+          </wp:inline>
+        </w:drawing>
+      </w:r>
+    </w:p>
+    <w:p>
+      <w:pPr>
+        <w:pStyle w:val="IT"/>
+        <w:rPr>
+          <w:b/>
+          <w:bCs/>
+        </w:rPr>
+      </w:pPr>
+      <w:r>
+        <w:rPr>
+          <w:b/>
+          <w:bCs/>
+        </w:rPr>
+        <w:t>4. Complete Table Structure</w:t>
+      </w:r>
+    </w:p>
+    <w:p>
+      <w:pPr>
+        <w:pStyle w:val="IT"/>
+      </w:pPr>
+      <w:r>
+        <w:t>The implemented relational database therefore contains:</w:t>
+      </w:r>
+    </w:p>
+    <w:tbl>
+      <w:tblPr>
+        <w:tblStyle w:val="TableGridLight"/>
+        <w:tblW w:w="0" w:type="auto"/>
+        <w:tblLook w:val="04A0" w:firstRow="1" w:lastRow="0" w:firstColumn="1" w:lastColumn="0" w:noHBand="0" w:noVBand="1"/>
+      </w:tblPr>
+      <w:tblGrid>
+        <w:gridCol w:w="2043"/>
+        <w:gridCol w:w="1856"/>
+        <w:gridCol w:w="4515"/>
+      </w:tblGrid>
+      <w:tr>
+        <w:tc>
+          <w:tcPr>
+            <w:tcW w:w="0" w:type="auto"/>
+            <w:hideMark/>
+          </w:tcPr>
+          <w:p>
+            <w:pPr>
+              <w:pStyle w:val="IT"/>
+              <w:rPr>
+                <w:b/>
+                <w:bCs/>
+              </w:rPr>
+            </w:pPr>
+            <w:r>
+              <w:rPr>
+                <w:b/>
+                <w:bCs/>
+              </w:rPr>
+              <w:t>Table</w:t>
+            </w:r>
+          </w:p>
+        </w:tc>
+        <w:tc>
+          <w:tcPr>
+            <w:tcW w:w="0" w:type="auto"/>
+            <w:hideMark/>
+          </w:tcPr>
+          <w:p>
+            <w:pPr>
+              <w:pStyle w:val="IT"/>
+              <w:rPr>
+                <w:b/>
+                <w:bCs/>
+              </w:rPr>
+            </w:pPr>
+            <w:r>
+              <w:rPr>
+                <w:b/>
+                <w:bCs/>
+              </w:rPr>
+              <w:t>Primary Key</w:t>
+            </w:r>
+          </w:p>
+        </w:tc>
+        <w:tc>
+          <w:tcPr>
+            <w:tcW w:w="0" w:type="auto"/>
+            <w:hideMark/>
+          </w:tcPr>
+          <w:p>
+            <w:pPr>
+              <w:pStyle w:val="IT"/>
+              <w:rPr>
+                <w:b/>
+                <w:bCs/>
+              </w:rPr>
+            </w:pPr>
+            <w:r>
+              <w:rPr>
+                <w:b/>
+                <w:bCs/>
+              </w:rPr>
+              <w:t>Main Foreign Key(s)</w:t>
+            </w:r>
+          </w:p>
+        </w:tc>
+      </w:tr>
+      <w:tr>
+        <w:tc>
+          <w:tcPr>
+            <w:tcW w:w="0" w:type="auto"/>
+            <w:hideMark/>
+          </w:tcPr>
+          <w:p>
+            <w:pPr>
+              <w:pStyle w:val="IT"/>
+            </w:pPr>
+            <w:r>
+              <w:t>Patient</w:t>
+            </w:r>
+          </w:p>
+        </w:tc>
+        <w:tc>
+          <w:tcPr>
+            <w:tcW w:w="0" w:type="auto"/>
+            <w:hideMark/>
+          </w:tcPr>
+          <w:p>
+            <w:pPr>
+              <w:pStyle w:val="IT"/>
+            </w:pPr>
+            <w:r>
+              <w:t>Patient_ID</w:t>
+            </w:r>
+          </w:p>
+        </w:tc>
+        <w:tc>
+          <w:tcPr>
+            <w:tcW w:w="0" w:type="auto"/>
+            <w:hideMark/>
+          </w:tcPr>
+          <w:p>
+            <w:pPr>
+              <w:pStyle w:val="IT"/>
+            </w:pPr>
+            <w:r>
+              <w:t>—</w:t>
+            </w:r>
+          </w:p>
+        </w:tc>
+      </w:tr>
+      <w:tr>
+        <w:tc>
+          <w:tcPr>
+            <w:tcW w:w="0" w:type="auto"/>
+            <w:hideMark/>
+          </w:tcPr>
+          <w:p>
+            <w:pPr>
+              <w:pStyle w:val="IT"/>
+            </w:pPr>
+            <w:r>
+              <w:t>Doctor</w:t>
+            </w:r>
+          </w:p>
+        </w:tc>
+        <w:tc>
+          <w:tcPr>
+            <w:tcW w:w="0" w:type="auto"/>
+            <w:hideMark/>
+          </w:tcPr>
+          <w:p>
+            <w:pPr>
+              <w:pStyle w:val="IT"/>
+            </w:pPr>
+            <w:r>
+              <w:t>Doctor_ID</w:t>
+            </w:r>
+          </w:p>
+        </w:tc>
+        <w:tc>
+          <w:tcPr>
+            <w:tcW w:w="0" w:type="auto"/>
+            <w:hideMark/>
+          </w:tcPr>
+          <w:p>
+            <w:pPr>
+              <w:pStyle w:val="IT"/>
+            </w:pPr>
+            <w:r>
+              <w:t>—</w:t>
+            </w:r>
+          </w:p>
+        </w:tc>
+      </w:tr>
+      <w:tr>
+        <w:tc>
+          <w:tcPr>
+            <w:tcW w:w="0" w:type="auto"/>
+            <w:hideMark/>
+          </w:tcPr>
+          <w:p>
+            <w:pPr>
+              <w:pStyle w:val="IT"/>
+            </w:pPr>
+            <w:r>
+              <w:t>Consultant_Doctor</w:t>
+            </w:r>
+          </w:p>
+        </w:tc>
+        <w:tc>
+          <w:tcPr>
+            <w:tcW w:w="0" w:type="auto"/>
+            <w:hideMark/>
+          </w:tcPr>
+          <w:p>
+            <w:pPr>
+              <w:pStyle w:val="IT"/>
+            </w:pPr>
+            <w:r>
+              <w:t>Doctor_ID</w:t>
+            </w:r>
+          </w:p>
+        </w:tc>
+        <w:tc>
+          <w:tcPr>
+            <w:tcW w:w="0" w:type="auto"/>
+            <w:hideMark/>
+          </w:tcPr>
+          <w:p>
+            <w:pPr>
+              <w:pStyle w:val="IT"/>
+            </w:pPr>
+            <w:r>
+              <w:t>Doctor_ID → Doctor</w:t>
+            </w:r>
+          </w:p>
+        </w:tc>
+      </w:tr>
+      <w:tr>
+        <w:tc>
+          <w:tcPr>
+            <w:tcW w:w="0" w:type="auto"/>
+            <w:hideMark/>
+          </w:tcPr>
+          <w:p>
+            <w:pPr>
+              <w:pStyle w:val="IT"/>
+            </w:pPr>
+            <w:r>
+              <w:t>Resident_Doctor</w:t>
+            </w:r>
+          </w:p>
+        </w:tc>
+        <w:tc>
+          <w:tcPr>
+            <w:tcW w:w="0" w:type="auto"/>
+            <w:hideMark/>
+          </w:tcPr>
+          <w:p>
+            <w:pPr>
+              <w:pStyle w:val="IT"/>
+            </w:pPr>
+            <w:r>
+              <w:t>Doctor_ID</w:t>
+            </w:r>
+          </w:p>
+        </w:tc>
+        <w:tc>
+          <w:tcPr>
+            <w:tcW w:w="0" w:type="auto"/>
+            <w:hideMark/>
+          </w:tcPr>
+          <w:p>
+            <w:pPr>
+              <w:pStyle w:val="IT"/>
+            </w:pPr>
+            <w:r>
+              <w:t>Doctor_ID → Doctor</w:t>
+            </w:r>
+          </w:p>
+        </w:tc>
+      </w:tr>
+      <w:tr>
+        <w:tc>
+          <w:tcPr>
+            <w:tcW w:w="0" w:type="auto"/>
+            <w:hideMark/>
+          </w:tcPr>
+          <w:p>
+            <w:pPr>
+              <w:pStyle w:val="IT"/>
+            </w:pPr>
+            <w:r>
+              <w:t>Appointment</w:t>
+            </w:r>
+          </w:p>
+        </w:tc>
+        <w:tc>
+          <w:tcPr>
+            <w:tcW w:w="0" w:type="auto"/>
+            <w:hideMark/>
+          </w:tcPr>
+          <w:p>
+            <w:pPr>
+              <w:pStyle w:val="IT"/>
+            </w:pPr>
+            <w:r>
+              <w:t>Appointment_ID</w:t>
+            </w:r>
+          </w:p>
+        </w:tc>
+        <w:tc>
+          <w:tcPr>
+            <w:tcW w:w="0" w:type="auto"/>
+            <w:hideMark/>
+          </w:tcPr>
+          <w:p>
+            <w:pPr>
+              <w:pStyle w:val="IT"/>
+            </w:pPr>
+            <w:r>
+              <w:t>Patient_ID → Patient, Doctor_ID → Doctor</w:t>
+            </w:r>
+          </w:p>
+        </w:tc>
+      </w:tr>
+      <w:tr>
+        <w:tc>
+          <w:tcPr>
+            <w:tcW w:w="0" w:type="auto"/>
+            <w:hideMark/>
+          </w:tcPr>
+          <w:p>
+            <w:pPr>
+              <w:pStyle w:val="IT"/>
+            </w:pPr>
+            <w:r>
+              <w:t>Medicine</w:t>
+            </w:r>
+          </w:p>
+        </w:tc>
+        <w:tc>
+          <w:tcPr>
+            <w:tcW w:w="0" w:type="auto"/>
+            <w:hideMark/>
+          </w:tcPr>
+          <w:p>
+            <w:pPr>
+              <w:pStyle w:val="IT"/>
+            </w:pPr>
+            <w:r>
+              <w:t>Medicine_ID</w:t>
+            </w:r>
+          </w:p>
+        </w:tc>
+        <w:tc>
+          <w:tcPr>
+            <w:tcW w:w="0" w:type="auto"/>
+            <w:hideMark/>
+          </w:tcPr>
+          <w:p>
+            <w:pPr>
+              <w:pStyle w:val="IT"/>
+            </w:pPr>
+            <w:r>
+              <w:t>—</w:t>
+            </w:r>
+          </w:p>
+        </w:tc>
+      </w:tr>
+      <w:tr>
+        <w:tc>
+          <w:tcPr>
+            <w:tcW w:w="0" w:type="auto"/>
+            <w:hideMark/>
+          </w:tcPr>
+          <w:p>
+            <w:pPr>
+              <w:pStyle w:val="IT"/>
+            </w:pPr>
+            <w:r>
+              <w:t>Treatment</w:t>
+            </w:r>
+          </w:p>
+        </w:tc>
+        <w:tc>
+          <w:tcPr>
+            <w:tcW w:w="0" w:type="auto"/>
+            <w:hideMark/>
+          </w:tcPr>
+          <w:p>
+            <w:pPr>
+              <w:pStyle w:val="IT"/>
+            </w:pPr>
+            <w:r>
+              <w:t>Treatment_ID</w:t>
+            </w:r>
+          </w:p>
+        </w:tc>
+        <w:tc>
+          <w:tcPr>
+            <w:tcW w:w="0" w:type="auto"/>
+            <w:hideMark/>
+          </w:tcPr>
+          <w:p>
+            <w:pPr>
+              <w:pStyle w:val="IT"/>
+            </w:pPr>
+            <w:r>
+              <w:t>Appointment_ID → Appointment, Medicine_ID → Medicine</w:t>
+            </w:r>
+          </w:p>
+        </w:tc>
+      </w:tr>
+      <w:tr>
+        <w:tc>
+          <w:tcPr>
+            <w:tcW w:w="0" w:type="auto"/>
+            <w:hideMark/>
+          </w:tcPr>
+          <w:p>
+            <w:pPr>
+              <w:pStyle w:val="IT"/>
+            </w:pPr>
+            <w:r>
+              <w:t>Payment</w:t>
+            </w:r>
+          </w:p>
+        </w:tc>
+        <w:tc>
+          <w:tcPr>
+            <w:tcW w:w="0" w:type="auto"/>
+            <w:hideMark/>
+          </w:tcPr>
+          <w:p>
+            <w:pPr>
+              <w:pStyle w:val="IT"/>
+            </w:pPr>
+            <w:r>
+              <w:t>Payment_ID</w:t>
+            </w:r>
+          </w:p>
+        </w:tc>
+        <w:tc>
+          <w:tcPr>
+            <w:tcW w:w="0" w:type="auto"/>
+            <w:hideMark/>
+          </w:tcPr>
+          <w:p>
+            <w:pPr>
+              <w:pStyle w:val="IT"/>
+            </w:pPr>
+            <w:r>
+              <w:t>Appointment_ID → Appointment</w:t>
+            </w:r>
+          </w:p>
+        </w:tc>
+      </w:tr>
+    </w:tbl>
+    <w:p>
+      <w:pPr>
+        <w:pStyle w:val="IT"/>
+      </w:pPr>
+      <w:r>
+        <w:t>The use of primary keys prevents duplicate entity identifiers, while UNIQUE constraints are used for values such as national IDs, medical license numbers, phone numbers, and email addresses. Foreign keys preserve the relationships established in the ER/EER design. The DBMS automatically checks these constraints when new records are inserted or existing records are modified.</w:t>
+      </w:r>
     </w:p>
     <w:p>
       <w:pPr>
@@ -8358,7 +10641,7 @@
       </w:pPr>
     </w:p>
     <w:sectPr>
-      <w:headerReference w:type="default" r:id="rId19"/>
+      <w:headerReference w:type="default" r:id="rId26"/>
       <w:pgSz w:w="12240" w:h="15840"/>
       <w:pgMar w:top="1080" w:right="720" w:bottom="1800" w:left="3096" w:header="1080" w:footer="720" w:gutter="0"/>
       <w:pgNumType w:start="1"/>
@@ -12466,6 +14749,7 @@
     <w:rsid w:val="006D7F43"/>
     <w:rsid w:val="006E2B58"/>
     <w:rsid w:val="00737F6A"/>
+    <w:rsid w:val="007D16BD"/>
     <w:rsid w:val="00810750"/>
     <w:rsid w:val="008A4AE7"/>
     <w:rsid w:val="008C5716"/>
@@ -13361,16 +15645,16 @@
 </file>
 
 <file path=customXml/item3.xml><?xml version="1.0" encoding="utf-8"?>
+<b:Sources xmlns:b="http://schemas.openxmlformats.org/officeDocument/2006/bibliography" SelectedStyle="\APA.XSL" StyleName="APA"/>
+</file>
+
+<file path=customXml/item4.xml><?xml version="1.0" encoding="utf-8"?>
 <?mso-contentType ?>
 <FormTemplates xmlns="http://schemas.microsoft.com/sharepoint/v3/contenttype/forms">
   <Display>DocumentLibraryForm</Display>
   <Edit>AssetEditForm</Edit>
   <New>DocumentLibraryForm</New>
 </FormTemplates>
-</file>
-
-<file path=customXml/item4.xml><?xml version="1.0" encoding="utf-8"?>
-<b:Sources xmlns:b="http://schemas.openxmlformats.org/officeDocument/2006/bibliography" SelectedStyle="\APA.XSL" StyleName="APA"/>
 </file>
 
 <file path=customXml/itemProps1.xml><?xml version="1.0" encoding="utf-8"?>
@@ -13390,17 +15674,17 @@
 </file>
 
 <file path=customXml/itemProps3.xml><?xml version="1.0" encoding="utf-8"?>
+<ds:datastoreItem xmlns:ds="http://schemas.openxmlformats.org/officeDocument/2006/customXml" ds:itemID="{355C5113-D031-41DB-A6D8-43CE1A0E6695}">
+  <ds:schemaRefs>
+    <ds:schemaRef ds:uri="http://schemas.openxmlformats.org/officeDocument/2006/bibliography"/>
+  </ds:schemaRefs>
+</ds:datastoreItem>
+</file>
+
+<file path=customXml/itemProps4.xml><?xml version="1.0" encoding="utf-8"?>
 <ds:datastoreItem xmlns:ds="http://schemas.openxmlformats.org/officeDocument/2006/customXml" ds:itemID="{E34C63B7-A026-4A37-9535-4FBB4C03A11D}">
   <ds:schemaRefs>
     <ds:schemaRef ds:uri="http://schemas.microsoft.com/sharepoint/v3/contenttype/forms"/>
   </ds:schemaRefs>
 </ds:datastoreItem>
-</file>
-
-<file path=customXml/itemProps4.xml><?xml version="1.0" encoding="utf-8"?>
-<ds:datastoreItem xmlns:ds="http://schemas.openxmlformats.org/officeDocument/2006/customXml" ds:itemID="{355C5113-D031-41DB-A6D8-43CE1A0E6695}">
-  <ds:schemaRefs>
-    <ds:schemaRef ds:uri="http://schemas.openxmlformats.org/officeDocument/2006/bibliography"/>
-  </ds:schemaRefs>
-</ds:datastoreItem>
 </file>
</xml_diff>

<commit_message>
Solve task 3 and reflection task 4.
</commit_message>
<xml_diff>
--- a/IT244 - Project.docx
+++ b/IT244 - Project.docx
@@ -3600,7 +3600,25 @@
           <w:sz w:val="24"/>
           <w:szCs w:val="24"/>
         </w:rPr>
-        <w:t xml:space="preserve"> to the live report document, GitHub/GitLab repository, and Google Colab notebook (if applicable) in the </w:t>
+        <w:t xml:space="preserve"> to the live report document, GitHub/GitLab repository, and Google </w:t>
+      </w:r>
+      <w:proofErr w:type="spellStart"/>
+      <w:r>
+        <w:rPr>
+          <w:rFonts w:ascii="Times New Roman" w:hAnsi="Times New Roman" w:cs="Times New Roman"/>
+          <w:sz w:val="24"/>
+          <w:szCs w:val="24"/>
+        </w:rPr>
+        <w:t>Colab</w:t>
+      </w:r>
+      <w:proofErr w:type="spellEnd"/>
+      <w:r>
+        <w:rPr>
+          <w:rFonts w:ascii="Times New Roman" w:hAnsi="Times New Roman" w:cs="Times New Roman"/>
+          <w:sz w:val="24"/>
+          <w:szCs w:val="24"/>
+        </w:rPr>
+        <w:t xml:space="preserve"> notebook (if applicable) in the </w:t>
       </w:r>
       <w:r>
         <w:rPr>
@@ -4444,7 +4462,27 @@
           <w:szCs w:val="24"/>
           <w:lang w:val="es-ES"/>
         </w:rPr>
-        <w:t>A complete ER/EER diagram.</w:t>
+        <w:t xml:space="preserve">A complete ER/EER </w:t>
+      </w:r>
+      <w:proofErr w:type="spellStart"/>
+      <w:r>
+        <w:rPr>
+          <w:rFonts w:ascii="Times New Roman" w:hAnsi="Times New Roman" w:cs="Times New Roman"/>
+          <w:sz w:val="24"/>
+          <w:szCs w:val="24"/>
+          <w:lang w:val="es-ES"/>
+        </w:rPr>
+        <w:t>diagram</w:t>
+      </w:r>
+      <w:proofErr w:type="spellEnd"/>
+      <w:r>
+        <w:rPr>
+          <w:rFonts w:ascii="Times New Roman" w:hAnsi="Times New Roman" w:cs="Times New Roman"/>
+          <w:sz w:val="24"/>
+          <w:szCs w:val="24"/>
+          <w:lang w:val="es-ES"/>
+        </w:rPr>
+        <w:t>.</w:t>
       </w:r>
     </w:p>
     <w:p>
@@ -4761,11 +4799,61 @@
                 <w:lang w:bidi="ar-EG"/>
               </w:rPr>
             </w:pPr>
+            <w:proofErr w:type="spellStart"/>
             <w:r>
               <w:rPr>
                 <w:lang w:bidi="ar-EG"/>
               </w:rPr>
-              <w:t>Patient_ID, National_ID, Full_Name, Date_of_Birth, Gender, Phone, Email, Address</w:t>
+              <w:t>Patient_ID</w:t>
+            </w:r>
+            <w:proofErr w:type="spellEnd"/>
+            <w:r>
+              <w:rPr>
+                <w:lang w:bidi="ar-EG"/>
+              </w:rPr>
+              <w:t xml:space="preserve">, </w:t>
+            </w:r>
+            <w:proofErr w:type="spellStart"/>
+            <w:r>
+              <w:rPr>
+                <w:lang w:bidi="ar-EG"/>
+              </w:rPr>
+              <w:t>National_ID</w:t>
+            </w:r>
+            <w:proofErr w:type="spellEnd"/>
+            <w:r>
+              <w:rPr>
+                <w:lang w:bidi="ar-EG"/>
+              </w:rPr>
+              <w:t xml:space="preserve">, </w:t>
+            </w:r>
+            <w:proofErr w:type="spellStart"/>
+            <w:r>
+              <w:rPr>
+                <w:lang w:bidi="ar-EG"/>
+              </w:rPr>
+              <w:t>Full_Name</w:t>
+            </w:r>
+            <w:proofErr w:type="spellEnd"/>
+            <w:r>
+              <w:rPr>
+                <w:lang w:bidi="ar-EG"/>
+              </w:rPr>
+              <w:t xml:space="preserve">, </w:t>
+            </w:r>
+            <w:proofErr w:type="spellStart"/>
+            <w:r>
+              <w:rPr>
+                <w:lang w:bidi="ar-EG"/>
+              </w:rPr>
+              <w:t>Date_of_Birth</w:t>
+            </w:r>
+            <w:proofErr w:type="spellEnd"/>
+            <w:r>
+              <w:rPr>
+                <w:lang w:bidi="ar-EG"/>
+              </w:rPr>
+              <w:t>, Gender, Phone, Email, Address</w:t>
             </w:r>
           </w:p>
         </w:tc>
@@ -4781,12 +4869,14 @@
                 <w:lang w:bidi="ar-EG"/>
               </w:rPr>
             </w:pPr>
+            <w:proofErr w:type="spellStart"/>
             <w:r>
               <w:rPr>
                 <w:lang w:bidi="ar-EG"/>
               </w:rPr>
               <w:t>Patient_ID</w:t>
             </w:r>
+            <w:proofErr w:type="spellEnd"/>
           </w:p>
         </w:tc>
         <w:tc>
@@ -4845,12 +4935,56 @@
                 <w:lang w:bidi="ar-EG"/>
               </w:rPr>
             </w:pPr>
+            <w:proofErr w:type="spellStart"/>
             <w:r>
               <w:rPr>
                 <w:lang w:bidi="ar-EG"/>
               </w:rPr>
-              <w:t>Doctor_ID, Full_Name, Specialty, License_No, Phone, Email, Doctor_Type</w:t>
+              <w:t>Doctor_ID</w:t>
             </w:r>
+            <w:proofErr w:type="spellEnd"/>
+            <w:r>
+              <w:rPr>
+                <w:lang w:bidi="ar-EG"/>
+              </w:rPr>
+              <w:t xml:space="preserve">, </w:t>
+            </w:r>
+            <w:proofErr w:type="spellStart"/>
+            <w:r>
+              <w:rPr>
+                <w:lang w:bidi="ar-EG"/>
+              </w:rPr>
+              <w:t>Full_Name</w:t>
+            </w:r>
+            <w:proofErr w:type="spellEnd"/>
+            <w:r>
+              <w:rPr>
+                <w:lang w:bidi="ar-EG"/>
+              </w:rPr>
+              <w:t xml:space="preserve">, Specialty, </w:t>
+            </w:r>
+            <w:proofErr w:type="spellStart"/>
+            <w:r>
+              <w:rPr>
+                <w:lang w:bidi="ar-EG"/>
+              </w:rPr>
+              <w:t>License_No</w:t>
+            </w:r>
+            <w:proofErr w:type="spellEnd"/>
+            <w:r>
+              <w:rPr>
+                <w:lang w:bidi="ar-EG"/>
+              </w:rPr>
+              <w:t xml:space="preserve">, Phone, Email, </w:t>
+            </w:r>
+            <w:proofErr w:type="spellStart"/>
+            <w:r>
+              <w:rPr>
+                <w:lang w:bidi="ar-EG"/>
+              </w:rPr>
+              <w:t>Doctor_Type</w:t>
+            </w:r>
+            <w:proofErr w:type="spellEnd"/>
           </w:p>
         </w:tc>
         <w:tc>
@@ -4865,12 +4999,14 @@
                 <w:lang w:bidi="ar-EG"/>
               </w:rPr>
             </w:pPr>
+            <w:proofErr w:type="spellStart"/>
             <w:r>
               <w:rPr>
                 <w:lang w:bidi="ar-EG"/>
               </w:rPr>
               <w:t>Doctor_ID</w:t>
             </w:r>
+            <w:proofErr w:type="spellEnd"/>
           </w:p>
         </w:tc>
         <w:tc>
@@ -4929,11 +5065,61 @@
                 <w:lang w:bidi="ar-EG"/>
               </w:rPr>
             </w:pPr>
+            <w:proofErr w:type="spellStart"/>
             <w:r>
               <w:rPr>
                 <w:lang w:bidi="ar-EG"/>
               </w:rPr>
-              <w:t>Appointment_ID, Appointment_Date, Appointment_Time, Visit_Reason, Status</w:t>
+              <w:t>Appointment_ID</w:t>
+            </w:r>
+            <w:proofErr w:type="spellEnd"/>
+            <w:r>
+              <w:rPr>
+                <w:lang w:bidi="ar-EG"/>
+              </w:rPr>
+              <w:t xml:space="preserve">, </w:t>
+            </w:r>
+            <w:proofErr w:type="spellStart"/>
+            <w:r>
+              <w:rPr>
+                <w:lang w:bidi="ar-EG"/>
+              </w:rPr>
+              <w:t>Appointment_Date</w:t>
+            </w:r>
+            <w:proofErr w:type="spellEnd"/>
+            <w:r>
+              <w:rPr>
+                <w:lang w:bidi="ar-EG"/>
+              </w:rPr>
+              <w:t xml:space="preserve">, </w:t>
+            </w:r>
+            <w:proofErr w:type="spellStart"/>
+            <w:r>
+              <w:rPr>
+                <w:lang w:bidi="ar-EG"/>
+              </w:rPr>
+              <w:t>Appointment_Time</w:t>
+            </w:r>
+            <w:proofErr w:type="spellEnd"/>
+            <w:r>
+              <w:rPr>
+                <w:lang w:bidi="ar-EG"/>
+              </w:rPr>
+              <w:t xml:space="preserve">, </w:t>
+            </w:r>
+            <w:proofErr w:type="spellStart"/>
+            <w:r>
+              <w:rPr>
+                <w:lang w:bidi="ar-EG"/>
+              </w:rPr>
+              <w:t>Visit_Reason</w:t>
+            </w:r>
+            <w:proofErr w:type="spellEnd"/>
+            <w:r>
+              <w:rPr>
+                <w:lang w:bidi="ar-EG"/>
+              </w:rPr>
+              <w:t>, Status</w:t>
             </w:r>
           </w:p>
         </w:tc>
@@ -4949,12 +5135,14 @@
                 <w:lang w:bidi="ar-EG"/>
               </w:rPr>
             </w:pPr>
+            <w:proofErr w:type="spellStart"/>
             <w:r>
               <w:rPr>
                 <w:lang w:bidi="ar-EG"/>
               </w:rPr>
               <w:t>Appointment_ID</w:t>
             </w:r>
+            <w:proofErr w:type="spellEnd"/>
           </w:p>
         </w:tc>
         <w:tc>
@@ -4969,12 +5157,28 @@
                 <w:lang w:bidi="ar-EG"/>
               </w:rPr>
             </w:pPr>
+            <w:proofErr w:type="spellStart"/>
             <w:r>
               <w:rPr>
                 <w:lang w:bidi="ar-EG"/>
               </w:rPr>
-              <w:t>Patient_ID, Doctor_ID</w:t>
+              <w:t>Patient_ID</w:t>
             </w:r>
+            <w:proofErr w:type="spellEnd"/>
+            <w:r>
+              <w:rPr>
+                <w:lang w:bidi="ar-EG"/>
+              </w:rPr>
+              <w:t xml:space="preserve">, </w:t>
+            </w:r>
+            <w:proofErr w:type="spellStart"/>
+            <w:r>
+              <w:rPr>
+                <w:lang w:bidi="ar-EG"/>
+              </w:rPr>
+              <w:t>Doctor_ID</w:t>
+            </w:r>
+            <w:proofErr w:type="spellEnd"/>
           </w:p>
         </w:tc>
       </w:tr>
@@ -5013,11 +5217,33 @@
                 <w:lang w:bidi="ar-EG"/>
               </w:rPr>
             </w:pPr>
+            <w:proofErr w:type="spellStart"/>
             <w:r>
               <w:rPr>
                 <w:lang w:bidi="ar-EG"/>
               </w:rPr>
-              <w:t>Treatment_ID, Diagnosis, Procedure_Name, Notes, Cost</w:t>
+              <w:t>Treatment_ID</w:t>
+            </w:r>
+            <w:proofErr w:type="spellEnd"/>
+            <w:r>
+              <w:rPr>
+                <w:lang w:bidi="ar-EG"/>
+              </w:rPr>
+              <w:t xml:space="preserve">, Diagnosis, </w:t>
+            </w:r>
+            <w:proofErr w:type="spellStart"/>
+            <w:r>
+              <w:rPr>
+                <w:lang w:bidi="ar-EG"/>
+              </w:rPr>
+              <w:t>Procedure_Name</w:t>
+            </w:r>
+            <w:proofErr w:type="spellEnd"/>
+            <w:r>
+              <w:rPr>
+                <w:lang w:bidi="ar-EG"/>
+              </w:rPr>
+              <w:t>, Notes, Cost</w:t>
             </w:r>
           </w:p>
         </w:tc>
@@ -5033,12 +5259,14 @@
                 <w:lang w:bidi="ar-EG"/>
               </w:rPr>
             </w:pPr>
+            <w:proofErr w:type="spellStart"/>
             <w:r>
               <w:rPr>
                 <w:lang w:bidi="ar-EG"/>
               </w:rPr>
               <w:t>Treatment_ID</w:t>
             </w:r>
+            <w:proofErr w:type="spellEnd"/>
           </w:p>
         </w:tc>
         <w:tc>
@@ -5053,12 +5281,28 @@
                 <w:lang w:bidi="ar-EG"/>
               </w:rPr>
             </w:pPr>
+            <w:proofErr w:type="spellStart"/>
             <w:r>
               <w:rPr>
                 <w:lang w:bidi="ar-EG"/>
               </w:rPr>
-              <w:t>Appointment_ID, Medicine_ID</w:t>
+              <w:t>Appointment_ID</w:t>
             </w:r>
+            <w:proofErr w:type="spellEnd"/>
+            <w:r>
+              <w:rPr>
+                <w:lang w:bidi="ar-EG"/>
+              </w:rPr>
+              <w:t xml:space="preserve">, </w:t>
+            </w:r>
+            <w:proofErr w:type="spellStart"/>
+            <w:r>
+              <w:rPr>
+                <w:lang w:bidi="ar-EG"/>
+              </w:rPr>
+              <w:t>Medicine_ID</w:t>
+            </w:r>
+            <w:proofErr w:type="spellEnd"/>
           </w:p>
         </w:tc>
       </w:tr>
@@ -5097,12 +5341,56 @@
                 <w:lang w:bidi="ar-EG"/>
               </w:rPr>
             </w:pPr>
+            <w:proofErr w:type="spellStart"/>
             <w:r>
               <w:rPr>
                 <w:lang w:bidi="ar-EG"/>
               </w:rPr>
-              <w:t>Medicine_ID, Medicine_Name, Description, Unit_Price, Stock_Quantity</w:t>
+              <w:t>Medicine_ID</w:t>
             </w:r>
+            <w:proofErr w:type="spellEnd"/>
+            <w:r>
+              <w:rPr>
+                <w:lang w:bidi="ar-EG"/>
+              </w:rPr>
+              <w:t xml:space="preserve">, </w:t>
+            </w:r>
+            <w:proofErr w:type="spellStart"/>
+            <w:r>
+              <w:rPr>
+                <w:lang w:bidi="ar-EG"/>
+              </w:rPr>
+              <w:t>Medicine_Name</w:t>
+            </w:r>
+            <w:proofErr w:type="spellEnd"/>
+            <w:r>
+              <w:rPr>
+                <w:lang w:bidi="ar-EG"/>
+              </w:rPr>
+              <w:t xml:space="preserve">, Description, </w:t>
+            </w:r>
+            <w:proofErr w:type="spellStart"/>
+            <w:r>
+              <w:rPr>
+                <w:lang w:bidi="ar-EG"/>
+              </w:rPr>
+              <w:t>Unit_Price</w:t>
+            </w:r>
+            <w:proofErr w:type="spellEnd"/>
+            <w:r>
+              <w:rPr>
+                <w:lang w:bidi="ar-EG"/>
+              </w:rPr>
+              <w:t xml:space="preserve">, </w:t>
+            </w:r>
+            <w:proofErr w:type="spellStart"/>
+            <w:r>
+              <w:rPr>
+                <w:lang w:bidi="ar-EG"/>
+              </w:rPr>
+              <w:t>Stock_Quantity</w:t>
+            </w:r>
+            <w:proofErr w:type="spellEnd"/>
           </w:p>
         </w:tc>
         <w:tc>
@@ -5117,12 +5405,14 @@
                 <w:lang w:bidi="ar-EG"/>
               </w:rPr>
             </w:pPr>
+            <w:proofErr w:type="spellStart"/>
             <w:r>
               <w:rPr>
                 <w:lang w:bidi="ar-EG"/>
               </w:rPr>
               <w:t>Medicine_ID</w:t>
             </w:r>
+            <w:proofErr w:type="spellEnd"/>
           </w:p>
         </w:tc>
         <w:tc>
@@ -5181,12 +5471,70 @@
                 <w:lang w:bidi="ar-EG"/>
               </w:rPr>
             </w:pPr>
+            <w:proofErr w:type="spellStart"/>
             <w:r>
               <w:rPr>
                 <w:lang w:bidi="ar-EG"/>
               </w:rPr>
-              <w:t>Payment_ID, Amount, Payment_Date, Payment_Method, Payment_Status, Payment_Type</w:t>
+              <w:t>Payment_ID</w:t>
             </w:r>
+            <w:proofErr w:type="spellEnd"/>
+            <w:r>
+              <w:rPr>
+                <w:lang w:bidi="ar-EG"/>
+              </w:rPr>
+              <w:t xml:space="preserve">, Amount, </w:t>
+            </w:r>
+            <w:proofErr w:type="spellStart"/>
+            <w:r>
+              <w:rPr>
+                <w:lang w:bidi="ar-EG"/>
+              </w:rPr>
+              <w:t>Payment_Date</w:t>
+            </w:r>
+            <w:proofErr w:type="spellEnd"/>
+            <w:r>
+              <w:rPr>
+                <w:lang w:bidi="ar-EG"/>
+              </w:rPr>
+              <w:t xml:space="preserve">, </w:t>
+            </w:r>
+            <w:proofErr w:type="spellStart"/>
+            <w:r>
+              <w:rPr>
+                <w:lang w:bidi="ar-EG"/>
+              </w:rPr>
+              <w:t>Payment_Method</w:t>
+            </w:r>
+            <w:proofErr w:type="spellEnd"/>
+            <w:r>
+              <w:rPr>
+                <w:lang w:bidi="ar-EG"/>
+              </w:rPr>
+              <w:t xml:space="preserve">, </w:t>
+            </w:r>
+            <w:proofErr w:type="spellStart"/>
+            <w:r>
+              <w:rPr>
+                <w:lang w:bidi="ar-EG"/>
+              </w:rPr>
+              <w:t>Payment_Status</w:t>
+            </w:r>
+            <w:proofErr w:type="spellEnd"/>
+            <w:r>
+              <w:rPr>
+                <w:lang w:bidi="ar-EG"/>
+              </w:rPr>
+              <w:t xml:space="preserve">, </w:t>
+            </w:r>
+            <w:proofErr w:type="spellStart"/>
+            <w:r>
+              <w:rPr>
+                <w:lang w:bidi="ar-EG"/>
+              </w:rPr>
+              <w:t>Payment_Type</w:t>
+            </w:r>
+            <w:proofErr w:type="spellEnd"/>
           </w:p>
         </w:tc>
         <w:tc>
@@ -5201,12 +5549,14 @@
                 <w:lang w:bidi="ar-EG"/>
               </w:rPr>
             </w:pPr>
+            <w:proofErr w:type="spellStart"/>
             <w:r>
               <w:rPr>
                 <w:lang w:bidi="ar-EG"/>
               </w:rPr>
               <w:t>Payment_ID</w:t>
             </w:r>
+            <w:proofErr w:type="spellEnd"/>
           </w:p>
         </w:tc>
         <w:tc>
@@ -5221,12 +5571,14 @@
                 <w:lang w:bidi="ar-EG"/>
               </w:rPr>
             </w:pPr>
+            <w:proofErr w:type="spellStart"/>
             <w:r>
               <w:rPr>
                 <w:lang w:bidi="ar-EG"/>
               </w:rPr>
               <w:t>Appointment_ID</w:t>
             </w:r>
+            <w:proofErr w:type="spellEnd"/>
           </w:p>
         </w:tc>
       </w:tr>
@@ -5723,7 +6075,49 @@
         <w:rPr>
           <w:lang w:bidi="ar-EG"/>
         </w:rPr>
-        <w:t>Both subclasses inherit the common attributes of Doctor, such as Doctor_ID, Full_Name, Specialty, License_No, Phone, and Email.</w:t>
+        <w:t xml:space="preserve">Both subclasses inherit the common attributes of Doctor, such as </w:t>
+      </w:r>
+      <w:proofErr w:type="spellStart"/>
+      <w:r>
+        <w:rPr>
+          <w:lang w:bidi="ar-EG"/>
+        </w:rPr>
+        <w:t>Doctor_ID</w:t>
+      </w:r>
+      <w:proofErr w:type="spellEnd"/>
+      <w:r>
+        <w:rPr>
+          <w:lang w:bidi="ar-EG"/>
+        </w:rPr>
+        <w:t xml:space="preserve">, </w:t>
+      </w:r>
+      <w:proofErr w:type="spellStart"/>
+      <w:r>
+        <w:rPr>
+          <w:lang w:bidi="ar-EG"/>
+        </w:rPr>
+        <w:t>Full_Name</w:t>
+      </w:r>
+      <w:proofErr w:type="spellEnd"/>
+      <w:r>
+        <w:rPr>
+          <w:lang w:bidi="ar-EG"/>
+        </w:rPr>
+        <w:t xml:space="preserve">, Specialty, </w:t>
+      </w:r>
+      <w:proofErr w:type="spellStart"/>
+      <w:r>
+        <w:rPr>
+          <w:lang w:bidi="ar-EG"/>
+        </w:rPr>
+        <w:t>License_No</w:t>
+      </w:r>
+      <w:proofErr w:type="spellEnd"/>
+      <w:r>
+        <w:rPr>
+          <w:lang w:bidi="ar-EG"/>
+        </w:rPr>
+        <w:t>, Phone, and Email.</w:t>
       </w:r>
     </w:p>
     <w:p>
@@ -5751,7 +6145,21 @@
         <w:rPr>
           <w:lang w:bidi="ar-EG"/>
         </w:rPr>
-        <w:t>. Disjoint means that a doctor can belong to only one of the subclasses. Total means that every doctor must belong to at least one subclass. These are the two main specialization constraints used in an EER model: disjointness and completeness.</w:t>
+        <w:t xml:space="preserve">. Disjoint means that a doctor can belong to only one of the subclasses. Total means that every doctor must belong to at least one subclass. These are the two main specialization constraints used in an EER model: </w:t>
+      </w:r>
+      <w:proofErr w:type="spellStart"/>
+      <w:r>
+        <w:rPr>
+          <w:lang w:bidi="ar-EG"/>
+        </w:rPr>
+        <w:t>disjointness</w:t>
+      </w:r>
+      <w:proofErr w:type="spellEnd"/>
+      <w:r>
+        <w:rPr>
+          <w:lang w:bidi="ar-EG"/>
+        </w:rPr>
+        <w:t xml:space="preserve"> and completeness.</w:t>
       </w:r>
     </w:p>
     <w:p>
@@ -5860,12 +6268,28 @@
           <w:lang w:bidi="ar-EG"/>
         </w:rPr>
       </w:pPr>
+      <w:proofErr w:type="spellStart"/>
       <w:r>
         <w:rPr>
           <w:lang w:bidi="ar-EG"/>
         </w:rPr>
-        <w:t>Appointment.Patient_ID → Patient.Patient_ID</w:t>
-      </w:r>
+        <w:t>Appointment.Patient_ID</w:t>
+      </w:r>
+      <w:proofErr w:type="spellEnd"/>
+      <w:r>
+        <w:rPr>
+          <w:lang w:bidi="ar-EG"/>
+        </w:rPr>
+        <w:t xml:space="preserve"> → </w:t>
+      </w:r>
+      <w:proofErr w:type="spellStart"/>
+      <w:r>
+        <w:rPr>
+          <w:lang w:bidi="ar-EG"/>
+        </w:rPr>
+        <w:t>Patient.Patient_ID</w:t>
+      </w:r>
+      <w:proofErr w:type="spellEnd"/>
     </w:p>
     <w:p>
       <w:pPr>
@@ -5878,12 +6302,28 @@
           <w:lang w:bidi="ar-EG"/>
         </w:rPr>
       </w:pPr>
+      <w:proofErr w:type="spellStart"/>
       <w:r>
         <w:rPr>
           <w:lang w:bidi="ar-EG"/>
         </w:rPr>
-        <w:t>Appointment.Doctor_ID → Doctor.Doctor_ID</w:t>
-      </w:r>
+        <w:t>Appointment.Doctor_ID</w:t>
+      </w:r>
+      <w:proofErr w:type="spellEnd"/>
+      <w:r>
+        <w:rPr>
+          <w:lang w:bidi="ar-EG"/>
+        </w:rPr>
+        <w:t xml:space="preserve"> → </w:t>
+      </w:r>
+      <w:proofErr w:type="spellStart"/>
+      <w:r>
+        <w:rPr>
+          <w:lang w:bidi="ar-EG"/>
+        </w:rPr>
+        <w:t>Doctor.Doctor_ID</w:t>
+      </w:r>
+      <w:proofErr w:type="spellEnd"/>
     </w:p>
     <w:p>
       <w:pPr>
@@ -5896,12 +6336,28 @@
           <w:lang w:bidi="ar-EG"/>
         </w:rPr>
       </w:pPr>
+      <w:proofErr w:type="spellStart"/>
       <w:r>
         <w:rPr>
           <w:lang w:bidi="ar-EG"/>
         </w:rPr>
-        <w:t>Treatment.Appointment_ID → Appointment.Appointment_ID</w:t>
-      </w:r>
+        <w:t>Treatment.Appointment_ID</w:t>
+      </w:r>
+      <w:proofErr w:type="spellEnd"/>
+      <w:r>
+        <w:rPr>
+          <w:lang w:bidi="ar-EG"/>
+        </w:rPr>
+        <w:t xml:space="preserve"> → </w:t>
+      </w:r>
+      <w:proofErr w:type="spellStart"/>
+      <w:r>
+        <w:rPr>
+          <w:lang w:bidi="ar-EG"/>
+        </w:rPr>
+        <w:t>Appointment.Appointment_ID</w:t>
+      </w:r>
+      <w:proofErr w:type="spellEnd"/>
     </w:p>
     <w:p>
       <w:pPr>
@@ -5914,12 +6370,28 @@
           <w:lang w:bidi="ar-EG"/>
         </w:rPr>
       </w:pPr>
+      <w:proofErr w:type="spellStart"/>
       <w:r>
         <w:rPr>
           <w:lang w:bidi="ar-EG"/>
         </w:rPr>
-        <w:t>Treatment.Medicine_ID → Medicine.Medicine_ID</w:t>
-      </w:r>
+        <w:t>Treatment.Medicine_ID</w:t>
+      </w:r>
+      <w:proofErr w:type="spellEnd"/>
+      <w:r>
+        <w:rPr>
+          <w:lang w:bidi="ar-EG"/>
+        </w:rPr>
+        <w:t xml:space="preserve"> → </w:t>
+      </w:r>
+      <w:proofErr w:type="spellStart"/>
+      <w:r>
+        <w:rPr>
+          <w:lang w:bidi="ar-EG"/>
+        </w:rPr>
+        <w:t>Medicine.Medicine_ID</w:t>
+      </w:r>
+      <w:proofErr w:type="spellEnd"/>
     </w:p>
     <w:p>
       <w:pPr>
@@ -5932,12 +6404,28 @@
           <w:lang w:bidi="ar-EG"/>
         </w:rPr>
       </w:pPr>
+      <w:proofErr w:type="spellStart"/>
       <w:r>
         <w:rPr>
           <w:lang w:bidi="ar-EG"/>
         </w:rPr>
-        <w:t>Payment.Appointment_ID → Appointment.Appointment_ID</w:t>
-      </w:r>
+        <w:t>Payment.Appointment_ID</w:t>
+      </w:r>
+      <w:proofErr w:type="spellEnd"/>
+      <w:r>
+        <w:rPr>
+          <w:lang w:bidi="ar-EG"/>
+        </w:rPr>
+        <w:t xml:space="preserve"> → </w:t>
+      </w:r>
+      <w:proofErr w:type="spellStart"/>
+      <w:r>
+        <w:rPr>
+          <w:lang w:bidi="ar-EG"/>
+        </w:rPr>
+        <w:t>Appointment.Appointment_ID</w:t>
+      </w:r>
+      <w:proofErr w:type="spellEnd"/>
     </w:p>
     <w:p>
       <w:pPr>
@@ -6000,7 +6488,21 @@
         <w:rPr>
           <w:lang w:bidi="ar-EG"/>
         </w:rPr>
-        <w:t>Each patient has a unique Patient_ID.</w:t>
+        <w:t xml:space="preserve">Each patient has a unique </w:t>
+      </w:r>
+      <w:proofErr w:type="spellStart"/>
+      <w:r>
+        <w:rPr>
+          <w:lang w:bidi="ar-EG"/>
+        </w:rPr>
+        <w:t>Patient_ID</w:t>
+      </w:r>
+      <w:proofErr w:type="spellEnd"/>
+      <w:r>
+        <w:rPr>
+          <w:lang w:bidi="ar-EG"/>
+        </w:rPr>
+        <w:t>.</w:t>
       </w:r>
     </w:p>
     <w:p>
@@ -6018,7 +6520,21 @@
         <w:rPr>
           <w:lang w:bidi="ar-EG"/>
         </w:rPr>
-        <w:t>Each doctor has a unique Doctor_ID and license number.</w:t>
+        <w:t xml:space="preserve">Each doctor has a unique </w:t>
+      </w:r>
+      <w:proofErr w:type="spellStart"/>
+      <w:r>
+        <w:rPr>
+          <w:lang w:bidi="ar-EG"/>
+        </w:rPr>
+        <w:t>Doctor_ID</w:t>
+      </w:r>
+      <w:proofErr w:type="spellEnd"/>
+      <w:r>
+        <w:rPr>
+          <w:lang w:bidi="ar-EG"/>
+        </w:rPr>
+        <w:t xml:space="preserve"> and license number.</w:t>
       </w:r>
     </w:p>
     <w:p>
@@ -6457,15 +6973,31 @@
         <w:pStyle w:val="IT"/>
       </w:pPr>
       <w:r>
-        <w:t>CREATE DATABASE Smart_Clinic_DB;</w:t>
-      </w:r>
-    </w:p>
-    <w:p>
-      <w:pPr>
-        <w:pStyle w:val="IT"/>
-      </w:pPr>
-      <w:r>
-        <w:t>USE Smart_Clinic_DB;</w:t>
+        <w:t xml:space="preserve">CREATE DATABASE </w:t>
+      </w:r>
+      <w:proofErr w:type="spellStart"/>
+      <w:r>
+        <w:t>Smart_Clinic_DB</w:t>
+      </w:r>
+      <w:proofErr w:type="spellEnd"/>
+      <w:r>
+        <w:t>;</w:t>
+      </w:r>
+    </w:p>
+    <w:p>
+      <w:pPr>
+        <w:pStyle w:val="IT"/>
+      </w:pPr>
+      <w:r>
+        <w:t xml:space="preserve">USE </w:t>
+      </w:r>
+      <w:proofErr w:type="spellStart"/>
+      <w:r>
+        <w:t>Smart_Clinic_DB</w:t>
+      </w:r>
+      <w:proofErr w:type="spellEnd"/>
+      <w:r>
+        <w:t>;</w:t>
       </w:r>
     </w:p>
     <w:p>
@@ -6513,31 +7045,63 @@
         <w:pStyle w:val="IT"/>
       </w:pPr>
       <w:r>
-        <w:t xml:space="preserve">    Patient_ID INT AUTO_INCREMENT,</w:t>
-      </w:r>
-    </w:p>
-    <w:p>
-      <w:pPr>
-        <w:pStyle w:val="IT"/>
-      </w:pPr>
-      <w:r>
-        <w:t xml:space="preserve">    National_ID CHAR(10) NOT NULL,</w:t>
-      </w:r>
-    </w:p>
-    <w:p>
-      <w:pPr>
-        <w:pStyle w:val="IT"/>
-      </w:pPr>
-      <w:r>
-        <w:t xml:space="preserve">    Full_Name VARCHAR(100) NOT NULL,</w:t>
-      </w:r>
-    </w:p>
-    <w:p>
-      <w:pPr>
-        <w:pStyle w:val="IT"/>
-      </w:pPr>
-      <w:r>
-        <w:t xml:space="preserve">    Date_of_Birth DATE NOT NULL,</w:t>
+        <w:t xml:space="preserve">    </w:t>
+      </w:r>
+      <w:proofErr w:type="spellStart"/>
+      <w:r>
+        <w:t>Patient_ID</w:t>
+      </w:r>
+      <w:proofErr w:type="spellEnd"/>
+      <w:r>
+        <w:t xml:space="preserve"> INT AUTO_INCREMENT,</w:t>
+      </w:r>
+    </w:p>
+    <w:p>
+      <w:pPr>
+        <w:pStyle w:val="IT"/>
+      </w:pPr>
+      <w:r>
+        <w:t xml:space="preserve">    </w:t>
+      </w:r>
+      <w:proofErr w:type="spellStart"/>
+      <w:r>
+        <w:t>National_ID</w:t>
+      </w:r>
+      <w:proofErr w:type="spellEnd"/>
+      <w:r>
+        <w:t xml:space="preserve"> CHAR(10) NOT NULL,</w:t>
+      </w:r>
+    </w:p>
+    <w:p>
+      <w:pPr>
+        <w:pStyle w:val="IT"/>
+      </w:pPr>
+      <w:r>
+        <w:t xml:space="preserve">    </w:t>
+      </w:r>
+      <w:proofErr w:type="spellStart"/>
+      <w:r>
+        <w:t>Full_Name</w:t>
+      </w:r>
+      <w:proofErr w:type="spellEnd"/>
+      <w:r>
+        <w:t xml:space="preserve"> VARCHAR(100) NOT NULL,</w:t>
+      </w:r>
+    </w:p>
+    <w:p>
+      <w:pPr>
+        <w:pStyle w:val="IT"/>
+      </w:pPr>
+      <w:r>
+        <w:t xml:space="preserve">    </w:t>
+      </w:r>
+      <w:proofErr w:type="spellStart"/>
+      <w:r>
+        <w:t>Date_of_Birth</w:t>
+      </w:r>
+      <w:proofErr w:type="spellEnd"/>
+      <w:r>
+        <w:t xml:space="preserve"> DATE NOT NULL,</w:t>
       </w:r>
     </w:p>
     <w:p>
@@ -6582,15 +7146,31 @@
         <w:pStyle w:val="IT"/>
       </w:pPr>
       <w:r>
-        <w:t xml:space="preserve">    PRIMARY KEY (Patient_ID),</w:t>
-      </w:r>
-    </w:p>
-    <w:p>
-      <w:pPr>
-        <w:pStyle w:val="IT"/>
-      </w:pPr>
-      <w:r>
-        <w:t xml:space="preserve">    UNIQUE (National_ID),</w:t>
+        <w:t xml:space="preserve">    PRIMARY KEY (</w:t>
+      </w:r>
+      <w:proofErr w:type="spellStart"/>
+      <w:r>
+        <w:t>Patient_ID</w:t>
+      </w:r>
+      <w:proofErr w:type="spellEnd"/>
+      <w:r>
+        <w:t>),</w:t>
+      </w:r>
+    </w:p>
+    <w:p>
+      <w:pPr>
+        <w:pStyle w:val="IT"/>
+      </w:pPr>
+      <w:r>
+        <w:t xml:space="preserve">    UNIQUE (</w:t>
+      </w:r>
+      <w:proofErr w:type="spellStart"/>
+      <w:r>
+        <w:t>National_ID</w:t>
+      </w:r>
+      <w:proofErr w:type="spellEnd"/>
+      <w:r>
+        <w:t>),</w:t>
       </w:r>
     </w:p>
     <w:p>
@@ -6646,15 +7226,31 @@
         <w:pStyle w:val="IT"/>
       </w:pPr>
       <w:r>
-        <w:t xml:space="preserve">    Doctor_ID INT AUTO_INCREMENT,</w:t>
-      </w:r>
-    </w:p>
-    <w:p>
-      <w:pPr>
-        <w:pStyle w:val="IT"/>
-      </w:pPr>
-      <w:r>
-        <w:t xml:space="preserve">    Full_Name VARCHAR(100) NOT NULL,</w:t>
+        <w:t xml:space="preserve">    </w:t>
+      </w:r>
+      <w:proofErr w:type="spellStart"/>
+      <w:r>
+        <w:t>Doctor_ID</w:t>
+      </w:r>
+      <w:proofErr w:type="spellEnd"/>
+      <w:r>
+        <w:t xml:space="preserve"> INT AUTO_INCREMENT,</w:t>
+      </w:r>
+    </w:p>
+    <w:p>
+      <w:pPr>
+        <w:pStyle w:val="IT"/>
+      </w:pPr>
+      <w:r>
+        <w:t xml:space="preserve">    </w:t>
+      </w:r>
+      <w:proofErr w:type="spellStart"/>
+      <w:r>
+        <w:t>Full_Name</w:t>
+      </w:r>
+      <w:proofErr w:type="spellEnd"/>
+      <w:r>
+        <w:t xml:space="preserve"> VARCHAR(100) NOT NULL,</w:t>
       </w:r>
     </w:p>
     <w:p>
@@ -6670,7 +7266,15 @@
         <w:pStyle w:val="IT"/>
       </w:pPr>
       <w:r>
-        <w:t xml:space="preserve">    License_No VARCHAR(30) NOT NULL,</w:t>
+        <w:t xml:space="preserve">    </w:t>
+      </w:r>
+      <w:proofErr w:type="spellStart"/>
+      <w:r>
+        <w:t>License_No</w:t>
+      </w:r>
+      <w:proofErr w:type="spellEnd"/>
+      <w:r>
+        <w:t xml:space="preserve"> VARCHAR(30) NOT NULL,</w:t>
       </w:r>
     </w:p>
     <w:p>
@@ -6694,28 +7298,52 @@
         <w:pStyle w:val="IT"/>
       </w:pPr>
       <w:r>
-        <w:t xml:space="preserve">    Doctor_Type VARCHAR(20) NOT NULL,</w:t>
-      </w:r>
-    </w:p>
-    <w:p>
-      <w:pPr>
-        <w:pStyle w:val="IT"/>
-      </w:pPr>
-    </w:p>
-    <w:p>
-      <w:pPr>
-        <w:pStyle w:val="IT"/>
-      </w:pPr>
-      <w:r>
-        <w:t xml:space="preserve">    PRIMARY KEY (Doctor_ID),</w:t>
-      </w:r>
-    </w:p>
-    <w:p>
-      <w:pPr>
-        <w:pStyle w:val="IT"/>
-      </w:pPr>
-      <w:r>
-        <w:t xml:space="preserve">    UNIQUE (License_No),</w:t>
+        <w:t xml:space="preserve">    </w:t>
+      </w:r>
+      <w:proofErr w:type="spellStart"/>
+      <w:r>
+        <w:t>Doctor_Type</w:t>
+      </w:r>
+      <w:proofErr w:type="spellEnd"/>
+      <w:r>
+        <w:t xml:space="preserve"> VARCHAR(20) NOT NULL,</w:t>
+      </w:r>
+    </w:p>
+    <w:p>
+      <w:pPr>
+        <w:pStyle w:val="IT"/>
+      </w:pPr>
+    </w:p>
+    <w:p>
+      <w:pPr>
+        <w:pStyle w:val="IT"/>
+      </w:pPr>
+      <w:r>
+        <w:t xml:space="preserve">    PRIMARY KEY (</w:t>
+      </w:r>
+      <w:proofErr w:type="spellStart"/>
+      <w:r>
+        <w:t>Doctor_ID</w:t>
+      </w:r>
+      <w:proofErr w:type="spellEnd"/>
+      <w:r>
+        <w:t>),</w:t>
+      </w:r>
+    </w:p>
+    <w:p>
+      <w:pPr>
+        <w:pStyle w:val="IT"/>
+      </w:pPr>
+      <w:r>
+        <w:t xml:space="preserve">    UNIQUE (</w:t>
+      </w:r>
+      <w:proofErr w:type="spellStart"/>
+      <w:r>
+        <w:t>License_No</w:t>
+      </w:r>
+      <w:proofErr w:type="spellEnd"/>
+      <w:r>
+        <w:t>),</w:t>
       </w:r>
     </w:p>
     <w:p>
@@ -6763,57 +7391,105 @@
         <w:pStyle w:val="IT"/>
       </w:pPr>
       <w:r>
-        <w:t>CREATE TABLE Consultant_Doctor (</w:t>
-      </w:r>
-    </w:p>
-    <w:p>
-      <w:pPr>
-        <w:pStyle w:val="IT"/>
-      </w:pPr>
-      <w:r>
-        <w:t xml:space="preserve">    Doctor_ID INT,</w:t>
-      </w:r>
-    </w:p>
-    <w:p>
-      <w:pPr>
-        <w:pStyle w:val="IT"/>
-      </w:pPr>
-      <w:r>
-        <w:t xml:space="preserve">    Years_of_Experience INT NOT NULL,</w:t>
-      </w:r>
-    </w:p>
-    <w:p>
-      <w:pPr>
-        <w:pStyle w:val="IT"/>
-      </w:pPr>
-    </w:p>
-    <w:p>
-      <w:pPr>
-        <w:pStyle w:val="IT"/>
-      </w:pPr>
-      <w:r>
-        <w:t xml:space="preserve">    PRIMARY KEY (Doctor_ID),</w:t>
-      </w:r>
-    </w:p>
-    <w:p>
-      <w:pPr>
-        <w:pStyle w:val="IT"/>
-      </w:pPr>
-    </w:p>
-    <w:p>
-      <w:pPr>
-        <w:pStyle w:val="IT"/>
-      </w:pPr>
-      <w:r>
-        <w:t xml:space="preserve">    FOREIGN KEY (Doctor_ID)</w:t>
-      </w:r>
-    </w:p>
-    <w:p>
-      <w:pPr>
-        <w:pStyle w:val="IT"/>
-      </w:pPr>
-      <w:r>
-        <w:t xml:space="preserve">        REFERENCES Doctor(Doctor_ID)</w:t>
+        <w:t xml:space="preserve">CREATE TABLE </w:t>
+      </w:r>
+      <w:proofErr w:type="spellStart"/>
+      <w:r>
+        <w:t>Consultant_Doctor</w:t>
+      </w:r>
+      <w:proofErr w:type="spellEnd"/>
+      <w:r>
+        <w:t xml:space="preserve"> (</w:t>
+      </w:r>
+    </w:p>
+    <w:p>
+      <w:pPr>
+        <w:pStyle w:val="IT"/>
+      </w:pPr>
+      <w:r>
+        <w:t xml:space="preserve">    </w:t>
+      </w:r>
+      <w:proofErr w:type="spellStart"/>
+      <w:r>
+        <w:t>Doctor_ID</w:t>
+      </w:r>
+      <w:proofErr w:type="spellEnd"/>
+      <w:r>
+        <w:t xml:space="preserve"> INT,</w:t>
+      </w:r>
+    </w:p>
+    <w:p>
+      <w:pPr>
+        <w:pStyle w:val="IT"/>
+      </w:pPr>
+      <w:r>
+        <w:t xml:space="preserve">    </w:t>
+      </w:r>
+      <w:proofErr w:type="spellStart"/>
+      <w:r>
+        <w:t>Years_of_Experience</w:t>
+      </w:r>
+      <w:proofErr w:type="spellEnd"/>
+      <w:r>
+        <w:t xml:space="preserve"> INT NOT NULL,</w:t>
+      </w:r>
+    </w:p>
+    <w:p>
+      <w:pPr>
+        <w:pStyle w:val="IT"/>
+      </w:pPr>
+    </w:p>
+    <w:p>
+      <w:pPr>
+        <w:pStyle w:val="IT"/>
+      </w:pPr>
+      <w:r>
+        <w:t xml:space="preserve">    PRIMARY KEY (</w:t>
+      </w:r>
+      <w:proofErr w:type="spellStart"/>
+      <w:r>
+        <w:t>Doctor_ID</w:t>
+      </w:r>
+      <w:proofErr w:type="spellEnd"/>
+      <w:r>
+        <w:t>),</w:t>
+      </w:r>
+    </w:p>
+    <w:p>
+      <w:pPr>
+        <w:pStyle w:val="IT"/>
+      </w:pPr>
+    </w:p>
+    <w:p>
+      <w:pPr>
+        <w:pStyle w:val="IT"/>
+      </w:pPr>
+      <w:r>
+        <w:t xml:space="preserve">    FOREIGN KEY (</w:t>
+      </w:r>
+      <w:proofErr w:type="spellStart"/>
+      <w:r>
+        <w:t>Doctor_ID</w:t>
+      </w:r>
+      <w:proofErr w:type="spellEnd"/>
+      <w:r>
+        <w:t>)</w:t>
+      </w:r>
+    </w:p>
+    <w:p>
+      <w:pPr>
+        <w:pStyle w:val="IT"/>
+      </w:pPr>
+      <w:r>
+        <w:t xml:space="preserve">        REFERENCES Doctor(</w:t>
+      </w:r>
+      <w:proofErr w:type="spellStart"/>
+      <w:r>
+        <w:t>Doctor_ID</w:t>
+      </w:r>
+      <w:proofErr w:type="spellEnd"/>
+      <w:r>
+        <w:t>)</w:t>
       </w:r>
     </w:p>
     <w:p>
@@ -6861,57 +7537,105 @@
         <w:pStyle w:val="IT"/>
       </w:pPr>
       <w:r>
-        <w:t>CREATE TABLE Resident_Doctor (</w:t>
-      </w:r>
-    </w:p>
-    <w:p>
-      <w:pPr>
-        <w:pStyle w:val="IT"/>
-      </w:pPr>
-      <w:r>
-        <w:t xml:space="preserve">    Doctor_ID INT,</w:t>
-      </w:r>
-    </w:p>
-    <w:p>
-      <w:pPr>
-        <w:pStyle w:val="IT"/>
-      </w:pPr>
-      <w:r>
-        <w:t xml:space="preserve">    Residency_Year INT NOT NULL,</w:t>
-      </w:r>
-    </w:p>
-    <w:p>
-      <w:pPr>
-        <w:pStyle w:val="IT"/>
-      </w:pPr>
-    </w:p>
-    <w:p>
-      <w:pPr>
-        <w:pStyle w:val="IT"/>
-      </w:pPr>
-      <w:r>
-        <w:t xml:space="preserve">    PRIMARY KEY (Doctor_ID),</w:t>
-      </w:r>
-    </w:p>
-    <w:p>
-      <w:pPr>
-        <w:pStyle w:val="IT"/>
-      </w:pPr>
-    </w:p>
-    <w:p>
-      <w:pPr>
-        <w:pStyle w:val="IT"/>
-      </w:pPr>
-      <w:r>
-        <w:t xml:space="preserve">    FOREIGN KEY (Doctor_ID)</w:t>
-      </w:r>
-    </w:p>
-    <w:p>
-      <w:pPr>
-        <w:pStyle w:val="IT"/>
-      </w:pPr>
-      <w:r>
-        <w:t xml:space="preserve">        REFERENCES Doctor(Doctor_ID)</w:t>
+        <w:t xml:space="preserve">CREATE TABLE </w:t>
+      </w:r>
+      <w:proofErr w:type="spellStart"/>
+      <w:r>
+        <w:t>Resident_Doctor</w:t>
+      </w:r>
+      <w:proofErr w:type="spellEnd"/>
+      <w:r>
+        <w:t xml:space="preserve"> (</w:t>
+      </w:r>
+    </w:p>
+    <w:p>
+      <w:pPr>
+        <w:pStyle w:val="IT"/>
+      </w:pPr>
+      <w:r>
+        <w:t xml:space="preserve">    </w:t>
+      </w:r>
+      <w:proofErr w:type="spellStart"/>
+      <w:r>
+        <w:t>Doctor_ID</w:t>
+      </w:r>
+      <w:proofErr w:type="spellEnd"/>
+      <w:r>
+        <w:t xml:space="preserve"> INT,</w:t>
+      </w:r>
+    </w:p>
+    <w:p>
+      <w:pPr>
+        <w:pStyle w:val="IT"/>
+      </w:pPr>
+      <w:r>
+        <w:t xml:space="preserve">    </w:t>
+      </w:r>
+      <w:proofErr w:type="spellStart"/>
+      <w:r>
+        <w:t>Residency_Year</w:t>
+      </w:r>
+      <w:proofErr w:type="spellEnd"/>
+      <w:r>
+        <w:t xml:space="preserve"> INT NOT NULL,</w:t>
+      </w:r>
+    </w:p>
+    <w:p>
+      <w:pPr>
+        <w:pStyle w:val="IT"/>
+      </w:pPr>
+    </w:p>
+    <w:p>
+      <w:pPr>
+        <w:pStyle w:val="IT"/>
+      </w:pPr>
+      <w:r>
+        <w:t xml:space="preserve">    PRIMARY KEY (</w:t>
+      </w:r>
+      <w:proofErr w:type="spellStart"/>
+      <w:r>
+        <w:t>Doctor_ID</w:t>
+      </w:r>
+      <w:proofErr w:type="spellEnd"/>
+      <w:r>
+        <w:t>),</w:t>
+      </w:r>
+    </w:p>
+    <w:p>
+      <w:pPr>
+        <w:pStyle w:val="IT"/>
+      </w:pPr>
+    </w:p>
+    <w:p>
+      <w:pPr>
+        <w:pStyle w:val="IT"/>
+      </w:pPr>
+      <w:r>
+        <w:t xml:space="preserve">    FOREIGN KEY (</w:t>
+      </w:r>
+      <w:proofErr w:type="spellStart"/>
+      <w:r>
+        <w:t>Doctor_ID</w:t>
+      </w:r>
+      <w:proofErr w:type="spellEnd"/>
+      <w:r>
+        <w:t>)</w:t>
+      </w:r>
+    </w:p>
+    <w:p>
+      <w:pPr>
+        <w:pStyle w:val="IT"/>
+      </w:pPr>
+      <w:r>
+        <w:t xml:space="preserve">        REFERENCES Doctor(</w:t>
+      </w:r>
+      <w:proofErr w:type="spellStart"/>
+      <w:r>
+        <w:t>Doctor_ID</w:t>
+      </w:r>
+      <w:proofErr w:type="spellEnd"/>
+      <w:r>
+        <w:t>)</w:t>
       </w:r>
     </w:p>
     <w:p>
@@ -6943,7 +7667,15 @@
         <w:pStyle w:val="IT"/>
       </w:pPr>
       <w:r>
-        <w:t>The subtype tables use the Doctor_ID of the superclass as both their primary key and foreign key. This preserves the specialization/generalization structure designed in the EER model.</w:t>
+        <w:t xml:space="preserve">The subtype tables use the </w:t>
+      </w:r>
+      <w:proofErr w:type="spellStart"/>
+      <w:r>
+        <w:t>Doctor_ID</w:t>
+      </w:r>
+      <w:proofErr w:type="spellEnd"/>
+      <w:r>
+        <w:t xml:space="preserve"> of the superclass as both their primary key and foreign key. This preserves the specialization/generalization structure designed in the EER model.</w:t>
       </w:r>
     </w:p>
     <w:p>
@@ -6975,47 +7707,95 @@
         <w:pStyle w:val="IT"/>
       </w:pPr>
       <w:r>
-        <w:t xml:space="preserve">    Appointment_ID INT AUTO_INCREMENT,</w:t>
-      </w:r>
-    </w:p>
-    <w:p>
-      <w:pPr>
-        <w:pStyle w:val="IT"/>
-      </w:pPr>
-      <w:r>
-        <w:t xml:space="preserve">    Patient_ID INT NOT NULL,</w:t>
-      </w:r>
-    </w:p>
-    <w:p>
-      <w:pPr>
-        <w:pStyle w:val="IT"/>
-      </w:pPr>
-      <w:r>
-        <w:t xml:space="preserve">    Doctor_ID INT NOT NULL,</w:t>
-      </w:r>
-    </w:p>
-    <w:p>
-      <w:pPr>
-        <w:pStyle w:val="IT"/>
-      </w:pPr>
-      <w:r>
-        <w:t xml:space="preserve">    Appointment_Date DATE NOT NULL,</w:t>
-      </w:r>
-    </w:p>
-    <w:p>
-      <w:pPr>
-        <w:pStyle w:val="IT"/>
-      </w:pPr>
-      <w:r>
-        <w:t xml:space="preserve">    Appointment_Time TIME NOT NULL,</w:t>
-      </w:r>
-    </w:p>
-    <w:p>
-      <w:pPr>
-        <w:pStyle w:val="IT"/>
-      </w:pPr>
-      <w:r>
-        <w:t xml:space="preserve">    Visit_Reason VARCHAR(255) NOT NULL,</w:t>
+        <w:t xml:space="preserve">    </w:t>
+      </w:r>
+      <w:proofErr w:type="spellStart"/>
+      <w:r>
+        <w:t>Appointment_ID</w:t>
+      </w:r>
+      <w:proofErr w:type="spellEnd"/>
+      <w:r>
+        <w:t xml:space="preserve"> INT AUTO_INCREMENT,</w:t>
+      </w:r>
+    </w:p>
+    <w:p>
+      <w:pPr>
+        <w:pStyle w:val="IT"/>
+      </w:pPr>
+      <w:r>
+        <w:t xml:space="preserve">    </w:t>
+      </w:r>
+      <w:proofErr w:type="spellStart"/>
+      <w:r>
+        <w:t>Patient_ID</w:t>
+      </w:r>
+      <w:proofErr w:type="spellEnd"/>
+      <w:r>
+        <w:t xml:space="preserve"> INT NOT NULL,</w:t>
+      </w:r>
+    </w:p>
+    <w:p>
+      <w:pPr>
+        <w:pStyle w:val="IT"/>
+      </w:pPr>
+      <w:r>
+        <w:t xml:space="preserve">    </w:t>
+      </w:r>
+      <w:proofErr w:type="spellStart"/>
+      <w:r>
+        <w:t>Doctor_ID</w:t>
+      </w:r>
+      <w:proofErr w:type="spellEnd"/>
+      <w:r>
+        <w:t xml:space="preserve"> INT NOT NULL,</w:t>
+      </w:r>
+    </w:p>
+    <w:p>
+      <w:pPr>
+        <w:pStyle w:val="IT"/>
+      </w:pPr>
+      <w:r>
+        <w:t xml:space="preserve">    </w:t>
+      </w:r>
+      <w:proofErr w:type="spellStart"/>
+      <w:r>
+        <w:t>Appointment_Date</w:t>
+      </w:r>
+      <w:proofErr w:type="spellEnd"/>
+      <w:r>
+        <w:t xml:space="preserve"> DATE NOT NULL,</w:t>
+      </w:r>
+    </w:p>
+    <w:p>
+      <w:pPr>
+        <w:pStyle w:val="IT"/>
+      </w:pPr>
+      <w:r>
+        <w:t xml:space="preserve">    </w:t>
+      </w:r>
+      <w:proofErr w:type="spellStart"/>
+      <w:r>
+        <w:t>Appointment_Time</w:t>
+      </w:r>
+      <w:proofErr w:type="spellEnd"/>
+      <w:r>
+        <w:t xml:space="preserve"> TIME NOT NULL,</w:t>
+      </w:r>
+    </w:p>
+    <w:p>
+      <w:pPr>
+        <w:pStyle w:val="IT"/>
+      </w:pPr>
+      <w:r>
+        <w:t xml:space="preserve">    </w:t>
+      </w:r>
+      <w:proofErr w:type="spellStart"/>
+      <w:r>
+        <w:t>Visit_Reason</w:t>
+      </w:r>
+      <w:proofErr w:type="spellEnd"/>
+      <w:r>
+        <w:t xml:space="preserve"> VARCHAR(255) NOT NULL,</w:t>
       </w:r>
     </w:p>
     <w:p>
@@ -7036,28 +7816,52 @@
         <w:pStyle w:val="IT"/>
       </w:pPr>
       <w:r>
-        <w:t xml:space="preserve">    PRIMARY KEY (Appointment_ID),</w:t>
-      </w:r>
-    </w:p>
-    <w:p>
-      <w:pPr>
-        <w:pStyle w:val="IT"/>
-      </w:pPr>
-    </w:p>
-    <w:p>
-      <w:pPr>
-        <w:pStyle w:val="IT"/>
-      </w:pPr>
-      <w:r>
-        <w:t xml:space="preserve">    FOREIGN KEY (Patient_ID)</w:t>
-      </w:r>
-    </w:p>
-    <w:p>
-      <w:pPr>
-        <w:pStyle w:val="IT"/>
-      </w:pPr>
-      <w:r>
-        <w:t xml:space="preserve">        REFERENCES Patient(Patient_ID)</w:t>
+        <w:t xml:space="preserve">    PRIMARY KEY (</w:t>
+      </w:r>
+      <w:proofErr w:type="spellStart"/>
+      <w:r>
+        <w:t>Appointment_ID</w:t>
+      </w:r>
+      <w:proofErr w:type="spellEnd"/>
+      <w:r>
+        <w:t>),</w:t>
+      </w:r>
+    </w:p>
+    <w:p>
+      <w:pPr>
+        <w:pStyle w:val="IT"/>
+      </w:pPr>
+    </w:p>
+    <w:p>
+      <w:pPr>
+        <w:pStyle w:val="IT"/>
+      </w:pPr>
+      <w:r>
+        <w:t xml:space="preserve">    FOREIGN KEY (</w:t>
+      </w:r>
+      <w:proofErr w:type="spellStart"/>
+      <w:r>
+        <w:t>Patient_ID</w:t>
+      </w:r>
+      <w:proofErr w:type="spellEnd"/>
+      <w:r>
+        <w:t>)</w:t>
+      </w:r>
+    </w:p>
+    <w:p>
+      <w:pPr>
+        <w:pStyle w:val="IT"/>
+      </w:pPr>
+      <w:r>
+        <w:t xml:space="preserve">        REFERENCES Patient(</w:t>
+      </w:r>
+      <w:proofErr w:type="spellStart"/>
+      <w:r>
+        <w:t>Patient_ID</w:t>
+      </w:r>
+      <w:proofErr w:type="spellEnd"/>
+      <w:r>
+        <w:t>)</w:t>
       </w:r>
     </w:p>
     <w:p>
@@ -7086,15 +7890,31 @@
         <w:pStyle w:val="IT"/>
       </w:pPr>
       <w:r>
-        <w:t xml:space="preserve">    FOREIGN KEY (Doctor_ID)</w:t>
-      </w:r>
-    </w:p>
-    <w:p>
-      <w:pPr>
-        <w:pStyle w:val="IT"/>
-      </w:pPr>
-      <w:r>
-        <w:t xml:space="preserve">        REFERENCES Doctor(Doctor_ID)</w:t>
+        <w:t xml:space="preserve">    FOREIGN KEY (</w:t>
+      </w:r>
+      <w:proofErr w:type="spellStart"/>
+      <w:r>
+        <w:t>Doctor_ID</w:t>
+      </w:r>
+      <w:proofErr w:type="spellEnd"/>
+      <w:r>
+        <w:t>)</w:t>
+      </w:r>
+    </w:p>
+    <w:p>
+      <w:pPr>
+        <w:pStyle w:val="IT"/>
+      </w:pPr>
+      <w:r>
+        <w:t xml:space="preserve">        REFERENCES Doctor(</w:t>
+      </w:r>
+      <w:proofErr w:type="spellStart"/>
+      <w:r>
+        <w:t>Doctor_ID</w:t>
+      </w:r>
+      <w:proofErr w:type="spellEnd"/>
+      <w:r>
+        <w:t>)</w:t>
       </w:r>
     </w:p>
     <w:p>
@@ -7123,7 +7943,31 @@
         <w:pStyle w:val="IT"/>
       </w:pPr>
       <w:r>
-        <w:t xml:space="preserve">    UNIQUE (Doctor_ID, Appointment_Date, Appointment_Time)</w:t>
+        <w:t xml:space="preserve">    UNIQUE (</w:t>
+      </w:r>
+      <w:proofErr w:type="spellStart"/>
+      <w:r>
+        <w:t>Doctor_ID</w:t>
+      </w:r>
+      <w:proofErr w:type="spellEnd"/>
+      <w:r>
+        <w:t xml:space="preserve">, </w:t>
+      </w:r>
+      <w:proofErr w:type="spellStart"/>
+      <w:r>
+        <w:t>Appointment_Date</w:t>
+      </w:r>
+      <w:proofErr w:type="spellEnd"/>
+      <w:r>
+        <w:t xml:space="preserve">, </w:t>
+      </w:r>
+      <w:proofErr w:type="spellStart"/>
+      <w:r>
+        <w:t>Appointment_Time</w:t>
+      </w:r>
+      <w:proofErr w:type="spellEnd"/>
+      <w:r>
+        <w:t>)</w:t>
       </w:r>
     </w:p>
     <w:p>
@@ -7171,15 +8015,31 @@
         <w:pStyle w:val="IT"/>
       </w:pPr>
       <w:r>
-        <w:t xml:space="preserve">    Medicine_ID INT AUTO_INCREMENT,</w:t>
-      </w:r>
-    </w:p>
-    <w:p>
-      <w:pPr>
-        <w:pStyle w:val="IT"/>
-      </w:pPr>
-      <w:r>
-        <w:t xml:space="preserve">    Medicine_Name VARCHAR(100) NOT NULL,</w:t>
+        <w:t xml:space="preserve">    </w:t>
+      </w:r>
+      <w:proofErr w:type="spellStart"/>
+      <w:r>
+        <w:t>Medicine_ID</w:t>
+      </w:r>
+      <w:proofErr w:type="spellEnd"/>
+      <w:r>
+        <w:t xml:space="preserve"> INT AUTO_INCREMENT,</w:t>
+      </w:r>
+    </w:p>
+    <w:p>
+      <w:pPr>
+        <w:pStyle w:val="IT"/>
+      </w:pPr>
+      <w:r>
+        <w:t xml:space="preserve">    </w:t>
+      </w:r>
+      <w:proofErr w:type="spellStart"/>
+      <w:r>
+        <w:t>Medicine_Name</w:t>
+      </w:r>
+      <w:proofErr w:type="spellEnd"/>
+      <w:r>
+        <w:t xml:space="preserve"> VARCHAR(100) NOT NULL,</w:t>
       </w:r>
     </w:p>
     <w:p>
@@ -7195,36 +8055,68 @@
         <w:pStyle w:val="IT"/>
       </w:pPr>
       <w:r>
-        <w:t xml:space="preserve">    Unit_Price DECIMAL(8,2) NOT NULL,</w:t>
-      </w:r>
-    </w:p>
-    <w:p>
-      <w:pPr>
-        <w:pStyle w:val="IT"/>
-      </w:pPr>
-      <w:r>
-        <w:t xml:space="preserve">    Stock_Quantity INT NOT NULL,</w:t>
-      </w:r>
-    </w:p>
-    <w:p>
-      <w:pPr>
-        <w:pStyle w:val="IT"/>
-      </w:pPr>
-    </w:p>
-    <w:p>
-      <w:pPr>
-        <w:pStyle w:val="IT"/>
-      </w:pPr>
-      <w:r>
-        <w:t xml:space="preserve">    PRIMARY KEY (Medicine_ID),</w:t>
-      </w:r>
-    </w:p>
-    <w:p>
-      <w:pPr>
-        <w:pStyle w:val="IT"/>
-      </w:pPr>
-      <w:r>
-        <w:t xml:space="preserve">    UNIQUE (Medicine_Name)</w:t>
+        <w:t xml:space="preserve">    </w:t>
+      </w:r>
+      <w:proofErr w:type="spellStart"/>
+      <w:r>
+        <w:t>Unit_Price</w:t>
+      </w:r>
+      <w:proofErr w:type="spellEnd"/>
+      <w:r>
+        <w:t xml:space="preserve"> DECIMAL(8,2) NOT NULL,</w:t>
+      </w:r>
+    </w:p>
+    <w:p>
+      <w:pPr>
+        <w:pStyle w:val="IT"/>
+      </w:pPr>
+      <w:r>
+        <w:t xml:space="preserve">    </w:t>
+      </w:r>
+      <w:proofErr w:type="spellStart"/>
+      <w:r>
+        <w:t>Stock_Quantity</w:t>
+      </w:r>
+      <w:proofErr w:type="spellEnd"/>
+      <w:r>
+        <w:t xml:space="preserve"> INT NOT NULL,</w:t>
+      </w:r>
+    </w:p>
+    <w:p>
+      <w:pPr>
+        <w:pStyle w:val="IT"/>
+      </w:pPr>
+    </w:p>
+    <w:p>
+      <w:pPr>
+        <w:pStyle w:val="IT"/>
+      </w:pPr>
+      <w:r>
+        <w:t xml:space="preserve">    PRIMARY KEY (</w:t>
+      </w:r>
+      <w:proofErr w:type="spellStart"/>
+      <w:r>
+        <w:t>Medicine_ID</w:t>
+      </w:r>
+      <w:proofErr w:type="spellEnd"/>
+      <w:r>
+        <w:t>),</w:t>
+      </w:r>
+    </w:p>
+    <w:p>
+      <w:pPr>
+        <w:pStyle w:val="IT"/>
+      </w:pPr>
+      <w:r>
+        <w:t xml:space="preserve">    UNIQUE (</w:t>
+      </w:r>
+      <w:proofErr w:type="spellStart"/>
+      <w:r>
+        <w:t>Medicine_Name</w:t>
+      </w:r>
+      <w:proofErr w:type="spellEnd"/>
+      <w:r>
+        <w:t>)</w:t>
       </w:r>
     </w:p>
     <w:p>
@@ -7264,23 +8156,47 @@
         <w:pStyle w:val="IT"/>
       </w:pPr>
       <w:r>
-        <w:t xml:space="preserve">    Treatment_ID INT AUTO_INCREMENT,</w:t>
-      </w:r>
-    </w:p>
-    <w:p>
-      <w:pPr>
-        <w:pStyle w:val="IT"/>
-      </w:pPr>
-      <w:r>
-        <w:t xml:space="preserve">    Appointment_ID INT NOT NULL,</w:t>
-      </w:r>
-    </w:p>
-    <w:p>
-      <w:pPr>
-        <w:pStyle w:val="IT"/>
-      </w:pPr>
-      <w:r>
-        <w:t xml:space="preserve">    Medicine_ID INT,</w:t>
+        <w:t xml:space="preserve">    </w:t>
+      </w:r>
+      <w:proofErr w:type="spellStart"/>
+      <w:r>
+        <w:t>Treatment_ID</w:t>
+      </w:r>
+      <w:proofErr w:type="spellEnd"/>
+      <w:r>
+        <w:t xml:space="preserve"> INT AUTO_INCREMENT,</w:t>
+      </w:r>
+    </w:p>
+    <w:p>
+      <w:pPr>
+        <w:pStyle w:val="IT"/>
+      </w:pPr>
+      <w:r>
+        <w:t xml:space="preserve">    </w:t>
+      </w:r>
+      <w:proofErr w:type="spellStart"/>
+      <w:r>
+        <w:t>Appointment_ID</w:t>
+      </w:r>
+      <w:proofErr w:type="spellEnd"/>
+      <w:r>
+        <w:t xml:space="preserve"> INT NOT NULL,</w:t>
+      </w:r>
+    </w:p>
+    <w:p>
+      <w:pPr>
+        <w:pStyle w:val="IT"/>
+      </w:pPr>
+      <w:r>
+        <w:t xml:space="preserve">    </w:t>
+      </w:r>
+      <w:proofErr w:type="spellStart"/>
+      <w:r>
+        <w:t>Medicine_ID</w:t>
+      </w:r>
+      <w:proofErr w:type="spellEnd"/>
+      <w:r>
+        <w:t xml:space="preserve"> INT,</w:t>
       </w:r>
     </w:p>
     <w:p>
@@ -7296,7 +8212,15 @@
         <w:pStyle w:val="IT"/>
       </w:pPr>
       <w:r>
-        <w:t xml:space="preserve">    Procedure_Name VARCHAR(150) NOT NULL,</w:t>
+        <w:t xml:space="preserve">    </w:t>
+      </w:r>
+      <w:proofErr w:type="spellStart"/>
+      <w:r>
+        <w:t>Procedure_Name</w:t>
+      </w:r>
+      <w:proofErr w:type="spellEnd"/>
+      <w:r>
+        <w:t xml:space="preserve"> VARCHAR(150) NOT NULL,</w:t>
       </w:r>
     </w:p>
     <w:p>
@@ -7325,28 +8249,52 @@
         <w:pStyle w:val="IT"/>
       </w:pPr>
       <w:r>
-        <w:t xml:space="preserve">    PRIMARY KEY (Treatment_ID),</w:t>
-      </w:r>
-    </w:p>
-    <w:p>
-      <w:pPr>
-        <w:pStyle w:val="IT"/>
-      </w:pPr>
-    </w:p>
-    <w:p>
-      <w:pPr>
-        <w:pStyle w:val="IT"/>
-      </w:pPr>
-      <w:r>
-        <w:t xml:space="preserve">    FOREIGN KEY (Appointment_ID)</w:t>
-      </w:r>
-    </w:p>
-    <w:p>
-      <w:pPr>
-        <w:pStyle w:val="IT"/>
-      </w:pPr>
-      <w:r>
-        <w:t xml:space="preserve">        REFERENCES Appointment(Appointment_ID)</w:t>
+        <w:t xml:space="preserve">    PRIMARY KEY (</w:t>
+      </w:r>
+      <w:proofErr w:type="spellStart"/>
+      <w:r>
+        <w:t>Treatment_ID</w:t>
+      </w:r>
+      <w:proofErr w:type="spellEnd"/>
+      <w:r>
+        <w:t>),</w:t>
+      </w:r>
+    </w:p>
+    <w:p>
+      <w:pPr>
+        <w:pStyle w:val="IT"/>
+      </w:pPr>
+    </w:p>
+    <w:p>
+      <w:pPr>
+        <w:pStyle w:val="IT"/>
+      </w:pPr>
+      <w:r>
+        <w:t xml:space="preserve">    FOREIGN KEY (</w:t>
+      </w:r>
+      <w:proofErr w:type="spellStart"/>
+      <w:r>
+        <w:t>Appointment_ID</w:t>
+      </w:r>
+      <w:proofErr w:type="spellEnd"/>
+      <w:r>
+        <w:t>)</w:t>
+      </w:r>
+    </w:p>
+    <w:p>
+      <w:pPr>
+        <w:pStyle w:val="IT"/>
+      </w:pPr>
+      <w:r>
+        <w:t xml:space="preserve">        REFERENCES Appointment(</w:t>
+      </w:r>
+      <w:proofErr w:type="spellStart"/>
+      <w:r>
+        <w:t>Appointment_ID</w:t>
+      </w:r>
+      <w:proofErr w:type="spellEnd"/>
+      <w:r>
+        <w:t>)</w:t>
       </w:r>
     </w:p>
     <w:p>
@@ -7375,15 +8323,31 @@
         <w:pStyle w:val="IT"/>
       </w:pPr>
       <w:r>
-        <w:t xml:space="preserve">    FOREIGN KEY (Medicine_ID)</w:t>
-      </w:r>
-    </w:p>
-    <w:p>
-      <w:pPr>
-        <w:pStyle w:val="IT"/>
-      </w:pPr>
-      <w:r>
-        <w:t xml:space="preserve">        REFERENCES Medicine(Medicine_ID)</w:t>
+        <w:t xml:space="preserve">    FOREIGN KEY (</w:t>
+      </w:r>
+      <w:proofErr w:type="spellStart"/>
+      <w:r>
+        <w:t>Medicine_ID</w:t>
+      </w:r>
+      <w:proofErr w:type="spellEnd"/>
+      <w:r>
+        <w:t>)</w:t>
+      </w:r>
+    </w:p>
+    <w:p>
+      <w:pPr>
+        <w:pStyle w:val="IT"/>
+      </w:pPr>
+      <w:r>
+        <w:t xml:space="preserve">        REFERENCES Medicine(</w:t>
+      </w:r>
+      <w:proofErr w:type="spellStart"/>
+      <w:r>
+        <w:t>Medicine_ID</w:t>
+      </w:r>
+      <w:proofErr w:type="spellEnd"/>
+      <w:r>
+        <w:t>)</w:t>
       </w:r>
     </w:p>
     <w:p>
@@ -7439,15 +8403,31 @@
         <w:pStyle w:val="IT"/>
       </w:pPr>
       <w:r>
-        <w:t xml:space="preserve">    Payment_ID INT AUTO_INCREMENT,</w:t>
-      </w:r>
-    </w:p>
-    <w:p>
-      <w:pPr>
-        <w:pStyle w:val="IT"/>
-      </w:pPr>
-      <w:r>
-        <w:t xml:space="preserve">    Appointment_ID INT NOT NULL,</w:t>
+        <w:t xml:space="preserve">    </w:t>
+      </w:r>
+      <w:proofErr w:type="spellStart"/>
+      <w:r>
+        <w:t>Payment_ID</w:t>
+      </w:r>
+      <w:proofErr w:type="spellEnd"/>
+      <w:r>
+        <w:t xml:space="preserve"> INT AUTO_INCREMENT,</w:t>
+      </w:r>
+    </w:p>
+    <w:p>
+      <w:pPr>
+        <w:pStyle w:val="IT"/>
+      </w:pPr>
+      <w:r>
+        <w:t xml:space="preserve">    </w:t>
+      </w:r>
+      <w:proofErr w:type="spellStart"/>
+      <w:r>
+        <w:t>Appointment_ID</w:t>
+      </w:r>
+      <w:proofErr w:type="spellEnd"/>
+      <w:r>
+        <w:t xml:space="preserve"> INT NOT NULL,</w:t>
       </w:r>
     </w:p>
     <w:p>
@@ -7463,65 +8443,121 @@
         <w:pStyle w:val="IT"/>
       </w:pPr>
       <w:r>
-        <w:t xml:space="preserve">    Payment_Date DATE NOT NULL,</w:t>
-      </w:r>
-    </w:p>
-    <w:p>
-      <w:pPr>
-        <w:pStyle w:val="IT"/>
-      </w:pPr>
-      <w:r>
-        <w:t xml:space="preserve">    Payment_Method VARCHAR(30) NOT NULL,</w:t>
-      </w:r>
-    </w:p>
-    <w:p>
-      <w:pPr>
-        <w:pStyle w:val="IT"/>
-      </w:pPr>
-      <w:r>
-        <w:t xml:space="preserve">    Payment_Status VARCHAR(20) NOT NULL,</w:t>
-      </w:r>
-    </w:p>
-    <w:p>
-      <w:pPr>
-        <w:pStyle w:val="IT"/>
-      </w:pPr>
-      <w:r>
-        <w:t xml:space="preserve">    Payment_Type VARCHAR(30) NOT NULL,</w:t>
-      </w:r>
-    </w:p>
-    <w:p>
-      <w:pPr>
-        <w:pStyle w:val="IT"/>
-      </w:pPr>
-    </w:p>
-    <w:p>
-      <w:pPr>
-        <w:pStyle w:val="IT"/>
-      </w:pPr>
-      <w:r>
-        <w:t xml:space="preserve">    PRIMARY KEY (Payment_ID),</w:t>
-      </w:r>
-    </w:p>
-    <w:p>
-      <w:pPr>
-        <w:pStyle w:val="IT"/>
-      </w:pPr>
-    </w:p>
-    <w:p>
-      <w:pPr>
-        <w:pStyle w:val="IT"/>
-      </w:pPr>
-      <w:r>
-        <w:t xml:space="preserve">    FOREIGN KEY (Appointment_ID)</w:t>
-      </w:r>
-    </w:p>
-    <w:p>
-      <w:pPr>
-        <w:pStyle w:val="IT"/>
-      </w:pPr>
-      <w:r>
-        <w:t xml:space="preserve">        REFERENCES Appointment(Appointment_ID)</w:t>
+        <w:t xml:space="preserve">    </w:t>
+      </w:r>
+      <w:proofErr w:type="spellStart"/>
+      <w:r>
+        <w:t>Payment_Date</w:t>
+      </w:r>
+      <w:proofErr w:type="spellEnd"/>
+      <w:r>
+        <w:t xml:space="preserve"> DATE NOT NULL,</w:t>
+      </w:r>
+    </w:p>
+    <w:p>
+      <w:pPr>
+        <w:pStyle w:val="IT"/>
+      </w:pPr>
+      <w:r>
+        <w:t xml:space="preserve">    </w:t>
+      </w:r>
+      <w:proofErr w:type="spellStart"/>
+      <w:r>
+        <w:t>Payment_Method</w:t>
+      </w:r>
+      <w:proofErr w:type="spellEnd"/>
+      <w:r>
+        <w:t xml:space="preserve"> VARCHAR(30) NOT NULL,</w:t>
+      </w:r>
+    </w:p>
+    <w:p>
+      <w:pPr>
+        <w:pStyle w:val="IT"/>
+      </w:pPr>
+      <w:r>
+        <w:t xml:space="preserve">    </w:t>
+      </w:r>
+      <w:proofErr w:type="spellStart"/>
+      <w:r>
+        <w:t>Payment_Status</w:t>
+      </w:r>
+      <w:proofErr w:type="spellEnd"/>
+      <w:r>
+        <w:t xml:space="preserve"> VARCHAR(20) NOT NULL,</w:t>
+      </w:r>
+    </w:p>
+    <w:p>
+      <w:pPr>
+        <w:pStyle w:val="IT"/>
+      </w:pPr>
+      <w:r>
+        <w:t xml:space="preserve">    </w:t>
+      </w:r>
+      <w:proofErr w:type="spellStart"/>
+      <w:r>
+        <w:t>Payment_Type</w:t>
+      </w:r>
+      <w:proofErr w:type="spellEnd"/>
+      <w:r>
+        <w:t xml:space="preserve"> VARCHAR(30) NOT NULL,</w:t>
+      </w:r>
+    </w:p>
+    <w:p>
+      <w:pPr>
+        <w:pStyle w:val="IT"/>
+      </w:pPr>
+    </w:p>
+    <w:p>
+      <w:pPr>
+        <w:pStyle w:val="IT"/>
+      </w:pPr>
+      <w:r>
+        <w:t xml:space="preserve">    PRIMARY KEY (</w:t>
+      </w:r>
+      <w:proofErr w:type="spellStart"/>
+      <w:r>
+        <w:t>Payment_ID</w:t>
+      </w:r>
+      <w:proofErr w:type="spellEnd"/>
+      <w:r>
+        <w:t>),</w:t>
+      </w:r>
+    </w:p>
+    <w:p>
+      <w:pPr>
+        <w:pStyle w:val="IT"/>
+      </w:pPr>
+    </w:p>
+    <w:p>
+      <w:pPr>
+        <w:pStyle w:val="IT"/>
+      </w:pPr>
+      <w:r>
+        <w:t xml:space="preserve">    FOREIGN KEY (</w:t>
+      </w:r>
+      <w:proofErr w:type="spellStart"/>
+      <w:r>
+        <w:t>Appointment_ID</w:t>
+      </w:r>
+      <w:proofErr w:type="spellEnd"/>
+      <w:r>
+        <w:t>)</w:t>
+      </w:r>
+    </w:p>
+    <w:p>
+      <w:pPr>
+        <w:pStyle w:val="IT"/>
+      </w:pPr>
+      <w:r>
+        <w:t xml:space="preserve">        REFERENCES Appointment(</w:t>
+      </w:r>
+      <w:proofErr w:type="spellStart"/>
+      <w:r>
+        <w:t>Appointment_ID</w:t>
+      </w:r>
+      <w:proofErr w:type="spellEnd"/>
+      <w:r>
+        <w:t>)</w:t>
       </w:r>
     </w:p>
     <w:p>
@@ -7638,7 +8674,31 @@
         <w:pStyle w:val="IT"/>
       </w:pPr>
       <w:r>
-        <w:t xml:space="preserve">    (National_ID, Full_Name, Date_of_Birth, Gender, Phone, Email, Address)</w:t>
+        <w:t xml:space="preserve">    (</w:t>
+      </w:r>
+      <w:proofErr w:type="spellStart"/>
+      <w:r>
+        <w:t>National_ID</w:t>
+      </w:r>
+      <w:proofErr w:type="spellEnd"/>
+      <w:r>
+        <w:t xml:space="preserve">, </w:t>
+      </w:r>
+      <w:proofErr w:type="spellStart"/>
+      <w:r>
+        <w:t>Full_Name</w:t>
+      </w:r>
+      <w:proofErr w:type="spellEnd"/>
+      <w:r>
+        <w:t xml:space="preserve">, </w:t>
+      </w:r>
+      <w:proofErr w:type="spellStart"/>
+      <w:r>
+        <w:t>Date_of_Birth</w:t>
+      </w:r>
+      <w:proofErr w:type="spellEnd"/>
+      <w:r>
+        <w:t>, Gender, Phone, Email, Address)</w:t>
       </w:r>
     </w:p>
     <w:p>
@@ -7678,7 +8738,15 @@
         <w:pStyle w:val="IT"/>
       </w:pPr>
       <w:r>
-        <w:t xml:space="preserve">     'Al Malqa District, Riyadh'),</w:t>
+        <w:t xml:space="preserve">     'Al </w:t>
+      </w:r>
+      <w:proofErr w:type="spellStart"/>
+      <w:r>
+        <w:t>Malqa</w:t>
+      </w:r>
+      <w:proofErr w:type="spellEnd"/>
+      <w:r>
+        <w:t xml:space="preserve"> District, Riyadh'),</w:t>
       </w:r>
     </w:p>
     <w:p>
@@ -7752,7 +8820,15 @@
         <w:pStyle w:val="IT"/>
       </w:pPr>
       <w:r>
-        <w:t xml:space="preserve">     'Al Faisaliyah District, Dammam'),</w:t>
+        <w:t xml:space="preserve">     'Al </w:t>
+      </w:r>
+      <w:proofErr w:type="spellStart"/>
+      <w:r>
+        <w:t>Faisaliyah</w:t>
+      </w:r>
+      <w:proofErr w:type="spellEnd"/>
+      <w:r>
+        <w:t xml:space="preserve"> District, Dammam'),</w:t>
       </w:r>
     </w:p>
     <w:p>
@@ -7789,7 +8865,15 @@
         <w:pStyle w:val="IT"/>
       </w:pPr>
       <w:r>
-        <w:t xml:space="preserve">     'Al Aziziyah District, Makkah'),</w:t>
+        <w:t xml:space="preserve">     'Al </w:t>
+      </w:r>
+      <w:proofErr w:type="spellStart"/>
+      <w:r>
+        <w:t>Aziziyah</w:t>
+      </w:r>
+      <w:proofErr w:type="spellEnd"/>
+      <w:r>
+        <w:t xml:space="preserve"> District, Makkah'),</w:t>
       </w:r>
     </w:p>
     <w:p>
@@ -7866,7 +8950,31 @@
         <w:pStyle w:val="IT"/>
       </w:pPr>
       <w:r>
-        <w:t xml:space="preserve">    (Full_Name, Specialty, License_No, Phone, Email, Doctor_Type)</w:t>
+        <w:t xml:space="preserve">    (</w:t>
+      </w:r>
+      <w:proofErr w:type="spellStart"/>
+      <w:r>
+        <w:t>Full_Name</w:t>
+      </w:r>
+      <w:proofErr w:type="spellEnd"/>
+      <w:r>
+        <w:t xml:space="preserve">, Specialty, </w:t>
+      </w:r>
+      <w:proofErr w:type="spellStart"/>
+      <w:r>
+        <w:t>License_No</w:t>
+      </w:r>
+      <w:proofErr w:type="spellEnd"/>
+      <w:r>
+        <w:t xml:space="preserve">, Phone, Email, </w:t>
+      </w:r>
+      <w:proofErr w:type="spellStart"/>
+      <w:r>
+        <w:t>Doctor_Type</w:t>
+      </w:r>
+      <w:proofErr w:type="spellEnd"/>
+      <w:r>
+        <w:t>)</w:t>
       </w:r>
     </w:p>
     <w:p>
@@ -8114,7 +9222,15 @@
         <w:pStyle w:val="IT"/>
       </w:pPr>
       <w:r>
-        <w:t xml:space="preserve">    ('Lama Alsubaie', 'Internal Medicine',</w:t>
+        <w:t xml:space="preserve">    ('Lama </w:t>
+      </w:r>
+      <w:proofErr w:type="spellStart"/>
+      <w:r>
+        <w:t>Alsubaie</w:t>
+      </w:r>
+      <w:proofErr w:type="spellEnd"/>
+      <w:r>
+        <w:t>', 'Internal Medicine',</w:t>
       </w:r>
     </w:p>
     <w:p>
@@ -8183,15 +9299,36 @@
         <w:pStyle w:val="IT"/>
       </w:pPr>
       <w:r>
-        <w:t>INSERT INTO Consultant_Doctor</w:t>
-      </w:r>
-    </w:p>
-    <w:p>
-      <w:pPr>
-        <w:pStyle w:val="IT"/>
-      </w:pPr>
-      <w:r>
-        <w:t xml:space="preserve">    (Doctor_ID, Years_of_Experience)</w:t>
+        <w:t xml:space="preserve">INSERT INTO </w:t>
+      </w:r>
+      <w:proofErr w:type="spellStart"/>
+      <w:r>
+        <w:t>Consultant_Doctor</w:t>
+      </w:r>
+      <w:proofErr w:type="spellEnd"/>
+    </w:p>
+    <w:p>
+      <w:pPr>
+        <w:pStyle w:val="IT"/>
+      </w:pPr>
+      <w:r>
+        <w:t xml:space="preserve">    (</w:t>
+      </w:r>
+      <w:proofErr w:type="spellStart"/>
+      <w:r>
+        <w:t>Doctor_ID</w:t>
+      </w:r>
+      <w:proofErr w:type="spellEnd"/>
+      <w:r>
+        <w:t xml:space="preserve">, </w:t>
+      </w:r>
+      <w:proofErr w:type="spellStart"/>
+      <w:r>
+        <w:t>Years_of_Experience</w:t>
+      </w:r>
+      <w:proofErr w:type="spellEnd"/>
+      <w:r>
+        <w:t>)</w:t>
       </w:r>
     </w:p>
     <w:p>
@@ -8263,15 +9400,36 @@
         <w:pStyle w:val="IT"/>
       </w:pPr>
       <w:r>
-        <w:t>INSERT INTO Resident_Doctor</w:t>
-      </w:r>
-    </w:p>
-    <w:p>
-      <w:pPr>
-        <w:pStyle w:val="IT"/>
-      </w:pPr>
-      <w:r>
-        <w:t xml:space="preserve">    (Doctor_ID, Residency_Year)</w:t>
+        <w:t xml:space="preserve">INSERT INTO </w:t>
+      </w:r>
+      <w:proofErr w:type="spellStart"/>
+      <w:r>
+        <w:t>Resident_Doctor</w:t>
+      </w:r>
+      <w:proofErr w:type="spellEnd"/>
+    </w:p>
+    <w:p>
+      <w:pPr>
+        <w:pStyle w:val="IT"/>
+      </w:pPr>
+      <w:r>
+        <w:t xml:space="preserve">    (</w:t>
+      </w:r>
+      <w:proofErr w:type="spellStart"/>
+      <w:r>
+        <w:t>Doctor_ID</w:t>
+      </w:r>
+      <w:proofErr w:type="spellEnd"/>
+      <w:r>
+        <w:t xml:space="preserve">, </w:t>
+      </w:r>
+      <w:proofErr w:type="spellStart"/>
+      <w:r>
+        <w:t>Residency_Year</w:t>
+      </w:r>
+      <w:proofErr w:type="spellEnd"/>
+      <w:r>
+        <w:t>)</w:t>
       </w:r>
     </w:p>
     <w:p>
@@ -8379,15 +9537,55 @@
         <w:pStyle w:val="IT"/>
       </w:pPr>
       <w:r>
-        <w:t xml:space="preserve">    (Patient_ID, Doctor_ID, Appointment_Date,</w:t>
-      </w:r>
-    </w:p>
-    <w:p>
-      <w:pPr>
-        <w:pStyle w:val="IT"/>
-      </w:pPr>
-      <w:r>
-        <w:t xml:space="preserve">     Appointment_Time, Visit_Reason, Status)</w:t>
+        <w:t xml:space="preserve">    (</w:t>
+      </w:r>
+      <w:proofErr w:type="spellStart"/>
+      <w:r>
+        <w:t>Patient_ID</w:t>
+      </w:r>
+      <w:proofErr w:type="spellEnd"/>
+      <w:r>
+        <w:t xml:space="preserve">, </w:t>
+      </w:r>
+      <w:proofErr w:type="spellStart"/>
+      <w:r>
+        <w:t>Doctor_ID</w:t>
+      </w:r>
+      <w:proofErr w:type="spellEnd"/>
+      <w:r>
+        <w:t xml:space="preserve">, </w:t>
+      </w:r>
+      <w:proofErr w:type="spellStart"/>
+      <w:r>
+        <w:t>Appointment_Date</w:t>
+      </w:r>
+      <w:proofErr w:type="spellEnd"/>
+      <w:r>
+        <w:t>,</w:t>
+      </w:r>
+    </w:p>
+    <w:p>
+      <w:pPr>
+        <w:pStyle w:val="IT"/>
+      </w:pPr>
+      <w:r>
+        <w:t xml:space="preserve">     </w:t>
+      </w:r>
+      <w:proofErr w:type="spellStart"/>
+      <w:r>
+        <w:t>Appointment_Time</w:t>
+      </w:r>
+      <w:proofErr w:type="spellEnd"/>
+      <w:r>
+        <w:t xml:space="preserve">, </w:t>
+      </w:r>
+      <w:proofErr w:type="spellStart"/>
+      <w:r>
+        <w:t>Visit_Reason</w:t>
+      </w:r>
+      <w:proofErr w:type="spellEnd"/>
+      <w:r>
+        <w:t>, Status)</w:t>
       </w:r>
     </w:p>
     <w:p>
@@ -8527,7 +9725,31 @@
         <w:pStyle w:val="IT"/>
       </w:pPr>
       <w:r>
-        <w:t xml:space="preserve">    (Medicine_Name, Description, Unit_Price, Stock_Quantity)</w:t>
+        <w:t xml:space="preserve">    (</w:t>
+      </w:r>
+      <w:proofErr w:type="spellStart"/>
+      <w:r>
+        <w:t>Medicine_Name</w:t>
+      </w:r>
+      <w:proofErr w:type="spellEnd"/>
+      <w:r>
+        <w:t xml:space="preserve">, Description, </w:t>
+      </w:r>
+      <w:proofErr w:type="spellStart"/>
+      <w:r>
+        <w:t>Unit_Price</w:t>
+      </w:r>
+      <w:proofErr w:type="spellEnd"/>
+      <w:r>
+        <w:t xml:space="preserve">, </w:t>
+      </w:r>
+      <w:proofErr w:type="spellStart"/>
+      <w:r>
+        <w:t>Stock_Quantity</w:t>
+      </w:r>
+      <w:proofErr w:type="spellEnd"/>
+      <w:r>
+        <w:t>)</w:t>
       </w:r>
     </w:p>
     <w:p>
@@ -8707,15 +9929,39 @@
         <w:pStyle w:val="IT"/>
       </w:pPr>
       <w:r>
-        <w:t xml:space="preserve">    (Appointment_ID, Medicine_ID, Diagnosis,</w:t>
-      </w:r>
-    </w:p>
-    <w:p>
-      <w:pPr>
-        <w:pStyle w:val="IT"/>
-      </w:pPr>
-      <w:r>
-        <w:t xml:space="preserve">     Procedure_Name, Notes, Cost)</w:t>
+        <w:t xml:space="preserve">    (</w:t>
+      </w:r>
+      <w:proofErr w:type="spellStart"/>
+      <w:r>
+        <w:t>Appointment_ID</w:t>
+      </w:r>
+      <w:proofErr w:type="spellEnd"/>
+      <w:r>
+        <w:t xml:space="preserve">, </w:t>
+      </w:r>
+      <w:proofErr w:type="spellStart"/>
+      <w:r>
+        <w:t>Medicine_ID</w:t>
+      </w:r>
+      <w:proofErr w:type="spellEnd"/>
+      <w:r>
+        <w:t>, Diagnosis,</w:t>
+      </w:r>
+    </w:p>
+    <w:p>
+      <w:pPr>
+        <w:pStyle w:val="IT"/>
+      </w:pPr>
+      <w:r>
+        <w:t xml:space="preserve">     </w:t>
+      </w:r>
+      <w:proofErr w:type="spellStart"/>
+      <w:r>
+        <w:t>Procedure_Name</w:t>
+      </w:r>
+      <w:proofErr w:type="spellEnd"/>
+      <w:r>
+        <w:t>, Notes, Cost)</w:t>
       </w:r>
     </w:p>
     <w:p>
@@ -8975,15 +10221,55 @@
         <w:pStyle w:val="IT"/>
       </w:pPr>
       <w:r>
-        <w:t xml:space="preserve">    (Appointment_ID, Amount, Payment_Date,</w:t>
-      </w:r>
-    </w:p>
-    <w:p>
-      <w:pPr>
-        <w:pStyle w:val="IT"/>
-      </w:pPr>
-      <w:r>
-        <w:t xml:space="preserve">     Payment_Method, Payment_Status, Payment_Type)</w:t>
+        <w:t xml:space="preserve">    (</w:t>
+      </w:r>
+      <w:proofErr w:type="spellStart"/>
+      <w:r>
+        <w:t>Appointment_ID</w:t>
+      </w:r>
+      <w:proofErr w:type="spellEnd"/>
+      <w:r>
+        <w:t xml:space="preserve">, Amount, </w:t>
+      </w:r>
+      <w:proofErr w:type="spellStart"/>
+      <w:r>
+        <w:t>Payment_Date</w:t>
+      </w:r>
+      <w:proofErr w:type="spellEnd"/>
+      <w:r>
+        <w:t>,</w:t>
+      </w:r>
+    </w:p>
+    <w:p>
+      <w:pPr>
+        <w:pStyle w:val="IT"/>
+      </w:pPr>
+      <w:r>
+        <w:t xml:space="preserve">     </w:t>
+      </w:r>
+      <w:proofErr w:type="spellStart"/>
+      <w:r>
+        <w:t>Payment_Method</w:t>
+      </w:r>
+      <w:proofErr w:type="spellEnd"/>
+      <w:r>
+        <w:t xml:space="preserve">, </w:t>
+      </w:r>
+      <w:proofErr w:type="spellStart"/>
+      <w:r>
+        <w:t>Payment_Status</w:t>
+      </w:r>
+      <w:proofErr w:type="spellEnd"/>
+      <w:r>
+        <w:t xml:space="preserve">, </w:t>
+      </w:r>
+      <w:proofErr w:type="spellStart"/>
+      <w:r>
+        <w:t>Payment_Type</w:t>
+      </w:r>
+      <w:proofErr w:type="spellEnd"/>
+      <w:r>
+        <w:t>)</w:t>
       </w:r>
     </w:p>
     <w:p>
@@ -9540,9 +10826,11 @@
             <w:pPr>
               <w:pStyle w:val="IT"/>
             </w:pPr>
+            <w:proofErr w:type="spellStart"/>
             <w:r>
               <w:t>Patient_ID</w:t>
             </w:r>
+            <w:proofErr w:type="spellEnd"/>
           </w:p>
         </w:tc>
         <w:tc>
@@ -9584,9 +10872,11 @@
             <w:pPr>
               <w:pStyle w:val="IT"/>
             </w:pPr>
+            <w:proofErr w:type="spellStart"/>
             <w:r>
               <w:t>Doctor_ID</w:t>
             </w:r>
+            <w:proofErr w:type="spellEnd"/>
           </w:p>
         </w:tc>
         <w:tc>
@@ -9614,9 +10904,11 @@
             <w:pPr>
               <w:pStyle w:val="IT"/>
             </w:pPr>
+            <w:proofErr w:type="spellStart"/>
             <w:r>
               <w:t>Consultant_Doctor</w:t>
             </w:r>
+            <w:proofErr w:type="spellEnd"/>
           </w:p>
         </w:tc>
         <w:tc>
@@ -9628,9 +10920,11 @@
             <w:pPr>
               <w:pStyle w:val="IT"/>
             </w:pPr>
+            <w:proofErr w:type="spellStart"/>
             <w:r>
               <w:t>Doctor_ID</w:t>
             </w:r>
+            <w:proofErr w:type="spellEnd"/>
           </w:p>
         </w:tc>
         <w:tc>
@@ -9642,8 +10936,13 @@
             <w:pPr>
               <w:pStyle w:val="IT"/>
             </w:pPr>
+            <w:proofErr w:type="spellStart"/>
             <w:r>
-              <w:t>Doctor_ID → Doctor</w:t>
+              <w:t>Doctor_ID</w:t>
+            </w:r>
+            <w:proofErr w:type="spellEnd"/>
+            <w:r>
+              <w:t xml:space="preserve"> → Doctor</w:t>
             </w:r>
           </w:p>
         </w:tc>
@@ -9658,9 +10957,11 @@
             <w:pPr>
               <w:pStyle w:val="IT"/>
             </w:pPr>
+            <w:proofErr w:type="spellStart"/>
             <w:r>
               <w:t>Resident_Doctor</w:t>
             </w:r>
+            <w:proofErr w:type="spellEnd"/>
           </w:p>
         </w:tc>
         <w:tc>
@@ -9672,9 +10973,11 @@
             <w:pPr>
               <w:pStyle w:val="IT"/>
             </w:pPr>
+            <w:proofErr w:type="spellStart"/>
             <w:r>
               <w:t>Doctor_ID</w:t>
             </w:r>
+            <w:proofErr w:type="spellEnd"/>
           </w:p>
         </w:tc>
         <w:tc>
@@ -9686,8 +10989,13 @@
             <w:pPr>
               <w:pStyle w:val="IT"/>
             </w:pPr>
+            <w:proofErr w:type="spellStart"/>
             <w:r>
-              <w:t>Doctor_ID → Doctor</w:t>
+              <w:t>Doctor_ID</w:t>
+            </w:r>
+            <w:proofErr w:type="spellEnd"/>
+            <w:r>
+              <w:t xml:space="preserve"> → Doctor</w:t>
             </w:r>
           </w:p>
         </w:tc>
@@ -9716,9 +11024,11 @@
             <w:pPr>
               <w:pStyle w:val="IT"/>
             </w:pPr>
+            <w:proofErr w:type="spellStart"/>
             <w:r>
               <w:t>Appointment_ID</w:t>
             </w:r>
+            <w:proofErr w:type="spellEnd"/>
           </w:p>
         </w:tc>
         <w:tc>
@@ -9730,8 +11040,21 @@
             <w:pPr>
               <w:pStyle w:val="IT"/>
             </w:pPr>
+            <w:proofErr w:type="spellStart"/>
             <w:r>
-              <w:t>Patient_ID → Patient, Doctor_ID → Doctor</w:t>
+              <w:t>Patient_ID</w:t>
+            </w:r>
+            <w:proofErr w:type="spellEnd"/>
+            <w:r>
+              <w:t xml:space="preserve"> → Patient, </w:t>
+            </w:r>
+            <w:proofErr w:type="spellStart"/>
+            <w:r>
+              <w:t>Doctor_ID</w:t>
+            </w:r>
+            <w:proofErr w:type="spellEnd"/>
+            <w:r>
+              <w:t xml:space="preserve"> → Doctor</w:t>
             </w:r>
           </w:p>
         </w:tc>
@@ -9760,9 +11083,11 @@
             <w:pPr>
               <w:pStyle w:val="IT"/>
             </w:pPr>
+            <w:proofErr w:type="spellStart"/>
             <w:r>
               <w:t>Medicine_ID</w:t>
             </w:r>
+            <w:proofErr w:type="spellEnd"/>
           </w:p>
         </w:tc>
         <w:tc>
@@ -9804,9 +11129,11 @@
             <w:pPr>
               <w:pStyle w:val="IT"/>
             </w:pPr>
+            <w:proofErr w:type="spellStart"/>
             <w:r>
               <w:t>Treatment_ID</w:t>
             </w:r>
+            <w:proofErr w:type="spellEnd"/>
           </w:p>
         </w:tc>
         <w:tc>
@@ -9818,8 +11145,21 @@
             <w:pPr>
               <w:pStyle w:val="IT"/>
             </w:pPr>
+            <w:proofErr w:type="spellStart"/>
             <w:r>
-              <w:t>Appointment_ID → Appointment, Medicine_ID → Medicine</w:t>
+              <w:t>Appointment_ID</w:t>
+            </w:r>
+            <w:proofErr w:type="spellEnd"/>
+            <w:r>
+              <w:t xml:space="preserve"> → Appointment, </w:t>
+            </w:r>
+            <w:proofErr w:type="spellStart"/>
+            <w:r>
+              <w:t>Medicine_ID</w:t>
+            </w:r>
+            <w:proofErr w:type="spellEnd"/>
+            <w:r>
+              <w:t xml:space="preserve"> → Medicine</w:t>
             </w:r>
           </w:p>
         </w:tc>
@@ -9848,9 +11188,11 @@
             <w:pPr>
               <w:pStyle w:val="IT"/>
             </w:pPr>
+            <w:proofErr w:type="spellStart"/>
             <w:r>
               <w:t>Payment_ID</w:t>
             </w:r>
+            <w:proofErr w:type="spellEnd"/>
           </w:p>
         </w:tc>
         <w:tc>
@@ -9862,8 +11204,13 @@
             <w:pPr>
               <w:pStyle w:val="IT"/>
             </w:pPr>
+            <w:proofErr w:type="spellStart"/>
             <w:r>
-              <w:t>Appointment_ID → Appointment</w:t>
+              <w:t>Appointment_ID</w:t>
+            </w:r>
+            <w:proofErr w:type="spellEnd"/>
+            <w:r>
+              <w:t xml:space="preserve"> → Appointment</w:t>
             </w:r>
           </w:p>
         </w:tc>
@@ -10220,6 +11567,685 @@
     <w:p>
       <w:pPr>
         <w:pStyle w:val="IT"/>
+        <w:rPr>
+          <w:b/>
+          <w:bCs/>
+        </w:rPr>
+      </w:pPr>
+      <w:r>
+        <w:rPr>
+          <w:b/>
+          <w:bCs/>
+        </w:rPr>
+        <w:t>1. SELECT Statement</w:t>
+      </w:r>
+    </w:p>
+    <w:p>
+      <w:pPr>
+        <w:pStyle w:val="IT"/>
+      </w:pPr>
+      <w:r>
+        <w:t>This query retrieves all completed appointments and displays their date, time, reason, and status. The ORDER BY clause arranges the results by appointment date and time.</w:t>
+      </w:r>
+    </w:p>
+    <w:p>
+      <w:pPr>
+        <w:pStyle w:val="IT"/>
+      </w:pPr>
+      <w:r>
+        <w:rPr>
+          <w:noProof/>
+        </w:rPr>
+        <w:drawing>
+          <wp:inline distT="0" distB="0" distL="0" distR="0" wp14:anchorId="24C8ACF5" wp14:editId="41A0014E">
+            <wp:extent cx="5349240" cy="1734820"/>
+            <wp:effectExtent l="0" t="0" r="3810" b="0"/>
+            <wp:docPr id="1787941635" name="Picture 1"/>
+            <wp:cNvGraphicFramePr>
+              <a:graphicFrameLocks xmlns:a="http://schemas.openxmlformats.org/drawingml/2006/main" noChangeAspect="1"/>
+            </wp:cNvGraphicFramePr>
+            <a:graphic xmlns:a="http://schemas.openxmlformats.org/drawingml/2006/main">
+              <a:graphicData uri="http://schemas.openxmlformats.org/drawingml/2006/picture">
+                <pic:pic xmlns:pic="http://schemas.openxmlformats.org/drawingml/2006/picture">
+                  <pic:nvPicPr>
+                    <pic:cNvPr id="1787941635" name=""/>
+                    <pic:cNvPicPr/>
+                  </pic:nvPicPr>
+                  <pic:blipFill>
+                    <a:blip r:embed="rId26"/>
+                    <a:stretch>
+                      <a:fillRect/>
+                    </a:stretch>
+                  </pic:blipFill>
+                  <pic:spPr>
+                    <a:xfrm>
+                      <a:off x="0" y="0"/>
+                      <a:ext cx="5349240" cy="1734820"/>
+                    </a:xfrm>
+                    <a:prstGeom prst="rect">
+                      <a:avLst/>
+                    </a:prstGeom>
+                  </pic:spPr>
+                </pic:pic>
+              </a:graphicData>
+            </a:graphic>
+          </wp:inline>
+        </w:drawing>
+      </w:r>
+    </w:p>
+    <w:p>
+      <w:pPr>
+        <w:pStyle w:val="IT"/>
+      </w:pPr>
+      <w:r>
+        <w:t>A basic SQL retrieval query uses SELECT and FROM, while WHERE can be used to filter records and ORDER BY to sort the result.</w:t>
+      </w:r>
+    </w:p>
+    <w:p>
+      <w:pPr>
+        <w:pStyle w:val="IT"/>
+        <w:rPr>
+          <w:b/>
+          <w:bCs/>
+        </w:rPr>
+      </w:pPr>
+      <w:r>
+        <w:rPr>
+          <w:b/>
+          <w:bCs/>
+        </w:rPr>
+        <w:t>2. JOIN Query</w:t>
+      </w:r>
+    </w:p>
+    <w:p>
+      <w:pPr>
+        <w:pStyle w:val="IT"/>
+      </w:pPr>
+      <w:r>
+        <w:t>This query combines appointment, patient, and doctor information. It shows the patient and doctor involved in each appointment together with the appointment details.</w:t>
+      </w:r>
+    </w:p>
+    <w:p>
+      <w:pPr>
+        <w:pStyle w:val="IT"/>
+      </w:pPr>
+      <w:r>
+        <w:rPr>
+          <w:noProof/>
+        </w:rPr>
+        <w:drawing>
+          <wp:inline distT="0" distB="0" distL="0" distR="0" wp14:anchorId="325EE00F" wp14:editId="7CC6674D">
+            <wp:extent cx="5349240" cy="1494155"/>
+            <wp:effectExtent l="0" t="0" r="3810" b="0"/>
+            <wp:docPr id="1191702910" name="Picture 1"/>
+            <wp:cNvGraphicFramePr>
+              <a:graphicFrameLocks xmlns:a="http://schemas.openxmlformats.org/drawingml/2006/main" noChangeAspect="1"/>
+            </wp:cNvGraphicFramePr>
+            <a:graphic xmlns:a="http://schemas.openxmlformats.org/drawingml/2006/main">
+              <a:graphicData uri="http://schemas.openxmlformats.org/drawingml/2006/picture">
+                <pic:pic xmlns:pic="http://schemas.openxmlformats.org/drawingml/2006/picture">
+                  <pic:nvPicPr>
+                    <pic:cNvPr id="1191702910" name=""/>
+                    <pic:cNvPicPr/>
+                  </pic:nvPicPr>
+                  <pic:blipFill>
+                    <a:blip r:embed="rId27"/>
+                    <a:stretch>
+                      <a:fillRect/>
+                    </a:stretch>
+                  </pic:blipFill>
+                  <pic:spPr>
+                    <a:xfrm>
+                      <a:off x="0" y="0"/>
+                      <a:ext cx="5349240" cy="1494155"/>
+                    </a:xfrm>
+                    <a:prstGeom prst="rect">
+                      <a:avLst/>
+                    </a:prstGeom>
+                  </pic:spPr>
+                </pic:pic>
+              </a:graphicData>
+            </a:graphic>
+          </wp:inline>
+        </w:drawing>
+      </w:r>
+    </w:p>
+    <w:p>
+      <w:pPr>
+        <w:pStyle w:val="IT"/>
+      </w:pPr>
+      <w:r>
+        <w:t>An INNER JOIN combines related tuples when they satisfy the specified join condition.</w:t>
+      </w:r>
+    </w:p>
+    <w:p>
+      <w:pPr>
+        <w:pStyle w:val="IT"/>
+        <w:rPr>
+          <w:b/>
+          <w:bCs/>
+        </w:rPr>
+      </w:pPr>
+      <w:r>
+        <w:rPr>
+          <w:b/>
+          <w:bCs/>
+        </w:rPr>
+        <w:t>3. Nested Query</w:t>
+      </w:r>
+    </w:p>
+    <w:p>
+      <w:pPr>
+        <w:pStyle w:val="IT"/>
+      </w:pPr>
+      <w:r>
+        <w:rPr>
+          <w:b/>
+          <w:bCs/>
+        </w:rPr>
+        <w:t>Purpose:</w:t>
+      </w:r>
+      <w:r>
+        <w:t xml:space="preserve"> This query identifies treatments whose cost is greater than the average cost of all treatments. The nested query first calculates the overall average treatment cost.</w:t>
+      </w:r>
+    </w:p>
+    <w:p>
+      <w:pPr>
+        <w:pStyle w:val="IT"/>
+      </w:pPr>
+      <w:r>
+        <w:rPr>
+          <w:noProof/>
+        </w:rPr>
+        <w:drawing>
+          <wp:inline distT="0" distB="0" distL="0" distR="0" wp14:anchorId="6275FC97" wp14:editId="6368245D">
+            <wp:extent cx="5349240" cy="1455420"/>
+            <wp:effectExtent l="0" t="0" r="3810" b="0"/>
+            <wp:docPr id="2041778168" name="Picture 1"/>
+            <wp:cNvGraphicFramePr>
+              <a:graphicFrameLocks xmlns:a="http://schemas.openxmlformats.org/drawingml/2006/main" noChangeAspect="1"/>
+            </wp:cNvGraphicFramePr>
+            <a:graphic xmlns:a="http://schemas.openxmlformats.org/drawingml/2006/main">
+              <a:graphicData uri="http://schemas.openxmlformats.org/drawingml/2006/picture">
+                <pic:pic xmlns:pic="http://schemas.openxmlformats.org/drawingml/2006/picture">
+                  <pic:nvPicPr>
+                    <pic:cNvPr id="2041778168" name=""/>
+                    <pic:cNvPicPr/>
+                  </pic:nvPicPr>
+                  <pic:blipFill>
+                    <a:blip r:embed="rId28"/>
+                    <a:stretch>
+                      <a:fillRect/>
+                    </a:stretch>
+                  </pic:blipFill>
+                  <pic:spPr>
+                    <a:xfrm>
+                      <a:off x="0" y="0"/>
+                      <a:ext cx="5349240" cy="1455420"/>
+                    </a:xfrm>
+                    <a:prstGeom prst="rect">
+                      <a:avLst/>
+                    </a:prstGeom>
+                  </pic:spPr>
+                </pic:pic>
+              </a:graphicData>
+            </a:graphic>
+          </wp:inline>
+        </w:drawing>
+      </w:r>
+    </w:p>
+    <w:p>
+      <w:pPr>
+        <w:pStyle w:val="IT"/>
+      </w:pPr>
+      <w:r>
+        <w:t>Nested queries allow one SQL query to be placed inside another query and are useful when the outer query depends on a value calculated by another query.</w:t>
+      </w:r>
+    </w:p>
+    <w:p>
+      <w:pPr>
+        <w:pStyle w:val="IT"/>
+        <w:rPr>
+          <w:b/>
+          <w:bCs/>
+        </w:rPr>
+      </w:pPr>
+      <w:r>
+        <w:rPr>
+          <w:b/>
+          <w:bCs/>
+        </w:rPr>
+        <w:t>4. Aggregate Functions with GROUP BY</w:t>
+      </w:r>
+    </w:p>
+    <w:p>
+      <w:pPr>
+        <w:pStyle w:val="IT"/>
+      </w:pPr>
+      <w:r>
+        <w:t>This query summarizes the number of appointments handled by each doctor. It groups appointments according to the doctor and uses COUNT() to calculate the total appointments for each doctor.</w:t>
+      </w:r>
+    </w:p>
+    <w:p>
+      <w:pPr>
+        <w:pStyle w:val="IT"/>
+      </w:pPr>
+    </w:p>
+    <w:p>
+      <w:pPr>
+        <w:pStyle w:val="IT"/>
+      </w:pPr>
+      <w:r>
+        <w:rPr>
+          <w:noProof/>
+        </w:rPr>
+        <w:drawing>
+          <wp:inline distT="0" distB="0" distL="0" distR="0" wp14:anchorId="2D47F920" wp14:editId="3D2D0556">
+            <wp:extent cx="5349240" cy="2176780"/>
+            <wp:effectExtent l="0" t="0" r="3810" b="0"/>
+            <wp:docPr id="1767619948" name="Picture 1"/>
+            <wp:cNvGraphicFramePr>
+              <a:graphicFrameLocks xmlns:a="http://schemas.openxmlformats.org/drawingml/2006/main" noChangeAspect="1"/>
+            </wp:cNvGraphicFramePr>
+            <a:graphic xmlns:a="http://schemas.openxmlformats.org/drawingml/2006/main">
+              <a:graphicData uri="http://schemas.openxmlformats.org/drawingml/2006/picture">
+                <pic:pic xmlns:pic="http://schemas.openxmlformats.org/drawingml/2006/picture">
+                  <pic:nvPicPr>
+                    <pic:cNvPr id="1767619948" name=""/>
+                    <pic:cNvPicPr/>
+                  </pic:nvPicPr>
+                  <pic:blipFill>
+                    <a:blip r:embed="rId29"/>
+                    <a:stretch>
+                      <a:fillRect/>
+                    </a:stretch>
+                  </pic:blipFill>
+                  <pic:spPr>
+                    <a:xfrm>
+                      <a:off x="0" y="0"/>
+                      <a:ext cx="5349240" cy="2176780"/>
+                    </a:xfrm>
+                    <a:prstGeom prst="rect">
+                      <a:avLst/>
+                    </a:prstGeom>
+                  </pic:spPr>
+                </pic:pic>
+              </a:graphicData>
+            </a:graphic>
+          </wp:inline>
+        </w:drawing>
+      </w:r>
+    </w:p>
+    <w:p>
+      <w:pPr>
+        <w:pStyle w:val="IT"/>
+      </w:pPr>
+      <w:r>
+        <w:t>Aggregate functions such as COUNT, AVG, SUM, MIN, and MAX can be combined with GROUP BY to summarize records according to selected attributes.</w:t>
+      </w:r>
+    </w:p>
+    <w:p>
+      <w:pPr>
+        <w:pStyle w:val="IT"/>
+        <w:rPr>
+          <w:b/>
+          <w:bCs/>
+        </w:rPr>
+      </w:pPr>
+      <w:r>
+        <w:rPr>
+          <w:b/>
+          <w:bCs/>
+        </w:rPr>
+        <w:t>5. UPDATE and DELETE Statements</w:t>
+      </w:r>
+    </w:p>
+    <w:p>
+      <w:pPr>
+        <w:pStyle w:val="IT"/>
+        <w:rPr>
+          <w:b/>
+          <w:bCs/>
+        </w:rPr>
+      </w:pPr>
+      <w:r>
+        <w:rPr>
+          <w:b/>
+          <w:bCs/>
+        </w:rPr>
+        <w:t>UPDATE Statement</w:t>
+      </w:r>
+    </w:p>
+    <w:p>
+      <w:pPr>
+        <w:pStyle w:val="IT"/>
+      </w:pPr>
+      <w:r>
+        <w:t>This statement changes the status of appointment number 5 from its current value to Cancelled.</w:t>
+      </w:r>
+    </w:p>
+    <w:p>
+      <w:pPr>
+        <w:pStyle w:val="IT"/>
+        <w:rPr>
+          <w:b/>
+          <w:bCs/>
+        </w:rPr>
+      </w:pPr>
+      <w:r>
+        <w:rPr>
+          <w:b/>
+          <w:bCs/>
+          <w:noProof/>
+        </w:rPr>
+        <w:drawing>
+          <wp:inline distT="0" distB="0" distL="0" distR="0" wp14:anchorId="03327D60" wp14:editId="43008A24">
+            <wp:extent cx="5349240" cy="1418590"/>
+            <wp:effectExtent l="0" t="0" r="3810" b="0"/>
+            <wp:docPr id="1238639233" name="Picture 1"/>
+            <wp:cNvGraphicFramePr>
+              <a:graphicFrameLocks xmlns:a="http://schemas.openxmlformats.org/drawingml/2006/main" noChangeAspect="1"/>
+            </wp:cNvGraphicFramePr>
+            <a:graphic xmlns:a="http://schemas.openxmlformats.org/drawingml/2006/main">
+              <a:graphicData uri="http://schemas.openxmlformats.org/drawingml/2006/picture">
+                <pic:pic xmlns:pic="http://schemas.openxmlformats.org/drawingml/2006/picture">
+                  <pic:nvPicPr>
+                    <pic:cNvPr id="1238639233" name=""/>
+                    <pic:cNvPicPr/>
+                  </pic:nvPicPr>
+                  <pic:blipFill>
+                    <a:blip r:embed="rId30"/>
+                    <a:stretch>
+                      <a:fillRect/>
+                    </a:stretch>
+                  </pic:blipFill>
+                  <pic:spPr>
+                    <a:xfrm>
+                      <a:off x="0" y="0"/>
+                      <a:ext cx="5349240" cy="1418590"/>
+                    </a:xfrm>
+                    <a:prstGeom prst="rect">
+                      <a:avLst/>
+                    </a:prstGeom>
+                  </pic:spPr>
+                </pic:pic>
+              </a:graphicData>
+            </a:graphic>
+          </wp:inline>
+        </w:drawing>
+      </w:r>
+    </w:p>
+    <w:p>
+      <w:pPr>
+        <w:pStyle w:val="IT"/>
+        <w:rPr>
+          <w:b/>
+          <w:bCs/>
+        </w:rPr>
+      </w:pPr>
+      <w:r>
+        <w:rPr>
+          <w:b/>
+          <w:bCs/>
+        </w:rPr>
+        <w:t>DELETE Statement</w:t>
+      </w:r>
+    </w:p>
+    <w:p>
+      <w:pPr>
+        <w:pStyle w:val="IT"/>
+      </w:pPr>
+      <w:r>
+        <w:t>This statement removes payment number 5 from the Payment table. The WHERE condition ensures that only the selected payment record is deleted.</w:t>
+      </w:r>
+    </w:p>
+    <w:p>
+      <w:pPr>
+        <w:pStyle w:val="IT"/>
+      </w:pPr>
+      <w:r>
+        <w:rPr>
+          <w:noProof/>
+        </w:rPr>
+        <w:drawing>
+          <wp:inline distT="0" distB="0" distL="0" distR="0" wp14:anchorId="06C05EC0" wp14:editId="1CFFA3CD">
+            <wp:extent cx="4382112" cy="1619476"/>
+            <wp:effectExtent l="0" t="0" r="0" b="0"/>
+            <wp:docPr id="646857878" name="Picture 1"/>
+            <wp:cNvGraphicFramePr>
+              <a:graphicFrameLocks xmlns:a="http://schemas.openxmlformats.org/drawingml/2006/main" noChangeAspect="1"/>
+            </wp:cNvGraphicFramePr>
+            <a:graphic xmlns:a="http://schemas.openxmlformats.org/drawingml/2006/main">
+              <a:graphicData uri="http://schemas.openxmlformats.org/drawingml/2006/picture">
+                <pic:pic xmlns:pic="http://schemas.openxmlformats.org/drawingml/2006/picture">
+                  <pic:nvPicPr>
+                    <pic:cNvPr id="646857878" name=""/>
+                    <pic:cNvPicPr/>
+                  </pic:nvPicPr>
+                  <pic:blipFill>
+                    <a:blip r:embed="rId31"/>
+                    <a:stretch>
+                      <a:fillRect/>
+                    </a:stretch>
+                  </pic:blipFill>
+                  <pic:spPr>
+                    <a:xfrm>
+                      <a:off x="0" y="0"/>
+                      <a:ext cx="4382112" cy="1619476"/>
+                    </a:xfrm>
+                    <a:prstGeom prst="rect">
+                      <a:avLst/>
+                    </a:prstGeom>
+                  </pic:spPr>
+                </pic:pic>
+              </a:graphicData>
+            </a:graphic>
+          </wp:inline>
+        </w:drawing>
+      </w:r>
+    </w:p>
+    <w:p>
+      <w:pPr>
+        <w:pStyle w:val="IT"/>
+      </w:pPr>
+      <w:r>
+        <w:t>UPDATE modifies selected existing records through the SET and WHERE clauses, while DELETE removes records selected by its WHERE condition. Omitting the WHERE clause from a DELETE statement would remove every record from the table.</w:t>
+      </w:r>
+    </w:p>
+    <w:p>
+      <w:pPr>
+        <w:pStyle w:val="IT"/>
+        <w:rPr>
+          <w:b/>
+          <w:bCs/>
+        </w:rPr>
+      </w:pPr>
+      <w:r>
+        <w:rPr>
+          <w:b/>
+          <w:bCs/>
+        </w:rPr>
+        <w:t>6. Create a VIEW</w:t>
+      </w:r>
+    </w:p>
+    <w:p>
+      <w:pPr>
+        <w:pStyle w:val="IT"/>
+      </w:pPr>
+      <w:r>
+        <w:t>This view provides a reusable summary of appointments containing patient names, doctor names, specialties, appointment dates, and appointment status. It makes this information easier to retrieve without rewriting the JOIN conditions each time.</w:t>
+      </w:r>
+    </w:p>
+    <w:p>
+      <w:pPr>
+        <w:pStyle w:val="IT"/>
+      </w:pPr>
+      <w:r>
+        <w:rPr>
+          <w:noProof/>
+        </w:rPr>
+        <w:drawing>
+          <wp:inline distT="0" distB="0" distL="0" distR="0" wp14:anchorId="163B9DDB" wp14:editId="08239EBF">
+            <wp:extent cx="4763165" cy="3858163"/>
+            <wp:effectExtent l="0" t="0" r="0" b="9525"/>
+            <wp:docPr id="1653225052" name="Picture 1"/>
+            <wp:cNvGraphicFramePr>
+              <a:graphicFrameLocks xmlns:a="http://schemas.openxmlformats.org/drawingml/2006/main" noChangeAspect="1"/>
+            </wp:cNvGraphicFramePr>
+            <a:graphic xmlns:a="http://schemas.openxmlformats.org/drawingml/2006/main">
+              <a:graphicData uri="http://schemas.openxmlformats.org/drawingml/2006/picture">
+                <pic:pic xmlns:pic="http://schemas.openxmlformats.org/drawingml/2006/picture">
+                  <pic:nvPicPr>
+                    <pic:cNvPr id="1653225052" name=""/>
+                    <pic:cNvPicPr/>
+                  </pic:nvPicPr>
+                  <pic:blipFill>
+                    <a:blip r:embed="rId32"/>
+                    <a:stretch>
+                      <a:fillRect/>
+                    </a:stretch>
+                  </pic:blipFill>
+                  <pic:spPr>
+                    <a:xfrm>
+                      <a:off x="0" y="0"/>
+                      <a:ext cx="4763165" cy="3858163"/>
+                    </a:xfrm>
+                    <a:prstGeom prst="rect">
+                      <a:avLst/>
+                    </a:prstGeom>
+                  </pic:spPr>
+                </pic:pic>
+              </a:graphicData>
+            </a:graphic>
+          </wp:inline>
+        </w:drawing>
+      </w:r>
+    </w:p>
+    <w:p>
+      <w:pPr>
+        <w:pStyle w:val="IT"/>
+      </w:pPr>
+      <w:r>
+        <w:rPr>
+          <w:noProof/>
+        </w:rPr>
+        <w:drawing>
+          <wp:inline distT="0" distB="0" distL="0" distR="0" wp14:anchorId="598DC41A" wp14:editId="2EA8F48F">
+            <wp:extent cx="5349240" cy="1671955"/>
+            <wp:effectExtent l="0" t="0" r="3810" b="4445"/>
+            <wp:docPr id="859642085" name="Picture 1"/>
+            <wp:cNvGraphicFramePr>
+              <a:graphicFrameLocks xmlns:a="http://schemas.openxmlformats.org/drawingml/2006/main" noChangeAspect="1"/>
+            </wp:cNvGraphicFramePr>
+            <a:graphic xmlns:a="http://schemas.openxmlformats.org/drawingml/2006/main">
+              <a:graphicData uri="http://schemas.openxmlformats.org/drawingml/2006/picture">
+                <pic:pic xmlns:pic="http://schemas.openxmlformats.org/drawingml/2006/picture">
+                  <pic:nvPicPr>
+                    <pic:cNvPr id="859642085" name=""/>
+                    <pic:cNvPicPr/>
+                  </pic:nvPicPr>
+                  <pic:blipFill>
+                    <a:blip r:embed="rId33"/>
+                    <a:stretch>
+                      <a:fillRect/>
+                    </a:stretch>
+                  </pic:blipFill>
+                  <pic:spPr>
+                    <a:xfrm>
+                      <a:off x="0" y="0"/>
+                      <a:ext cx="5349240" cy="1671955"/>
+                    </a:xfrm>
+                    <a:prstGeom prst="rect">
+                      <a:avLst/>
+                    </a:prstGeom>
+                  </pic:spPr>
+                </pic:pic>
+              </a:graphicData>
+            </a:graphic>
+          </wp:inline>
+        </w:drawing>
+      </w:r>
+    </w:p>
+    <w:p>
+      <w:pPr>
+        <w:pStyle w:val="IT"/>
+      </w:pPr>
+      <w:r>
+        <w:t>A view is a virtual table derived from other tables and is useful for defining a complex retrieval operation once and reusing it later.</w:t>
+      </w:r>
+    </w:p>
+    <w:p>
+      <w:pPr>
+        <w:pStyle w:val="IT"/>
+        <w:rPr>
+          <w:b/>
+          <w:bCs/>
+        </w:rPr>
+      </w:pPr>
+      <w:r>
+        <w:rPr>
+          <w:b/>
+          <w:bCs/>
+        </w:rPr>
+        <w:t>7. Create a TRIGGER</w:t>
+      </w:r>
+    </w:p>
+    <w:p>
+      <w:pPr>
+        <w:pStyle w:val="IT"/>
+      </w:pPr>
+      <w:r>
+        <w:t>This trigger prevents a new appointment from being inserted when its appointment date is earlier than the current date. This helps prevent invalid past appointments from being entered into the clinic database.</w:t>
+      </w:r>
+    </w:p>
+    <w:p>
+      <w:pPr>
+        <w:pStyle w:val="IT"/>
+      </w:pPr>
+      <w:r>
+        <w:rPr>
+          <w:noProof/>
+        </w:rPr>
+        <w:drawing>
+          <wp:inline distT="0" distB="0" distL="0" distR="0" wp14:anchorId="22BAE6FF" wp14:editId="773C7E54">
+            <wp:extent cx="5349240" cy="690245"/>
+            <wp:effectExtent l="0" t="0" r="3810" b="0"/>
+            <wp:docPr id="469261560" name="Picture 1"/>
+            <wp:cNvGraphicFramePr>
+              <a:graphicFrameLocks xmlns:a="http://schemas.openxmlformats.org/drawingml/2006/main" noChangeAspect="1"/>
+            </wp:cNvGraphicFramePr>
+            <a:graphic xmlns:a="http://schemas.openxmlformats.org/drawingml/2006/main">
+              <a:graphicData uri="http://schemas.openxmlformats.org/drawingml/2006/picture">
+                <pic:pic xmlns:pic="http://schemas.openxmlformats.org/drawingml/2006/picture">
+                  <pic:nvPicPr>
+                    <pic:cNvPr id="469261560" name=""/>
+                    <pic:cNvPicPr/>
+                  </pic:nvPicPr>
+                  <pic:blipFill>
+                    <a:blip r:embed="rId34"/>
+                    <a:stretch>
+                      <a:fillRect/>
+                    </a:stretch>
+                  </pic:blipFill>
+                  <pic:spPr>
+                    <a:xfrm>
+                      <a:off x="0" y="0"/>
+                      <a:ext cx="5349240" cy="690245"/>
+                    </a:xfrm>
+                    <a:prstGeom prst="rect">
+                      <a:avLst/>
+                    </a:prstGeom>
+                  </pic:spPr>
+                </pic:pic>
+              </a:graphicData>
+            </a:graphic>
+          </wp:inline>
+        </w:drawing>
+      </w:r>
+    </w:p>
+    <w:p>
+      <w:pPr>
+        <w:pStyle w:val="IT"/>
       </w:pPr>
     </w:p>
     <w:p>
@@ -10447,12 +12473,114 @@
     <w:p>
       <w:pPr>
         <w:pStyle w:val="IT"/>
-      </w:pPr>
-    </w:p>
-    <w:p>
-      <w:pPr>
-        <w:pStyle w:val="IT"/>
-      </w:pPr>
+        <w:rPr>
+          <w:b/>
+          <w:bCs/>
+        </w:rPr>
+      </w:pPr>
+      <w:r>
+        <w:rPr>
+          <w:b/>
+          <w:bCs/>
+        </w:rPr>
+        <w:t>Project Reflection</w:t>
+      </w:r>
+    </w:p>
+    <w:p>
+      <w:pPr>
+        <w:pStyle w:val="IT"/>
+        <w:rPr>
+          <w:b/>
+          <w:bCs/>
+        </w:rPr>
+      </w:pPr>
+      <w:r>
+        <w:rPr>
+          <w:b/>
+          <w:bCs/>
+        </w:rPr>
+        <w:t>1. Challenge Encountered and How It Was Resolved</w:t>
+      </w:r>
+    </w:p>
+    <w:p>
+      <w:pPr>
+        <w:pStyle w:val="IT"/>
+      </w:pPr>
+      <w:r>
+        <w:t>One of the main challenges I faced during this project was maintaining correct relationships between the tables while applying primary and foreign key constraints. The problem became clear when designing the Appointment, Treatment, and Payment tables because these tables depend on records from other entities. For example, an appointment cannot exist without a valid patient and doctor. I resolved this by carefully checking the ER/EER design before implementing the tables in MySQL. I then created the parent tables first, such as Patient and Doctor, before creating dependent tables such as Appointment. I also tested the foreign keys using sample records to make sure invalid references were rejected.</w:t>
+      </w:r>
+    </w:p>
+    <w:p>
+      <w:pPr>
+        <w:pStyle w:val="IT"/>
+        <w:rPr>
+          <w:b/>
+          <w:bCs/>
+        </w:rPr>
+      </w:pPr>
+      <w:r>
+        <w:rPr>
+          <w:b/>
+          <w:bCs/>
+        </w:rPr>
+        <w:t>2. Choice of Approach and Tradeoffs</w:t>
+      </w:r>
+    </w:p>
+    <w:p>
+      <w:pPr>
+        <w:pStyle w:val="IT"/>
+      </w:pPr>
+      <w:r>
+        <w:t>I chose a relational database model because the clinic data contains clear relationships between patients, doctors, appointments, treatments, medicines, and payments. I considered storing more information in fewer tables, such as placing treatment and payment details directly inside the Appointment table. However, this approach would create repeated data and make updates more difficult. Separating the data into related tables produced a cleaner design and reduced unnecessary duplication. The main tradeoff was that retrieving complete information required more JOIN queries, but this was acceptable because the structure was easier to manage and maintain.</w:t>
+      </w:r>
+    </w:p>
+    <w:p>
+      <w:pPr>
+        <w:pStyle w:val="IT"/>
+        <w:rPr>
+          <w:b/>
+          <w:bCs/>
+        </w:rPr>
+      </w:pPr>
+      <w:r>
+        <w:rPr>
+          <w:b/>
+          <w:bCs/>
+        </w:rPr>
+        <w:t>3. Use of AI Tools</w:t>
+      </w:r>
+    </w:p>
+    <w:p>
+      <w:pPr>
+        <w:pStyle w:val="IT"/>
+      </w:pPr>
+      <w:r>
+        <w:t>ChatGPT was used during the project mainly for brainstorming, reviewing SQL syntax, and identifying possible improvements to the database structure. For example, it helped suggest ways to organize the Doctor specialization into Consultant and Resident subclasses and provided examples of SQL queries. The generated suggestions were not used without checking them. I compared the SQL with the course concepts, reviewed the relationships against the ER/EER diagram, and tested the statements in MySQL. Some outputs were modified to match the exact table names, attributes, constraints, and Saudi-based sample data used in the project.</w:t>
+      </w:r>
+    </w:p>
+    <w:p>
+      <w:pPr>
+        <w:pStyle w:val="IT"/>
+        <w:rPr>
+          <w:b/>
+          <w:bCs/>
+        </w:rPr>
+      </w:pPr>
+      <w:r>
+        <w:rPr>
+          <w:b/>
+          <w:bCs/>
+        </w:rPr>
+        <w:t>4. What I Would Do Differently</w:t>
+      </w:r>
+    </w:p>
+    <w:p>
+      <w:pPr>
+        <w:pStyle w:val="IT"/>
+      </w:pPr>
+      <w:r>
+        <w:t>If I completed the project again with more time, I would spend more time testing unusual cases and improving validation. For example, I would test duplicate appointments, invalid payment amounts, missing medicine records, and attempts to insert appointments in the past. I would also add more triggers and constraints where appropriate and create a larger set of realistic sample data. This would make the database more reliable and provide better evidence that the system works correctly under different conditions.</w:t>
+      </w:r>
     </w:p>
     <w:p>
       <w:pPr>
@@ -10547,7 +12675,29 @@
           <w:sz w:val="24"/>
           <w:szCs w:val="24"/>
         </w:rPr>
-        <w:t>SQL Script (.sql)</w:t>
+        <w:t>SQL Script (.</w:t>
+      </w:r>
+      <w:proofErr w:type="spellStart"/>
+      <w:r>
+        <w:rPr>
+          <w:rFonts w:ascii="Times New Roman" w:hAnsi="Times New Roman" w:cs="Times New Roman"/>
+          <w:b/>
+          <w:bCs/>
+          <w:sz w:val="24"/>
+          <w:szCs w:val="24"/>
+        </w:rPr>
+        <w:t>sql</w:t>
+      </w:r>
+      <w:proofErr w:type="spellEnd"/>
+      <w:r>
+        <w:rPr>
+          <w:rFonts w:ascii="Times New Roman" w:hAnsi="Times New Roman" w:cs="Times New Roman"/>
+          <w:b/>
+          <w:bCs/>
+          <w:sz w:val="24"/>
+          <w:szCs w:val="24"/>
+        </w:rPr>
+        <w:t>)</w:t>
       </w:r>
       <w:r>
         <w:rPr>
@@ -10592,6 +12742,45 @@
     </w:p>
     <w:p>
       <w:pPr>
+        <w:spacing w:after="200" w:line="276" w:lineRule="auto"/>
+        <w:rPr>
+          <w:rFonts w:ascii="Times New Roman" w:hAnsi="Times New Roman" w:cs="Times New Roman"/>
+          <w:sz w:val="24"/>
+          <w:szCs w:val="24"/>
+        </w:rPr>
+      </w:pPr>
+      <w:proofErr w:type="spellStart"/>
+      <w:r>
+        <w:rPr>
+          <w:rFonts w:ascii="Times New Roman" w:hAnsi="Times New Roman" w:cs="Times New Roman"/>
+          <w:sz w:val="24"/>
+          <w:szCs w:val="24"/>
+        </w:rPr>
+        <w:t>Github</w:t>
+      </w:r>
+      <w:proofErr w:type="spellEnd"/>
+      <w:r>
+        <w:rPr>
+          <w:rFonts w:ascii="Times New Roman" w:hAnsi="Times New Roman" w:cs="Times New Roman"/>
+          <w:sz w:val="24"/>
+          <w:szCs w:val="24"/>
+        </w:rPr>
+        <w:t xml:space="preserve"> Link: </w:t>
+      </w:r>
+      <w:hyperlink r:id="rId35" w:history="1">
+        <w:r>
+          <w:rPr>
+            <w:rStyle w:val="Hyperlink"/>
+            <w:rFonts w:ascii="Times New Roman" w:hAnsi="Times New Roman" w:cs="Times New Roman"/>
+            <w:sz w:val="24"/>
+            <w:szCs w:val="24"/>
+          </w:rPr>
+          <w:t>https://github.com/Wajd0721/IT244_Project.git</w:t>
+        </w:r>
+      </w:hyperlink>
+    </w:p>
+    <w:p>
+      <w:pPr>
         <w:numPr>
           <w:ilvl w:val="0"/>
           <w:numId w:val="7"/>
@@ -10641,7 +12830,7 @@
       </w:pPr>
     </w:p>
     <w:sectPr>
-      <w:headerReference w:type="default" r:id="rId26"/>
+      <w:headerReference w:type="default" r:id="rId36"/>
       <w:pgSz w:w="12240" w:h="15840"/>
       <w:pgMar w:top="1080" w:right="720" w:bottom="1800" w:left="3096" w:header="1080" w:footer="720" w:gutter="0"/>
       <w:pgNumType w:start="1"/>
@@ -11659,7 +13848,7 @@
               <w:rPr>
                 <w:noProof/>
               </w:rPr>
-              <w:instrText>Task 2 – Database Implementation (6 Marks)</w:instrText>
+              <w:instrText>Task 4 – Reflection (2 Marks)</w:instrText>
             </w:r>
           </w:fldSimple>
           <w:r>
@@ -11670,7 +13859,7 @@
               <w:rPr>
                 <w:noProof/>
               </w:rPr>
-              <w:instrText>Task 2 – Database Implementation (6 Marks)</w:instrText>
+              <w:instrText>Task 4 – Reflection (2 Marks)</w:instrText>
             </w:r>
           </w:fldSimple>
           <w:r>
@@ -11683,7 +13872,7 @@
             <w:rPr>
               <w:noProof/>
             </w:rPr>
-            <w:t xml:space="preserve">Task 2 – Database Implementation (6 Marks) </w:t>
+            <w:t xml:space="preserve">Task 4 – Reflection (2 Marks) </w:t>
           </w:r>
           <w:r>
             <w:fldChar w:fldCharType="end"/>
@@ -14441,6 +16630,18 @@
       </w:tblBorders>
     </w:tblPr>
   </w:style>
+  <w:style w:type="character" w:styleId="UnresolvedMention">
+    <w:name w:val="Unresolved Mention"/>
+    <w:basedOn w:val="DefaultParagraphFont"/>
+    <w:uiPriority w:val="99"/>
+    <w:semiHidden/>
+    <w:unhideWhenUsed/>
+    <w:rsid w:val="0021755B"/>
+    <w:rPr>
+      <w:color w:val="605E5C"/>
+      <w:shd w:val="clear" w:color="auto" w:fill="E1DFDD"/>
+    </w:rPr>
+  </w:style>
 </w:styles>
 </file>
 
@@ -14735,6 +16936,7 @@
     <w:rsid w:val="004A7EE6"/>
     <w:rsid w:val="004E5C8C"/>
     <w:rsid w:val="004F0D9A"/>
+    <w:rsid w:val="00521B02"/>
     <w:rsid w:val="005443A0"/>
     <w:rsid w:val="00552B73"/>
     <w:rsid w:val="005674E7"/>
@@ -15634,6 +17836,19 @@
 </file>
 
 <file path=customXml/item2.xml><?xml version="1.0" encoding="utf-8"?>
+<?mso-contentType ?>
+<FormTemplates xmlns="http://schemas.microsoft.com/sharepoint/v3/contenttype/forms">
+  <Display>DocumentLibraryForm</Display>
+  <Edit>AssetEditForm</Edit>
+  <New>DocumentLibraryForm</New>
+</FormTemplates>
+</file>
+
+<file path=customXml/item3.xml><?xml version="1.0" encoding="utf-8"?>
+<b:Sources xmlns:b="http://schemas.openxmlformats.org/officeDocument/2006/bibliography" SelectedStyle="\APA.XSL" StyleName="APA"/>
+</file>
+
+<file path=customXml/item4.xml><?xml version="1.0" encoding="utf-8"?>
 <s:customData xmlns="http://www.wps.cn/officeDocument/2013/wpsCustomData" xmlns:s="http://www.wps.cn/officeDocument/2013/wpsCustomData">
   <customSectProps>
     <customSectPr/>
@@ -15642,19 +17857,6 @@
     <customShpInfo spid="_x0000_s1026" textRotate="1"/>
   </customShpExts>
 </s:customData>
-</file>
-
-<file path=customXml/item3.xml><?xml version="1.0" encoding="utf-8"?>
-<b:Sources xmlns:b="http://schemas.openxmlformats.org/officeDocument/2006/bibliography" SelectedStyle="\APA.XSL" StyleName="APA"/>
-</file>
-
-<file path=customXml/item4.xml><?xml version="1.0" encoding="utf-8"?>
-<?mso-contentType ?>
-<FormTemplates xmlns="http://schemas.microsoft.com/sharepoint/v3/contenttype/forms">
-  <Display>DocumentLibraryForm</Display>
-  <Edit>AssetEditForm</Edit>
-  <New>DocumentLibraryForm</New>
-</FormTemplates>
 </file>
 
 <file path=customXml/itemProps1.xml><?xml version="1.0" encoding="utf-8"?>
@@ -15666,9 +17868,9 @@
 </file>
 
 <file path=customXml/itemProps2.xml><?xml version="1.0" encoding="utf-8"?>
-<ds:datastoreItem xmlns:ds="http://schemas.openxmlformats.org/officeDocument/2006/customXml" ds:itemID="{B1977F7D-205B-4081-913C-38D41E755F92}">
+<ds:datastoreItem xmlns:ds="http://schemas.openxmlformats.org/officeDocument/2006/customXml" ds:itemID="{E34C63B7-A026-4A37-9535-4FBB4C03A11D}">
   <ds:schemaRefs>
-    <ds:schemaRef ds:uri="http://www.wps.cn/officeDocument/2013/wpsCustomData"/>
+    <ds:schemaRef ds:uri="http://schemas.microsoft.com/sharepoint/v3/contenttype/forms"/>
   </ds:schemaRefs>
 </ds:datastoreItem>
 </file>
@@ -15682,9 +17884,9 @@
 </file>
 
 <file path=customXml/itemProps4.xml><?xml version="1.0" encoding="utf-8"?>
-<ds:datastoreItem xmlns:ds="http://schemas.openxmlformats.org/officeDocument/2006/customXml" ds:itemID="{E34C63B7-A026-4A37-9535-4FBB4C03A11D}">
+<ds:datastoreItem xmlns:ds="http://schemas.openxmlformats.org/officeDocument/2006/customXml" ds:itemID="{B1977F7D-205B-4081-913C-38D41E755F92}">
   <ds:schemaRefs>
-    <ds:schemaRef ds:uri="http://schemas.microsoft.com/sharepoint/v3/contenttype/forms"/>
+    <ds:schemaRef ds:uri="http://www.wps.cn/officeDocument/2013/wpsCustomData"/>
   </ds:schemaRefs>
 </ds:datastoreItem>
 </file>
</xml_diff>